<commit_message>
Resume: replace skills section with Skills, Activities & Interests
Co-Authored-By: Claude Opus 5.5 <noreply@anthropic.com>
Claude-Session: https://claude.ai/code/session_01G3JV145HgjUfXQyW7hEcYE
</commit_message>
<xml_diff>
--- a/assets/Jennifer-Amogu-Resume.docx
+++ b/assets/Jennifer-Amogu-Resume.docx
@@ -1303,7 +1303,7 @@
           <w:sz w:val="18"/>
           <w:szCs w:val="18"/>
         </w:rPr>
-        <w:t xml:space="preserve">KILLS</w:t>
+        <w:t xml:space="preserve">KILLS,</w:t>
       </w:r>
       <w:r>
         <w:rPr>
@@ -1316,10 +1316,18 @@
       <w:r>
         <w:rPr>
           <w:rFonts w:ascii="EB Garamond" w:cs="EB Garamond" w:eastAsia="EB Garamond" w:hAnsi="EB Garamond"/>
+          <w:sz w:val="21"/>
+          <w:szCs w:val="21"/>
+        </w:rPr>
+        <w:t xml:space="preserve">A</w:t>
+      </w:r>
+      <w:r>
+        <w:rPr>
+          <w:rFonts w:ascii="EB Garamond" w:cs="EB Garamond" w:eastAsia="EB Garamond" w:hAnsi="EB Garamond"/>
           <w:sz w:val="18"/>
           <w:szCs w:val="18"/>
         </w:rPr>
-        <w:t xml:space="preserve">&amp;</w:t>
+        <w:t xml:space="preserve">CTIVITIES</w:t>
       </w:r>
       <w:r>
         <w:rPr>
@@ -1332,9 +1340,25 @@
       <w:r>
         <w:rPr>
           <w:rFonts w:ascii="EB Garamond" w:cs="EB Garamond" w:eastAsia="EB Garamond" w:hAnsi="EB Garamond"/>
+          <w:sz w:val="18"/>
+          <w:szCs w:val="18"/>
+        </w:rPr>
+        <w:t xml:space="preserve">&amp;</w:t>
+      </w:r>
+      <w:r>
+        <w:rPr>
+          <w:rFonts w:ascii="EB Garamond" w:cs="EB Garamond" w:eastAsia="EB Garamond" w:hAnsi="EB Garamond"/>
           <w:sz w:val="21"/>
           <w:szCs w:val="21"/>
         </w:rPr>
+        <w:t xml:space="preserve"> </w:t>
+      </w:r>
+      <w:r>
+        <w:rPr>
+          <w:rFonts w:ascii="EB Garamond" w:cs="EB Garamond" w:eastAsia="EB Garamond" w:hAnsi="EB Garamond"/>
+          <w:sz w:val="21"/>
+          <w:szCs w:val="21"/>
+        </w:rPr>
         <w:t xml:space="preserve">I</w:t>
       </w:r>
       <w:r>
@@ -1366,7 +1390,7 @@
           <w:sz w:val="20"/>
           <w:szCs w:val="20"/>
         </w:rPr>
-        <w:t xml:space="preserve">Excel, PowerPoint, PitchBook, Financial Statement Analysis, Valuation, Precedent Transactions, Diligence Support, Python, Codex</w:t>
+        <w:t xml:space="preserve">Excel, PowerPoint, PitchBook, Python, Codex</w:t>
       </w:r>
     </w:p>
     <w:p>
@@ -1381,15 +1405,15 @@
           <w:sz w:val="20"/>
           <w:szCs w:val="20"/>
         </w:rPr>
-        <w:t xml:space="preserve">Certifications &amp; Training: </w:t>
-      </w:r>
-      <w:r>
-        <w:rPr>
-          <w:rFonts w:ascii="EB Garamond" w:cs="EB Garamond" w:eastAsia="EB Garamond" w:hAnsi="EB Garamond"/>
-          <w:sz w:val="20"/>
-          <w:szCs w:val="20"/>
-        </w:rPr>
-        <w:t xml:space="preserve">Wall Street Prep Financial &amp; Valuation Modeling (DCF, LBO, M&amp;A, Comps)</w:t>
+        <w:t xml:space="preserve">Activities: </w:t>
+      </w:r>
+      <w:r>
+        <w:rPr>
+          <w:rFonts w:ascii="EB Garamond" w:cs="EB Garamond" w:eastAsia="EB Garamond" w:hAnsi="EB Garamond"/>
+          <w:sz w:val="20"/>
+          <w:szCs w:val="20"/>
+        </w:rPr>
+        <w:t xml:space="preserve">WILSkills, The Hustler, Front of House (Runner)</w:t>
       </w:r>
     </w:p>
     <w:p>
@@ -1412,7 +1436,7 @@
           <w:sz w:val="20"/>
           <w:szCs w:val="20"/>
         </w:rPr>
-        <w:t xml:space="preserve">Consumer Psychology, Vintage Cards, Asian Food, Basketball, Making Waffles, 2000s Fashion, Stand-Up Comedy, TV Dramas</w:t>
+        <w:t xml:space="preserve">Consumer Psychology, Vintage Cards, Asian Food, Skiing, Making Waffles</w:t>
       </w:r>
     </w:p>
     <w:sectPr>

</xml_diff>

<commit_message>
Resume: remove Mojro selected transaction, restore DVC diligence bullet
Co-Authored-By: Claude Opus 5.5 <noreply@anthropic.com>
Claude-Session: https://claude.ai/code/session_01G3JV145HgjUfXQyW7hEcYE
</commit_message>
<xml_diff>
--- a/assets/Jennifer-Amogu-Resume.docx
+++ b/assets/Jennifer-Amogu-Resume.docx
@@ -20,7 +20,7 @@
     </w:p>
     <w:p>
       <w:pPr>
-        <w:spacing w:after="0" w:before="0" w:line="208" w:lineRule="auto"/>
+        <w:spacing w:after="0" w:before="0" w:line="216" w:lineRule="auto"/>
         <w:jc w:val="center"/>
       </w:pPr>
       <w:r>
@@ -37,7 +37,7 @@
         <w:pBdr>
           <w:bottom w:val="single" w:color="000000" w:sz="6" w:space="1"/>
         </w:pBdr>
-        <w:spacing w:after="40" w:before="60" w:line="208" w:lineRule="auto"/>
+        <w:spacing w:after="40" w:before="60" w:line="216" w:lineRule="auto"/>
       </w:pPr>
       <w:r>
         <w:rPr>
@@ -61,7 +61,7 @@
         <w:tabs>
           <w:tab w:val="right" w:pos="11228"/>
         </w:tabs>
-        <w:spacing w:after="0" w:before="40" w:line="208" w:lineRule="auto"/>
+        <w:spacing w:after="0" w:before="40" w:line="216" w:lineRule="auto"/>
       </w:pPr>
       <w:r>
         <w:rPr>
@@ -95,7 +95,7 @@
         <w:tabs>
           <w:tab w:val="right" w:pos="11228"/>
         </w:tabs>
-        <w:spacing w:after="0" w:before="0" w:line="208" w:lineRule="auto"/>
+        <w:spacing w:after="0" w:before="0" w:line="216" w:lineRule="auto"/>
       </w:pPr>
       <w:r>
         <w:rPr>
@@ -118,7 +118,7 @@
     </w:p>
     <w:p>
       <w:pPr>
-        <w:spacing w:after="0" w:before="0" w:line="208" w:lineRule="auto"/>
+        <w:spacing w:after="0" w:before="0" w:line="216" w:lineRule="auto"/>
       </w:pPr>
       <w:r>
         <w:rPr>
@@ -144,7 +144,7 @@
         <w:pBdr>
           <w:bottom w:val="single" w:color="000000" w:sz="6" w:space="1"/>
         </w:pBdr>
-        <w:spacing w:after="40" w:before="80" w:line="208" w:lineRule="auto"/>
+        <w:spacing w:after="40" w:before="80" w:line="216" w:lineRule="auto"/>
       </w:pPr>
       <w:r>
         <w:rPr>
@@ -192,7 +192,7 @@
         <w:tabs>
           <w:tab w:val="right" w:pos="11228"/>
         </w:tabs>
-        <w:spacing w:after="0" w:before="40" w:line="208" w:lineRule="auto"/>
+        <w:spacing w:after="0" w:before="40" w:line="216" w:lineRule="auto"/>
       </w:pPr>
       <w:r>
         <w:rPr>
@@ -223,7 +223,7 @@
     </w:p>
     <w:p>
       <w:pPr>
-        <w:spacing w:after="0" w:before="0" w:line="208" w:lineRule="auto"/>
+        <w:spacing w:after="0" w:before="0" w:line="216" w:lineRule="auto"/>
       </w:pPr>
       <w:r>
         <w:rPr>
@@ -243,7 +243,7 @@
           <w:ilvl w:val="0"/>
           <w:numId w:val="2"/>
         </w:numPr>
-        <w:spacing w:after="0" w:before="0" w:line="208" w:lineRule="auto"/>
+        <w:spacing w:after="0" w:before="0" w:line="216" w:lineRule="auto"/>
       </w:pPr>
       <w:r>
         <w:rPr>
@@ -259,7 +259,7 @@
         <w:tabs>
           <w:tab w:val="right" w:pos="11228"/>
         </w:tabs>
-        <w:spacing w:after="0" w:before="24" w:line="208" w:lineRule="auto"/>
+        <w:spacing w:after="0" w:before="24" w:line="216" w:lineRule="auto"/>
       </w:pPr>
       <w:r>
         <w:rPr>
@@ -290,7 +290,7 @@
     </w:p>
     <w:p>
       <w:pPr>
-        <w:spacing w:after="0" w:before="0" w:line="208" w:lineRule="auto"/>
+        <w:spacing w:after="0" w:before="0" w:line="216" w:lineRule="auto"/>
       </w:pPr>
       <w:r>
         <w:rPr>
@@ -310,7 +310,7 @@
           <w:ilvl w:val="0"/>
           <w:numId w:val="2"/>
         </w:numPr>
-        <w:spacing w:after="0" w:before="0" w:line="208" w:lineRule="auto"/>
+        <w:spacing w:after="0" w:before="0" w:line="216" w:lineRule="auto"/>
       </w:pPr>
       <w:r>
         <w:rPr>
@@ -328,7 +328,7 @@
           <w:ilvl w:val="0"/>
           <w:numId w:val="2"/>
         </w:numPr>
-        <w:spacing w:after="0" w:before="0" w:line="208" w:lineRule="auto"/>
+        <w:spacing w:after="0" w:before="0" w:line="216" w:lineRule="auto"/>
       </w:pPr>
       <w:r>
         <w:rPr>
@@ -346,7 +346,7 @@
           <w:ilvl w:val="0"/>
           <w:numId w:val="2"/>
         </w:numPr>
-        <w:spacing w:after="0" w:before="0" w:line="208" w:lineRule="auto"/>
+        <w:spacing w:after="0" w:before="0" w:line="216" w:lineRule="auto"/>
       </w:pPr>
       <w:r>
         <w:rPr>
@@ -364,7 +364,7 @@
           <w:ilvl w:val="0"/>
           <w:numId w:val="2"/>
         </w:numPr>
-        <w:spacing w:after="0" w:before="0" w:line="208" w:lineRule="auto"/>
+        <w:spacing w:after="0" w:before="0" w:line="216" w:lineRule="auto"/>
       </w:pPr>
       <w:r>
         <w:rPr>
@@ -380,7 +380,7 @@
         <w:tabs>
           <w:tab w:val="right" w:pos="11228"/>
         </w:tabs>
-        <w:spacing w:after="0" w:before="24" w:line="208" w:lineRule="auto"/>
+        <w:spacing w:after="0" w:before="24" w:line="216" w:lineRule="auto"/>
       </w:pPr>
       <w:r>
         <w:rPr>
@@ -411,7 +411,7 @@
     </w:p>
     <w:p>
       <w:pPr>
-        <w:spacing w:after="0" w:before="0" w:line="208" w:lineRule="auto"/>
+        <w:spacing w:after="0" w:before="0" w:line="216" w:lineRule="auto"/>
       </w:pPr>
       <w:r>
         <w:rPr>
@@ -431,7 +431,7 @@
           <w:ilvl w:val="0"/>
           <w:numId w:val="2"/>
         </w:numPr>
-        <w:spacing w:after="0" w:before="0" w:line="208" w:lineRule="auto"/>
+        <w:spacing w:after="0" w:before="0" w:line="216" w:lineRule="auto"/>
       </w:pPr>
       <w:r>
         <w:rPr>
@@ -449,7 +449,7 @@
           <w:ilvl w:val="0"/>
           <w:numId w:val="2"/>
         </w:numPr>
-        <w:spacing w:after="0" w:before="0" w:line="208" w:lineRule="auto"/>
+        <w:spacing w:after="0" w:before="0" w:line="216" w:lineRule="auto"/>
       </w:pPr>
       <w:r>
         <w:rPr>
@@ -467,7 +467,7 @@
           <w:ilvl w:val="0"/>
           <w:numId w:val="2"/>
         </w:numPr>
-        <w:spacing w:after="0" w:before="0" w:line="208" w:lineRule="auto"/>
+        <w:spacing w:after="0" w:before="0" w:line="216" w:lineRule="auto"/>
       </w:pPr>
       <w:r>
         <w:rPr>
@@ -485,7 +485,7 @@
           <w:ilvl w:val="0"/>
           <w:numId w:val="2"/>
         </w:numPr>
-        <w:spacing w:after="0" w:before="0" w:line="208" w:lineRule="auto"/>
+        <w:spacing w:after="0" w:before="0" w:line="216" w:lineRule="auto"/>
       </w:pPr>
       <w:r>
         <w:rPr>
@@ -501,7 +501,7 @@
         <w:tabs>
           <w:tab w:val="right" w:pos="11228"/>
         </w:tabs>
-        <w:spacing w:after="0" w:before="24" w:line="208" w:lineRule="auto"/>
+        <w:spacing w:after="0" w:before="24" w:line="216" w:lineRule="auto"/>
       </w:pPr>
       <w:r>
         <w:rPr>
@@ -532,7 +532,7 @@
     </w:p>
     <w:p>
       <w:pPr>
-        <w:spacing w:after="0" w:before="0" w:line="208" w:lineRule="auto"/>
+        <w:spacing w:after="0" w:before="0" w:line="216" w:lineRule="auto"/>
       </w:pPr>
       <w:r>
         <w:rPr>
@@ -552,7 +552,7 @@
           <w:ilvl w:val="0"/>
           <w:numId w:val="2"/>
         </w:numPr>
-        <w:spacing w:after="0" w:before="0" w:line="208" w:lineRule="auto"/>
+        <w:spacing w:after="0" w:before="0" w:line="216" w:lineRule="auto"/>
       </w:pPr>
       <w:r>
         <w:rPr>
@@ -570,7 +570,25 @@
           <w:ilvl w:val="0"/>
           <w:numId w:val="2"/>
         </w:numPr>
-        <w:spacing w:after="0" w:before="0" w:line="208" w:lineRule="auto"/>
+        <w:spacing w:after="0" w:before="0" w:line="216" w:lineRule="auto"/>
+      </w:pPr>
+      <w:r>
+        <w:rPr>
+          <w:rFonts w:ascii="EB Garamond" w:cs="EB Garamond" w:eastAsia="EB Garamond" w:hAnsi="EB Garamond"/>
+          <w:sz w:val="20"/>
+          <w:szCs w:val="20"/>
+        </w:rPr>
+        <w:t xml:space="preserve">Performed financial due diligence on prospective investments, including cap table analysis, deal term verification, and founder projections</w:t>
+      </w:r>
+    </w:p>
+    <w:p>
+      <w:pPr>
+        <w:pStyle w:val="ListParagraph"/>
+        <w:numPr>
+          <w:ilvl w:val="0"/>
+          <w:numId w:val="2"/>
+        </w:numPr>
+        <w:spacing w:after="0" w:before="0" w:line="216" w:lineRule="auto"/>
       </w:pPr>
       <w:r>
         <w:rPr>
@@ -588,7 +606,7 @@
           <w:ilvl w:val="0"/>
           <w:numId w:val="2"/>
         </w:numPr>
-        <w:spacing w:after="0" w:before="0" w:line="208" w:lineRule="auto"/>
+        <w:spacing w:after="0" w:before="0" w:line="216" w:lineRule="auto"/>
       </w:pPr>
       <w:r>
         <w:rPr>
@@ -597,86 +615,6 @@
           <w:szCs w:val="20"/>
         </w:rPr>
         <w:t xml:space="preserve">Built standardized portfolio review decks and automated monthly KPI tracking in Python, replacing recurring manual data pulls for the team</w:t>
-      </w:r>
-    </w:p>
-    <w:p>
-      <w:pPr>
-        <w:spacing w:after="0" w:before="0" w:line="208" w:lineRule="auto"/>
-      </w:pPr>
-      <w:r>
-        <w:rPr>
-          <w:rFonts w:ascii="EB Garamond" w:cs="EB Garamond" w:eastAsia="EB Garamond" w:hAnsi="EB Garamond"/>
-          <w:i/>
-          <w:iCs/>
-          <w:sz w:val="20"/>
-          <w:szCs w:val="20"/>
-        </w:rPr>
-        <w:t xml:space="preserve">Selected Transaction Experience:</w:t>
-      </w:r>
-    </w:p>
-    <w:p>
-      <w:pPr>
-        <w:pStyle w:val="ListParagraph"/>
-        <w:numPr>
-          <w:ilvl w:val="0"/>
-          <w:numId w:val="2"/>
-        </w:numPr>
-        <w:spacing w:after="0" w:before="0" w:line="208" w:lineRule="auto"/>
-      </w:pPr>
-      <w:r>
-        <w:rPr>
-          <w:rFonts w:ascii="EB Garamond" w:cs="EB Garamond" w:eastAsia="EB Garamond" w:hAnsi="EB Garamond"/>
-          <w:i/>
-          <w:iCs/>
-          <w:sz w:val="20"/>
-          <w:szCs w:val="20"/>
-          <w:u w:val="single"/>
-        </w:rPr>
-        <w:t xml:space="preserve">Series A Investment in Mojro Technologies for $5.5 million:</w:t>
-      </w:r>
-      <w:r>
-        <w:rPr>
-          <w:rFonts w:ascii="EB Garamond" w:cs="EB Garamond" w:eastAsia="EB Garamond" w:hAnsi="EB Garamond"/>
-          <w:sz w:val="20"/>
-          <w:szCs w:val="20"/>
-        </w:rPr>
-        <w:t xml:space="preserve"> DVC led $2.5M extension into AI-driven logistics platform (Closed April 2026)</w:t>
-      </w:r>
-    </w:p>
-    <w:p>
-      <w:pPr>
-        <w:pStyle w:val="ListParagraph"/>
-        <w:numPr>
-          <w:ilvl w:val="1"/>
-          <w:numId w:val="2"/>
-        </w:numPr>
-        <w:spacing w:after="0" w:before="0" w:line="208" w:lineRule="auto"/>
-      </w:pPr>
-      <w:r>
-        <w:rPr>
-          <w:rFonts w:ascii="EB Garamond" w:cs="EB Garamond" w:eastAsia="EB Garamond" w:hAnsi="EB Garamond"/>
-          <w:sz w:val="20"/>
-          <w:szCs w:val="20"/>
-        </w:rPr>
-        <w:t xml:space="preserve">Modeled pro forma cap table and dilution for the $2.5M extension, reconciling DVC's ownership alongside IAN Alpha Fund and 1Crowd</w:t>
-      </w:r>
-    </w:p>
-    <w:p>
-      <w:pPr>
-        <w:pStyle w:val="ListParagraph"/>
-        <w:numPr>
-          <w:ilvl w:val="1"/>
-          <w:numId w:val="2"/>
-        </w:numPr>
-        <w:spacing w:after="0" w:before="0" w:line="208" w:lineRule="auto"/>
-      </w:pPr>
-      <w:r>
-        <w:rPr>
-          <w:rFonts w:ascii="EB Garamond" w:cs="EB Garamond" w:eastAsia="EB Garamond" w:hAnsi="EB Garamond"/>
-          <w:sz w:val="20"/>
-          <w:szCs w:val="20"/>
-        </w:rPr>
-        <w:t xml:space="preserve">Set up post-close ARR, NRR, and customer pilot tracking with Mojro's finance team, feeding DVC's quarterly portfolio updates to LPs</w:t>
       </w:r>
     </w:p>
     <w:p>
@@ -684,7 +622,7 @@
         <w:tabs>
           <w:tab w:val="right" w:pos="11228"/>
         </w:tabs>
-        <w:spacing w:after="0" w:before="24" w:line="208" w:lineRule="auto"/>
+        <w:spacing w:after="0" w:before="24" w:line="216" w:lineRule="auto"/>
       </w:pPr>
       <w:r>
         <w:rPr>
@@ -715,7 +653,7 @@
     </w:p>
     <w:p>
       <w:pPr>
-        <w:spacing w:after="0" w:before="0" w:line="208" w:lineRule="auto"/>
+        <w:spacing w:after="0" w:before="0" w:line="216" w:lineRule="auto"/>
       </w:pPr>
       <w:r>
         <w:rPr>
@@ -735,7 +673,7 @@
           <w:ilvl w:val="0"/>
           <w:numId w:val="2"/>
         </w:numPr>
-        <w:spacing w:after="0" w:before="0" w:line="208" w:lineRule="auto"/>
+        <w:spacing w:after="0" w:before="0" w:line="216" w:lineRule="auto"/>
       </w:pPr>
       <w:r>
         <w:rPr>
@@ -753,7 +691,7 @@
           <w:ilvl w:val="0"/>
           <w:numId w:val="2"/>
         </w:numPr>
-        <w:spacing w:after="0" w:before="0" w:line="208" w:lineRule="auto"/>
+        <w:spacing w:after="0" w:before="0" w:line="216" w:lineRule="auto"/>
       </w:pPr>
       <w:r>
         <w:rPr>
@@ -771,7 +709,7 @@
           <w:ilvl w:val="0"/>
           <w:numId w:val="2"/>
         </w:numPr>
-        <w:spacing w:after="0" w:before="0" w:line="208" w:lineRule="auto"/>
+        <w:spacing w:after="0" w:before="0" w:line="216" w:lineRule="auto"/>
       </w:pPr>
       <w:r>
         <w:rPr>
@@ -787,7 +725,7 @@
         <w:pBdr>
           <w:bottom w:val="single" w:color="000000" w:sz="6" w:space="1"/>
         </w:pBdr>
-        <w:spacing w:after="40" w:before="80" w:line="208" w:lineRule="auto"/>
+        <w:spacing w:after="40" w:before="80" w:line="216" w:lineRule="auto"/>
       </w:pPr>
       <w:r>
         <w:rPr>
@@ -883,7 +821,7 @@
         <w:tabs>
           <w:tab w:val="right" w:pos="11228"/>
         </w:tabs>
-        <w:spacing w:after="0" w:before="40" w:line="208" w:lineRule="auto"/>
+        <w:spacing w:after="0" w:before="40" w:line="216" w:lineRule="auto"/>
       </w:pPr>
       <w:r>
         <w:rPr>
@@ -906,7 +844,7 @@
     </w:p>
     <w:p>
       <w:pPr>
-        <w:spacing w:after="0" w:before="0" w:line="208" w:lineRule="auto"/>
+        <w:spacing w:after="0" w:before="0" w:line="216" w:lineRule="auto"/>
       </w:pPr>
       <w:r>
         <w:rPr>
@@ -926,7 +864,7 @@
           <w:ilvl w:val="0"/>
           <w:numId w:val="2"/>
         </w:numPr>
-        <w:spacing w:after="0" w:before="0" w:line="208" w:lineRule="auto"/>
+        <w:spacing w:after="0" w:before="0" w:line="216" w:lineRule="auto"/>
       </w:pPr>
       <w:r>
         <w:rPr>
@@ -944,7 +882,7 @@
           <w:ilvl w:val="0"/>
           <w:numId w:val="2"/>
         </w:numPr>
-        <w:spacing w:after="0" w:before="0" w:line="208" w:lineRule="auto"/>
+        <w:spacing w:after="0" w:before="0" w:line="216" w:lineRule="auto"/>
       </w:pPr>
       <w:r>
         <w:rPr>
@@ -962,7 +900,7 @@
           <w:ilvl w:val="0"/>
           <w:numId w:val="2"/>
         </w:numPr>
-        <w:spacing w:after="0" w:before="0" w:line="208" w:lineRule="auto"/>
+        <w:spacing w:after="0" w:before="0" w:line="216" w:lineRule="auto"/>
       </w:pPr>
       <w:r>
         <w:rPr>
@@ -978,7 +916,7 @@
         <w:tabs>
           <w:tab w:val="right" w:pos="11228"/>
         </w:tabs>
-        <w:spacing w:after="0" w:before="24" w:line="208" w:lineRule="auto"/>
+        <w:spacing w:after="0" w:before="24" w:line="216" w:lineRule="auto"/>
       </w:pPr>
       <w:r>
         <w:rPr>
@@ -1009,7 +947,7 @@
     </w:p>
     <w:p>
       <w:pPr>
-        <w:spacing w:after="0" w:before="0" w:line="208" w:lineRule="auto"/>
+        <w:spacing w:after="0" w:before="0" w:line="216" w:lineRule="auto"/>
       </w:pPr>
       <w:r>
         <w:rPr>
@@ -1029,7 +967,7 @@
           <w:ilvl w:val="0"/>
           <w:numId w:val="2"/>
         </w:numPr>
-        <w:spacing w:after="0" w:before="0" w:line="208" w:lineRule="auto"/>
+        <w:spacing w:after="0" w:before="0" w:line="216" w:lineRule="auto"/>
       </w:pPr>
       <w:r>
         <w:rPr>
@@ -1047,7 +985,7 @@
           <w:ilvl w:val="0"/>
           <w:numId w:val="2"/>
         </w:numPr>
-        <w:spacing w:after="0" w:before="0" w:line="208" w:lineRule="auto"/>
+        <w:spacing w:after="0" w:before="0" w:line="216" w:lineRule="auto"/>
       </w:pPr>
       <w:r>
         <w:rPr>
@@ -1065,7 +1003,7 @@
           <w:ilvl w:val="0"/>
           <w:numId w:val="2"/>
         </w:numPr>
-        <w:spacing w:after="0" w:before="0" w:line="208" w:lineRule="auto"/>
+        <w:spacing w:after="0" w:before="0" w:line="216" w:lineRule="auto"/>
       </w:pPr>
       <w:r>
         <w:rPr>
@@ -1081,7 +1019,7 @@
         <w:tabs>
           <w:tab w:val="right" w:pos="11228"/>
         </w:tabs>
-        <w:spacing w:after="0" w:before="24" w:line="208" w:lineRule="auto"/>
+        <w:spacing w:after="0" w:before="24" w:line="216" w:lineRule="auto"/>
       </w:pPr>
       <w:r>
         <w:rPr>
@@ -1112,7 +1050,7 @@
     </w:p>
     <w:p>
       <w:pPr>
-        <w:spacing w:after="0" w:before="0" w:line="208" w:lineRule="auto"/>
+        <w:spacing w:after="0" w:before="0" w:line="216" w:lineRule="auto"/>
       </w:pPr>
       <w:r>
         <w:rPr>
@@ -1132,7 +1070,7 @@
           <w:ilvl w:val="0"/>
           <w:numId w:val="2"/>
         </w:numPr>
-        <w:spacing w:after="0" w:before="0" w:line="208" w:lineRule="auto"/>
+        <w:spacing w:after="0" w:before="0" w:line="216" w:lineRule="auto"/>
       </w:pPr>
       <w:r>
         <w:rPr>
@@ -1150,7 +1088,7 @@
           <w:ilvl w:val="0"/>
           <w:numId w:val="2"/>
         </w:numPr>
-        <w:spacing w:after="0" w:before="0" w:line="208" w:lineRule="auto"/>
+        <w:spacing w:after="0" w:before="0" w:line="216" w:lineRule="auto"/>
       </w:pPr>
       <w:r>
         <w:rPr>
@@ -1168,7 +1106,7 @@
           <w:ilvl w:val="0"/>
           <w:numId w:val="2"/>
         </w:numPr>
-        <w:spacing w:after="0" w:before="0" w:line="208" w:lineRule="auto"/>
+        <w:spacing w:after="0" w:before="0" w:line="216" w:lineRule="auto"/>
       </w:pPr>
       <w:r>
         <w:rPr>
@@ -1184,7 +1122,7 @@
         <w:tabs>
           <w:tab w:val="right" w:pos="11228"/>
         </w:tabs>
-        <w:spacing w:after="0" w:before="24" w:line="208" w:lineRule="auto"/>
+        <w:spacing w:after="0" w:before="24" w:line="216" w:lineRule="auto"/>
       </w:pPr>
       <w:r>
         <w:rPr>
@@ -1215,7 +1153,7 @@
     </w:p>
     <w:p>
       <w:pPr>
-        <w:spacing w:after="0" w:before="0" w:line="208" w:lineRule="auto"/>
+        <w:spacing w:after="0" w:before="0" w:line="216" w:lineRule="auto"/>
       </w:pPr>
       <w:r>
         <w:rPr>
@@ -1235,7 +1173,7 @@
           <w:ilvl w:val="0"/>
           <w:numId w:val="2"/>
         </w:numPr>
-        <w:spacing w:after="0" w:before="0" w:line="208" w:lineRule="auto"/>
+        <w:spacing w:after="0" w:before="0" w:line="216" w:lineRule="auto"/>
       </w:pPr>
       <w:r>
         <w:rPr>
@@ -1253,7 +1191,7 @@
           <w:ilvl w:val="0"/>
           <w:numId w:val="2"/>
         </w:numPr>
-        <w:spacing w:after="0" w:before="0" w:line="208" w:lineRule="auto"/>
+        <w:spacing w:after="0" w:before="0" w:line="216" w:lineRule="auto"/>
       </w:pPr>
       <w:r>
         <w:rPr>
@@ -1271,7 +1209,7 @@
           <w:ilvl w:val="0"/>
           <w:numId w:val="2"/>
         </w:numPr>
-        <w:spacing w:after="0" w:before="0" w:line="208" w:lineRule="auto"/>
+        <w:spacing w:after="0" w:before="0" w:line="216" w:lineRule="auto"/>
       </w:pPr>
       <w:r>
         <w:rPr>
@@ -1287,7 +1225,7 @@
         <w:pBdr>
           <w:bottom w:val="single" w:color="000000" w:sz="6" w:space="1"/>
         </w:pBdr>
-        <w:spacing w:after="40" w:before="80" w:line="208" w:lineRule="auto"/>
+        <w:spacing w:after="40" w:before="80" w:line="216" w:lineRule="auto"/>
       </w:pPr>
       <w:r>
         <w:rPr>
@@ -1372,7 +1310,7 @@
     </w:p>
     <w:p>
       <w:pPr>
-        <w:spacing w:after="0" w:before="30" w:line="208" w:lineRule="auto"/>
+        <w:spacing w:after="0" w:before="30" w:line="216" w:lineRule="auto"/>
       </w:pPr>
       <w:r>
         <w:rPr>
@@ -1395,7 +1333,7 @@
     </w:p>
     <w:p>
       <w:pPr>
-        <w:spacing w:after="0" w:before="0" w:line="208" w:lineRule="auto"/>
+        <w:spacing w:after="0" w:before="0" w:line="216" w:lineRule="auto"/>
       </w:pPr>
       <w:r>
         <w:rPr>
@@ -1418,7 +1356,7 @@
     </w:p>
     <w:p>
       <w:pPr>
-        <w:spacing w:after="0" w:before="0" w:line="208" w:lineRule="auto"/>
+        <w:spacing w:after="0" w:before="0" w:line="216" w:lineRule="auto"/>
       </w:pPr>
       <w:r>
         <w:rPr>

</xml_diff>

<commit_message>
Resume: add SEO Career and Recalc, trim MLT and Hear My Cry
Co-Authored-By: Claude Opus 5.5 <noreply@anthropic.com>
Claude-Session: https://claude.ai/code/session_01G3JV145HgjUfXQyW7hEcYE
</commit_message>
<xml_diff>
--- a/assets/Jennifer-Amogu-Resume.docx
+++ b/assets/Jennifer-Amogu-Resume.docx
@@ -20,7 +20,7 @@
     </w:p>
     <w:p>
       <w:pPr>
-        <w:spacing w:after="0" w:before="0" w:line="216" w:lineRule="auto"/>
+        <w:spacing w:after="0" w:before="0" w:line="198" w:lineRule="auto"/>
         <w:jc w:val="center"/>
       </w:pPr>
       <w:r>
@@ -37,7 +37,7 @@
         <w:pBdr>
           <w:bottom w:val="single" w:color="000000" w:sz="6" w:space="1"/>
         </w:pBdr>
-        <w:spacing w:after="40" w:before="60" w:line="216" w:lineRule="auto"/>
+        <w:spacing w:after="40" w:before="60" w:line="198" w:lineRule="auto"/>
       </w:pPr>
       <w:r>
         <w:rPr>
@@ -61,7 +61,7 @@
         <w:tabs>
           <w:tab w:val="right" w:pos="11228"/>
         </w:tabs>
-        <w:spacing w:after="0" w:before="40" w:line="216" w:lineRule="auto"/>
+        <w:spacing w:after="0" w:before="40" w:line="198" w:lineRule="auto"/>
       </w:pPr>
       <w:r>
         <w:rPr>
@@ -95,7 +95,7 @@
         <w:tabs>
           <w:tab w:val="right" w:pos="11228"/>
         </w:tabs>
-        <w:spacing w:after="0" w:before="0" w:line="216" w:lineRule="auto"/>
+        <w:spacing w:after="0" w:before="0" w:line="198" w:lineRule="auto"/>
       </w:pPr>
       <w:r>
         <w:rPr>
@@ -118,7 +118,7 @@
     </w:p>
     <w:p>
       <w:pPr>
-        <w:spacing w:after="0" w:before="0" w:line="216" w:lineRule="auto"/>
+        <w:spacing w:after="0" w:before="0" w:line="198" w:lineRule="auto"/>
       </w:pPr>
       <w:r>
         <w:rPr>
@@ -144,7 +144,7 @@
         <w:pBdr>
           <w:bottom w:val="single" w:color="000000" w:sz="6" w:space="1"/>
         </w:pBdr>
-        <w:spacing w:after="40" w:before="80" w:line="216" w:lineRule="auto"/>
+        <w:spacing w:after="40" w:before="80" w:line="198" w:lineRule="auto"/>
       </w:pPr>
       <w:r>
         <w:rPr>
@@ -192,7 +192,7 @@
         <w:tabs>
           <w:tab w:val="right" w:pos="11228"/>
         </w:tabs>
-        <w:spacing w:after="0" w:before="40" w:line="216" w:lineRule="auto"/>
+        <w:spacing w:after="0" w:before="40" w:line="198" w:lineRule="auto"/>
       </w:pPr>
       <w:r>
         <w:rPr>
@@ -223,7 +223,7 @@
     </w:p>
     <w:p>
       <w:pPr>
-        <w:spacing w:after="0" w:before="0" w:line="216" w:lineRule="auto"/>
+        <w:spacing w:after="0" w:before="0" w:line="198" w:lineRule="auto"/>
       </w:pPr>
       <w:r>
         <w:rPr>
@@ -243,7 +243,7 @@
           <w:ilvl w:val="0"/>
           <w:numId w:val="2"/>
         </w:numPr>
-        <w:spacing w:after="0" w:before="0" w:line="216" w:lineRule="auto"/>
+        <w:spacing w:after="0" w:before="0" w:line="198" w:lineRule="auto"/>
       </w:pPr>
       <w:r>
         <w:rPr>
@@ -259,7 +259,7 @@
         <w:tabs>
           <w:tab w:val="right" w:pos="11228"/>
         </w:tabs>
-        <w:spacing w:after="0" w:before="24" w:line="216" w:lineRule="auto"/>
+        <w:spacing w:after="0" w:before="24" w:line="198" w:lineRule="auto"/>
       </w:pPr>
       <w:r>
         <w:rPr>
@@ -290,7 +290,7 @@
     </w:p>
     <w:p>
       <w:pPr>
-        <w:spacing w:after="0" w:before="0" w:line="216" w:lineRule="auto"/>
+        <w:spacing w:after="0" w:before="0" w:line="198" w:lineRule="auto"/>
       </w:pPr>
       <w:r>
         <w:rPr>
@@ -310,7 +310,7 @@
           <w:ilvl w:val="0"/>
           <w:numId w:val="2"/>
         </w:numPr>
-        <w:spacing w:after="0" w:before="0" w:line="216" w:lineRule="auto"/>
+        <w:spacing w:after="0" w:before="0" w:line="198" w:lineRule="auto"/>
       </w:pPr>
       <w:r>
         <w:rPr>
@@ -328,7 +328,7 @@
           <w:ilvl w:val="0"/>
           <w:numId w:val="2"/>
         </w:numPr>
-        <w:spacing w:after="0" w:before="0" w:line="216" w:lineRule="auto"/>
+        <w:spacing w:after="0" w:before="0" w:line="198" w:lineRule="auto"/>
       </w:pPr>
       <w:r>
         <w:rPr>
@@ -346,7 +346,7 @@
           <w:ilvl w:val="0"/>
           <w:numId w:val="2"/>
         </w:numPr>
-        <w:spacing w:after="0" w:before="0" w:line="216" w:lineRule="auto"/>
+        <w:spacing w:after="0" w:before="0" w:line="198" w:lineRule="auto"/>
       </w:pPr>
       <w:r>
         <w:rPr>
@@ -364,7 +364,7 @@
           <w:ilvl w:val="0"/>
           <w:numId w:val="2"/>
         </w:numPr>
-        <w:spacing w:after="0" w:before="0" w:line="216" w:lineRule="auto"/>
+        <w:spacing w:after="0" w:before="0" w:line="198" w:lineRule="auto"/>
       </w:pPr>
       <w:r>
         <w:rPr>
@@ -380,7 +380,7 @@
         <w:tabs>
           <w:tab w:val="right" w:pos="11228"/>
         </w:tabs>
-        <w:spacing w:after="0" w:before="24" w:line="216" w:lineRule="auto"/>
+        <w:spacing w:after="0" w:before="24" w:line="198" w:lineRule="auto"/>
       </w:pPr>
       <w:r>
         <w:rPr>
@@ -411,7 +411,7 @@
     </w:p>
     <w:p>
       <w:pPr>
-        <w:spacing w:after="0" w:before="0" w:line="216" w:lineRule="auto"/>
+        <w:spacing w:after="0" w:before="0" w:line="198" w:lineRule="auto"/>
       </w:pPr>
       <w:r>
         <w:rPr>
@@ -431,7 +431,7 @@
           <w:ilvl w:val="0"/>
           <w:numId w:val="2"/>
         </w:numPr>
-        <w:spacing w:after="0" w:before="0" w:line="216" w:lineRule="auto"/>
+        <w:spacing w:after="0" w:before="0" w:line="198" w:lineRule="auto"/>
       </w:pPr>
       <w:r>
         <w:rPr>
@@ -449,7 +449,7 @@
           <w:ilvl w:val="0"/>
           <w:numId w:val="2"/>
         </w:numPr>
-        <w:spacing w:after="0" w:before="0" w:line="216" w:lineRule="auto"/>
+        <w:spacing w:after="0" w:before="0" w:line="198" w:lineRule="auto"/>
       </w:pPr>
       <w:r>
         <w:rPr>
@@ -467,7 +467,7 @@
           <w:ilvl w:val="0"/>
           <w:numId w:val="2"/>
         </w:numPr>
-        <w:spacing w:after="0" w:before="0" w:line="216" w:lineRule="auto"/>
+        <w:spacing w:after="0" w:before="0" w:line="198" w:lineRule="auto"/>
       </w:pPr>
       <w:r>
         <w:rPr>
@@ -485,7 +485,7 @@
           <w:ilvl w:val="0"/>
           <w:numId w:val="2"/>
         </w:numPr>
-        <w:spacing w:after="0" w:before="0" w:line="216" w:lineRule="auto"/>
+        <w:spacing w:after="0" w:before="0" w:line="198" w:lineRule="auto"/>
       </w:pPr>
       <w:r>
         <w:rPr>
@@ -501,7 +501,7 @@
         <w:tabs>
           <w:tab w:val="right" w:pos="11228"/>
         </w:tabs>
-        <w:spacing w:after="0" w:before="24" w:line="216" w:lineRule="auto"/>
+        <w:spacing w:after="0" w:before="24" w:line="198" w:lineRule="auto"/>
       </w:pPr>
       <w:r>
         <w:rPr>
@@ -532,7 +532,7 @@
     </w:p>
     <w:p>
       <w:pPr>
-        <w:spacing w:after="0" w:before="0" w:line="216" w:lineRule="auto"/>
+        <w:spacing w:after="0" w:before="0" w:line="198" w:lineRule="auto"/>
       </w:pPr>
       <w:r>
         <w:rPr>
@@ -552,7 +552,7 @@
           <w:ilvl w:val="0"/>
           <w:numId w:val="2"/>
         </w:numPr>
-        <w:spacing w:after="0" w:before="0" w:line="216" w:lineRule="auto"/>
+        <w:spacing w:after="0" w:before="0" w:line="198" w:lineRule="auto"/>
       </w:pPr>
       <w:r>
         <w:rPr>
@@ -570,7 +570,7 @@
           <w:ilvl w:val="0"/>
           <w:numId w:val="2"/>
         </w:numPr>
-        <w:spacing w:after="0" w:before="0" w:line="216" w:lineRule="auto"/>
+        <w:spacing w:after="0" w:before="0" w:line="198" w:lineRule="auto"/>
       </w:pPr>
       <w:r>
         <w:rPr>
@@ -588,7 +588,7 @@
           <w:ilvl w:val="0"/>
           <w:numId w:val="2"/>
         </w:numPr>
-        <w:spacing w:after="0" w:before="0" w:line="216" w:lineRule="auto"/>
+        <w:spacing w:after="0" w:before="0" w:line="198" w:lineRule="auto"/>
       </w:pPr>
       <w:r>
         <w:rPr>
@@ -606,7 +606,7 @@
           <w:ilvl w:val="0"/>
           <w:numId w:val="2"/>
         </w:numPr>
-        <w:spacing w:after="0" w:before="0" w:line="216" w:lineRule="auto"/>
+        <w:spacing w:after="0" w:before="0" w:line="198" w:lineRule="auto"/>
       </w:pPr>
       <w:r>
         <w:rPr>
@@ -622,7 +622,7 @@
         <w:tabs>
           <w:tab w:val="right" w:pos="11228"/>
         </w:tabs>
-        <w:spacing w:after="0" w:before="24" w:line="216" w:lineRule="auto"/>
+        <w:spacing w:after="0" w:before="24" w:line="198" w:lineRule="auto"/>
       </w:pPr>
       <w:r>
         <w:rPr>
@@ -653,7 +653,7 @@
     </w:p>
     <w:p>
       <w:pPr>
-        <w:spacing w:after="0" w:before="0" w:line="216" w:lineRule="auto"/>
+        <w:spacing w:after="0" w:before="0" w:line="198" w:lineRule="auto"/>
       </w:pPr>
       <w:r>
         <w:rPr>
@@ -673,7 +673,7 @@
           <w:ilvl w:val="0"/>
           <w:numId w:val="2"/>
         </w:numPr>
-        <w:spacing w:after="0" w:before="0" w:line="216" w:lineRule="auto"/>
+        <w:spacing w:after="0" w:before="0" w:line="198" w:lineRule="auto"/>
       </w:pPr>
       <w:r>
         <w:rPr>
@@ -691,7 +691,7 @@
           <w:ilvl w:val="0"/>
           <w:numId w:val="2"/>
         </w:numPr>
-        <w:spacing w:after="0" w:before="0" w:line="216" w:lineRule="auto"/>
+        <w:spacing w:after="0" w:before="0" w:line="198" w:lineRule="auto"/>
       </w:pPr>
       <w:r>
         <w:rPr>
@@ -709,7 +709,7 @@
           <w:ilvl w:val="0"/>
           <w:numId w:val="2"/>
         </w:numPr>
-        <w:spacing w:after="0" w:before="0" w:line="216" w:lineRule="auto"/>
+        <w:spacing w:after="0" w:before="0" w:line="198" w:lineRule="auto"/>
       </w:pPr>
       <w:r>
         <w:rPr>
@@ -725,7 +725,7 @@
         <w:pBdr>
           <w:bottom w:val="single" w:color="000000" w:sz="6" w:space="1"/>
         </w:pBdr>
-        <w:spacing w:after="40" w:before="80" w:line="216" w:lineRule="auto"/>
+        <w:spacing w:after="40" w:before="80" w:line="198" w:lineRule="auto"/>
       </w:pPr>
       <w:r>
         <w:rPr>
@@ -821,7 +821,7 @@
         <w:tabs>
           <w:tab w:val="right" w:pos="11228"/>
         </w:tabs>
-        <w:spacing w:after="0" w:before="40" w:line="216" w:lineRule="auto"/>
+        <w:spacing w:after="0" w:before="40" w:line="198" w:lineRule="auto"/>
       </w:pPr>
       <w:r>
         <w:rPr>
@@ -831,20 +831,20 @@
           <w:sz w:val="20"/>
           <w:szCs w:val="20"/>
         </w:rPr>
-        <w:t xml:space="preserve">Management Leadership for Tomorrow (MLT)</w:t>
-      </w:r>
-      <w:r>
-        <w:rPr>
-          <w:rFonts w:ascii="EB Garamond" w:cs="EB Garamond" w:eastAsia="EB Garamond" w:hAnsi="EB Garamond"/>
-          <w:sz w:val="20"/>
-          <w:szCs w:val="20"/>
-        </w:rPr>
-        <w:t xml:space="preserve">	Sep 2026 - Present</w:t>
-      </w:r>
-    </w:p>
-    <w:p>
-      <w:pPr>
-        <w:spacing w:after="0" w:before="0" w:line="216" w:lineRule="auto"/>
+        <w:t xml:space="preserve">SEO Career</w:t>
+      </w:r>
+      <w:r>
+        <w:rPr>
+          <w:rFonts w:ascii="EB Garamond" w:cs="EB Garamond" w:eastAsia="EB Garamond" w:hAnsi="EB Garamond"/>
+          <w:sz w:val="20"/>
+          <w:szCs w:val="20"/>
+        </w:rPr>
+        <w:t xml:space="preserve">	Oct 2026 - Present</w:t>
+      </w:r>
+    </w:p>
+    <w:p>
+      <w:pPr>
+        <w:spacing w:after="0" w:before="0" w:line="198" w:lineRule="auto"/>
       </w:pPr>
       <w:r>
         <w:rPr>
@@ -854,61 +854,43 @@
           <w:sz w:val="20"/>
           <w:szCs w:val="20"/>
         </w:rPr>
-        <w:t xml:space="preserve">Career Prep Fellow</w:t>
-      </w:r>
-    </w:p>
-    <w:p>
-      <w:pPr>
-        <w:pStyle w:val="ListParagraph"/>
-        <w:numPr>
-          <w:ilvl w:val="0"/>
-          <w:numId w:val="2"/>
-        </w:numPr>
-        <w:spacing w:after="0" w:before="0" w:line="216" w:lineRule="auto"/>
-      </w:pPr>
-      <w:r>
-        <w:rPr>
-          <w:rFonts w:ascii="EB Garamond" w:cs="EB Garamond" w:eastAsia="EB Garamond" w:hAnsi="EB Garamond"/>
-          <w:sz w:val="20"/>
-          <w:szCs w:val="20"/>
-        </w:rPr>
-        <w:t xml:space="preserve">Selected for highly competitive 18+-month fellowship accelerating emerging leaders' careers through coaching, mentorship, and skill-building</w:t>
-      </w:r>
-    </w:p>
-    <w:p>
-      <w:pPr>
-        <w:pStyle w:val="ListParagraph"/>
-        <w:numPr>
-          <w:ilvl w:val="0"/>
-          <w:numId w:val="2"/>
-        </w:numPr>
-        <w:spacing w:after="0" w:before="0" w:line="216" w:lineRule="auto"/>
-      </w:pPr>
-      <w:r>
-        <w:rPr>
-          <w:rFonts w:ascii="EB Garamond" w:cs="EB Garamond" w:eastAsia="EB Garamond" w:hAnsi="EB Garamond"/>
-          <w:sz w:val="20"/>
-          <w:szCs w:val="20"/>
-        </w:rPr>
-        <w:t xml:space="preserve">Develop business acumen through case studies, simulations, and real-world projects that strengthen analytical, strategic, and leadership skills</w:t>
-      </w:r>
-    </w:p>
-    <w:p>
-      <w:pPr>
-        <w:pStyle w:val="ListParagraph"/>
-        <w:numPr>
-          <w:ilvl w:val="0"/>
-          <w:numId w:val="2"/>
-        </w:numPr>
-        <w:spacing w:after="0" w:before="0" w:line="216" w:lineRule="auto"/>
-      </w:pPr>
-      <w:r>
-        <w:rPr>
-          <w:rFonts w:ascii="EB Garamond" w:cs="EB Garamond" w:eastAsia="EB Garamond" w:hAnsi="EB Garamond"/>
-          <w:sz w:val="20"/>
-          <w:szCs w:val="20"/>
-        </w:rPr>
-        <w:t xml:space="preserve">Engage with leading Fortune 500 partner organizations to gain industry exposure and insight into consulting and corporate career pathways</w:t>
+        <w:t xml:space="preserve">Fellow, Alternative Investments &amp; Investment Banking</w:t>
+      </w:r>
+    </w:p>
+    <w:p>
+      <w:pPr>
+        <w:pStyle w:val="ListParagraph"/>
+        <w:numPr>
+          <w:ilvl w:val="0"/>
+          <w:numId w:val="2"/>
+        </w:numPr>
+        <w:spacing w:after="0" w:before="0" w:line="198" w:lineRule="auto"/>
+      </w:pPr>
+      <w:r>
+        <w:rPr>
+          <w:rFonts w:ascii="EB Garamond" w:cs="EB Garamond" w:eastAsia="EB Garamond" w:hAnsi="EB Garamond"/>
+          <w:sz w:val="20"/>
+          <w:szCs w:val="20"/>
+        </w:rPr>
+        <w:t xml:space="preserve">Selected for SEO Career's Alternative Investments and Investment Banking track, a highly selective program placing students at top-tier firms</w:t>
+      </w:r>
+    </w:p>
+    <w:p>
+      <w:pPr>
+        <w:pStyle w:val="ListParagraph"/>
+        <w:numPr>
+          <w:ilvl w:val="0"/>
+          <w:numId w:val="2"/>
+        </w:numPr>
+        <w:spacing w:after="0" w:before="0" w:line="198" w:lineRule="auto"/>
+      </w:pPr>
+      <w:r>
+        <w:rPr>
+          <w:rFonts w:ascii="EB Garamond" w:cs="EB Garamond" w:eastAsia="EB Garamond" w:hAnsi="EB Garamond"/>
+          <w:sz w:val="20"/>
+          <w:szCs w:val="20"/>
+        </w:rPr>
+        <w:t xml:space="preserve">Complete technical training in accounting, valuation, and financial modeling with coaching from SEO staff and mentors from partner firms</w:t>
       </w:r>
     </w:p>
     <w:p>
@@ -916,7 +898,7 @@
         <w:tabs>
           <w:tab w:val="right" w:pos="11228"/>
         </w:tabs>
-        <w:spacing w:after="0" w:before="24" w:line="216" w:lineRule="auto"/>
+        <w:spacing w:after="0" w:before="24" w:line="198" w:lineRule="auto"/>
       </w:pPr>
       <w:r>
         <w:rPr>
@@ -926,28 +908,20 @@
           <w:sz w:val="20"/>
           <w:szCs w:val="20"/>
         </w:rPr>
-        <w:t xml:space="preserve">Hear My Cry Foundation</w:t>
-      </w:r>
-      <w:r>
-        <w:rPr>
-          <w:rFonts w:ascii="EB Garamond" w:cs="EB Garamond" w:eastAsia="EB Garamond" w:hAnsi="EB Garamond"/>
-          <w:sz w:val="20"/>
-          <w:szCs w:val="20"/>
-        </w:rPr>
-        <w:t xml:space="preserve"> | Dallas, TX</w:t>
-      </w:r>
-      <w:r>
-        <w:rPr>
-          <w:rFonts w:ascii="EB Garamond" w:cs="EB Garamond" w:eastAsia="EB Garamond" w:hAnsi="EB Garamond"/>
-          <w:sz w:val="20"/>
-          <w:szCs w:val="20"/>
-        </w:rPr>
-        <w:t xml:space="preserve">	Jul 2026 - Aug 2026</w:t>
-      </w:r>
-    </w:p>
-    <w:p>
-      <w:pPr>
-        <w:spacing w:after="0" w:before="0" w:line="216" w:lineRule="auto"/>
+        <w:t xml:space="preserve">Recalc Finance Accelerator</w:t>
+      </w:r>
+      <w:r>
+        <w:rPr>
+          <w:rFonts w:ascii="EB Garamond" w:cs="EB Garamond" w:eastAsia="EB Garamond" w:hAnsi="EB Garamond"/>
+          <w:sz w:val="20"/>
+          <w:szCs w:val="20"/>
+        </w:rPr>
+        <w:t xml:space="preserve">	Oct 2026 - Dec 2026</w:t>
+      </w:r>
+    </w:p>
+    <w:p>
+      <w:pPr>
+        <w:spacing w:after="0" w:before="0" w:line="198" w:lineRule="auto"/>
       </w:pPr>
       <w:r>
         <w:rPr>
@@ -957,61 +931,43 @@
           <w:sz w:val="20"/>
           <w:szCs w:val="20"/>
         </w:rPr>
-        <w:t xml:space="preserve">College Access Volunteer</w:t>
-      </w:r>
-    </w:p>
-    <w:p>
-      <w:pPr>
-        <w:pStyle w:val="ListParagraph"/>
-        <w:numPr>
-          <w:ilvl w:val="0"/>
-          <w:numId w:val="2"/>
-        </w:numPr>
-        <w:spacing w:after="0" w:before="0" w:line="216" w:lineRule="auto"/>
-      </w:pPr>
-      <w:r>
-        <w:rPr>
-          <w:rFonts w:ascii="EB Garamond" w:cs="EB Garamond" w:eastAsia="EB Garamond" w:hAnsi="EB Garamond"/>
-          <w:sz w:val="20"/>
-          <w:szCs w:val="20"/>
-        </w:rPr>
-        <w:t xml:space="preserve">Researched and compiled 150+ scholarships, awards, and college resources for Dallas-area teens, partnering with Dr. DeWone Bennett, PsyD</w:t>
-      </w:r>
-    </w:p>
-    <w:p>
-      <w:pPr>
-        <w:pStyle w:val="ListParagraph"/>
-        <w:numPr>
-          <w:ilvl w:val="0"/>
-          <w:numId w:val="2"/>
-        </w:numPr>
-        <w:spacing w:after="0" w:before="0" w:line="216" w:lineRule="auto"/>
-      </w:pPr>
-      <w:r>
-        <w:rPr>
-          <w:rFonts w:ascii="EB Garamond" w:cs="EB Garamond" w:eastAsia="EB Garamond" w:hAnsi="EB Garamond"/>
-          <w:sz w:val="20"/>
-          <w:szCs w:val="20"/>
-        </w:rPr>
-        <w:t xml:space="preserve">Built a centralized database organizing funding and application resources in one place, making college support much easier for teens to find</w:t>
-      </w:r>
-    </w:p>
-    <w:p>
-      <w:pPr>
-        <w:pStyle w:val="ListParagraph"/>
-        <w:numPr>
-          <w:ilvl w:val="0"/>
-          <w:numId w:val="2"/>
-        </w:numPr>
-        <w:spacing w:after="0" w:before="0" w:line="216" w:lineRule="auto"/>
-      </w:pPr>
-      <w:r>
-        <w:rPr>
-          <w:rFonts w:ascii="EB Garamond" w:cs="EB Garamond" w:eastAsia="EB Garamond" w:hAnsi="EB Garamond"/>
-          <w:sz w:val="20"/>
-          <w:szCs w:val="20"/>
-        </w:rPr>
-        <w:t xml:space="preserve">Spoke to 15 Dallas-area teens about personal college and career journey, helping them see a clear path to higher education and scholarships</w:t>
+        <w:t xml:space="preserve">Fall 2026 Cohort</w:t>
+      </w:r>
+    </w:p>
+    <w:p>
+      <w:pPr>
+        <w:pStyle w:val="ListParagraph"/>
+        <w:numPr>
+          <w:ilvl w:val="0"/>
+          <w:numId w:val="2"/>
+        </w:numPr>
+        <w:spacing w:after="0" w:before="0" w:line="198" w:lineRule="auto"/>
+      </w:pPr>
+      <w:r>
+        <w:rPr>
+          <w:rFonts w:ascii="EB Garamond" w:cs="EB Garamond" w:eastAsia="EB Garamond" w:hAnsi="EB Garamond"/>
+          <w:sz w:val="20"/>
+          <w:szCs w:val="20"/>
+        </w:rPr>
+        <w:t xml:space="preserve">Selected for Recalc's Fall 2026 Finance Accelerator, an intensive training program preparing students for careers in alternative investments</w:t>
+      </w:r>
+    </w:p>
+    <w:p>
+      <w:pPr>
+        <w:pStyle w:val="ListParagraph"/>
+        <w:numPr>
+          <w:ilvl w:val="0"/>
+          <w:numId w:val="2"/>
+        </w:numPr>
+        <w:spacing w:after="0" w:before="0" w:line="198" w:lineRule="auto"/>
+      </w:pPr>
+      <w:r>
+        <w:rPr>
+          <w:rFonts w:ascii="EB Garamond" w:cs="EB Garamond" w:eastAsia="EB Garamond" w:hAnsi="EB Garamond"/>
+          <w:sz w:val="20"/>
+          <w:szCs w:val="20"/>
+        </w:rPr>
+        <w:t xml:space="preserve">Train weekly in accounting, Excel, financial modeling, and business analysis, with mentorship and recruiting support from PE professionals</w:t>
       </w:r>
     </w:p>
     <w:p>
@@ -1019,7 +975,7 @@
         <w:tabs>
           <w:tab w:val="right" w:pos="11228"/>
         </w:tabs>
-        <w:spacing w:after="0" w:before="24" w:line="216" w:lineRule="auto"/>
+        <w:spacing w:after="0" w:before="24" w:line="198" w:lineRule="auto"/>
       </w:pPr>
       <w:r>
         <w:rPr>
@@ -1029,28 +985,20 @@
           <w:sz w:val="20"/>
           <w:szCs w:val="20"/>
         </w:rPr>
-        <w:t xml:space="preserve">Vandy 2 Wall Street</w:t>
-      </w:r>
-      <w:r>
-        <w:rPr>
-          <w:rFonts w:ascii="EB Garamond" w:cs="EB Garamond" w:eastAsia="EB Garamond" w:hAnsi="EB Garamond"/>
-          <w:sz w:val="20"/>
-          <w:szCs w:val="20"/>
-        </w:rPr>
-        <w:t xml:space="preserve"> | Nashville, TN</w:t>
-      </w:r>
-      <w:r>
-        <w:rPr>
-          <w:rFonts w:ascii="EB Garamond" w:cs="EB Garamond" w:eastAsia="EB Garamond" w:hAnsi="EB Garamond"/>
-          <w:sz w:val="20"/>
-          <w:szCs w:val="20"/>
-        </w:rPr>
-        <w:t xml:space="preserve">	Jun 2026</w:t>
-      </w:r>
-    </w:p>
-    <w:p>
-      <w:pPr>
-        <w:spacing w:after="0" w:before="0" w:line="216" w:lineRule="auto"/>
+        <w:t xml:space="preserve">Management Leadership for Tomorrow (MLT)</w:t>
+      </w:r>
+      <w:r>
+        <w:rPr>
+          <w:rFonts w:ascii="EB Garamond" w:cs="EB Garamond" w:eastAsia="EB Garamond" w:hAnsi="EB Garamond"/>
+          <w:sz w:val="20"/>
+          <w:szCs w:val="20"/>
+        </w:rPr>
+        <w:t xml:space="preserve">	Sep 2026 - Present</w:t>
+      </w:r>
+    </w:p>
+    <w:p>
+      <w:pPr>
+        <w:spacing w:after="0" w:before="0" w:line="198" w:lineRule="auto"/>
       </w:pPr>
       <w:r>
         <w:rPr>
@@ -1060,61 +1008,25 @@
           <w:sz w:val="20"/>
           <w:szCs w:val="20"/>
         </w:rPr>
-        <w:t xml:space="preserve">Team Co-Lead, M&amp;A Pitch Competition</w:t>
-      </w:r>
-    </w:p>
-    <w:p>
-      <w:pPr>
-        <w:pStyle w:val="ListParagraph"/>
-        <w:numPr>
-          <w:ilvl w:val="0"/>
-          <w:numId w:val="2"/>
-        </w:numPr>
-        <w:spacing w:after="0" w:before="0" w:line="216" w:lineRule="auto"/>
-      </w:pPr>
-      <w:r>
-        <w:rPr>
-          <w:rFonts w:ascii="EB Garamond" w:cs="EB Garamond" w:eastAsia="EB Garamond" w:hAnsi="EB Garamond"/>
-          <w:sz w:val="20"/>
-          <w:szCs w:val="20"/>
-        </w:rPr>
-        <w:t xml:space="preserve">Selected for inaugural M&amp;A Pitch Competition; recommended selling a 51% controlling stake in Athleta while retaining 49% of the upside</w:t>
-      </w:r>
-    </w:p>
-    <w:p>
-      <w:pPr>
-        <w:pStyle w:val="ListParagraph"/>
-        <w:numPr>
-          <w:ilvl w:val="0"/>
-          <w:numId w:val="2"/>
-        </w:numPr>
-        <w:spacing w:after="0" w:before="0" w:line="216" w:lineRule="auto"/>
-      </w:pPr>
-      <w:r>
-        <w:rPr>
-          <w:rFonts w:ascii="EB Garamond" w:cs="EB Garamond" w:eastAsia="EB Garamond" w:hAnsi="EB Garamond"/>
-          <w:sz w:val="20"/>
-          <w:szCs w:val="20"/>
-        </w:rPr>
-        <w:t xml:space="preserve">Modeled five-year operating case, DCF, sum-of-the-parts, and buyer returns analysis supporting a $561M enterprise value and a 19-20% IRR</w:t>
-      </w:r>
-    </w:p>
-    <w:p>
-      <w:pPr>
-        <w:pStyle w:val="ListParagraph"/>
-        <w:numPr>
-          <w:ilvl w:val="0"/>
-          <w:numId w:val="2"/>
-        </w:numPr>
-        <w:spacing w:after="0" w:before="0" w:line="216" w:lineRule="auto"/>
-      </w:pPr>
-      <w:r>
-        <w:rPr>
-          <w:rFonts w:ascii="EB Garamond" w:cs="EB Garamond" w:eastAsia="EB Garamond" w:hAnsi="EB Garamond"/>
-          <w:sz w:val="20"/>
-          <w:szCs w:val="20"/>
-        </w:rPr>
-        <w:t xml:space="preserve">Analyzed SEC filings, equity research, trading comparables, and precedent transactions to co-author a four-page investment banking memo</w:t>
+        <w:t xml:space="preserve">Career Prep Fellow</w:t>
+      </w:r>
+    </w:p>
+    <w:p>
+      <w:pPr>
+        <w:pStyle w:val="ListParagraph"/>
+        <w:numPr>
+          <w:ilvl w:val="0"/>
+          <w:numId w:val="2"/>
+        </w:numPr>
+        <w:spacing w:after="0" w:before="0" w:line="198" w:lineRule="auto"/>
+      </w:pPr>
+      <w:r>
+        <w:rPr>
+          <w:rFonts w:ascii="EB Garamond" w:cs="EB Garamond" w:eastAsia="EB Garamond" w:hAnsi="EB Garamond"/>
+          <w:sz w:val="20"/>
+          <w:szCs w:val="20"/>
+        </w:rPr>
+        <w:t xml:space="preserve">Selected for highly competitive 18+-month fellowship accelerating emerging leaders' careers through coaching, mentorship, and skill-building</w:t>
       </w:r>
     </w:p>
     <w:p>
@@ -1122,7 +1034,7 @@
         <w:tabs>
           <w:tab w:val="right" w:pos="11228"/>
         </w:tabs>
-        <w:spacing w:after="0" w:before="24" w:line="216" w:lineRule="auto"/>
+        <w:spacing w:after="0" w:before="24" w:line="198" w:lineRule="auto"/>
       </w:pPr>
       <w:r>
         <w:rPr>
@@ -1132,7 +1044,7 @@
           <w:sz w:val="20"/>
           <w:szCs w:val="20"/>
         </w:rPr>
-        <w:t xml:space="preserve">SEYA</w:t>
+        <w:t xml:space="preserve">Hear My Cry Foundation</w:t>
       </w:r>
       <w:r>
         <w:rPr>
@@ -1148,12 +1060,12 @@
           <w:sz w:val="20"/>
           <w:szCs w:val="20"/>
         </w:rPr>
-        <w:t xml:space="preserve">	Jun 2025 - Jul 2026</w:t>
-      </w:r>
-    </w:p>
-    <w:p>
-      <w:pPr>
-        <w:spacing w:after="0" w:before="0" w:line="216" w:lineRule="auto"/>
+        <w:t xml:space="preserve">	Jul 2026 - Aug 2026</w:t>
+      </w:r>
+    </w:p>
+    <w:p>
+      <w:pPr>
+        <w:spacing w:after="0" w:before="0" w:line="198" w:lineRule="auto"/>
       </w:pPr>
       <w:r>
         <w:rPr>
@@ -1163,6 +1075,194 @@
           <w:sz w:val="20"/>
           <w:szCs w:val="20"/>
         </w:rPr>
+        <w:t xml:space="preserve">College Access Volunteer</w:t>
+      </w:r>
+    </w:p>
+    <w:p>
+      <w:pPr>
+        <w:pStyle w:val="ListParagraph"/>
+        <w:numPr>
+          <w:ilvl w:val="0"/>
+          <w:numId w:val="2"/>
+        </w:numPr>
+        <w:spacing w:after="0" w:before="0" w:line="198" w:lineRule="auto"/>
+      </w:pPr>
+      <w:r>
+        <w:rPr>
+          <w:rFonts w:ascii="EB Garamond" w:cs="EB Garamond" w:eastAsia="EB Garamond" w:hAnsi="EB Garamond"/>
+          <w:sz w:val="20"/>
+          <w:szCs w:val="20"/>
+        </w:rPr>
+        <w:t xml:space="preserve">Researched and compiled 150+ scholarships, awards, and college resources for Dallas-area teens, partnering with Dr. DeWone Bennett, PsyD</w:t>
+      </w:r>
+    </w:p>
+    <w:p>
+      <w:pPr>
+        <w:pStyle w:val="ListParagraph"/>
+        <w:numPr>
+          <w:ilvl w:val="0"/>
+          <w:numId w:val="2"/>
+        </w:numPr>
+        <w:spacing w:after="0" w:before="0" w:line="198" w:lineRule="auto"/>
+      </w:pPr>
+      <w:r>
+        <w:rPr>
+          <w:rFonts w:ascii="EB Garamond" w:cs="EB Garamond" w:eastAsia="EB Garamond" w:hAnsi="EB Garamond"/>
+          <w:sz w:val="20"/>
+          <w:szCs w:val="20"/>
+        </w:rPr>
+        <w:t xml:space="preserve">Built a centralized database organizing funding and application resources in one place, making college support much easier for teens to find</w:t>
+      </w:r>
+    </w:p>
+    <w:p>
+      <w:pPr>
+        <w:tabs>
+          <w:tab w:val="right" w:pos="11228"/>
+        </w:tabs>
+        <w:spacing w:after="0" w:before="24" w:line="198" w:lineRule="auto"/>
+      </w:pPr>
+      <w:r>
+        <w:rPr>
+          <w:rFonts w:ascii="EB Garamond" w:cs="EB Garamond" w:eastAsia="EB Garamond" w:hAnsi="EB Garamond"/>
+          <w:b/>
+          <w:bCs/>
+          <w:sz w:val="20"/>
+          <w:szCs w:val="20"/>
+        </w:rPr>
+        <w:t xml:space="preserve">Vandy 2 Wall Street</w:t>
+      </w:r>
+      <w:r>
+        <w:rPr>
+          <w:rFonts w:ascii="EB Garamond" w:cs="EB Garamond" w:eastAsia="EB Garamond" w:hAnsi="EB Garamond"/>
+          <w:sz w:val="20"/>
+          <w:szCs w:val="20"/>
+        </w:rPr>
+        <w:t xml:space="preserve"> | Nashville, TN</w:t>
+      </w:r>
+      <w:r>
+        <w:rPr>
+          <w:rFonts w:ascii="EB Garamond" w:cs="EB Garamond" w:eastAsia="EB Garamond" w:hAnsi="EB Garamond"/>
+          <w:sz w:val="20"/>
+          <w:szCs w:val="20"/>
+        </w:rPr>
+        <w:t xml:space="preserve">	Jun 2026</w:t>
+      </w:r>
+    </w:p>
+    <w:p>
+      <w:pPr>
+        <w:spacing w:after="0" w:before="0" w:line="198" w:lineRule="auto"/>
+      </w:pPr>
+      <w:r>
+        <w:rPr>
+          <w:rFonts w:ascii="EB Garamond" w:cs="EB Garamond" w:eastAsia="EB Garamond" w:hAnsi="EB Garamond"/>
+          <w:i/>
+          <w:iCs/>
+          <w:sz w:val="20"/>
+          <w:szCs w:val="20"/>
+        </w:rPr>
+        <w:t xml:space="preserve">Team Co-Lead, M&amp;A Pitch Competition</w:t>
+      </w:r>
+    </w:p>
+    <w:p>
+      <w:pPr>
+        <w:pStyle w:val="ListParagraph"/>
+        <w:numPr>
+          <w:ilvl w:val="0"/>
+          <w:numId w:val="2"/>
+        </w:numPr>
+        <w:spacing w:after="0" w:before="0" w:line="198" w:lineRule="auto"/>
+      </w:pPr>
+      <w:r>
+        <w:rPr>
+          <w:rFonts w:ascii="EB Garamond" w:cs="EB Garamond" w:eastAsia="EB Garamond" w:hAnsi="EB Garamond"/>
+          <w:sz w:val="20"/>
+          <w:szCs w:val="20"/>
+        </w:rPr>
+        <w:t xml:space="preserve">Selected for inaugural M&amp;A Pitch Competition; recommended selling a 51% controlling stake in Athleta while retaining 49% of the upside</w:t>
+      </w:r>
+    </w:p>
+    <w:p>
+      <w:pPr>
+        <w:pStyle w:val="ListParagraph"/>
+        <w:numPr>
+          <w:ilvl w:val="0"/>
+          <w:numId w:val="2"/>
+        </w:numPr>
+        <w:spacing w:after="0" w:before="0" w:line="198" w:lineRule="auto"/>
+      </w:pPr>
+      <w:r>
+        <w:rPr>
+          <w:rFonts w:ascii="EB Garamond" w:cs="EB Garamond" w:eastAsia="EB Garamond" w:hAnsi="EB Garamond"/>
+          <w:sz w:val="20"/>
+          <w:szCs w:val="20"/>
+        </w:rPr>
+        <w:t xml:space="preserve">Modeled five-year operating case, DCF, sum-of-the-parts, and buyer returns analysis supporting a $561M enterprise value and a 19-20% IRR</w:t>
+      </w:r>
+    </w:p>
+    <w:p>
+      <w:pPr>
+        <w:pStyle w:val="ListParagraph"/>
+        <w:numPr>
+          <w:ilvl w:val="0"/>
+          <w:numId w:val="2"/>
+        </w:numPr>
+        <w:spacing w:after="0" w:before="0" w:line="198" w:lineRule="auto"/>
+      </w:pPr>
+      <w:r>
+        <w:rPr>
+          <w:rFonts w:ascii="EB Garamond" w:cs="EB Garamond" w:eastAsia="EB Garamond" w:hAnsi="EB Garamond"/>
+          <w:sz w:val="20"/>
+          <w:szCs w:val="20"/>
+        </w:rPr>
+        <w:t xml:space="preserve">Analyzed SEC filings, equity research, trading comparables, and precedent transactions to co-author a four-page investment banking memo</w:t>
+      </w:r>
+    </w:p>
+    <w:p>
+      <w:pPr>
+        <w:tabs>
+          <w:tab w:val="right" w:pos="11228"/>
+        </w:tabs>
+        <w:spacing w:after="0" w:before="24" w:line="198" w:lineRule="auto"/>
+      </w:pPr>
+      <w:r>
+        <w:rPr>
+          <w:rFonts w:ascii="EB Garamond" w:cs="EB Garamond" w:eastAsia="EB Garamond" w:hAnsi="EB Garamond"/>
+          <w:b/>
+          <w:bCs/>
+          <w:sz w:val="20"/>
+          <w:szCs w:val="20"/>
+        </w:rPr>
+        <w:t xml:space="preserve">SEYA</w:t>
+      </w:r>
+      <w:r>
+        <w:rPr>
+          <w:rFonts w:ascii="EB Garamond" w:cs="EB Garamond" w:eastAsia="EB Garamond" w:hAnsi="EB Garamond"/>
+          <w:sz w:val="20"/>
+          <w:szCs w:val="20"/>
+        </w:rPr>
+        <w:t xml:space="preserve"> | Dallas, TX</w:t>
+      </w:r>
+      <w:r>
+        <w:rPr>
+          <w:rFonts w:ascii="EB Garamond" w:cs="EB Garamond" w:eastAsia="EB Garamond" w:hAnsi="EB Garamond"/>
+          <w:sz w:val="20"/>
+          <w:szCs w:val="20"/>
+        </w:rPr>
+        <w:t xml:space="preserve">	Jun 2025 - Jul 2026</w:t>
+      </w:r>
+    </w:p>
+    <w:p>
+      <w:pPr>
+        <w:spacing w:after="0" w:before="0" w:line="198" w:lineRule="auto"/>
+      </w:pPr>
+      <w:r>
+        <w:rPr>
+          <w:rFonts w:ascii="EB Garamond" w:cs="EB Garamond" w:eastAsia="EB Garamond" w:hAnsi="EB Garamond"/>
+          <w:i/>
+          <w:iCs/>
+          <w:sz w:val="20"/>
+          <w:szCs w:val="20"/>
+        </w:rPr>
         <w:t xml:space="preserve">Co-Founder, DTC Apparel Brand</w:t>
       </w:r>
     </w:p>
@@ -1173,7 +1273,7 @@
           <w:ilvl w:val="0"/>
           <w:numId w:val="2"/>
         </w:numPr>
-        <w:spacing w:after="0" w:before="0" w:line="216" w:lineRule="auto"/>
+        <w:spacing w:after="0" w:before="0" w:line="198" w:lineRule="auto"/>
       </w:pPr>
       <w:r>
         <w:rPr>
@@ -1191,7 +1291,7 @@
           <w:ilvl w:val="0"/>
           <w:numId w:val="2"/>
         </w:numPr>
-        <w:spacing w:after="0" w:before="0" w:line="216" w:lineRule="auto"/>
+        <w:spacing w:after="0" w:before="0" w:line="198" w:lineRule="auto"/>
       </w:pPr>
       <w:r>
         <w:rPr>
@@ -1209,7 +1309,7 @@
           <w:ilvl w:val="0"/>
           <w:numId w:val="2"/>
         </w:numPr>
-        <w:spacing w:after="0" w:before="0" w:line="216" w:lineRule="auto"/>
+        <w:spacing w:after="0" w:before="0" w:line="198" w:lineRule="auto"/>
       </w:pPr>
       <w:r>
         <w:rPr>
@@ -1225,7 +1325,7 @@
         <w:pBdr>
           <w:bottom w:val="single" w:color="000000" w:sz="6" w:space="1"/>
         </w:pBdr>
-        <w:spacing w:after="40" w:before="80" w:line="216" w:lineRule="auto"/>
+        <w:spacing w:after="40" w:before="80" w:line="198" w:lineRule="auto"/>
       </w:pPr>
       <w:r>
         <w:rPr>
@@ -1310,7 +1410,7 @@
     </w:p>
     <w:p>
       <w:pPr>
-        <w:spacing w:after="0" w:before="30" w:line="216" w:lineRule="auto"/>
+        <w:spacing w:after="0" w:before="30" w:line="198" w:lineRule="auto"/>
       </w:pPr>
       <w:r>
         <w:rPr>
@@ -1333,7 +1433,7 @@
     </w:p>
     <w:p>
       <w:pPr>
-        <w:spacing w:after="0" w:before="0" w:line="216" w:lineRule="auto"/>
+        <w:spacing w:after="0" w:before="0" w:line="198" w:lineRule="auto"/>
       </w:pPr>
       <w:r>
         <w:rPr>
@@ -1356,7 +1456,7 @@
     </w:p>
     <w:p>
       <w:pPr>
-        <w:spacing w:after="0" w:before="0" w:line="216" w:lineRule="auto"/>
+        <w:spacing w:after="0" w:before="0" w:line="198" w:lineRule="auto"/>
       </w:pPr>
       <w:r>
         <w:rPr>

</xml_diff>

<commit_message>
Resume: keep SEO Career as full entry, move MLT and Recalc to Programs line
Co-Authored-By: Claude Opus 5.5 <noreply@anthropic.com>
Claude-Session: https://claude.ai/code/session_01G3JV145HgjUfXQyW7hEcYE
</commit_message>
<xml_diff>
--- a/assets/Jennifer-Amogu-Resume.docx
+++ b/assets/Jennifer-Amogu-Resume.docx
@@ -20,7 +20,7 @@
     </w:p>
     <w:p>
       <w:pPr>
-        <w:spacing w:after="0" w:before="0" w:line="198" w:lineRule="auto"/>
+        <w:spacing w:after="0" w:before="0" w:line="216" w:lineRule="auto"/>
         <w:jc w:val="center"/>
       </w:pPr>
       <w:r>
@@ -37,7 +37,7 @@
         <w:pBdr>
           <w:bottom w:val="single" w:color="000000" w:sz="6" w:space="1"/>
         </w:pBdr>
-        <w:spacing w:after="40" w:before="60" w:line="198" w:lineRule="auto"/>
+        <w:spacing w:after="40" w:before="60" w:line="216" w:lineRule="auto"/>
       </w:pPr>
       <w:r>
         <w:rPr>
@@ -61,7 +61,7 @@
         <w:tabs>
           <w:tab w:val="right" w:pos="11228"/>
         </w:tabs>
-        <w:spacing w:after="0" w:before="40" w:line="198" w:lineRule="auto"/>
+        <w:spacing w:after="0" w:before="40" w:line="216" w:lineRule="auto"/>
       </w:pPr>
       <w:r>
         <w:rPr>
@@ -95,7 +95,7 @@
         <w:tabs>
           <w:tab w:val="right" w:pos="11228"/>
         </w:tabs>
-        <w:spacing w:after="0" w:before="0" w:line="198" w:lineRule="auto"/>
+        <w:spacing w:after="0" w:before="0" w:line="216" w:lineRule="auto"/>
       </w:pPr>
       <w:r>
         <w:rPr>
@@ -118,7 +118,7 @@
     </w:p>
     <w:p>
       <w:pPr>
-        <w:spacing w:after="0" w:before="0" w:line="198" w:lineRule="auto"/>
+        <w:spacing w:after="0" w:before="0" w:line="216" w:lineRule="auto"/>
       </w:pPr>
       <w:r>
         <w:rPr>
@@ -144,7 +144,7 @@
         <w:pBdr>
           <w:bottom w:val="single" w:color="000000" w:sz="6" w:space="1"/>
         </w:pBdr>
-        <w:spacing w:after="40" w:before="80" w:line="198" w:lineRule="auto"/>
+        <w:spacing w:after="40" w:before="80" w:line="216" w:lineRule="auto"/>
       </w:pPr>
       <w:r>
         <w:rPr>
@@ -192,7 +192,7 @@
         <w:tabs>
           <w:tab w:val="right" w:pos="11228"/>
         </w:tabs>
-        <w:spacing w:after="0" w:before="40" w:line="198" w:lineRule="auto"/>
+        <w:spacing w:after="0" w:before="40" w:line="216" w:lineRule="auto"/>
       </w:pPr>
       <w:r>
         <w:rPr>
@@ -223,7 +223,7 @@
     </w:p>
     <w:p>
       <w:pPr>
-        <w:spacing w:after="0" w:before="0" w:line="198" w:lineRule="auto"/>
+        <w:spacing w:after="0" w:before="0" w:line="216" w:lineRule="auto"/>
       </w:pPr>
       <w:r>
         <w:rPr>
@@ -243,7 +243,7 @@
           <w:ilvl w:val="0"/>
           <w:numId w:val="2"/>
         </w:numPr>
-        <w:spacing w:after="0" w:before="0" w:line="198" w:lineRule="auto"/>
+        <w:spacing w:after="0" w:before="0" w:line="216" w:lineRule="auto"/>
       </w:pPr>
       <w:r>
         <w:rPr>
@@ -259,7 +259,7 @@
         <w:tabs>
           <w:tab w:val="right" w:pos="11228"/>
         </w:tabs>
-        <w:spacing w:after="0" w:before="24" w:line="198" w:lineRule="auto"/>
+        <w:spacing w:after="0" w:before="24" w:line="216" w:lineRule="auto"/>
       </w:pPr>
       <w:r>
         <w:rPr>
@@ -290,7 +290,7 @@
     </w:p>
     <w:p>
       <w:pPr>
-        <w:spacing w:after="0" w:before="0" w:line="198" w:lineRule="auto"/>
+        <w:spacing w:after="0" w:before="0" w:line="216" w:lineRule="auto"/>
       </w:pPr>
       <w:r>
         <w:rPr>
@@ -310,7 +310,7 @@
           <w:ilvl w:val="0"/>
           <w:numId w:val="2"/>
         </w:numPr>
-        <w:spacing w:after="0" w:before="0" w:line="198" w:lineRule="auto"/>
+        <w:spacing w:after="0" w:before="0" w:line="216" w:lineRule="auto"/>
       </w:pPr>
       <w:r>
         <w:rPr>
@@ -328,7 +328,7 @@
           <w:ilvl w:val="0"/>
           <w:numId w:val="2"/>
         </w:numPr>
-        <w:spacing w:after="0" w:before="0" w:line="198" w:lineRule="auto"/>
+        <w:spacing w:after="0" w:before="0" w:line="216" w:lineRule="auto"/>
       </w:pPr>
       <w:r>
         <w:rPr>
@@ -346,7 +346,7 @@
           <w:ilvl w:val="0"/>
           <w:numId w:val="2"/>
         </w:numPr>
-        <w:spacing w:after="0" w:before="0" w:line="198" w:lineRule="auto"/>
+        <w:spacing w:after="0" w:before="0" w:line="216" w:lineRule="auto"/>
       </w:pPr>
       <w:r>
         <w:rPr>
@@ -364,7 +364,7 @@
           <w:ilvl w:val="0"/>
           <w:numId w:val="2"/>
         </w:numPr>
-        <w:spacing w:after="0" w:before="0" w:line="198" w:lineRule="auto"/>
+        <w:spacing w:after="0" w:before="0" w:line="216" w:lineRule="auto"/>
       </w:pPr>
       <w:r>
         <w:rPr>
@@ -380,7 +380,7 @@
         <w:tabs>
           <w:tab w:val="right" w:pos="11228"/>
         </w:tabs>
-        <w:spacing w:after="0" w:before="24" w:line="198" w:lineRule="auto"/>
+        <w:spacing w:after="0" w:before="24" w:line="216" w:lineRule="auto"/>
       </w:pPr>
       <w:r>
         <w:rPr>
@@ -411,7 +411,7 @@
     </w:p>
     <w:p>
       <w:pPr>
-        <w:spacing w:after="0" w:before="0" w:line="198" w:lineRule="auto"/>
+        <w:spacing w:after="0" w:before="0" w:line="216" w:lineRule="auto"/>
       </w:pPr>
       <w:r>
         <w:rPr>
@@ -431,7 +431,7 @@
           <w:ilvl w:val="0"/>
           <w:numId w:val="2"/>
         </w:numPr>
-        <w:spacing w:after="0" w:before="0" w:line="198" w:lineRule="auto"/>
+        <w:spacing w:after="0" w:before="0" w:line="216" w:lineRule="auto"/>
       </w:pPr>
       <w:r>
         <w:rPr>
@@ -449,7 +449,7 @@
           <w:ilvl w:val="0"/>
           <w:numId w:val="2"/>
         </w:numPr>
-        <w:spacing w:after="0" w:before="0" w:line="198" w:lineRule="auto"/>
+        <w:spacing w:after="0" w:before="0" w:line="216" w:lineRule="auto"/>
       </w:pPr>
       <w:r>
         <w:rPr>
@@ -467,7 +467,7 @@
           <w:ilvl w:val="0"/>
           <w:numId w:val="2"/>
         </w:numPr>
-        <w:spacing w:after="0" w:before="0" w:line="198" w:lineRule="auto"/>
+        <w:spacing w:after="0" w:before="0" w:line="216" w:lineRule="auto"/>
       </w:pPr>
       <w:r>
         <w:rPr>
@@ -485,7 +485,7 @@
           <w:ilvl w:val="0"/>
           <w:numId w:val="2"/>
         </w:numPr>
-        <w:spacing w:after="0" w:before="0" w:line="198" w:lineRule="auto"/>
+        <w:spacing w:after="0" w:before="0" w:line="216" w:lineRule="auto"/>
       </w:pPr>
       <w:r>
         <w:rPr>
@@ -501,7 +501,7 @@
         <w:tabs>
           <w:tab w:val="right" w:pos="11228"/>
         </w:tabs>
-        <w:spacing w:after="0" w:before="24" w:line="198" w:lineRule="auto"/>
+        <w:spacing w:after="0" w:before="24" w:line="216" w:lineRule="auto"/>
       </w:pPr>
       <w:r>
         <w:rPr>
@@ -532,7 +532,7 @@
     </w:p>
     <w:p>
       <w:pPr>
-        <w:spacing w:after="0" w:before="0" w:line="198" w:lineRule="auto"/>
+        <w:spacing w:after="0" w:before="0" w:line="216" w:lineRule="auto"/>
       </w:pPr>
       <w:r>
         <w:rPr>
@@ -552,7 +552,7 @@
           <w:ilvl w:val="0"/>
           <w:numId w:val="2"/>
         </w:numPr>
-        <w:spacing w:after="0" w:before="0" w:line="198" w:lineRule="auto"/>
+        <w:spacing w:after="0" w:before="0" w:line="216" w:lineRule="auto"/>
       </w:pPr>
       <w:r>
         <w:rPr>
@@ -570,7 +570,7 @@
           <w:ilvl w:val="0"/>
           <w:numId w:val="2"/>
         </w:numPr>
-        <w:spacing w:after="0" w:before="0" w:line="198" w:lineRule="auto"/>
+        <w:spacing w:after="0" w:before="0" w:line="216" w:lineRule="auto"/>
       </w:pPr>
       <w:r>
         <w:rPr>
@@ -588,7 +588,7 @@
           <w:ilvl w:val="0"/>
           <w:numId w:val="2"/>
         </w:numPr>
-        <w:spacing w:after="0" w:before="0" w:line="198" w:lineRule="auto"/>
+        <w:spacing w:after="0" w:before="0" w:line="216" w:lineRule="auto"/>
       </w:pPr>
       <w:r>
         <w:rPr>
@@ -606,7 +606,7 @@
           <w:ilvl w:val="0"/>
           <w:numId w:val="2"/>
         </w:numPr>
-        <w:spacing w:after="0" w:before="0" w:line="198" w:lineRule="auto"/>
+        <w:spacing w:after="0" w:before="0" w:line="216" w:lineRule="auto"/>
       </w:pPr>
       <w:r>
         <w:rPr>
@@ -622,7 +622,7 @@
         <w:tabs>
           <w:tab w:val="right" w:pos="11228"/>
         </w:tabs>
-        <w:spacing w:after="0" w:before="24" w:line="198" w:lineRule="auto"/>
+        <w:spacing w:after="0" w:before="24" w:line="216" w:lineRule="auto"/>
       </w:pPr>
       <w:r>
         <w:rPr>
@@ -653,7 +653,7 @@
     </w:p>
     <w:p>
       <w:pPr>
-        <w:spacing w:after="0" w:before="0" w:line="198" w:lineRule="auto"/>
+        <w:spacing w:after="0" w:before="0" w:line="216" w:lineRule="auto"/>
       </w:pPr>
       <w:r>
         <w:rPr>
@@ -673,7 +673,7 @@
           <w:ilvl w:val="0"/>
           <w:numId w:val="2"/>
         </w:numPr>
-        <w:spacing w:after="0" w:before="0" w:line="198" w:lineRule="auto"/>
+        <w:spacing w:after="0" w:before="0" w:line="216" w:lineRule="auto"/>
       </w:pPr>
       <w:r>
         <w:rPr>
@@ -691,7 +691,7 @@
           <w:ilvl w:val="0"/>
           <w:numId w:val="2"/>
         </w:numPr>
-        <w:spacing w:after="0" w:before="0" w:line="198" w:lineRule="auto"/>
+        <w:spacing w:after="0" w:before="0" w:line="216" w:lineRule="auto"/>
       </w:pPr>
       <w:r>
         <w:rPr>
@@ -709,7 +709,7 @@
           <w:ilvl w:val="0"/>
           <w:numId w:val="2"/>
         </w:numPr>
-        <w:spacing w:after="0" w:before="0" w:line="198" w:lineRule="auto"/>
+        <w:spacing w:after="0" w:before="0" w:line="216" w:lineRule="auto"/>
       </w:pPr>
       <w:r>
         <w:rPr>
@@ -725,7 +725,7 @@
         <w:pBdr>
           <w:bottom w:val="single" w:color="000000" w:sz="6" w:space="1"/>
         </w:pBdr>
-        <w:spacing w:after="40" w:before="80" w:line="198" w:lineRule="auto"/>
+        <w:spacing w:after="40" w:before="80" w:line="216" w:lineRule="auto"/>
       </w:pPr>
       <w:r>
         <w:rPr>
@@ -821,7 +821,7 @@
         <w:tabs>
           <w:tab w:val="right" w:pos="11228"/>
         </w:tabs>
-        <w:spacing w:after="0" w:before="40" w:line="198" w:lineRule="auto"/>
+        <w:spacing w:after="0" w:before="40" w:line="216" w:lineRule="auto"/>
       </w:pPr>
       <w:r>
         <w:rPr>
@@ -844,7 +844,7 @@
     </w:p>
     <w:p>
       <w:pPr>
-        <w:spacing w:after="0" w:before="0" w:line="198" w:lineRule="auto"/>
+        <w:spacing w:after="0" w:before="0" w:line="216" w:lineRule="auto"/>
       </w:pPr>
       <w:r>
         <w:rPr>
@@ -864,7 +864,7 @@
           <w:ilvl w:val="0"/>
           <w:numId w:val="2"/>
         </w:numPr>
-        <w:spacing w:after="0" w:before="0" w:line="198" w:lineRule="auto"/>
+        <w:spacing w:after="0" w:before="0" w:line="216" w:lineRule="auto"/>
       </w:pPr>
       <w:r>
         <w:rPr>
@@ -882,7 +882,7 @@
           <w:ilvl w:val="0"/>
           <w:numId w:val="2"/>
         </w:numPr>
-        <w:spacing w:after="0" w:before="0" w:line="198" w:lineRule="auto"/>
+        <w:spacing w:after="0" w:before="0" w:line="216" w:lineRule="auto"/>
       </w:pPr>
       <w:r>
         <w:rPr>
@@ -898,7 +898,7 @@
         <w:tabs>
           <w:tab w:val="right" w:pos="11228"/>
         </w:tabs>
-        <w:spacing w:after="0" w:before="24" w:line="198" w:lineRule="auto"/>
+        <w:spacing w:after="0" w:before="24" w:line="216" w:lineRule="auto"/>
       </w:pPr>
       <w:r>
         <w:rPr>
@@ -908,20 +908,28 @@
           <w:sz w:val="20"/>
           <w:szCs w:val="20"/>
         </w:rPr>
-        <w:t xml:space="preserve">Recalc Finance Accelerator</w:t>
-      </w:r>
-      <w:r>
-        <w:rPr>
-          <w:rFonts w:ascii="EB Garamond" w:cs="EB Garamond" w:eastAsia="EB Garamond" w:hAnsi="EB Garamond"/>
-          <w:sz w:val="20"/>
-          <w:szCs w:val="20"/>
-        </w:rPr>
-        <w:t xml:space="preserve">	Oct 2026 - Dec 2026</w:t>
-      </w:r>
-    </w:p>
-    <w:p>
-      <w:pPr>
-        <w:spacing w:after="0" w:before="0" w:line="198" w:lineRule="auto"/>
+        <w:t xml:space="preserve">Hear My Cry Foundation</w:t>
+      </w:r>
+      <w:r>
+        <w:rPr>
+          <w:rFonts w:ascii="EB Garamond" w:cs="EB Garamond" w:eastAsia="EB Garamond" w:hAnsi="EB Garamond"/>
+          <w:sz w:val="20"/>
+          <w:szCs w:val="20"/>
+        </w:rPr>
+        <w:t xml:space="preserve"> | Dallas, TX</w:t>
+      </w:r>
+      <w:r>
+        <w:rPr>
+          <w:rFonts w:ascii="EB Garamond" w:cs="EB Garamond" w:eastAsia="EB Garamond" w:hAnsi="EB Garamond"/>
+          <w:sz w:val="20"/>
+          <w:szCs w:val="20"/>
+        </w:rPr>
+        <w:t xml:space="preserve">	Jul 2026 - Aug 2026</w:t>
+      </w:r>
+    </w:p>
+    <w:p>
+      <w:pPr>
+        <w:spacing w:after="0" w:before="0" w:line="216" w:lineRule="auto"/>
       </w:pPr>
       <w:r>
         <w:rPr>
@@ -931,43 +939,61 @@
           <w:sz w:val="20"/>
           <w:szCs w:val="20"/>
         </w:rPr>
-        <w:t xml:space="preserve">Fall 2026 Cohort</w:t>
-      </w:r>
-    </w:p>
-    <w:p>
-      <w:pPr>
-        <w:pStyle w:val="ListParagraph"/>
-        <w:numPr>
-          <w:ilvl w:val="0"/>
-          <w:numId w:val="2"/>
-        </w:numPr>
-        <w:spacing w:after="0" w:before="0" w:line="198" w:lineRule="auto"/>
-      </w:pPr>
-      <w:r>
-        <w:rPr>
-          <w:rFonts w:ascii="EB Garamond" w:cs="EB Garamond" w:eastAsia="EB Garamond" w:hAnsi="EB Garamond"/>
-          <w:sz w:val="20"/>
-          <w:szCs w:val="20"/>
-        </w:rPr>
-        <w:t xml:space="preserve">Selected for Recalc's Fall 2026 Finance Accelerator, an intensive training program preparing students for careers in alternative investments</w:t>
-      </w:r>
-    </w:p>
-    <w:p>
-      <w:pPr>
-        <w:pStyle w:val="ListParagraph"/>
-        <w:numPr>
-          <w:ilvl w:val="0"/>
-          <w:numId w:val="2"/>
-        </w:numPr>
-        <w:spacing w:after="0" w:before="0" w:line="198" w:lineRule="auto"/>
-      </w:pPr>
-      <w:r>
-        <w:rPr>
-          <w:rFonts w:ascii="EB Garamond" w:cs="EB Garamond" w:eastAsia="EB Garamond" w:hAnsi="EB Garamond"/>
-          <w:sz w:val="20"/>
-          <w:szCs w:val="20"/>
-        </w:rPr>
-        <w:t xml:space="preserve">Train weekly in accounting, Excel, financial modeling, and business analysis, with mentorship and recruiting support from PE professionals</w:t>
+        <w:t xml:space="preserve">College Access Volunteer</w:t>
+      </w:r>
+    </w:p>
+    <w:p>
+      <w:pPr>
+        <w:pStyle w:val="ListParagraph"/>
+        <w:numPr>
+          <w:ilvl w:val="0"/>
+          <w:numId w:val="2"/>
+        </w:numPr>
+        <w:spacing w:after="0" w:before="0" w:line="216" w:lineRule="auto"/>
+      </w:pPr>
+      <w:r>
+        <w:rPr>
+          <w:rFonts w:ascii="EB Garamond" w:cs="EB Garamond" w:eastAsia="EB Garamond" w:hAnsi="EB Garamond"/>
+          <w:sz w:val="20"/>
+          <w:szCs w:val="20"/>
+        </w:rPr>
+        <w:t xml:space="preserve">Researched and compiled 150+ scholarships, awards, and college resources for Dallas-area teens, partnering with Dr. DeWone Bennett, PsyD</w:t>
+      </w:r>
+    </w:p>
+    <w:p>
+      <w:pPr>
+        <w:pStyle w:val="ListParagraph"/>
+        <w:numPr>
+          <w:ilvl w:val="0"/>
+          <w:numId w:val="2"/>
+        </w:numPr>
+        <w:spacing w:after="0" w:before="0" w:line="216" w:lineRule="auto"/>
+      </w:pPr>
+      <w:r>
+        <w:rPr>
+          <w:rFonts w:ascii="EB Garamond" w:cs="EB Garamond" w:eastAsia="EB Garamond" w:hAnsi="EB Garamond"/>
+          <w:sz w:val="20"/>
+          <w:szCs w:val="20"/>
+        </w:rPr>
+        <w:t xml:space="preserve">Built a centralized database organizing funding and application resources in one place, making college support much easier for teens to find</w:t>
+      </w:r>
+    </w:p>
+    <w:p>
+      <w:pPr>
+        <w:pStyle w:val="ListParagraph"/>
+        <w:numPr>
+          <w:ilvl w:val="0"/>
+          <w:numId w:val="2"/>
+        </w:numPr>
+        <w:spacing w:after="0" w:before="0" w:line="216" w:lineRule="auto"/>
+      </w:pPr>
+      <w:r>
+        <w:rPr>
+          <w:rFonts w:ascii="EB Garamond" w:cs="EB Garamond" w:eastAsia="EB Garamond" w:hAnsi="EB Garamond"/>
+          <w:sz w:val="20"/>
+          <w:szCs w:val="20"/>
+        </w:rPr>
+        <w:t xml:space="preserve">Spoke to 15 Dallas-area teens about personal college and career journey, helping them see a clear path to higher education and scholarships</w:t>
       </w:r>
     </w:p>
     <w:p>
@@ -975,7 +1001,7 @@
         <w:tabs>
           <w:tab w:val="right" w:pos="11228"/>
         </w:tabs>
-        <w:spacing w:after="0" w:before="24" w:line="198" w:lineRule="auto"/>
+        <w:spacing w:after="0" w:before="24" w:line="216" w:lineRule="auto"/>
       </w:pPr>
       <w:r>
         <w:rPr>
@@ -985,20 +1011,28 @@
           <w:sz w:val="20"/>
           <w:szCs w:val="20"/>
         </w:rPr>
-        <w:t xml:space="preserve">Management Leadership for Tomorrow (MLT)</w:t>
-      </w:r>
-      <w:r>
-        <w:rPr>
-          <w:rFonts w:ascii="EB Garamond" w:cs="EB Garamond" w:eastAsia="EB Garamond" w:hAnsi="EB Garamond"/>
-          <w:sz w:val="20"/>
-          <w:szCs w:val="20"/>
-        </w:rPr>
-        <w:t xml:space="preserve">	Sep 2026 - Present</w:t>
-      </w:r>
-    </w:p>
-    <w:p>
-      <w:pPr>
-        <w:spacing w:after="0" w:before="0" w:line="198" w:lineRule="auto"/>
+        <w:t xml:space="preserve">Vandy 2 Wall Street</w:t>
+      </w:r>
+      <w:r>
+        <w:rPr>
+          <w:rFonts w:ascii="EB Garamond" w:cs="EB Garamond" w:eastAsia="EB Garamond" w:hAnsi="EB Garamond"/>
+          <w:sz w:val="20"/>
+          <w:szCs w:val="20"/>
+        </w:rPr>
+        <w:t xml:space="preserve"> | Nashville, TN</w:t>
+      </w:r>
+      <w:r>
+        <w:rPr>
+          <w:rFonts w:ascii="EB Garamond" w:cs="EB Garamond" w:eastAsia="EB Garamond" w:hAnsi="EB Garamond"/>
+          <w:sz w:val="20"/>
+          <w:szCs w:val="20"/>
+        </w:rPr>
+        <w:t xml:space="preserve">	Jun 2026</w:t>
+      </w:r>
+    </w:p>
+    <w:p>
+      <w:pPr>
+        <w:spacing w:after="0" w:before="0" w:line="216" w:lineRule="auto"/>
       </w:pPr>
       <w:r>
         <w:rPr>
@@ -1008,25 +1042,61 @@
           <w:sz w:val="20"/>
           <w:szCs w:val="20"/>
         </w:rPr>
-        <w:t xml:space="preserve">Career Prep Fellow</w:t>
-      </w:r>
-    </w:p>
-    <w:p>
-      <w:pPr>
-        <w:pStyle w:val="ListParagraph"/>
-        <w:numPr>
-          <w:ilvl w:val="0"/>
-          <w:numId w:val="2"/>
-        </w:numPr>
-        <w:spacing w:after="0" w:before="0" w:line="198" w:lineRule="auto"/>
-      </w:pPr>
-      <w:r>
-        <w:rPr>
-          <w:rFonts w:ascii="EB Garamond" w:cs="EB Garamond" w:eastAsia="EB Garamond" w:hAnsi="EB Garamond"/>
-          <w:sz w:val="20"/>
-          <w:szCs w:val="20"/>
-        </w:rPr>
-        <w:t xml:space="preserve">Selected for highly competitive 18+-month fellowship accelerating emerging leaders' careers through coaching, mentorship, and skill-building</w:t>
+        <w:t xml:space="preserve">Team Co-Lead, M&amp;A Pitch Competition</w:t>
+      </w:r>
+    </w:p>
+    <w:p>
+      <w:pPr>
+        <w:pStyle w:val="ListParagraph"/>
+        <w:numPr>
+          <w:ilvl w:val="0"/>
+          <w:numId w:val="2"/>
+        </w:numPr>
+        <w:spacing w:after="0" w:before="0" w:line="216" w:lineRule="auto"/>
+      </w:pPr>
+      <w:r>
+        <w:rPr>
+          <w:rFonts w:ascii="EB Garamond" w:cs="EB Garamond" w:eastAsia="EB Garamond" w:hAnsi="EB Garamond"/>
+          <w:sz w:val="20"/>
+          <w:szCs w:val="20"/>
+        </w:rPr>
+        <w:t xml:space="preserve">Selected for inaugural M&amp;A Pitch Competition; recommended selling a 51% controlling stake in Athleta while retaining 49% of the upside</w:t>
+      </w:r>
+    </w:p>
+    <w:p>
+      <w:pPr>
+        <w:pStyle w:val="ListParagraph"/>
+        <w:numPr>
+          <w:ilvl w:val="0"/>
+          <w:numId w:val="2"/>
+        </w:numPr>
+        <w:spacing w:after="0" w:before="0" w:line="216" w:lineRule="auto"/>
+      </w:pPr>
+      <w:r>
+        <w:rPr>
+          <w:rFonts w:ascii="EB Garamond" w:cs="EB Garamond" w:eastAsia="EB Garamond" w:hAnsi="EB Garamond"/>
+          <w:sz w:val="20"/>
+          <w:szCs w:val="20"/>
+        </w:rPr>
+        <w:t xml:space="preserve">Modeled five-year operating case, DCF, sum-of-the-parts, and buyer returns analysis supporting a $561M enterprise value and a 19-20% IRR</w:t>
+      </w:r>
+    </w:p>
+    <w:p>
+      <w:pPr>
+        <w:pStyle w:val="ListParagraph"/>
+        <w:numPr>
+          <w:ilvl w:val="0"/>
+          <w:numId w:val="2"/>
+        </w:numPr>
+        <w:spacing w:after="0" w:before="0" w:line="216" w:lineRule="auto"/>
+      </w:pPr>
+      <w:r>
+        <w:rPr>
+          <w:rFonts w:ascii="EB Garamond" w:cs="EB Garamond" w:eastAsia="EB Garamond" w:hAnsi="EB Garamond"/>
+          <w:sz w:val="20"/>
+          <w:szCs w:val="20"/>
+        </w:rPr>
+        <w:t xml:space="preserve">Analyzed SEC filings, equity research, trading comparables, and precedent transactions to co-author a four-page investment banking memo</w:t>
       </w:r>
     </w:p>
     <w:p>
@@ -1034,7 +1104,7 @@
         <w:tabs>
           <w:tab w:val="right" w:pos="11228"/>
         </w:tabs>
-        <w:spacing w:after="0" w:before="24" w:line="198" w:lineRule="auto"/>
+        <w:spacing w:after="0" w:before="24" w:line="216" w:lineRule="auto"/>
       </w:pPr>
       <w:r>
         <w:rPr>
@@ -1044,7 +1114,7 @@
           <w:sz w:val="20"/>
           <w:szCs w:val="20"/>
         </w:rPr>
-        <w:t xml:space="preserve">Hear My Cry Foundation</w:t>
+        <w:t xml:space="preserve">SEYA</w:t>
       </w:r>
       <w:r>
         <w:rPr>
@@ -1060,12 +1130,12 @@
           <w:sz w:val="20"/>
           <w:szCs w:val="20"/>
         </w:rPr>
-        <w:t xml:space="preserve">	Jul 2026 - Aug 2026</w:t>
-      </w:r>
-    </w:p>
-    <w:p>
-      <w:pPr>
-        <w:spacing w:after="0" w:before="0" w:line="198" w:lineRule="auto"/>
+        <w:t xml:space="preserve">	Jun 2025 - Jul 2026</w:t>
+      </w:r>
+    </w:p>
+    <w:p>
+      <w:pPr>
+        <w:spacing w:after="0" w:before="0" w:line="216" w:lineRule="auto"/>
       </w:pPr>
       <w:r>
         <w:rPr>
@@ -1075,194 +1145,6 @@
           <w:sz w:val="20"/>
           <w:szCs w:val="20"/>
         </w:rPr>
-        <w:t xml:space="preserve">College Access Volunteer</w:t>
-      </w:r>
-    </w:p>
-    <w:p>
-      <w:pPr>
-        <w:pStyle w:val="ListParagraph"/>
-        <w:numPr>
-          <w:ilvl w:val="0"/>
-          <w:numId w:val="2"/>
-        </w:numPr>
-        <w:spacing w:after="0" w:before="0" w:line="198" w:lineRule="auto"/>
-      </w:pPr>
-      <w:r>
-        <w:rPr>
-          <w:rFonts w:ascii="EB Garamond" w:cs="EB Garamond" w:eastAsia="EB Garamond" w:hAnsi="EB Garamond"/>
-          <w:sz w:val="20"/>
-          <w:szCs w:val="20"/>
-        </w:rPr>
-        <w:t xml:space="preserve">Researched and compiled 150+ scholarships, awards, and college resources for Dallas-area teens, partnering with Dr. DeWone Bennett, PsyD</w:t>
-      </w:r>
-    </w:p>
-    <w:p>
-      <w:pPr>
-        <w:pStyle w:val="ListParagraph"/>
-        <w:numPr>
-          <w:ilvl w:val="0"/>
-          <w:numId w:val="2"/>
-        </w:numPr>
-        <w:spacing w:after="0" w:before="0" w:line="198" w:lineRule="auto"/>
-      </w:pPr>
-      <w:r>
-        <w:rPr>
-          <w:rFonts w:ascii="EB Garamond" w:cs="EB Garamond" w:eastAsia="EB Garamond" w:hAnsi="EB Garamond"/>
-          <w:sz w:val="20"/>
-          <w:szCs w:val="20"/>
-        </w:rPr>
-        <w:t xml:space="preserve">Built a centralized database organizing funding and application resources in one place, making college support much easier for teens to find</w:t>
-      </w:r>
-    </w:p>
-    <w:p>
-      <w:pPr>
-        <w:tabs>
-          <w:tab w:val="right" w:pos="11228"/>
-        </w:tabs>
-        <w:spacing w:after="0" w:before="24" w:line="198" w:lineRule="auto"/>
-      </w:pPr>
-      <w:r>
-        <w:rPr>
-          <w:rFonts w:ascii="EB Garamond" w:cs="EB Garamond" w:eastAsia="EB Garamond" w:hAnsi="EB Garamond"/>
-          <w:b/>
-          <w:bCs/>
-          <w:sz w:val="20"/>
-          <w:szCs w:val="20"/>
-        </w:rPr>
-        <w:t xml:space="preserve">Vandy 2 Wall Street</w:t>
-      </w:r>
-      <w:r>
-        <w:rPr>
-          <w:rFonts w:ascii="EB Garamond" w:cs="EB Garamond" w:eastAsia="EB Garamond" w:hAnsi="EB Garamond"/>
-          <w:sz w:val="20"/>
-          <w:szCs w:val="20"/>
-        </w:rPr>
-        <w:t xml:space="preserve"> | Nashville, TN</w:t>
-      </w:r>
-      <w:r>
-        <w:rPr>
-          <w:rFonts w:ascii="EB Garamond" w:cs="EB Garamond" w:eastAsia="EB Garamond" w:hAnsi="EB Garamond"/>
-          <w:sz w:val="20"/>
-          <w:szCs w:val="20"/>
-        </w:rPr>
-        <w:t xml:space="preserve">	Jun 2026</w:t>
-      </w:r>
-    </w:p>
-    <w:p>
-      <w:pPr>
-        <w:spacing w:after="0" w:before="0" w:line="198" w:lineRule="auto"/>
-      </w:pPr>
-      <w:r>
-        <w:rPr>
-          <w:rFonts w:ascii="EB Garamond" w:cs="EB Garamond" w:eastAsia="EB Garamond" w:hAnsi="EB Garamond"/>
-          <w:i/>
-          <w:iCs/>
-          <w:sz w:val="20"/>
-          <w:szCs w:val="20"/>
-        </w:rPr>
-        <w:t xml:space="preserve">Team Co-Lead, M&amp;A Pitch Competition</w:t>
-      </w:r>
-    </w:p>
-    <w:p>
-      <w:pPr>
-        <w:pStyle w:val="ListParagraph"/>
-        <w:numPr>
-          <w:ilvl w:val="0"/>
-          <w:numId w:val="2"/>
-        </w:numPr>
-        <w:spacing w:after="0" w:before="0" w:line="198" w:lineRule="auto"/>
-      </w:pPr>
-      <w:r>
-        <w:rPr>
-          <w:rFonts w:ascii="EB Garamond" w:cs="EB Garamond" w:eastAsia="EB Garamond" w:hAnsi="EB Garamond"/>
-          <w:sz w:val="20"/>
-          <w:szCs w:val="20"/>
-        </w:rPr>
-        <w:t xml:space="preserve">Selected for inaugural M&amp;A Pitch Competition; recommended selling a 51% controlling stake in Athleta while retaining 49% of the upside</w:t>
-      </w:r>
-    </w:p>
-    <w:p>
-      <w:pPr>
-        <w:pStyle w:val="ListParagraph"/>
-        <w:numPr>
-          <w:ilvl w:val="0"/>
-          <w:numId w:val="2"/>
-        </w:numPr>
-        <w:spacing w:after="0" w:before="0" w:line="198" w:lineRule="auto"/>
-      </w:pPr>
-      <w:r>
-        <w:rPr>
-          <w:rFonts w:ascii="EB Garamond" w:cs="EB Garamond" w:eastAsia="EB Garamond" w:hAnsi="EB Garamond"/>
-          <w:sz w:val="20"/>
-          <w:szCs w:val="20"/>
-        </w:rPr>
-        <w:t xml:space="preserve">Modeled five-year operating case, DCF, sum-of-the-parts, and buyer returns analysis supporting a $561M enterprise value and a 19-20% IRR</w:t>
-      </w:r>
-    </w:p>
-    <w:p>
-      <w:pPr>
-        <w:pStyle w:val="ListParagraph"/>
-        <w:numPr>
-          <w:ilvl w:val="0"/>
-          <w:numId w:val="2"/>
-        </w:numPr>
-        <w:spacing w:after="0" w:before="0" w:line="198" w:lineRule="auto"/>
-      </w:pPr>
-      <w:r>
-        <w:rPr>
-          <w:rFonts w:ascii="EB Garamond" w:cs="EB Garamond" w:eastAsia="EB Garamond" w:hAnsi="EB Garamond"/>
-          <w:sz w:val="20"/>
-          <w:szCs w:val="20"/>
-        </w:rPr>
-        <w:t xml:space="preserve">Analyzed SEC filings, equity research, trading comparables, and precedent transactions to co-author a four-page investment banking memo</w:t>
-      </w:r>
-    </w:p>
-    <w:p>
-      <w:pPr>
-        <w:tabs>
-          <w:tab w:val="right" w:pos="11228"/>
-        </w:tabs>
-        <w:spacing w:after="0" w:before="24" w:line="198" w:lineRule="auto"/>
-      </w:pPr>
-      <w:r>
-        <w:rPr>
-          <w:rFonts w:ascii="EB Garamond" w:cs="EB Garamond" w:eastAsia="EB Garamond" w:hAnsi="EB Garamond"/>
-          <w:b/>
-          <w:bCs/>
-          <w:sz w:val="20"/>
-          <w:szCs w:val="20"/>
-        </w:rPr>
-        <w:t xml:space="preserve">SEYA</w:t>
-      </w:r>
-      <w:r>
-        <w:rPr>
-          <w:rFonts w:ascii="EB Garamond" w:cs="EB Garamond" w:eastAsia="EB Garamond" w:hAnsi="EB Garamond"/>
-          <w:sz w:val="20"/>
-          <w:szCs w:val="20"/>
-        </w:rPr>
-        <w:t xml:space="preserve"> | Dallas, TX</w:t>
-      </w:r>
-      <w:r>
-        <w:rPr>
-          <w:rFonts w:ascii="EB Garamond" w:cs="EB Garamond" w:eastAsia="EB Garamond" w:hAnsi="EB Garamond"/>
-          <w:sz w:val="20"/>
-          <w:szCs w:val="20"/>
-        </w:rPr>
-        <w:t xml:space="preserve">	Jun 2025 - Jul 2026</w:t>
-      </w:r>
-    </w:p>
-    <w:p>
-      <w:pPr>
-        <w:spacing w:after="0" w:before="0" w:line="198" w:lineRule="auto"/>
-      </w:pPr>
-      <w:r>
-        <w:rPr>
-          <w:rFonts w:ascii="EB Garamond" w:cs="EB Garamond" w:eastAsia="EB Garamond" w:hAnsi="EB Garamond"/>
-          <w:i/>
-          <w:iCs/>
-          <w:sz w:val="20"/>
-          <w:szCs w:val="20"/>
-        </w:rPr>
         <w:t xml:space="preserve">Co-Founder, DTC Apparel Brand</w:t>
       </w:r>
     </w:p>
@@ -1273,7 +1155,7 @@
           <w:ilvl w:val="0"/>
           <w:numId w:val="2"/>
         </w:numPr>
-        <w:spacing w:after="0" w:before="0" w:line="198" w:lineRule="auto"/>
+        <w:spacing w:after="0" w:before="0" w:line="216" w:lineRule="auto"/>
       </w:pPr>
       <w:r>
         <w:rPr>
@@ -1291,7 +1173,7 @@
           <w:ilvl w:val="0"/>
           <w:numId w:val="2"/>
         </w:numPr>
-        <w:spacing w:after="0" w:before="0" w:line="198" w:lineRule="auto"/>
+        <w:spacing w:after="0" w:before="0" w:line="216" w:lineRule="auto"/>
       </w:pPr>
       <w:r>
         <w:rPr>
@@ -1309,7 +1191,7 @@
           <w:ilvl w:val="0"/>
           <w:numId w:val="2"/>
         </w:numPr>
-        <w:spacing w:after="0" w:before="0" w:line="198" w:lineRule="auto"/>
+        <w:spacing w:after="0" w:before="0" w:line="216" w:lineRule="auto"/>
       </w:pPr>
       <w:r>
         <w:rPr>
@@ -1325,7 +1207,7 @@
         <w:pBdr>
           <w:bottom w:val="single" w:color="000000" w:sz="6" w:space="1"/>
         </w:pBdr>
-        <w:spacing w:after="40" w:before="80" w:line="198" w:lineRule="auto"/>
+        <w:spacing w:after="40" w:before="80" w:line="216" w:lineRule="auto"/>
       </w:pPr>
       <w:r>
         <w:rPr>
@@ -1410,7 +1292,7 @@
     </w:p>
     <w:p>
       <w:pPr>
-        <w:spacing w:after="0" w:before="30" w:line="198" w:lineRule="auto"/>
+        <w:spacing w:after="0" w:before="30" w:line="216" w:lineRule="auto"/>
       </w:pPr>
       <w:r>
         <w:rPr>
@@ -1433,7 +1315,7 @@
     </w:p>
     <w:p>
       <w:pPr>
-        <w:spacing w:after="0" w:before="0" w:line="198" w:lineRule="auto"/>
+        <w:spacing w:after="0" w:before="0" w:line="216" w:lineRule="auto"/>
       </w:pPr>
       <w:r>
         <w:rPr>
@@ -1443,6 +1325,29 @@
           <w:sz w:val="20"/>
           <w:szCs w:val="20"/>
         </w:rPr>
+        <w:t xml:space="preserve">Programs: </w:t>
+      </w:r>
+      <w:r>
+        <w:rPr>
+          <w:rFonts w:ascii="EB Garamond" w:cs="EB Garamond" w:eastAsia="EB Garamond" w:hAnsi="EB Garamond"/>
+          <w:sz w:val="20"/>
+          <w:szCs w:val="20"/>
+        </w:rPr>
+        <w:t xml:space="preserve">Management Leadership for Tomorrow (MLT) Career Prep Fellow, Recalc Finance Accelerator (Fall 2026)</w:t>
+      </w:r>
+    </w:p>
+    <w:p>
+      <w:pPr>
+        <w:spacing w:after="0" w:before="0" w:line="216" w:lineRule="auto"/>
+      </w:pPr>
+      <w:r>
+        <w:rPr>
+          <w:rFonts w:ascii="EB Garamond" w:cs="EB Garamond" w:eastAsia="EB Garamond" w:hAnsi="EB Garamond"/>
+          <w:b/>
+          <w:bCs/>
+          <w:sz w:val="20"/>
+          <w:szCs w:val="20"/>
+        </w:rPr>
         <w:t xml:space="preserve">Activities: </w:t>
       </w:r>
       <w:r>
@@ -1456,7 +1361,7 @@
     </w:p>
     <w:p>
       <w:pPr>
-        <w:spacing w:after="0" w:before="0" w:line="198" w:lineRule="auto"/>
+        <w:spacing w:after="0" w:before="0" w:line="216" w:lineRule="auto"/>
       </w:pPr>
       <w:r>
         <w:rPr>

</xml_diff>

<commit_message>
Resume: list SEO Career, MLT, and Recalc together under Programs
Co-Authored-By: Claude Opus 5.5 <noreply@anthropic.com>
Claude-Session: https://claude.ai/code/session_01G3JV145HgjUfXQyW7hEcYE
</commit_message>
<xml_diff>
--- a/assets/Jennifer-Amogu-Resume.docx
+++ b/assets/Jennifer-Amogu-Resume.docx
@@ -20,7 +20,7 @@
     </w:p>
     <w:p>
       <w:pPr>
-        <w:spacing w:after="0" w:before="0" w:line="216" w:lineRule="auto"/>
+        <w:spacing w:after="0" w:before="0" w:line="234" w:lineRule="auto"/>
         <w:jc w:val="center"/>
       </w:pPr>
       <w:r>
@@ -37,7 +37,7 @@
         <w:pBdr>
           <w:bottom w:val="single" w:color="000000" w:sz="6" w:space="1"/>
         </w:pBdr>
-        <w:spacing w:after="40" w:before="60" w:line="216" w:lineRule="auto"/>
+        <w:spacing w:after="40" w:before="60" w:line="234" w:lineRule="auto"/>
       </w:pPr>
       <w:r>
         <w:rPr>
@@ -61,7 +61,7 @@
         <w:tabs>
           <w:tab w:val="right" w:pos="11228"/>
         </w:tabs>
-        <w:spacing w:after="0" w:before="40" w:line="216" w:lineRule="auto"/>
+        <w:spacing w:after="0" w:before="40" w:line="234" w:lineRule="auto"/>
       </w:pPr>
       <w:r>
         <w:rPr>
@@ -95,7 +95,7 @@
         <w:tabs>
           <w:tab w:val="right" w:pos="11228"/>
         </w:tabs>
-        <w:spacing w:after="0" w:before="0" w:line="216" w:lineRule="auto"/>
+        <w:spacing w:after="0" w:before="0" w:line="234" w:lineRule="auto"/>
       </w:pPr>
       <w:r>
         <w:rPr>
@@ -118,7 +118,7 @@
     </w:p>
     <w:p>
       <w:pPr>
-        <w:spacing w:after="0" w:before="0" w:line="216" w:lineRule="auto"/>
+        <w:spacing w:after="0" w:before="0" w:line="234" w:lineRule="auto"/>
       </w:pPr>
       <w:r>
         <w:rPr>
@@ -144,7 +144,7 @@
         <w:pBdr>
           <w:bottom w:val="single" w:color="000000" w:sz="6" w:space="1"/>
         </w:pBdr>
-        <w:spacing w:after="40" w:before="80" w:line="216" w:lineRule="auto"/>
+        <w:spacing w:after="40" w:before="80" w:line="234" w:lineRule="auto"/>
       </w:pPr>
       <w:r>
         <w:rPr>
@@ -192,7 +192,7 @@
         <w:tabs>
           <w:tab w:val="right" w:pos="11228"/>
         </w:tabs>
-        <w:spacing w:after="0" w:before="40" w:line="216" w:lineRule="auto"/>
+        <w:spacing w:after="0" w:before="40" w:line="234" w:lineRule="auto"/>
       </w:pPr>
       <w:r>
         <w:rPr>
@@ -223,7 +223,7 @@
     </w:p>
     <w:p>
       <w:pPr>
-        <w:spacing w:after="0" w:before="0" w:line="216" w:lineRule="auto"/>
+        <w:spacing w:after="0" w:before="0" w:line="234" w:lineRule="auto"/>
       </w:pPr>
       <w:r>
         <w:rPr>
@@ -243,7 +243,7 @@
           <w:ilvl w:val="0"/>
           <w:numId w:val="2"/>
         </w:numPr>
-        <w:spacing w:after="0" w:before="0" w:line="216" w:lineRule="auto"/>
+        <w:spacing w:after="0" w:before="0" w:line="234" w:lineRule="auto"/>
       </w:pPr>
       <w:r>
         <w:rPr>
@@ -259,7 +259,7 @@
         <w:tabs>
           <w:tab w:val="right" w:pos="11228"/>
         </w:tabs>
-        <w:spacing w:after="0" w:before="24" w:line="216" w:lineRule="auto"/>
+        <w:spacing w:after="0" w:before="24" w:line="234" w:lineRule="auto"/>
       </w:pPr>
       <w:r>
         <w:rPr>
@@ -290,7 +290,7 @@
     </w:p>
     <w:p>
       <w:pPr>
-        <w:spacing w:after="0" w:before="0" w:line="216" w:lineRule="auto"/>
+        <w:spacing w:after="0" w:before="0" w:line="234" w:lineRule="auto"/>
       </w:pPr>
       <w:r>
         <w:rPr>
@@ -310,7 +310,7 @@
           <w:ilvl w:val="0"/>
           <w:numId w:val="2"/>
         </w:numPr>
-        <w:spacing w:after="0" w:before="0" w:line="216" w:lineRule="auto"/>
+        <w:spacing w:after="0" w:before="0" w:line="234" w:lineRule="auto"/>
       </w:pPr>
       <w:r>
         <w:rPr>
@@ -328,7 +328,7 @@
           <w:ilvl w:val="0"/>
           <w:numId w:val="2"/>
         </w:numPr>
-        <w:spacing w:after="0" w:before="0" w:line="216" w:lineRule="auto"/>
+        <w:spacing w:after="0" w:before="0" w:line="234" w:lineRule="auto"/>
       </w:pPr>
       <w:r>
         <w:rPr>
@@ -346,7 +346,7 @@
           <w:ilvl w:val="0"/>
           <w:numId w:val="2"/>
         </w:numPr>
-        <w:spacing w:after="0" w:before="0" w:line="216" w:lineRule="auto"/>
+        <w:spacing w:after="0" w:before="0" w:line="234" w:lineRule="auto"/>
       </w:pPr>
       <w:r>
         <w:rPr>
@@ -364,7 +364,7 @@
           <w:ilvl w:val="0"/>
           <w:numId w:val="2"/>
         </w:numPr>
-        <w:spacing w:after="0" w:before="0" w:line="216" w:lineRule="auto"/>
+        <w:spacing w:after="0" w:before="0" w:line="234" w:lineRule="auto"/>
       </w:pPr>
       <w:r>
         <w:rPr>
@@ -380,7 +380,7 @@
         <w:tabs>
           <w:tab w:val="right" w:pos="11228"/>
         </w:tabs>
-        <w:spacing w:after="0" w:before="24" w:line="216" w:lineRule="auto"/>
+        <w:spacing w:after="0" w:before="24" w:line="234" w:lineRule="auto"/>
       </w:pPr>
       <w:r>
         <w:rPr>
@@ -411,7 +411,7 @@
     </w:p>
     <w:p>
       <w:pPr>
-        <w:spacing w:after="0" w:before="0" w:line="216" w:lineRule="auto"/>
+        <w:spacing w:after="0" w:before="0" w:line="234" w:lineRule="auto"/>
       </w:pPr>
       <w:r>
         <w:rPr>
@@ -431,7 +431,7 @@
           <w:ilvl w:val="0"/>
           <w:numId w:val="2"/>
         </w:numPr>
-        <w:spacing w:after="0" w:before="0" w:line="216" w:lineRule="auto"/>
+        <w:spacing w:after="0" w:before="0" w:line="234" w:lineRule="auto"/>
       </w:pPr>
       <w:r>
         <w:rPr>
@@ -449,7 +449,7 @@
           <w:ilvl w:val="0"/>
           <w:numId w:val="2"/>
         </w:numPr>
-        <w:spacing w:after="0" w:before="0" w:line="216" w:lineRule="auto"/>
+        <w:spacing w:after="0" w:before="0" w:line="234" w:lineRule="auto"/>
       </w:pPr>
       <w:r>
         <w:rPr>
@@ -467,7 +467,7 @@
           <w:ilvl w:val="0"/>
           <w:numId w:val="2"/>
         </w:numPr>
-        <w:spacing w:after="0" w:before="0" w:line="216" w:lineRule="auto"/>
+        <w:spacing w:after="0" w:before="0" w:line="234" w:lineRule="auto"/>
       </w:pPr>
       <w:r>
         <w:rPr>
@@ -485,7 +485,7 @@
           <w:ilvl w:val="0"/>
           <w:numId w:val="2"/>
         </w:numPr>
-        <w:spacing w:after="0" w:before="0" w:line="216" w:lineRule="auto"/>
+        <w:spacing w:after="0" w:before="0" w:line="234" w:lineRule="auto"/>
       </w:pPr>
       <w:r>
         <w:rPr>
@@ -501,7 +501,7 @@
         <w:tabs>
           <w:tab w:val="right" w:pos="11228"/>
         </w:tabs>
-        <w:spacing w:after="0" w:before="24" w:line="216" w:lineRule="auto"/>
+        <w:spacing w:after="0" w:before="24" w:line="234" w:lineRule="auto"/>
       </w:pPr>
       <w:r>
         <w:rPr>
@@ -532,7 +532,7 @@
     </w:p>
     <w:p>
       <w:pPr>
-        <w:spacing w:after="0" w:before="0" w:line="216" w:lineRule="auto"/>
+        <w:spacing w:after="0" w:before="0" w:line="234" w:lineRule="auto"/>
       </w:pPr>
       <w:r>
         <w:rPr>
@@ -552,7 +552,7 @@
           <w:ilvl w:val="0"/>
           <w:numId w:val="2"/>
         </w:numPr>
-        <w:spacing w:after="0" w:before="0" w:line="216" w:lineRule="auto"/>
+        <w:spacing w:after="0" w:before="0" w:line="234" w:lineRule="auto"/>
       </w:pPr>
       <w:r>
         <w:rPr>
@@ -570,7 +570,7 @@
           <w:ilvl w:val="0"/>
           <w:numId w:val="2"/>
         </w:numPr>
-        <w:spacing w:after="0" w:before="0" w:line="216" w:lineRule="auto"/>
+        <w:spacing w:after="0" w:before="0" w:line="234" w:lineRule="auto"/>
       </w:pPr>
       <w:r>
         <w:rPr>
@@ -588,7 +588,7 @@
           <w:ilvl w:val="0"/>
           <w:numId w:val="2"/>
         </w:numPr>
-        <w:spacing w:after="0" w:before="0" w:line="216" w:lineRule="auto"/>
+        <w:spacing w:after="0" w:before="0" w:line="234" w:lineRule="auto"/>
       </w:pPr>
       <w:r>
         <w:rPr>
@@ -606,7 +606,7 @@
           <w:ilvl w:val="0"/>
           <w:numId w:val="2"/>
         </w:numPr>
-        <w:spacing w:after="0" w:before="0" w:line="216" w:lineRule="auto"/>
+        <w:spacing w:after="0" w:before="0" w:line="234" w:lineRule="auto"/>
       </w:pPr>
       <w:r>
         <w:rPr>
@@ -622,7 +622,7 @@
         <w:tabs>
           <w:tab w:val="right" w:pos="11228"/>
         </w:tabs>
-        <w:spacing w:after="0" w:before="24" w:line="216" w:lineRule="auto"/>
+        <w:spacing w:after="0" w:before="24" w:line="234" w:lineRule="auto"/>
       </w:pPr>
       <w:r>
         <w:rPr>
@@ -653,7 +653,7 @@
     </w:p>
     <w:p>
       <w:pPr>
-        <w:spacing w:after="0" w:before="0" w:line="216" w:lineRule="auto"/>
+        <w:spacing w:after="0" w:before="0" w:line="234" w:lineRule="auto"/>
       </w:pPr>
       <w:r>
         <w:rPr>
@@ -673,7 +673,7 @@
           <w:ilvl w:val="0"/>
           <w:numId w:val="2"/>
         </w:numPr>
-        <w:spacing w:after="0" w:before="0" w:line="216" w:lineRule="auto"/>
+        <w:spacing w:after="0" w:before="0" w:line="234" w:lineRule="auto"/>
       </w:pPr>
       <w:r>
         <w:rPr>
@@ -691,7 +691,7 @@
           <w:ilvl w:val="0"/>
           <w:numId w:val="2"/>
         </w:numPr>
-        <w:spacing w:after="0" w:before="0" w:line="216" w:lineRule="auto"/>
+        <w:spacing w:after="0" w:before="0" w:line="234" w:lineRule="auto"/>
       </w:pPr>
       <w:r>
         <w:rPr>
@@ -709,7 +709,7 @@
           <w:ilvl w:val="0"/>
           <w:numId w:val="2"/>
         </w:numPr>
-        <w:spacing w:after="0" w:before="0" w:line="216" w:lineRule="auto"/>
+        <w:spacing w:after="0" w:before="0" w:line="234" w:lineRule="auto"/>
       </w:pPr>
       <w:r>
         <w:rPr>
@@ -725,7 +725,7 @@
         <w:pBdr>
           <w:bottom w:val="single" w:color="000000" w:sz="6" w:space="1"/>
         </w:pBdr>
-        <w:spacing w:after="40" w:before="80" w:line="216" w:lineRule="auto"/>
+        <w:spacing w:after="40" w:before="80" w:line="234" w:lineRule="auto"/>
       </w:pPr>
       <w:r>
         <w:rPr>
@@ -821,7 +821,7 @@
         <w:tabs>
           <w:tab w:val="right" w:pos="11228"/>
         </w:tabs>
-        <w:spacing w:after="0" w:before="40" w:line="216" w:lineRule="auto"/>
+        <w:spacing w:after="0" w:before="40" w:line="234" w:lineRule="auto"/>
       </w:pPr>
       <w:r>
         <w:rPr>
@@ -831,20 +831,28 @@
           <w:sz w:val="20"/>
           <w:szCs w:val="20"/>
         </w:rPr>
-        <w:t xml:space="preserve">SEO Career</w:t>
-      </w:r>
-      <w:r>
-        <w:rPr>
-          <w:rFonts w:ascii="EB Garamond" w:cs="EB Garamond" w:eastAsia="EB Garamond" w:hAnsi="EB Garamond"/>
-          <w:sz w:val="20"/>
-          <w:szCs w:val="20"/>
-        </w:rPr>
-        <w:t xml:space="preserve">	Oct 2026 - Present</w:t>
-      </w:r>
-    </w:p>
-    <w:p>
-      <w:pPr>
-        <w:spacing w:after="0" w:before="0" w:line="216" w:lineRule="auto"/>
+        <w:t xml:space="preserve">Hear My Cry Foundation</w:t>
+      </w:r>
+      <w:r>
+        <w:rPr>
+          <w:rFonts w:ascii="EB Garamond" w:cs="EB Garamond" w:eastAsia="EB Garamond" w:hAnsi="EB Garamond"/>
+          <w:sz w:val="20"/>
+          <w:szCs w:val="20"/>
+        </w:rPr>
+        <w:t xml:space="preserve"> | Dallas, TX</w:t>
+      </w:r>
+      <w:r>
+        <w:rPr>
+          <w:rFonts w:ascii="EB Garamond" w:cs="EB Garamond" w:eastAsia="EB Garamond" w:hAnsi="EB Garamond"/>
+          <w:sz w:val="20"/>
+          <w:szCs w:val="20"/>
+        </w:rPr>
+        <w:t xml:space="preserve">	Jul 2026 - Aug 2026</w:t>
+      </w:r>
+    </w:p>
+    <w:p>
+      <w:pPr>
+        <w:spacing w:after="0" w:before="0" w:line="234" w:lineRule="auto"/>
       </w:pPr>
       <w:r>
         <w:rPr>
@@ -854,43 +862,61 @@
           <w:sz w:val="20"/>
           <w:szCs w:val="20"/>
         </w:rPr>
-        <w:t xml:space="preserve">Fellow, Alternative Investments &amp; Investment Banking</w:t>
-      </w:r>
-    </w:p>
-    <w:p>
-      <w:pPr>
-        <w:pStyle w:val="ListParagraph"/>
-        <w:numPr>
-          <w:ilvl w:val="0"/>
-          <w:numId w:val="2"/>
-        </w:numPr>
-        <w:spacing w:after="0" w:before="0" w:line="216" w:lineRule="auto"/>
-      </w:pPr>
-      <w:r>
-        <w:rPr>
-          <w:rFonts w:ascii="EB Garamond" w:cs="EB Garamond" w:eastAsia="EB Garamond" w:hAnsi="EB Garamond"/>
-          <w:sz w:val="20"/>
-          <w:szCs w:val="20"/>
-        </w:rPr>
-        <w:t xml:space="preserve">Selected for SEO Career's Alternative Investments and Investment Banking track, a highly selective program placing students at top-tier firms</w:t>
-      </w:r>
-    </w:p>
-    <w:p>
-      <w:pPr>
-        <w:pStyle w:val="ListParagraph"/>
-        <w:numPr>
-          <w:ilvl w:val="0"/>
-          <w:numId w:val="2"/>
-        </w:numPr>
-        <w:spacing w:after="0" w:before="0" w:line="216" w:lineRule="auto"/>
-      </w:pPr>
-      <w:r>
-        <w:rPr>
-          <w:rFonts w:ascii="EB Garamond" w:cs="EB Garamond" w:eastAsia="EB Garamond" w:hAnsi="EB Garamond"/>
-          <w:sz w:val="20"/>
-          <w:szCs w:val="20"/>
-        </w:rPr>
-        <w:t xml:space="preserve">Complete technical training in accounting, valuation, and financial modeling with coaching from SEO staff and mentors from partner firms</w:t>
+        <w:t xml:space="preserve">College Access Volunteer</w:t>
+      </w:r>
+    </w:p>
+    <w:p>
+      <w:pPr>
+        <w:pStyle w:val="ListParagraph"/>
+        <w:numPr>
+          <w:ilvl w:val="0"/>
+          <w:numId w:val="2"/>
+        </w:numPr>
+        <w:spacing w:after="0" w:before="0" w:line="234" w:lineRule="auto"/>
+      </w:pPr>
+      <w:r>
+        <w:rPr>
+          <w:rFonts w:ascii="EB Garamond" w:cs="EB Garamond" w:eastAsia="EB Garamond" w:hAnsi="EB Garamond"/>
+          <w:sz w:val="20"/>
+          <w:szCs w:val="20"/>
+        </w:rPr>
+        <w:t xml:space="preserve">Researched and compiled 150+ scholarships, awards, and college resources for Dallas-area teens, partnering with Dr. DeWone Bennett, PsyD</w:t>
+      </w:r>
+    </w:p>
+    <w:p>
+      <w:pPr>
+        <w:pStyle w:val="ListParagraph"/>
+        <w:numPr>
+          <w:ilvl w:val="0"/>
+          <w:numId w:val="2"/>
+        </w:numPr>
+        <w:spacing w:after="0" w:before="0" w:line="234" w:lineRule="auto"/>
+      </w:pPr>
+      <w:r>
+        <w:rPr>
+          <w:rFonts w:ascii="EB Garamond" w:cs="EB Garamond" w:eastAsia="EB Garamond" w:hAnsi="EB Garamond"/>
+          <w:sz w:val="20"/>
+          <w:szCs w:val="20"/>
+        </w:rPr>
+        <w:t xml:space="preserve">Built a centralized database organizing funding and application resources in one place, making college support much easier for teens to find</w:t>
+      </w:r>
+    </w:p>
+    <w:p>
+      <w:pPr>
+        <w:pStyle w:val="ListParagraph"/>
+        <w:numPr>
+          <w:ilvl w:val="0"/>
+          <w:numId w:val="2"/>
+        </w:numPr>
+        <w:spacing w:after="0" w:before="0" w:line="234" w:lineRule="auto"/>
+      </w:pPr>
+      <w:r>
+        <w:rPr>
+          <w:rFonts w:ascii="EB Garamond" w:cs="EB Garamond" w:eastAsia="EB Garamond" w:hAnsi="EB Garamond"/>
+          <w:sz w:val="20"/>
+          <w:szCs w:val="20"/>
+        </w:rPr>
+        <w:t xml:space="preserve">Spoke to 15 Dallas-area teens about personal college and career journey, helping them see a clear path to higher education and scholarships</w:t>
       </w:r>
     </w:p>
     <w:p>
@@ -898,7 +924,7 @@
         <w:tabs>
           <w:tab w:val="right" w:pos="11228"/>
         </w:tabs>
-        <w:spacing w:after="0" w:before="24" w:line="216" w:lineRule="auto"/>
+        <w:spacing w:after="0" w:before="24" w:line="234" w:lineRule="auto"/>
       </w:pPr>
       <w:r>
         <w:rPr>
@@ -908,28 +934,28 @@
           <w:sz w:val="20"/>
           <w:szCs w:val="20"/>
         </w:rPr>
-        <w:t xml:space="preserve">Hear My Cry Foundation</w:t>
-      </w:r>
-      <w:r>
-        <w:rPr>
-          <w:rFonts w:ascii="EB Garamond" w:cs="EB Garamond" w:eastAsia="EB Garamond" w:hAnsi="EB Garamond"/>
-          <w:sz w:val="20"/>
-          <w:szCs w:val="20"/>
-        </w:rPr>
-        <w:t xml:space="preserve"> | Dallas, TX</w:t>
-      </w:r>
-      <w:r>
-        <w:rPr>
-          <w:rFonts w:ascii="EB Garamond" w:cs="EB Garamond" w:eastAsia="EB Garamond" w:hAnsi="EB Garamond"/>
-          <w:sz w:val="20"/>
-          <w:szCs w:val="20"/>
-        </w:rPr>
-        <w:t xml:space="preserve">	Jul 2026 - Aug 2026</w:t>
-      </w:r>
-    </w:p>
-    <w:p>
-      <w:pPr>
-        <w:spacing w:after="0" w:before="0" w:line="216" w:lineRule="auto"/>
+        <w:t xml:space="preserve">Vandy 2 Wall Street</w:t>
+      </w:r>
+      <w:r>
+        <w:rPr>
+          <w:rFonts w:ascii="EB Garamond" w:cs="EB Garamond" w:eastAsia="EB Garamond" w:hAnsi="EB Garamond"/>
+          <w:sz w:val="20"/>
+          <w:szCs w:val="20"/>
+        </w:rPr>
+        <w:t xml:space="preserve"> | Nashville, TN</w:t>
+      </w:r>
+      <w:r>
+        <w:rPr>
+          <w:rFonts w:ascii="EB Garamond" w:cs="EB Garamond" w:eastAsia="EB Garamond" w:hAnsi="EB Garamond"/>
+          <w:sz w:val="20"/>
+          <w:szCs w:val="20"/>
+        </w:rPr>
+        <w:t xml:space="preserve">	Jun 2026</w:t>
+      </w:r>
+    </w:p>
+    <w:p>
+      <w:pPr>
+        <w:spacing w:after="0" w:before="0" w:line="234" w:lineRule="auto"/>
       </w:pPr>
       <w:r>
         <w:rPr>
@@ -939,61 +965,61 @@
           <w:sz w:val="20"/>
           <w:szCs w:val="20"/>
         </w:rPr>
-        <w:t xml:space="preserve">College Access Volunteer</w:t>
-      </w:r>
-    </w:p>
-    <w:p>
-      <w:pPr>
-        <w:pStyle w:val="ListParagraph"/>
-        <w:numPr>
-          <w:ilvl w:val="0"/>
-          <w:numId w:val="2"/>
-        </w:numPr>
-        <w:spacing w:after="0" w:before="0" w:line="216" w:lineRule="auto"/>
-      </w:pPr>
-      <w:r>
-        <w:rPr>
-          <w:rFonts w:ascii="EB Garamond" w:cs="EB Garamond" w:eastAsia="EB Garamond" w:hAnsi="EB Garamond"/>
-          <w:sz w:val="20"/>
-          <w:szCs w:val="20"/>
-        </w:rPr>
-        <w:t xml:space="preserve">Researched and compiled 150+ scholarships, awards, and college resources for Dallas-area teens, partnering with Dr. DeWone Bennett, PsyD</w:t>
-      </w:r>
-    </w:p>
-    <w:p>
-      <w:pPr>
-        <w:pStyle w:val="ListParagraph"/>
-        <w:numPr>
-          <w:ilvl w:val="0"/>
-          <w:numId w:val="2"/>
-        </w:numPr>
-        <w:spacing w:after="0" w:before="0" w:line="216" w:lineRule="auto"/>
-      </w:pPr>
-      <w:r>
-        <w:rPr>
-          <w:rFonts w:ascii="EB Garamond" w:cs="EB Garamond" w:eastAsia="EB Garamond" w:hAnsi="EB Garamond"/>
-          <w:sz w:val="20"/>
-          <w:szCs w:val="20"/>
-        </w:rPr>
-        <w:t xml:space="preserve">Built a centralized database organizing funding and application resources in one place, making college support much easier for teens to find</w:t>
-      </w:r>
-    </w:p>
-    <w:p>
-      <w:pPr>
-        <w:pStyle w:val="ListParagraph"/>
-        <w:numPr>
-          <w:ilvl w:val="0"/>
-          <w:numId w:val="2"/>
-        </w:numPr>
-        <w:spacing w:after="0" w:before="0" w:line="216" w:lineRule="auto"/>
-      </w:pPr>
-      <w:r>
-        <w:rPr>
-          <w:rFonts w:ascii="EB Garamond" w:cs="EB Garamond" w:eastAsia="EB Garamond" w:hAnsi="EB Garamond"/>
-          <w:sz w:val="20"/>
-          <w:szCs w:val="20"/>
-        </w:rPr>
-        <w:t xml:space="preserve">Spoke to 15 Dallas-area teens about personal college and career journey, helping them see a clear path to higher education and scholarships</w:t>
+        <w:t xml:space="preserve">Team Co-Lead, M&amp;A Pitch Competition</w:t>
+      </w:r>
+    </w:p>
+    <w:p>
+      <w:pPr>
+        <w:pStyle w:val="ListParagraph"/>
+        <w:numPr>
+          <w:ilvl w:val="0"/>
+          <w:numId w:val="2"/>
+        </w:numPr>
+        <w:spacing w:after="0" w:before="0" w:line="234" w:lineRule="auto"/>
+      </w:pPr>
+      <w:r>
+        <w:rPr>
+          <w:rFonts w:ascii="EB Garamond" w:cs="EB Garamond" w:eastAsia="EB Garamond" w:hAnsi="EB Garamond"/>
+          <w:sz w:val="20"/>
+          <w:szCs w:val="20"/>
+        </w:rPr>
+        <w:t xml:space="preserve">Selected for inaugural M&amp;A Pitch Competition; recommended selling a 51% controlling stake in Athleta while retaining 49% of the upside</w:t>
+      </w:r>
+    </w:p>
+    <w:p>
+      <w:pPr>
+        <w:pStyle w:val="ListParagraph"/>
+        <w:numPr>
+          <w:ilvl w:val="0"/>
+          <w:numId w:val="2"/>
+        </w:numPr>
+        <w:spacing w:after="0" w:before="0" w:line="234" w:lineRule="auto"/>
+      </w:pPr>
+      <w:r>
+        <w:rPr>
+          <w:rFonts w:ascii="EB Garamond" w:cs="EB Garamond" w:eastAsia="EB Garamond" w:hAnsi="EB Garamond"/>
+          <w:sz w:val="20"/>
+          <w:szCs w:val="20"/>
+        </w:rPr>
+        <w:t xml:space="preserve">Modeled five-year operating case, DCF, sum-of-the-parts, and buyer returns analysis supporting a $561M enterprise value and a 19-20% IRR</w:t>
+      </w:r>
+    </w:p>
+    <w:p>
+      <w:pPr>
+        <w:pStyle w:val="ListParagraph"/>
+        <w:numPr>
+          <w:ilvl w:val="0"/>
+          <w:numId w:val="2"/>
+        </w:numPr>
+        <w:spacing w:after="0" w:before="0" w:line="234" w:lineRule="auto"/>
+      </w:pPr>
+      <w:r>
+        <w:rPr>
+          <w:rFonts w:ascii="EB Garamond" w:cs="EB Garamond" w:eastAsia="EB Garamond" w:hAnsi="EB Garamond"/>
+          <w:sz w:val="20"/>
+          <w:szCs w:val="20"/>
+        </w:rPr>
+        <w:t xml:space="preserve">Analyzed SEC filings, equity research, trading comparables, and precedent transactions to co-author a four-page investment banking memo</w:t>
       </w:r>
     </w:p>
     <w:p>
@@ -1001,7 +1027,7 @@
         <w:tabs>
           <w:tab w:val="right" w:pos="11228"/>
         </w:tabs>
-        <w:spacing w:after="0" w:before="24" w:line="216" w:lineRule="auto"/>
+        <w:spacing w:after="0" w:before="24" w:line="234" w:lineRule="auto"/>
       </w:pPr>
       <w:r>
         <w:rPr>
@@ -1011,28 +1037,28 @@
           <w:sz w:val="20"/>
           <w:szCs w:val="20"/>
         </w:rPr>
-        <w:t xml:space="preserve">Vandy 2 Wall Street</w:t>
-      </w:r>
-      <w:r>
-        <w:rPr>
-          <w:rFonts w:ascii="EB Garamond" w:cs="EB Garamond" w:eastAsia="EB Garamond" w:hAnsi="EB Garamond"/>
-          <w:sz w:val="20"/>
-          <w:szCs w:val="20"/>
-        </w:rPr>
-        <w:t xml:space="preserve"> | Nashville, TN</w:t>
-      </w:r>
-      <w:r>
-        <w:rPr>
-          <w:rFonts w:ascii="EB Garamond" w:cs="EB Garamond" w:eastAsia="EB Garamond" w:hAnsi="EB Garamond"/>
-          <w:sz w:val="20"/>
-          <w:szCs w:val="20"/>
-        </w:rPr>
-        <w:t xml:space="preserve">	Jun 2026</w:t>
-      </w:r>
-    </w:p>
-    <w:p>
-      <w:pPr>
-        <w:spacing w:after="0" w:before="0" w:line="216" w:lineRule="auto"/>
+        <w:t xml:space="preserve">SEYA</w:t>
+      </w:r>
+      <w:r>
+        <w:rPr>
+          <w:rFonts w:ascii="EB Garamond" w:cs="EB Garamond" w:eastAsia="EB Garamond" w:hAnsi="EB Garamond"/>
+          <w:sz w:val="20"/>
+          <w:szCs w:val="20"/>
+        </w:rPr>
+        <w:t xml:space="preserve"> | Dallas, TX</w:t>
+      </w:r>
+      <w:r>
+        <w:rPr>
+          <w:rFonts w:ascii="EB Garamond" w:cs="EB Garamond" w:eastAsia="EB Garamond" w:hAnsi="EB Garamond"/>
+          <w:sz w:val="20"/>
+          <w:szCs w:val="20"/>
+        </w:rPr>
+        <w:t xml:space="preserve">	Jun 2025 - Jul 2026</w:t>
+      </w:r>
+    </w:p>
+    <w:p>
+      <w:pPr>
+        <w:spacing w:after="0" w:before="0" w:line="234" w:lineRule="auto"/>
       </w:pPr>
       <w:r>
         <w:rPr>
@@ -1042,109 +1068,6 @@
           <w:sz w:val="20"/>
           <w:szCs w:val="20"/>
         </w:rPr>
-        <w:t xml:space="preserve">Team Co-Lead, M&amp;A Pitch Competition</w:t>
-      </w:r>
-    </w:p>
-    <w:p>
-      <w:pPr>
-        <w:pStyle w:val="ListParagraph"/>
-        <w:numPr>
-          <w:ilvl w:val="0"/>
-          <w:numId w:val="2"/>
-        </w:numPr>
-        <w:spacing w:after="0" w:before="0" w:line="216" w:lineRule="auto"/>
-      </w:pPr>
-      <w:r>
-        <w:rPr>
-          <w:rFonts w:ascii="EB Garamond" w:cs="EB Garamond" w:eastAsia="EB Garamond" w:hAnsi="EB Garamond"/>
-          <w:sz w:val="20"/>
-          <w:szCs w:val="20"/>
-        </w:rPr>
-        <w:t xml:space="preserve">Selected for inaugural M&amp;A Pitch Competition; recommended selling a 51% controlling stake in Athleta while retaining 49% of the upside</w:t>
-      </w:r>
-    </w:p>
-    <w:p>
-      <w:pPr>
-        <w:pStyle w:val="ListParagraph"/>
-        <w:numPr>
-          <w:ilvl w:val="0"/>
-          <w:numId w:val="2"/>
-        </w:numPr>
-        <w:spacing w:after="0" w:before="0" w:line="216" w:lineRule="auto"/>
-      </w:pPr>
-      <w:r>
-        <w:rPr>
-          <w:rFonts w:ascii="EB Garamond" w:cs="EB Garamond" w:eastAsia="EB Garamond" w:hAnsi="EB Garamond"/>
-          <w:sz w:val="20"/>
-          <w:szCs w:val="20"/>
-        </w:rPr>
-        <w:t xml:space="preserve">Modeled five-year operating case, DCF, sum-of-the-parts, and buyer returns analysis supporting a $561M enterprise value and a 19-20% IRR</w:t>
-      </w:r>
-    </w:p>
-    <w:p>
-      <w:pPr>
-        <w:pStyle w:val="ListParagraph"/>
-        <w:numPr>
-          <w:ilvl w:val="0"/>
-          <w:numId w:val="2"/>
-        </w:numPr>
-        <w:spacing w:after="0" w:before="0" w:line="216" w:lineRule="auto"/>
-      </w:pPr>
-      <w:r>
-        <w:rPr>
-          <w:rFonts w:ascii="EB Garamond" w:cs="EB Garamond" w:eastAsia="EB Garamond" w:hAnsi="EB Garamond"/>
-          <w:sz w:val="20"/>
-          <w:szCs w:val="20"/>
-        </w:rPr>
-        <w:t xml:space="preserve">Analyzed SEC filings, equity research, trading comparables, and precedent transactions to co-author a four-page investment banking memo</w:t>
-      </w:r>
-    </w:p>
-    <w:p>
-      <w:pPr>
-        <w:tabs>
-          <w:tab w:val="right" w:pos="11228"/>
-        </w:tabs>
-        <w:spacing w:after="0" w:before="24" w:line="216" w:lineRule="auto"/>
-      </w:pPr>
-      <w:r>
-        <w:rPr>
-          <w:rFonts w:ascii="EB Garamond" w:cs="EB Garamond" w:eastAsia="EB Garamond" w:hAnsi="EB Garamond"/>
-          <w:b/>
-          <w:bCs/>
-          <w:sz w:val="20"/>
-          <w:szCs w:val="20"/>
-        </w:rPr>
-        <w:t xml:space="preserve">SEYA</w:t>
-      </w:r>
-      <w:r>
-        <w:rPr>
-          <w:rFonts w:ascii="EB Garamond" w:cs="EB Garamond" w:eastAsia="EB Garamond" w:hAnsi="EB Garamond"/>
-          <w:sz w:val="20"/>
-          <w:szCs w:val="20"/>
-        </w:rPr>
-        <w:t xml:space="preserve"> | Dallas, TX</w:t>
-      </w:r>
-      <w:r>
-        <w:rPr>
-          <w:rFonts w:ascii="EB Garamond" w:cs="EB Garamond" w:eastAsia="EB Garamond" w:hAnsi="EB Garamond"/>
-          <w:sz w:val="20"/>
-          <w:szCs w:val="20"/>
-        </w:rPr>
-        <w:t xml:space="preserve">	Jun 2025 - Jul 2026</w:t>
-      </w:r>
-    </w:p>
-    <w:p>
-      <w:pPr>
-        <w:spacing w:after="0" w:before="0" w:line="216" w:lineRule="auto"/>
-      </w:pPr>
-      <w:r>
-        <w:rPr>
-          <w:rFonts w:ascii="EB Garamond" w:cs="EB Garamond" w:eastAsia="EB Garamond" w:hAnsi="EB Garamond"/>
-          <w:i/>
-          <w:iCs/>
-          <w:sz w:val="20"/>
-          <w:szCs w:val="20"/>
-        </w:rPr>
         <w:t xml:space="preserve">Co-Founder, DTC Apparel Brand</w:t>
       </w:r>
     </w:p>
@@ -1155,7 +1078,7 @@
           <w:ilvl w:val="0"/>
           <w:numId w:val="2"/>
         </w:numPr>
-        <w:spacing w:after="0" w:before="0" w:line="216" w:lineRule="auto"/>
+        <w:spacing w:after="0" w:before="0" w:line="234" w:lineRule="auto"/>
       </w:pPr>
       <w:r>
         <w:rPr>
@@ -1173,7 +1096,7 @@
           <w:ilvl w:val="0"/>
           <w:numId w:val="2"/>
         </w:numPr>
-        <w:spacing w:after="0" w:before="0" w:line="216" w:lineRule="auto"/>
+        <w:spacing w:after="0" w:before="0" w:line="234" w:lineRule="auto"/>
       </w:pPr>
       <w:r>
         <w:rPr>
@@ -1191,7 +1114,7 @@
           <w:ilvl w:val="0"/>
           <w:numId w:val="2"/>
         </w:numPr>
-        <w:spacing w:after="0" w:before="0" w:line="216" w:lineRule="auto"/>
+        <w:spacing w:after="0" w:before="0" w:line="234" w:lineRule="auto"/>
       </w:pPr>
       <w:r>
         <w:rPr>
@@ -1207,7 +1130,7 @@
         <w:pBdr>
           <w:bottom w:val="single" w:color="000000" w:sz="6" w:space="1"/>
         </w:pBdr>
-        <w:spacing w:after="40" w:before="80" w:line="216" w:lineRule="auto"/>
+        <w:spacing w:after="40" w:before="80" w:line="234" w:lineRule="auto"/>
       </w:pPr>
       <w:r>
         <w:rPr>
@@ -1292,7 +1215,7 @@
     </w:p>
     <w:p>
       <w:pPr>
-        <w:spacing w:after="0" w:before="30" w:line="216" w:lineRule="auto"/>
+        <w:spacing w:after="0" w:before="30" w:line="234" w:lineRule="auto"/>
       </w:pPr>
       <w:r>
         <w:rPr>
@@ -1315,7 +1238,7 @@
     </w:p>
     <w:p>
       <w:pPr>
-        <w:spacing w:after="0" w:before="0" w:line="216" w:lineRule="auto"/>
+        <w:spacing w:after="0" w:before="0" w:line="234" w:lineRule="auto"/>
       </w:pPr>
       <w:r>
         <w:rPr>
@@ -1333,12 +1256,12 @@
           <w:sz w:val="20"/>
           <w:szCs w:val="20"/>
         </w:rPr>
-        <w:t xml:space="preserve">Management Leadership for Tomorrow (MLT) Career Prep Fellow, Recalc Finance Accelerator (Fall 2026)</w:t>
-      </w:r>
-    </w:p>
-    <w:p>
-      <w:pPr>
-        <w:spacing w:after="0" w:before="0" w:line="216" w:lineRule="auto"/>
+        <w:t xml:space="preserve">SEO Career (Alternative Investments &amp; Investment Banking), MLT Career Prep Fellow, Recalc Finance Accelerator (Fall 2026)</w:t>
+      </w:r>
+    </w:p>
+    <w:p>
+      <w:pPr>
+        <w:spacing w:after="0" w:before="0" w:line="234" w:lineRule="auto"/>
       </w:pPr>
       <w:r>
         <w:rPr>
@@ -1361,7 +1284,7 @@
     </w:p>
     <w:p>
       <w:pPr>
-        <w:spacing w:after="0" w:before="0" w:line="216" w:lineRule="auto"/>
+        <w:spacing w:after="0" w:before="0" w:line="234" w:lineRule="auto"/>
       </w:pPr>
       <w:r>
         <w:rPr>

</xml_diff>

<commit_message>
Resume: programs as one-line entries under Leadership, Hear My Cry to activities
Co-Authored-By: Claude Opus 5.5 <noreply@anthropic.com>
Claude-Session: https://claude.ai/code/session_01G3JV145HgjUfXQyW7hEcYE
</commit_message>
<xml_diff>
--- a/assets/Jennifer-Amogu-Resume.docx
+++ b/assets/Jennifer-Amogu-Resume.docx
@@ -20,7 +20,7 @@
     </w:p>
     <w:p>
       <w:pPr>
-        <w:spacing w:after="0" w:before="0" w:line="234" w:lineRule="auto"/>
+        <w:spacing w:after="0" w:before="0" w:line="242" w:lineRule="auto"/>
         <w:jc w:val="center"/>
       </w:pPr>
       <w:r>
@@ -37,7 +37,7 @@
         <w:pBdr>
           <w:bottom w:val="single" w:color="000000" w:sz="6" w:space="1"/>
         </w:pBdr>
-        <w:spacing w:after="40" w:before="60" w:line="234" w:lineRule="auto"/>
+        <w:spacing w:after="40" w:before="60" w:line="242" w:lineRule="auto"/>
       </w:pPr>
       <w:r>
         <w:rPr>
@@ -61,7 +61,7 @@
         <w:tabs>
           <w:tab w:val="right" w:pos="11228"/>
         </w:tabs>
-        <w:spacing w:after="0" w:before="40" w:line="234" w:lineRule="auto"/>
+        <w:spacing w:after="0" w:before="40" w:line="242" w:lineRule="auto"/>
       </w:pPr>
       <w:r>
         <w:rPr>
@@ -95,7 +95,7 @@
         <w:tabs>
           <w:tab w:val="right" w:pos="11228"/>
         </w:tabs>
-        <w:spacing w:after="0" w:before="0" w:line="234" w:lineRule="auto"/>
+        <w:spacing w:after="0" w:before="0" w:line="242" w:lineRule="auto"/>
       </w:pPr>
       <w:r>
         <w:rPr>
@@ -118,7 +118,7 @@
     </w:p>
     <w:p>
       <w:pPr>
-        <w:spacing w:after="0" w:before="0" w:line="234" w:lineRule="auto"/>
+        <w:spacing w:after="0" w:before="0" w:line="242" w:lineRule="auto"/>
       </w:pPr>
       <w:r>
         <w:rPr>
@@ -144,7 +144,7 @@
         <w:pBdr>
           <w:bottom w:val="single" w:color="000000" w:sz="6" w:space="1"/>
         </w:pBdr>
-        <w:spacing w:after="40" w:before="80" w:line="234" w:lineRule="auto"/>
+        <w:spacing w:after="40" w:before="80" w:line="242" w:lineRule="auto"/>
       </w:pPr>
       <w:r>
         <w:rPr>
@@ -192,7 +192,7 @@
         <w:tabs>
           <w:tab w:val="right" w:pos="11228"/>
         </w:tabs>
-        <w:spacing w:after="0" w:before="40" w:line="234" w:lineRule="auto"/>
+        <w:spacing w:after="0" w:before="60" w:line="242" w:lineRule="auto"/>
       </w:pPr>
       <w:r>
         <w:rPr>
@@ -223,7 +223,7 @@
     </w:p>
     <w:p>
       <w:pPr>
-        <w:spacing w:after="0" w:before="0" w:line="234" w:lineRule="auto"/>
+        <w:spacing w:after="0" w:before="0" w:line="242" w:lineRule="auto"/>
       </w:pPr>
       <w:r>
         <w:rPr>
@@ -243,7 +243,7 @@
           <w:ilvl w:val="0"/>
           <w:numId w:val="2"/>
         </w:numPr>
-        <w:spacing w:after="0" w:before="0" w:line="234" w:lineRule="auto"/>
+        <w:spacing w:after="0" w:before="0" w:line="242" w:lineRule="auto"/>
       </w:pPr>
       <w:r>
         <w:rPr>
@@ -259,7 +259,7 @@
         <w:tabs>
           <w:tab w:val="right" w:pos="11228"/>
         </w:tabs>
-        <w:spacing w:after="0" w:before="24" w:line="234" w:lineRule="auto"/>
+        <w:spacing w:after="0" w:before="70" w:line="242" w:lineRule="auto"/>
       </w:pPr>
       <w:r>
         <w:rPr>
@@ -290,7 +290,7 @@
     </w:p>
     <w:p>
       <w:pPr>
-        <w:spacing w:after="0" w:before="0" w:line="234" w:lineRule="auto"/>
+        <w:spacing w:after="0" w:before="0" w:line="242" w:lineRule="auto"/>
       </w:pPr>
       <w:r>
         <w:rPr>
@@ -310,7 +310,7 @@
           <w:ilvl w:val="0"/>
           <w:numId w:val="2"/>
         </w:numPr>
-        <w:spacing w:after="0" w:before="0" w:line="234" w:lineRule="auto"/>
+        <w:spacing w:after="0" w:before="0" w:line="242" w:lineRule="auto"/>
       </w:pPr>
       <w:r>
         <w:rPr>
@@ -328,7 +328,7 @@
           <w:ilvl w:val="0"/>
           <w:numId w:val="2"/>
         </w:numPr>
-        <w:spacing w:after="0" w:before="0" w:line="234" w:lineRule="auto"/>
+        <w:spacing w:after="0" w:before="0" w:line="242" w:lineRule="auto"/>
       </w:pPr>
       <w:r>
         <w:rPr>
@@ -346,7 +346,7 @@
           <w:ilvl w:val="0"/>
           <w:numId w:val="2"/>
         </w:numPr>
-        <w:spacing w:after="0" w:before="0" w:line="234" w:lineRule="auto"/>
+        <w:spacing w:after="0" w:before="0" w:line="242" w:lineRule="auto"/>
       </w:pPr>
       <w:r>
         <w:rPr>
@@ -364,7 +364,7 @@
           <w:ilvl w:val="0"/>
           <w:numId w:val="2"/>
         </w:numPr>
-        <w:spacing w:after="0" w:before="0" w:line="234" w:lineRule="auto"/>
+        <w:spacing w:after="0" w:before="0" w:line="242" w:lineRule="auto"/>
       </w:pPr>
       <w:r>
         <w:rPr>
@@ -380,7 +380,7 @@
         <w:tabs>
           <w:tab w:val="right" w:pos="11228"/>
         </w:tabs>
-        <w:spacing w:after="0" w:before="24" w:line="234" w:lineRule="auto"/>
+        <w:spacing w:after="0" w:before="70" w:line="242" w:lineRule="auto"/>
       </w:pPr>
       <w:r>
         <w:rPr>
@@ -411,7 +411,7 @@
     </w:p>
     <w:p>
       <w:pPr>
-        <w:spacing w:after="0" w:before="0" w:line="234" w:lineRule="auto"/>
+        <w:spacing w:after="0" w:before="0" w:line="242" w:lineRule="auto"/>
       </w:pPr>
       <w:r>
         <w:rPr>
@@ -431,7 +431,7 @@
           <w:ilvl w:val="0"/>
           <w:numId w:val="2"/>
         </w:numPr>
-        <w:spacing w:after="0" w:before="0" w:line="234" w:lineRule="auto"/>
+        <w:spacing w:after="0" w:before="0" w:line="242" w:lineRule="auto"/>
       </w:pPr>
       <w:r>
         <w:rPr>
@@ -449,7 +449,7 @@
           <w:ilvl w:val="0"/>
           <w:numId w:val="2"/>
         </w:numPr>
-        <w:spacing w:after="0" w:before="0" w:line="234" w:lineRule="auto"/>
+        <w:spacing w:after="0" w:before="0" w:line="242" w:lineRule="auto"/>
       </w:pPr>
       <w:r>
         <w:rPr>
@@ -467,7 +467,7 @@
           <w:ilvl w:val="0"/>
           <w:numId w:val="2"/>
         </w:numPr>
-        <w:spacing w:after="0" w:before="0" w:line="234" w:lineRule="auto"/>
+        <w:spacing w:after="0" w:before="0" w:line="242" w:lineRule="auto"/>
       </w:pPr>
       <w:r>
         <w:rPr>
@@ -485,7 +485,7 @@
           <w:ilvl w:val="0"/>
           <w:numId w:val="2"/>
         </w:numPr>
-        <w:spacing w:after="0" w:before="0" w:line="234" w:lineRule="auto"/>
+        <w:spacing w:after="0" w:before="0" w:line="242" w:lineRule="auto"/>
       </w:pPr>
       <w:r>
         <w:rPr>
@@ -501,7 +501,7 @@
         <w:tabs>
           <w:tab w:val="right" w:pos="11228"/>
         </w:tabs>
-        <w:spacing w:after="0" w:before="24" w:line="234" w:lineRule="auto"/>
+        <w:spacing w:after="0" w:before="70" w:line="242" w:lineRule="auto"/>
       </w:pPr>
       <w:r>
         <w:rPr>
@@ -532,7 +532,7 @@
     </w:p>
     <w:p>
       <w:pPr>
-        <w:spacing w:after="0" w:before="0" w:line="234" w:lineRule="auto"/>
+        <w:spacing w:after="0" w:before="0" w:line="242" w:lineRule="auto"/>
       </w:pPr>
       <w:r>
         <w:rPr>
@@ -552,7 +552,7 @@
           <w:ilvl w:val="0"/>
           <w:numId w:val="2"/>
         </w:numPr>
-        <w:spacing w:after="0" w:before="0" w:line="234" w:lineRule="auto"/>
+        <w:spacing w:after="0" w:before="0" w:line="242" w:lineRule="auto"/>
       </w:pPr>
       <w:r>
         <w:rPr>
@@ -570,7 +570,7 @@
           <w:ilvl w:val="0"/>
           <w:numId w:val="2"/>
         </w:numPr>
-        <w:spacing w:after="0" w:before="0" w:line="234" w:lineRule="auto"/>
+        <w:spacing w:after="0" w:before="0" w:line="242" w:lineRule="auto"/>
       </w:pPr>
       <w:r>
         <w:rPr>
@@ -588,7 +588,7 @@
           <w:ilvl w:val="0"/>
           <w:numId w:val="2"/>
         </w:numPr>
-        <w:spacing w:after="0" w:before="0" w:line="234" w:lineRule="auto"/>
+        <w:spacing w:after="0" w:before="0" w:line="242" w:lineRule="auto"/>
       </w:pPr>
       <w:r>
         <w:rPr>
@@ -606,7 +606,7 @@
           <w:ilvl w:val="0"/>
           <w:numId w:val="2"/>
         </w:numPr>
-        <w:spacing w:after="0" w:before="0" w:line="234" w:lineRule="auto"/>
+        <w:spacing w:after="0" w:before="0" w:line="242" w:lineRule="auto"/>
       </w:pPr>
       <w:r>
         <w:rPr>
@@ -622,7 +622,7 @@
         <w:tabs>
           <w:tab w:val="right" w:pos="11228"/>
         </w:tabs>
-        <w:spacing w:after="0" w:before="24" w:line="234" w:lineRule="auto"/>
+        <w:spacing w:after="0" w:before="70" w:line="242" w:lineRule="auto"/>
       </w:pPr>
       <w:r>
         <w:rPr>
@@ -653,7 +653,7 @@
     </w:p>
     <w:p>
       <w:pPr>
-        <w:spacing w:after="0" w:before="0" w:line="234" w:lineRule="auto"/>
+        <w:spacing w:after="0" w:before="0" w:line="242" w:lineRule="auto"/>
       </w:pPr>
       <w:r>
         <w:rPr>
@@ -673,7 +673,7 @@
           <w:ilvl w:val="0"/>
           <w:numId w:val="2"/>
         </w:numPr>
-        <w:spacing w:after="0" w:before="0" w:line="234" w:lineRule="auto"/>
+        <w:spacing w:after="0" w:before="0" w:line="242" w:lineRule="auto"/>
       </w:pPr>
       <w:r>
         <w:rPr>
@@ -691,7 +691,7 @@
           <w:ilvl w:val="0"/>
           <w:numId w:val="2"/>
         </w:numPr>
-        <w:spacing w:after="0" w:before="0" w:line="234" w:lineRule="auto"/>
+        <w:spacing w:after="0" w:before="0" w:line="242" w:lineRule="auto"/>
       </w:pPr>
       <w:r>
         <w:rPr>
@@ -709,7 +709,7 @@
           <w:ilvl w:val="0"/>
           <w:numId w:val="2"/>
         </w:numPr>
-        <w:spacing w:after="0" w:before="0" w:line="234" w:lineRule="auto"/>
+        <w:spacing w:after="0" w:before="0" w:line="242" w:lineRule="auto"/>
       </w:pPr>
       <w:r>
         <w:rPr>
@@ -725,7 +725,7 @@
         <w:pBdr>
           <w:bottom w:val="single" w:color="000000" w:sz="6" w:space="1"/>
         </w:pBdr>
-        <w:spacing w:after="40" w:before="80" w:line="234" w:lineRule="auto"/>
+        <w:spacing w:after="40" w:before="80" w:line="242" w:lineRule="auto"/>
       </w:pPr>
       <w:r>
         <w:rPr>
@@ -821,7 +821,7 @@
         <w:tabs>
           <w:tab w:val="right" w:pos="11228"/>
         </w:tabs>
-        <w:spacing w:after="0" w:before="40" w:line="234" w:lineRule="auto"/>
+        <w:spacing w:after="0" w:before="40" w:line="242" w:lineRule="auto"/>
       </w:pPr>
       <w:r>
         <w:rPr>
@@ -831,29 +831,16 @@
           <w:sz w:val="20"/>
           <w:szCs w:val="20"/>
         </w:rPr>
-        <w:t xml:space="preserve">Hear My Cry Foundation</w:t>
-      </w:r>
-      <w:r>
-        <w:rPr>
-          <w:rFonts w:ascii="EB Garamond" w:cs="EB Garamond" w:eastAsia="EB Garamond" w:hAnsi="EB Garamond"/>
-          <w:sz w:val="20"/>
-          <w:szCs w:val="20"/>
-        </w:rPr>
-        <w:t xml:space="preserve"> | Dallas, TX</w:t>
-      </w:r>
-      <w:r>
-        <w:rPr>
-          <w:rFonts w:ascii="EB Garamond" w:cs="EB Garamond" w:eastAsia="EB Garamond" w:hAnsi="EB Garamond"/>
-          <w:sz w:val="20"/>
-          <w:szCs w:val="20"/>
-        </w:rPr>
-        <w:t xml:space="preserve">	Jul 2026 - Aug 2026</w:t>
-      </w:r>
-    </w:p>
-    <w:p>
-      <w:pPr>
-        <w:spacing w:after="0" w:before="0" w:line="234" w:lineRule="auto"/>
-      </w:pPr>
+        <w:t xml:space="preserve">SEO Career</w:t>
+      </w:r>
+      <w:r>
+        <w:rPr>
+          <w:rFonts w:ascii="EB Garamond" w:cs="EB Garamond" w:eastAsia="EB Garamond" w:hAnsi="EB Garamond"/>
+          <w:sz w:val="20"/>
+          <w:szCs w:val="20"/>
+        </w:rPr>
+        <w:t xml:space="preserve"> | </w:t>
+      </w:r>
       <w:r>
         <w:rPr>
           <w:rFonts w:ascii="EB Garamond" w:cs="EB Garamond" w:eastAsia="EB Garamond" w:hAnsi="EB Garamond"/>
@@ -862,61 +849,15 @@
           <w:sz w:val="20"/>
           <w:szCs w:val="20"/>
         </w:rPr>
-        <w:t xml:space="preserve">College Access Volunteer</w:t>
-      </w:r>
-    </w:p>
-    <w:p>
-      <w:pPr>
-        <w:pStyle w:val="ListParagraph"/>
-        <w:numPr>
-          <w:ilvl w:val="0"/>
-          <w:numId w:val="2"/>
-        </w:numPr>
-        <w:spacing w:after="0" w:before="0" w:line="234" w:lineRule="auto"/>
-      </w:pPr>
-      <w:r>
-        <w:rPr>
-          <w:rFonts w:ascii="EB Garamond" w:cs="EB Garamond" w:eastAsia="EB Garamond" w:hAnsi="EB Garamond"/>
-          <w:sz w:val="20"/>
-          <w:szCs w:val="20"/>
-        </w:rPr>
-        <w:t xml:space="preserve">Researched and compiled 150+ scholarships, awards, and college resources for Dallas-area teens, partnering with Dr. DeWone Bennett, PsyD</w:t>
-      </w:r>
-    </w:p>
-    <w:p>
-      <w:pPr>
-        <w:pStyle w:val="ListParagraph"/>
-        <w:numPr>
-          <w:ilvl w:val="0"/>
-          <w:numId w:val="2"/>
-        </w:numPr>
-        <w:spacing w:after="0" w:before="0" w:line="234" w:lineRule="auto"/>
-      </w:pPr>
-      <w:r>
-        <w:rPr>
-          <w:rFonts w:ascii="EB Garamond" w:cs="EB Garamond" w:eastAsia="EB Garamond" w:hAnsi="EB Garamond"/>
-          <w:sz w:val="20"/>
-          <w:szCs w:val="20"/>
-        </w:rPr>
-        <w:t xml:space="preserve">Built a centralized database organizing funding and application resources in one place, making college support much easier for teens to find</w:t>
-      </w:r>
-    </w:p>
-    <w:p>
-      <w:pPr>
-        <w:pStyle w:val="ListParagraph"/>
-        <w:numPr>
-          <w:ilvl w:val="0"/>
-          <w:numId w:val="2"/>
-        </w:numPr>
-        <w:spacing w:after="0" w:before="0" w:line="234" w:lineRule="auto"/>
-      </w:pPr>
-      <w:r>
-        <w:rPr>
-          <w:rFonts w:ascii="EB Garamond" w:cs="EB Garamond" w:eastAsia="EB Garamond" w:hAnsi="EB Garamond"/>
-          <w:sz w:val="20"/>
-          <w:szCs w:val="20"/>
-        </w:rPr>
-        <w:t xml:space="preserve">Spoke to 15 Dallas-area teens about personal college and career journey, helping them see a clear path to higher education and scholarships</w:t>
+        <w:t xml:space="preserve">Fellow, Alternative Investments &amp; Investment Banking</w:t>
+      </w:r>
+      <w:r>
+        <w:rPr>
+          <w:rFonts w:ascii="EB Garamond" w:cs="EB Garamond" w:eastAsia="EB Garamond" w:hAnsi="EB Garamond"/>
+          <w:sz w:val="20"/>
+          <w:szCs w:val="20"/>
+        </w:rPr>
+        <w:t xml:space="preserve">	Oct 2026 - Present</w:t>
       </w:r>
     </w:p>
     <w:p>
@@ -924,7 +865,7 @@
         <w:tabs>
           <w:tab w:val="right" w:pos="11228"/>
         </w:tabs>
-        <w:spacing w:after="0" w:before="24" w:line="234" w:lineRule="auto"/>
+        <w:spacing w:after="0" w:before="0" w:line="242" w:lineRule="auto"/>
       </w:pPr>
       <w:r>
         <w:rPr>
@@ -934,29 +875,16 @@
           <w:sz w:val="20"/>
           <w:szCs w:val="20"/>
         </w:rPr>
-        <w:t xml:space="preserve">Vandy 2 Wall Street</w:t>
-      </w:r>
-      <w:r>
-        <w:rPr>
-          <w:rFonts w:ascii="EB Garamond" w:cs="EB Garamond" w:eastAsia="EB Garamond" w:hAnsi="EB Garamond"/>
-          <w:sz w:val="20"/>
-          <w:szCs w:val="20"/>
-        </w:rPr>
-        <w:t xml:space="preserve"> | Nashville, TN</w:t>
-      </w:r>
-      <w:r>
-        <w:rPr>
-          <w:rFonts w:ascii="EB Garamond" w:cs="EB Garamond" w:eastAsia="EB Garamond" w:hAnsi="EB Garamond"/>
-          <w:sz w:val="20"/>
-          <w:szCs w:val="20"/>
-        </w:rPr>
-        <w:t xml:space="preserve">	Jun 2026</w:t>
-      </w:r>
-    </w:p>
-    <w:p>
-      <w:pPr>
-        <w:spacing w:after="0" w:before="0" w:line="234" w:lineRule="auto"/>
-      </w:pPr>
+        <w:t xml:space="preserve">Management Leadership for Tomorrow (MLT)</w:t>
+      </w:r>
+      <w:r>
+        <w:rPr>
+          <w:rFonts w:ascii="EB Garamond" w:cs="EB Garamond" w:eastAsia="EB Garamond" w:hAnsi="EB Garamond"/>
+          <w:sz w:val="20"/>
+          <w:szCs w:val="20"/>
+        </w:rPr>
+        <w:t xml:space="preserve"> | </w:t>
+      </w:r>
       <w:r>
         <w:rPr>
           <w:rFonts w:ascii="EB Garamond" w:cs="EB Garamond" w:eastAsia="EB Garamond" w:hAnsi="EB Garamond"/>
@@ -965,61 +893,15 @@
           <w:sz w:val="20"/>
           <w:szCs w:val="20"/>
         </w:rPr>
-        <w:t xml:space="preserve">Team Co-Lead, M&amp;A Pitch Competition</w:t>
-      </w:r>
-    </w:p>
-    <w:p>
-      <w:pPr>
-        <w:pStyle w:val="ListParagraph"/>
-        <w:numPr>
-          <w:ilvl w:val="0"/>
-          <w:numId w:val="2"/>
-        </w:numPr>
-        <w:spacing w:after="0" w:before="0" w:line="234" w:lineRule="auto"/>
-      </w:pPr>
-      <w:r>
-        <w:rPr>
-          <w:rFonts w:ascii="EB Garamond" w:cs="EB Garamond" w:eastAsia="EB Garamond" w:hAnsi="EB Garamond"/>
-          <w:sz w:val="20"/>
-          <w:szCs w:val="20"/>
-        </w:rPr>
-        <w:t xml:space="preserve">Selected for inaugural M&amp;A Pitch Competition; recommended selling a 51% controlling stake in Athleta while retaining 49% of the upside</w:t>
-      </w:r>
-    </w:p>
-    <w:p>
-      <w:pPr>
-        <w:pStyle w:val="ListParagraph"/>
-        <w:numPr>
-          <w:ilvl w:val="0"/>
-          <w:numId w:val="2"/>
-        </w:numPr>
-        <w:spacing w:after="0" w:before="0" w:line="234" w:lineRule="auto"/>
-      </w:pPr>
-      <w:r>
-        <w:rPr>
-          <w:rFonts w:ascii="EB Garamond" w:cs="EB Garamond" w:eastAsia="EB Garamond" w:hAnsi="EB Garamond"/>
-          <w:sz w:val="20"/>
-          <w:szCs w:val="20"/>
-        </w:rPr>
-        <w:t xml:space="preserve">Modeled five-year operating case, DCF, sum-of-the-parts, and buyer returns analysis supporting a $561M enterprise value and a 19-20% IRR</w:t>
-      </w:r>
-    </w:p>
-    <w:p>
-      <w:pPr>
-        <w:pStyle w:val="ListParagraph"/>
-        <w:numPr>
-          <w:ilvl w:val="0"/>
-          <w:numId w:val="2"/>
-        </w:numPr>
-        <w:spacing w:after="0" w:before="0" w:line="234" w:lineRule="auto"/>
-      </w:pPr>
-      <w:r>
-        <w:rPr>
-          <w:rFonts w:ascii="EB Garamond" w:cs="EB Garamond" w:eastAsia="EB Garamond" w:hAnsi="EB Garamond"/>
-          <w:sz w:val="20"/>
-          <w:szCs w:val="20"/>
-        </w:rPr>
-        <w:t xml:space="preserve">Analyzed SEC filings, equity research, trading comparables, and precedent transactions to co-author a four-page investment banking memo</w:t>
+        <w:t xml:space="preserve">Career Prep Fellow</w:t>
+      </w:r>
+      <w:r>
+        <w:rPr>
+          <w:rFonts w:ascii="EB Garamond" w:cs="EB Garamond" w:eastAsia="EB Garamond" w:hAnsi="EB Garamond"/>
+          <w:sz w:val="20"/>
+          <w:szCs w:val="20"/>
+        </w:rPr>
+        <w:t xml:space="preserve">	Sep 2026 - Present</w:t>
       </w:r>
     </w:p>
     <w:p>
@@ -1027,7 +909,7 @@
         <w:tabs>
           <w:tab w:val="right" w:pos="11228"/>
         </w:tabs>
-        <w:spacing w:after="0" w:before="24" w:line="234" w:lineRule="auto"/>
+        <w:spacing w:after="0" w:before="0" w:line="242" w:lineRule="auto"/>
       </w:pPr>
       <w:r>
         <w:rPr>
@@ -1037,29 +919,16 @@
           <w:sz w:val="20"/>
           <w:szCs w:val="20"/>
         </w:rPr>
-        <w:t xml:space="preserve">SEYA</w:t>
-      </w:r>
-      <w:r>
-        <w:rPr>
-          <w:rFonts w:ascii="EB Garamond" w:cs="EB Garamond" w:eastAsia="EB Garamond" w:hAnsi="EB Garamond"/>
-          <w:sz w:val="20"/>
-          <w:szCs w:val="20"/>
-        </w:rPr>
-        <w:t xml:space="preserve"> | Dallas, TX</w:t>
-      </w:r>
-      <w:r>
-        <w:rPr>
-          <w:rFonts w:ascii="EB Garamond" w:cs="EB Garamond" w:eastAsia="EB Garamond" w:hAnsi="EB Garamond"/>
-          <w:sz w:val="20"/>
-          <w:szCs w:val="20"/>
-        </w:rPr>
-        <w:t xml:space="preserve">	Jun 2025 - Jul 2026</w:t>
-      </w:r>
-    </w:p>
-    <w:p>
-      <w:pPr>
-        <w:spacing w:after="0" w:before="0" w:line="234" w:lineRule="auto"/>
-      </w:pPr>
+        <w:t xml:space="preserve">Recalc Finance Accelerator</w:t>
+      </w:r>
+      <w:r>
+        <w:rPr>
+          <w:rFonts w:ascii="EB Garamond" w:cs="EB Garamond" w:eastAsia="EB Garamond" w:hAnsi="EB Garamond"/>
+          <w:sz w:val="20"/>
+          <w:szCs w:val="20"/>
+        </w:rPr>
+        <w:t xml:space="preserve"> | </w:t>
+      </w:r>
       <w:r>
         <w:rPr>
           <w:rFonts w:ascii="EB Garamond" w:cs="EB Garamond" w:eastAsia="EB Garamond" w:hAnsi="EB Garamond"/>
@@ -1068,6 +937,166 @@
           <w:sz w:val="20"/>
           <w:szCs w:val="20"/>
         </w:rPr>
+        <w:t xml:space="preserve">Fall 2026 Cohort</w:t>
+      </w:r>
+      <w:r>
+        <w:rPr>
+          <w:rFonts w:ascii="EB Garamond" w:cs="EB Garamond" w:eastAsia="EB Garamond" w:hAnsi="EB Garamond"/>
+          <w:sz w:val="20"/>
+          <w:szCs w:val="20"/>
+        </w:rPr>
+        <w:t xml:space="preserve">	Oct 2026 - Dec 2026</w:t>
+      </w:r>
+    </w:p>
+    <w:p>
+      <w:pPr>
+        <w:tabs>
+          <w:tab w:val="right" w:pos="11228"/>
+        </w:tabs>
+        <w:spacing w:after="0" w:before="70" w:line="242" w:lineRule="auto"/>
+      </w:pPr>
+      <w:r>
+        <w:rPr>
+          <w:rFonts w:ascii="EB Garamond" w:cs="EB Garamond" w:eastAsia="EB Garamond" w:hAnsi="EB Garamond"/>
+          <w:b/>
+          <w:bCs/>
+          <w:sz w:val="20"/>
+          <w:szCs w:val="20"/>
+        </w:rPr>
+        <w:t xml:space="preserve">Vandy 2 Wall Street</w:t>
+      </w:r>
+      <w:r>
+        <w:rPr>
+          <w:rFonts w:ascii="EB Garamond" w:cs="EB Garamond" w:eastAsia="EB Garamond" w:hAnsi="EB Garamond"/>
+          <w:sz w:val="20"/>
+          <w:szCs w:val="20"/>
+        </w:rPr>
+        <w:t xml:space="preserve"> | Nashville, TN</w:t>
+      </w:r>
+      <w:r>
+        <w:rPr>
+          <w:rFonts w:ascii="EB Garamond" w:cs="EB Garamond" w:eastAsia="EB Garamond" w:hAnsi="EB Garamond"/>
+          <w:sz w:val="20"/>
+          <w:szCs w:val="20"/>
+        </w:rPr>
+        <w:t xml:space="preserve">	Jun 2026</w:t>
+      </w:r>
+    </w:p>
+    <w:p>
+      <w:pPr>
+        <w:spacing w:after="0" w:before="0" w:line="242" w:lineRule="auto"/>
+      </w:pPr>
+      <w:r>
+        <w:rPr>
+          <w:rFonts w:ascii="EB Garamond" w:cs="EB Garamond" w:eastAsia="EB Garamond" w:hAnsi="EB Garamond"/>
+          <w:i/>
+          <w:iCs/>
+          <w:sz w:val="20"/>
+          <w:szCs w:val="20"/>
+        </w:rPr>
+        <w:t xml:space="preserve">Team Co-Lead, M&amp;A Pitch Competition</w:t>
+      </w:r>
+    </w:p>
+    <w:p>
+      <w:pPr>
+        <w:pStyle w:val="ListParagraph"/>
+        <w:numPr>
+          <w:ilvl w:val="0"/>
+          <w:numId w:val="2"/>
+        </w:numPr>
+        <w:spacing w:after="0" w:before="0" w:line="242" w:lineRule="auto"/>
+      </w:pPr>
+      <w:r>
+        <w:rPr>
+          <w:rFonts w:ascii="EB Garamond" w:cs="EB Garamond" w:eastAsia="EB Garamond" w:hAnsi="EB Garamond"/>
+          <w:sz w:val="20"/>
+          <w:szCs w:val="20"/>
+        </w:rPr>
+        <w:t xml:space="preserve">Selected for inaugural M&amp;A Pitch Competition; recommended selling a 51% controlling stake in Athleta while retaining 49% of the upside</w:t>
+      </w:r>
+    </w:p>
+    <w:p>
+      <w:pPr>
+        <w:pStyle w:val="ListParagraph"/>
+        <w:numPr>
+          <w:ilvl w:val="0"/>
+          <w:numId w:val="2"/>
+        </w:numPr>
+        <w:spacing w:after="0" w:before="0" w:line="242" w:lineRule="auto"/>
+      </w:pPr>
+      <w:r>
+        <w:rPr>
+          <w:rFonts w:ascii="EB Garamond" w:cs="EB Garamond" w:eastAsia="EB Garamond" w:hAnsi="EB Garamond"/>
+          <w:sz w:val="20"/>
+          <w:szCs w:val="20"/>
+        </w:rPr>
+        <w:t xml:space="preserve">Modeled five-year operating case, DCF, sum-of-the-parts, and buyer returns analysis supporting a $561M enterprise value and a 19-20% IRR</w:t>
+      </w:r>
+    </w:p>
+    <w:p>
+      <w:pPr>
+        <w:pStyle w:val="ListParagraph"/>
+        <w:numPr>
+          <w:ilvl w:val="0"/>
+          <w:numId w:val="2"/>
+        </w:numPr>
+        <w:spacing w:after="0" w:before="0" w:line="242" w:lineRule="auto"/>
+      </w:pPr>
+      <w:r>
+        <w:rPr>
+          <w:rFonts w:ascii="EB Garamond" w:cs="EB Garamond" w:eastAsia="EB Garamond" w:hAnsi="EB Garamond"/>
+          <w:sz w:val="20"/>
+          <w:szCs w:val="20"/>
+        </w:rPr>
+        <w:t xml:space="preserve">Analyzed SEC filings, equity research, trading comparables, and precedent transactions to co-author a four-page investment banking memo</w:t>
+      </w:r>
+    </w:p>
+    <w:p>
+      <w:pPr>
+        <w:tabs>
+          <w:tab w:val="right" w:pos="11228"/>
+        </w:tabs>
+        <w:spacing w:after="0" w:before="70" w:line="242" w:lineRule="auto"/>
+      </w:pPr>
+      <w:r>
+        <w:rPr>
+          <w:rFonts w:ascii="EB Garamond" w:cs="EB Garamond" w:eastAsia="EB Garamond" w:hAnsi="EB Garamond"/>
+          <w:b/>
+          <w:bCs/>
+          <w:sz w:val="20"/>
+          <w:szCs w:val="20"/>
+        </w:rPr>
+        <w:t xml:space="preserve">SEYA</w:t>
+      </w:r>
+      <w:r>
+        <w:rPr>
+          <w:rFonts w:ascii="EB Garamond" w:cs="EB Garamond" w:eastAsia="EB Garamond" w:hAnsi="EB Garamond"/>
+          <w:sz w:val="20"/>
+          <w:szCs w:val="20"/>
+        </w:rPr>
+        <w:t xml:space="preserve"> | Dallas, TX</w:t>
+      </w:r>
+      <w:r>
+        <w:rPr>
+          <w:rFonts w:ascii="EB Garamond" w:cs="EB Garamond" w:eastAsia="EB Garamond" w:hAnsi="EB Garamond"/>
+          <w:sz w:val="20"/>
+          <w:szCs w:val="20"/>
+        </w:rPr>
+        <w:t xml:space="preserve">	Jun 2025 - Jul 2026</w:t>
+      </w:r>
+    </w:p>
+    <w:p>
+      <w:pPr>
+        <w:spacing w:after="0" w:before="0" w:line="242" w:lineRule="auto"/>
+      </w:pPr>
+      <w:r>
+        <w:rPr>
+          <w:rFonts w:ascii="EB Garamond" w:cs="EB Garamond" w:eastAsia="EB Garamond" w:hAnsi="EB Garamond"/>
+          <w:i/>
+          <w:iCs/>
+          <w:sz w:val="20"/>
+          <w:szCs w:val="20"/>
+        </w:rPr>
         <w:t xml:space="preserve">Co-Founder, DTC Apparel Brand</w:t>
       </w:r>
     </w:p>
@@ -1078,7 +1107,7 @@
           <w:ilvl w:val="0"/>
           <w:numId w:val="2"/>
         </w:numPr>
-        <w:spacing w:after="0" w:before="0" w:line="234" w:lineRule="auto"/>
+        <w:spacing w:after="0" w:before="0" w:line="242" w:lineRule="auto"/>
       </w:pPr>
       <w:r>
         <w:rPr>
@@ -1096,7 +1125,7 @@
           <w:ilvl w:val="0"/>
           <w:numId w:val="2"/>
         </w:numPr>
-        <w:spacing w:after="0" w:before="0" w:line="234" w:lineRule="auto"/>
+        <w:spacing w:after="0" w:before="0" w:line="242" w:lineRule="auto"/>
       </w:pPr>
       <w:r>
         <w:rPr>
@@ -1114,7 +1143,7 @@
           <w:ilvl w:val="0"/>
           <w:numId w:val="2"/>
         </w:numPr>
-        <w:spacing w:after="0" w:before="0" w:line="234" w:lineRule="auto"/>
+        <w:spacing w:after="0" w:before="0" w:line="242" w:lineRule="auto"/>
       </w:pPr>
       <w:r>
         <w:rPr>
@@ -1130,7 +1159,7 @@
         <w:pBdr>
           <w:bottom w:val="single" w:color="000000" w:sz="6" w:space="1"/>
         </w:pBdr>
-        <w:spacing w:after="40" w:before="80" w:line="234" w:lineRule="auto"/>
+        <w:spacing w:after="40" w:before="80" w:line="242" w:lineRule="auto"/>
       </w:pPr>
       <w:r>
         <w:rPr>
@@ -1215,7 +1244,7 @@
     </w:p>
     <w:p>
       <w:pPr>
-        <w:spacing w:after="0" w:before="30" w:line="234" w:lineRule="auto"/>
+        <w:spacing w:after="0" w:before="30" w:line="242" w:lineRule="auto"/>
       </w:pPr>
       <w:r>
         <w:rPr>
@@ -1238,7 +1267,7 @@
     </w:p>
     <w:p>
       <w:pPr>
-        <w:spacing w:after="0" w:before="0" w:line="234" w:lineRule="auto"/>
+        <w:spacing w:after="0" w:before="0" w:line="242" w:lineRule="auto"/>
       </w:pPr>
       <w:r>
         <w:rPr>
@@ -1248,29 +1277,6 @@
           <w:sz w:val="20"/>
           <w:szCs w:val="20"/>
         </w:rPr>
-        <w:t xml:space="preserve">Programs: </w:t>
-      </w:r>
-      <w:r>
-        <w:rPr>
-          <w:rFonts w:ascii="EB Garamond" w:cs="EB Garamond" w:eastAsia="EB Garamond" w:hAnsi="EB Garamond"/>
-          <w:sz w:val="20"/>
-          <w:szCs w:val="20"/>
-        </w:rPr>
-        <w:t xml:space="preserve">SEO Career (Alternative Investments &amp; Investment Banking), MLT Career Prep Fellow, Recalc Finance Accelerator (Fall 2026)</w:t>
-      </w:r>
-    </w:p>
-    <w:p>
-      <w:pPr>
-        <w:spacing w:after="0" w:before="0" w:line="234" w:lineRule="auto"/>
-      </w:pPr>
-      <w:r>
-        <w:rPr>
-          <w:rFonts w:ascii="EB Garamond" w:cs="EB Garamond" w:eastAsia="EB Garamond" w:hAnsi="EB Garamond"/>
-          <w:b/>
-          <w:bCs/>
-          <w:sz w:val="20"/>
-          <w:szCs w:val="20"/>
-        </w:rPr>
         <w:t xml:space="preserve">Activities: </w:t>
       </w:r>
       <w:r>
@@ -1279,12 +1285,12 @@
           <w:sz w:val="20"/>
           <w:szCs w:val="20"/>
         </w:rPr>
-        <w:t xml:space="preserve">Vanderbilt Finance Club, Vanderbilt Culinary Club, WILSkills, Front of House (Runner)</w:t>
-      </w:r>
-    </w:p>
-    <w:p>
-      <w:pPr>
-        <w:spacing w:after="0" w:before="0" w:line="234" w:lineRule="auto"/>
+        <w:t xml:space="preserve">Vanderbilt Finance Club, Vanderbilt Culinary Club, WILSkills, Hear My Cry Foundation (Volunteer), Front of House (Runner)</w:t>
+      </w:r>
+    </w:p>
+    <w:p>
+      <w:pPr>
+        <w:spacing w:after="0" w:before="0" w:line="242" w:lineRule="auto"/>
       </w:pPr>
       <w:r>
         <w:rPr>

</xml_diff>

<commit_message>
Resume: full SEO Career, MLT, and Recalc entries with three-part bullets
Co-Authored-By: Claude Opus 5.5 <noreply@anthropic.com>
Claude-Session: https://claude.ai/code/session_01G3JV145HgjUfXQyW7hEcYE
</commit_message>
<xml_diff>
--- a/assets/Jennifer-Amogu-Resume.docx
+++ b/assets/Jennifer-Amogu-Resume.docx
@@ -20,7 +20,7 @@
     </w:p>
     <w:p>
       <w:pPr>
-        <w:spacing w:after="0" w:before="0" w:line="242" w:lineRule="auto"/>
+        <w:spacing w:after="0" w:before="0" w:line="198" w:lineRule="auto"/>
         <w:jc w:val="center"/>
       </w:pPr>
       <w:r>
@@ -37,7 +37,7 @@
         <w:pBdr>
           <w:bottom w:val="single" w:color="000000" w:sz="6" w:space="1"/>
         </w:pBdr>
-        <w:spacing w:after="40" w:before="60" w:line="242" w:lineRule="auto"/>
+        <w:spacing w:after="40" w:before="60" w:line="198" w:lineRule="auto"/>
       </w:pPr>
       <w:r>
         <w:rPr>
@@ -61,7 +61,7 @@
         <w:tabs>
           <w:tab w:val="right" w:pos="11228"/>
         </w:tabs>
-        <w:spacing w:after="0" w:before="40" w:line="242" w:lineRule="auto"/>
+        <w:spacing w:after="0" w:before="40" w:line="198" w:lineRule="auto"/>
       </w:pPr>
       <w:r>
         <w:rPr>
@@ -95,7 +95,7 @@
         <w:tabs>
           <w:tab w:val="right" w:pos="11228"/>
         </w:tabs>
-        <w:spacing w:after="0" w:before="0" w:line="242" w:lineRule="auto"/>
+        <w:spacing w:after="0" w:before="0" w:line="198" w:lineRule="auto"/>
       </w:pPr>
       <w:r>
         <w:rPr>
@@ -118,7 +118,7 @@
     </w:p>
     <w:p>
       <w:pPr>
-        <w:spacing w:after="0" w:before="0" w:line="242" w:lineRule="auto"/>
+        <w:spacing w:after="0" w:before="0" w:line="198" w:lineRule="auto"/>
       </w:pPr>
       <w:r>
         <w:rPr>
@@ -144,7 +144,7 @@
         <w:pBdr>
           <w:bottom w:val="single" w:color="000000" w:sz="6" w:space="1"/>
         </w:pBdr>
-        <w:spacing w:after="40" w:before="80" w:line="242" w:lineRule="auto"/>
+        <w:spacing w:after="40" w:before="80" w:line="198" w:lineRule="auto"/>
       </w:pPr>
       <w:r>
         <w:rPr>
@@ -192,7 +192,7 @@
         <w:tabs>
           <w:tab w:val="right" w:pos="11228"/>
         </w:tabs>
-        <w:spacing w:after="0" w:before="60" w:line="242" w:lineRule="auto"/>
+        <w:spacing w:after="0" w:before="40" w:line="198" w:lineRule="auto"/>
       </w:pPr>
       <w:r>
         <w:rPr>
@@ -223,7 +223,7 @@
     </w:p>
     <w:p>
       <w:pPr>
-        <w:spacing w:after="0" w:before="0" w:line="242" w:lineRule="auto"/>
+        <w:spacing w:after="0" w:before="0" w:line="198" w:lineRule="auto"/>
       </w:pPr>
       <w:r>
         <w:rPr>
@@ -243,7 +243,7 @@
           <w:ilvl w:val="0"/>
           <w:numId w:val="2"/>
         </w:numPr>
-        <w:spacing w:after="0" w:before="0" w:line="242" w:lineRule="auto"/>
+        <w:spacing w:after="0" w:before="0" w:line="198" w:lineRule="auto"/>
       </w:pPr>
       <w:r>
         <w:rPr>
@@ -259,7 +259,7 @@
         <w:tabs>
           <w:tab w:val="right" w:pos="11228"/>
         </w:tabs>
-        <w:spacing w:after="0" w:before="70" w:line="242" w:lineRule="auto"/>
+        <w:spacing w:after="0" w:before="24" w:line="198" w:lineRule="auto"/>
       </w:pPr>
       <w:r>
         <w:rPr>
@@ -290,7 +290,7 @@
     </w:p>
     <w:p>
       <w:pPr>
-        <w:spacing w:after="0" w:before="0" w:line="242" w:lineRule="auto"/>
+        <w:spacing w:after="0" w:before="0" w:line="198" w:lineRule="auto"/>
       </w:pPr>
       <w:r>
         <w:rPr>
@@ -310,7 +310,7 @@
           <w:ilvl w:val="0"/>
           <w:numId w:val="2"/>
         </w:numPr>
-        <w:spacing w:after="0" w:before="0" w:line="242" w:lineRule="auto"/>
+        <w:spacing w:after="0" w:before="0" w:line="198" w:lineRule="auto"/>
       </w:pPr>
       <w:r>
         <w:rPr>
@@ -328,7 +328,7 @@
           <w:ilvl w:val="0"/>
           <w:numId w:val="2"/>
         </w:numPr>
-        <w:spacing w:after="0" w:before="0" w:line="242" w:lineRule="auto"/>
+        <w:spacing w:after="0" w:before="0" w:line="198" w:lineRule="auto"/>
       </w:pPr>
       <w:r>
         <w:rPr>
@@ -346,7 +346,7 @@
           <w:ilvl w:val="0"/>
           <w:numId w:val="2"/>
         </w:numPr>
-        <w:spacing w:after="0" w:before="0" w:line="242" w:lineRule="auto"/>
+        <w:spacing w:after="0" w:before="0" w:line="198" w:lineRule="auto"/>
       </w:pPr>
       <w:r>
         <w:rPr>
@@ -364,7 +364,7 @@
           <w:ilvl w:val="0"/>
           <w:numId w:val="2"/>
         </w:numPr>
-        <w:spacing w:after="0" w:before="0" w:line="242" w:lineRule="auto"/>
+        <w:spacing w:after="0" w:before="0" w:line="198" w:lineRule="auto"/>
       </w:pPr>
       <w:r>
         <w:rPr>
@@ -380,7 +380,7 @@
         <w:tabs>
           <w:tab w:val="right" w:pos="11228"/>
         </w:tabs>
-        <w:spacing w:after="0" w:before="70" w:line="242" w:lineRule="auto"/>
+        <w:spacing w:after="0" w:before="24" w:line="198" w:lineRule="auto"/>
       </w:pPr>
       <w:r>
         <w:rPr>
@@ -411,7 +411,7 @@
     </w:p>
     <w:p>
       <w:pPr>
-        <w:spacing w:after="0" w:before="0" w:line="242" w:lineRule="auto"/>
+        <w:spacing w:after="0" w:before="0" w:line="198" w:lineRule="auto"/>
       </w:pPr>
       <w:r>
         <w:rPr>
@@ -431,7 +431,7 @@
           <w:ilvl w:val="0"/>
           <w:numId w:val="2"/>
         </w:numPr>
-        <w:spacing w:after="0" w:before="0" w:line="242" w:lineRule="auto"/>
+        <w:spacing w:after="0" w:before="0" w:line="198" w:lineRule="auto"/>
       </w:pPr>
       <w:r>
         <w:rPr>
@@ -449,7 +449,7 @@
           <w:ilvl w:val="0"/>
           <w:numId w:val="2"/>
         </w:numPr>
-        <w:spacing w:after="0" w:before="0" w:line="242" w:lineRule="auto"/>
+        <w:spacing w:after="0" w:before="0" w:line="198" w:lineRule="auto"/>
       </w:pPr>
       <w:r>
         <w:rPr>
@@ -467,7 +467,7 @@
           <w:ilvl w:val="0"/>
           <w:numId w:val="2"/>
         </w:numPr>
-        <w:spacing w:after="0" w:before="0" w:line="242" w:lineRule="auto"/>
+        <w:spacing w:after="0" w:before="0" w:line="198" w:lineRule="auto"/>
       </w:pPr>
       <w:r>
         <w:rPr>
@@ -485,7 +485,7 @@
           <w:ilvl w:val="0"/>
           <w:numId w:val="2"/>
         </w:numPr>
-        <w:spacing w:after="0" w:before="0" w:line="242" w:lineRule="auto"/>
+        <w:spacing w:after="0" w:before="0" w:line="198" w:lineRule="auto"/>
       </w:pPr>
       <w:r>
         <w:rPr>
@@ -501,7 +501,7 @@
         <w:tabs>
           <w:tab w:val="right" w:pos="11228"/>
         </w:tabs>
-        <w:spacing w:after="0" w:before="70" w:line="242" w:lineRule="auto"/>
+        <w:spacing w:after="0" w:before="24" w:line="198" w:lineRule="auto"/>
       </w:pPr>
       <w:r>
         <w:rPr>
@@ -532,7 +532,7 @@
     </w:p>
     <w:p>
       <w:pPr>
-        <w:spacing w:after="0" w:before="0" w:line="242" w:lineRule="auto"/>
+        <w:spacing w:after="0" w:before="0" w:line="198" w:lineRule="auto"/>
       </w:pPr>
       <w:r>
         <w:rPr>
@@ -552,7 +552,7 @@
           <w:ilvl w:val="0"/>
           <w:numId w:val="2"/>
         </w:numPr>
-        <w:spacing w:after="0" w:before="0" w:line="242" w:lineRule="auto"/>
+        <w:spacing w:after="0" w:before="0" w:line="198" w:lineRule="auto"/>
       </w:pPr>
       <w:r>
         <w:rPr>
@@ -570,7 +570,7 @@
           <w:ilvl w:val="0"/>
           <w:numId w:val="2"/>
         </w:numPr>
-        <w:spacing w:after="0" w:before="0" w:line="242" w:lineRule="auto"/>
+        <w:spacing w:after="0" w:before="0" w:line="198" w:lineRule="auto"/>
       </w:pPr>
       <w:r>
         <w:rPr>
@@ -588,7 +588,7 @@
           <w:ilvl w:val="0"/>
           <w:numId w:val="2"/>
         </w:numPr>
-        <w:spacing w:after="0" w:before="0" w:line="242" w:lineRule="auto"/>
+        <w:spacing w:after="0" w:before="0" w:line="198" w:lineRule="auto"/>
       </w:pPr>
       <w:r>
         <w:rPr>
@@ -606,7 +606,7 @@
           <w:ilvl w:val="0"/>
           <w:numId w:val="2"/>
         </w:numPr>
-        <w:spacing w:after="0" w:before="0" w:line="242" w:lineRule="auto"/>
+        <w:spacing w:after="0" w:before="0" w:line="198" w:lineRule="auto"/>
       </w:pPr>
       <w:r>
         <w:rPr>
@@ -622,7 +622,7 @@
         <w:tabs>
           <w:tab w:val="right" w:pos="11228"/>
         </w:tabs>
-        <w:spacing w:after="0" w:before="70" w:line="242" w:lineRule="auto"/>
+        <w:spacing w:after="0" w:before="24" w:line="198" w:lineRule="auto"/>
       </w:pPr>
       <w:r>
         <w:rPr>
@@ -653,7 +653,7 @@
     </w:p>
     <w:p>
       <w:pPr>
-        <w:spacing w:after="0" w:before="0" w:line="242" w:lineRule="auto"/>
+        <w:spacing w:after="0" w:before="0" w:line="198" w:lineRule="auto"/>
       </w:pPr>
       <w:r>
         <w:rPr>
@@ -673,7 +673,7 @@
           <w:ilvl w:val="0"/>
           <w:numId w:val="2"/>
         </w:numPr>
-        <w:spacing w:after="0" w:before="0" w:line="242" w:lineRule="auto"/>
+        <w:spacing w:after="0" w:before="0" w:line="198" w:lineRule="auto"/>
       </w:pPr>
       <w:r>
         <w:rPr>
@@ -691,7 +691,7 @@
           <w:ilvl w:val="0"/>
           <w:numId w:val="2"/>
         </w:numPr>
-        <w:spacing w:after="0" w:before="0" w:line="242" w:lineRule="auto"/>
+        <w:spacing w:after="0" w:before="0" w:line="198" w:lineRule="auto"/>
       </w:pPr>
       <w:r>
         <w:rPr>
@@ -709,7 +709,7 @@
           <w:ilvl w:val="0"/>
           <w:numId w:val="2"/>
         </w:numPr>
-        <w:spacing w:after="0" w:before="0" w:line="242" w:lineRule="auto"/>
+        <w:spacing w:after="0" w:before="0" w:line="198" w:lineRule="auto"/>
       </w:pPr>
       <w:r>
         <w:rPr>
@@ -725,7 +725,7 @@
         <w:pBdr>
           <w:bottom w:val="single" w:color="000000" w:sz="6" w:space="1"/>
         </w:pBdr>
-        <w:spacing w:after="40" w:before="80" w:line="242" w:lineRule="auto"/>
+        <w:spacing w:after="40" w:before="80" w:line="198" w:lineRule="auto"/>
       </w:pPr>
       <w:r>
         <w:rPr>
@@ -821,7 +821,7 @@
         <w:tabs>
           <w:tab w:val="right" w:pos="11228"/>
         </w:tabs>
-        <w:spacing w:after="0" w:before="40" w:line="242" w:lineRule="auto"/>
+        <w:spacing w:after="0" w:before="40" w:line="198" w:lineRule="auto"/>
       </w:pPr>
       <w:r>
         <w:rPr>
@@ -839,8 +839,13 @@
           <w:sz w:val="20"/>
           <w:szCs w:val="20"/>
         </w:rPr>
-        <w:t xml:space="preserve"> | </w:t>
-      </w:r>
+        <w:t xml:space="preserve">	Oct 2026 - Present</w:t>
+      </w:r>
+    </w:p>
+    <w:p>
+      <w:pPr>
+        <w:spacing w:after="0" w:before="0" w:line="198" w:lineRule="auto"/>
+      </w:pPr>
       <w:r>
         <w:rPr>
           <w:rFonts w:ascii="EB Garamond" w:cs="EB Garamond" w:eastAsia="EB Garamond" w:hAnsi="EB Garamond"/>
@@ -851,13 +856,59 @@
         </w:rPr>
         <w:t xml:space="preserve">Fellow, Alternative Investments &amp; Investment Banking</w:t>
       </w:r>
-      <w:r>
-        <w:rPr>
-          <w:rFonts w:ascii="EB Garamond" w:cs="EB Garamond" w:eastAsia="EB Garamond" w:hAnsi="EB Garamond"/>
-          <w:sz w:val="20"/>
-          <w:szCs w:val="20"/>
-        </w:rPr>
-        <w:t xml:space="preserve">	Oct 2026 - Present</w:t>
+    </w:p>
+    <w:p>
+      <w:pPr>
+        <w:pStyle w:val="ListParagraph"/>
+        <w:numPr>
+          <w:ilvl w:val="0"/>
+          <w:numId w:val="2"/>
+        </w:numPr>
+        <w:spacing w:after="0" w:before="0" w:line="198" w:lineRule="auto"/>
+      </w:pPr>
+      <w:r>
+        <w:rPr>
+          <w:rFonts w:ascii="EB Garamond" w:cs="EB Garamond" w:eastAsia="EB Garamond" w:hAnsi="EB Garamond"/>
+          <w:sz w:val="20"/>
+          <w:szCs w:val="20"/>
+        </w:rPr>
+        <w:t xml:space="preserve">Selected for competitive pre-professional fellowship offering intensive technical training for careers in investment banking and private equity</w:t>
+      </w:r>
+    </w:p>
+    <w:p>
+      <w:pPr>
+        <w:pStyle w:val="ListParagraph"/>
+        <w:numPr>
+          <w:ilvl w:val="0"/>
+          <w:numId w:val="2"/>
+        </w:numPr>
+        <w:spacing w:after="0" w:before="0" w:line="198" w:lineRule="auto"/>
+      </w:pPr>
+      <w:r>
+        <w:rPr>
+          <w:rFonts w:ascii="EB Garamond" w:cs="EB Garamond" w:eastAsia="EB Garamond" w:hAnsi="EB Garamond"/>
+          <w:sz w:val="20"/>
+          <w:szCs w:val="20"/>
+        </w:rPr>
+        <w:t xml:space="preserve">Completed 100+ hours of technical training in three-statement modeling, valuation methods (DCF, CCA, PTA), and core corporate finance</w:t>
+      </w:r>
+    </w:p>
+    <w:p>
+      <w:pPr>
+        <w:pStyle w:val="ListParagraph"/>
+        <w:numPr>
+          <w:ilvl w:val="0"/>
+          <w:numId w:val="2"/>
+        </w:numPr>
+        <w:spacing w:after="0" w:before="0" w:line="198" w:lineRule="auto"/>
+      </w:pPr>
+      <w:r>
+        <w:rPr>
+          <w:rFonts w:ascii="EB Garamond" w:cs="EB Garamond" w:eastAsia="EB Garamond" w:hAnsi="EB Garamond"/>
+          <w:sz w:val="20"/>
+          <w:szCs w:val="20"/>
+        </w:rPr>
+        <w:t xml:space="preserve">Analyzed real-world transaction case studies, completed technical assessments, and received mentorship from senior Wall Street professionals</w:t>
       </w:r>
     </w:p>
     <w:p>
@@ -865,7 +916,7 @@
         <w:tabs>
           <w:tab w:val="right" w:pos="11228"/>
         </w:tabs>
-        <w:spacing w:after="0" w:before="0" w:line="242" w:lineRule="auto"/>
+        <w:spacing w:after="0" w:before="24" w:line="198" w:lineRule="auto"/>
       </w:pPr>
       <w:r>
         <w:rPr>
@@ -883,8 +934,13 @@
           <w:sz w:val="20"/>
           <w:szCs w:val="20"/>
         </w:rPr>
-        <w:t xml:space="preserve"> | </w:t>
-      </w:r>
+        <w:t xml:space="preserve">	Sep 2026 - Present</w:t>
+      </w:r>
+    </w:p>
+    <w:p>
+      <w:pPr>
+        <w:spacing w:after="0" w:before="0" w:line="198" w:lineRule="auto"/>
+      </w:pPr>
       <w:r>
         <w:rPr>
           <w:rFonts w:ascii="EB Garamond" w:cs="EB Garamond" w:eastAsia="EB Garamond" w:hAnsi="EB Garamond"/>
@@ -895,13 +951,59 @@
         </w:rPr>
         <w:t xml:space="preserve">Career Prep Fellow</w:t>
       </w:r>
-      <w:r>
-        <w:rPr>
-          <w:rFonts w:ascii="EB Garamond" w:cs="EB Garamond" w:eastAsia="EB Garamond" w:hAnsi="EB Garamond"/>
-          <w:sz w:val="20"/>
-          <w:szCs w:val="20"/>
-        </w:rPr>
-        <w:t xml:space="preserve">	Sep 2026 - Present</w:t>
+    </w:p>
+    <w:p>
+      <w:pPr>
+        <w:pStyle w:val="ListParagraph"/>
+        <w:numPr>
+          <w:ilvl w:val="0"/>
+          <w:numId w:val="2"/>
+        </w:numPr>
+        <w:spacing w:after="0" w:before="0" w:line="198" w:lineRule="auto"/>
+      </w:pPr>
+      <w:r>
+        <w:rPr>
+          <w:rFonts w:ascii="EB Garamond" w:cs="EB Garamond" w:eastAsia="EB Garamond" w:hAnsi="EB Garamond"/>
+          <w:sz w:val="20"/>
+          <w:szCs w:val="20"/>
+        </w:rPr>
+        <w:t xml:space="preserve">Selected for competitive 18+-month fellowship accelerating emerging leaders' careers via executive coaching, skill-building, and mentorship</w:t>
+      </w:r>
+    </w:p>
+    <w:p>
+      <w:pPr>
+        <w:pStyle w:val="ListParagraph"/>
+        <w:numPr>
+          <w:ilvl w:val="0"/>
+          <w:numId w:val="2"/>
+        </w:numPr>
+        <w:spacing w:after="0" w:before="0" w:line="198" w:lineRule="auto"/>
+      </w:pPr>
+      <w:r>
+        <w:rPr>
+          <w:rFonts w:ascii="EB Garamond" w:cs="EB Garamond" w:eastAsia="EB Garamond" w:hAnsi="EB Garamond"/>
+          <w:sz w:val="20"/>
+          <w:szCs w:val="20"/>
+        </w:rPr>
+        <w:t xml:space="preserve">Completed rigorous business case analyses, quantitative problem-solving assignments, and strategic simulations evaluated by career coaches</w:t>
+      </w:r>
+    </w:p>
+    <w:p>
+      <w:pPr>
+        <w:pStyle w:val="ListParagraph"/>
+        <w:numPr>
+          <w:ilvl w:val="0"/>
+          <w:numId w:val="2"/>
+        </w:numPr>
+        <w:spacing w:after="0" w:before="0" w:line="198" w:lineRule="auto"/>
+      </w:pPr>
+      <w:r>
+        <w:rPr>
+          <w:rFonts w:ascii="EB Garamond" w:cs="EB Garamond" w:eastAsia="EB Garamond" w:hAnsi="EB Garamond"/>
+          <w:sz w:val="20"/>
+          <w:szCs w:val="20"/>
+        </w:rPr>
+        <w:t xml:space="preserve">Engaged with corporate partner firms to gain direct industry exposure and prepare for accelerated investment banking and buyside recruiting</w:t>
       </w:r>
     </w:p>
     <w:p>
@@ -909,7 +1011,7 @@
         <w:tabs>
           <w:tab w:val="right" w:pos="11228"/>
         </w:tabs>
-        <w:spacing w:after="0" w:before="0" w:line="242" w:lineRule="auto"/>
+        <w:spacing w:after="0" w:before="24" w:line="198" w:lineRule="auto"/>
       </w:pPr>
       <w:r>
         <w:rPr>
@@ -927,8 +1029,13 @@
           <w:sz w:val="20"/>
           <w:szCs w:val="20"/>
         </w:rPr>
-        <w:t xml:space="preserve"> | </w:t>
-      </w:r>
+        <w:t xml:space="preserve">	Oct 2026 - Dec 2026</w:t>
+      </w:r>
+    </w:p>
+    <w:p>
+      <w:pPr>
+        <w:spacing w:after="0" w:before="0" w:line="198" w:lineRule="auto"/>
+      </w:pPr>
       <w:r>
         <w:rPr>
           <w:rFonts w:ascii="EB Garamond" w:cs="EB Garamond" w:eastAsia="EB Garamond" w:hAnsi="EB Garamond"/>
@@ -937,15 +1044,61 @@
           <w:sz w:val="20"/>
           <w:szCs w:val="20"/>
         </w:rPr>
-        <w:t xml:space="preserve">Fall 2026 Cohort</w:t>
-      </w:r>
-      <w:r>
-        <w:rPr>
-          <w:rFonts w:ascii="EB Garamond" w:cs="EB Garamond" w:eastAsia="EB Garamond" w:hAnsi="EB Garamond"/>
-          <w:sz w:val="20"/>
-          <w:szCs w:val="20"/>
-        </w:rPr>
-        <w:t xml:space="preserve">	Oct 2026 - Dec 2026</w:t>
+        <w:t xml:space="preserve">Fall 2026 Cohort Member</w:t>
+      </w:r>
+    </w:p>
+    <w:p>
+      <w:pPr>
+        <w:pStyle w:val="ListParagraph"/>
+        <w:numPr>
+          <w:ilvl w:val="0"/>
+          <w:numId w:val="2"/>
+        </w:numPr>
+        <w:spacing w:after="0" w:before="0" w:line="198" w:lineRule="auto"/>
+      </w:pPr>
+      <w:r>
+        <w:rPr>
+          <w:rFonts w:ascii="EB Garamond" w:cs="EB Garamond" w:eastAsia="EB Garamond" w:hAnsi="EB Garamond"/>
+          <w:sz w:val="20"/>
+          <w:szCs w:val="20"/>
+        </w:rPr>
+        <w:t xml:space="preserve">Selected via competitive application for an intensive finance accelerator backed by leading PE sponsors, focused on investor-grade modeling</w:t>
+      </w:r>
+    </w:p>
+    <w:p>
+      <w:pPr>
+        <w:pStyle w:val="ListParagraph"/>
+        <w:numPr>
+          <w:ilvl w:val="0"/>
+          <w:numId w:val="2"/>
+        </w:numPr>
+        <w:spacing w:after="0" w:before="0" w:line="198" w:lineRule="auto"/>
+      </w:pPr>
+      <w:r>
+        <w:rPr>
+          <w:rFonts w:ascii="EB Garamond" w:cs="EB Garamond" w:eastAsia="EB Garamond" w:hAnsi="EB Garamond"/>
+          <w:sz w:val="20"/>
+          <w:szCs w:val="20"/>
+        </w:rPr>
+        <w:t xml:space="preserve">Constructed multi-period three-statement operating models from blank spreadsheets with working capital, debt waterfalls, and sensitivities</w:t>
+      </w:r>
+    </w:p>
+    <w:p>
+      <w:pPr>
+        <w:pStyle w:val="ListParagraph"/>
+        <w:numPr>
+          <w:ilvl w:val="0"/>
+          <w:numId w:val="2"/>
+        </w:numPr>
+        <w:spacing w:after="0" w:before="0" w:line="198" w:lineRule="auto"/>
+      </w:pPr>
+      <w:r>
+        <w:rPr>
+          <w:rFonts w:ascii="EB Garamond" w:cs="EB Garamond" w:eastAsia="EB Garamond" w:hAnsi="EB Garamond"/>
+          <w:sz w:val="20"/>
+          <w:szCs w:val="20"/>
+        </w:rPr>
+        <w:t xml:space="preserve">Evaluated buyout case studies, analyzed operational drivers (unit economics, margins), and presented valuation takeaways to PE investors</w:t>
       </w:r>
     </w:p>
     <w:p>
@@ -953,7 +1106,7 @@
         <w:tabs>
           <w:tab w:val="right" w:pos="11228"/>
         </w:tabs>
-        <w:spacing w:after="0" w:before="70" w:line="242" w:lineRule="auto"/>
+        <w:spacing w:after="0" w:before="24" w:line="198" w:lineRule="auto"/>
       </w:pPr>
       <w:r>
         <w:rPr>
@@ -984,7 +1137,7 @@
     </w:p>
     <w:p>
       <w:pPr>
-        <w:spacing w:after="0" w:before="0" w:line="242" w:lineRule="auto"/>
+        <w:spacing w:after="0" w:before="0" w:line="198" w:lineRule="auto"/>
       </w:pPr>
       <w:r>
         <w:rPr>
@@ -1004,7 +1157,7 @@
           <w:ilvl w:val="0"/>
           <w:numId w:val="2"/>
         </w:numPr>
-        <w:spacing w:after="0" w:before="0" w:line="242" w:lineRule="auto"/>
+        <w:spacing w:after="0" w:before="0" w:line="198" w:lineRule="auto"/>
       </w:pPr>
       <w:r>
         <w:rPr>
@@ -1022,7 +1175,7 @@
           <w:ilvl w:val="0"/>
           <w:numId w:val="2"/>
         </w:numPr>
-        <w:spacing w:after="0" w:before="0" w:line="242" w:lineRule="auto"/>
+        <w:spacing w:after="0" w:before="0" w:line="198" w:lineRule="auto"/>
       </w:pPr>
       <w:r>
         <w:rPr>
@@ -1040,7 +1193,7 @@
           <w:ilvl w:val="0"/>
           <w:numId w:val="2"/>
         </w:numPr>
-        <w:spacing w:after="0" w:before="0" w:line="242" w:lineRule="auto"/>
+        <w:spacing w:after="0" w:before="0" w:line="198" w:lineRule="auto"/>
       </w:pPr>
       <w:r>
         <w:rPr>
@@ -1056,7 +1209,7 @@
         <w:tabs>
           <w:tab w:val="right" w:pos="11228"/>
         </w:tabs>
-        <w:spacing w:after="0" w:before="70" w:line="242" w:lineRule="auto"/>
+        <w:spacing w:after="0" w:before="24" w:line="198" w:lineRule="auto"/>
       </w:pPr>
       <w:r>
         <w:rPr>
@@ -1087,7 +1240,7 @@
     </w:p>
     <w:p>
       <w:pPr>
-        <w:spacing w:after="0" w:before="0" w:line="242" w:lineRule="auto"/>
+        <w:spacing w:after="0" w:before="0" w:line="198" w:lineRule="auto"/>
       </w:pPr>
       <w:r>
         <w:rPr>
@@ -1107,7 +1260,7 @@
           <w:ilvl w:val="0"/>
           <w:numId w:val="2"/>
         </w:numPr>
-        <w:spacing w:after="0" w:before="0" w:line="242" w:lineRule="auto"/>
+        <w:spacing w:after="0" w:before="0" w:line="198" w:lineRule="auto"/>
       </w:pPr>
       <w:r>
         <w:rPr>
@@ -1125,7 +1278,7 @@
           <w:ilvl w:val="0"/>
           <w:numId w:val="2"/>
         </w:numPr>
-        <w:spacing w:after="0" w:before="0" w:line="242" w:lineRule="auto"/>
+        <w:spacing w:after="0" w:before="0" w:line="198" w:lineRule="auto"/>
       </w:pPr>
       <w:r>
         <w:rPr>
@@ -1143,7 +1296,7 @@
           <w:ilvl w:val="0"/>
           <w:numId w:val="2"/>
         </w:numPr>
-        <w:spacing w:after="0" w:before="0" w:line="242" w:lineRule="auto"/>
+        <w:spacing w:after="0" w:before="0" w:line="198" w:lineRule="auto"/>
       </w:pPr>
       <w:r>
         <w:rPr>
@@ -1159,7 +1312,7 @@
         <w:pBdr>
           <w:bottom w:val="single" w:color="000000" w:sz="6" w:space="1"/>
         </w:pBdr>
-        <w:spacing w:after="40" w:before="80" w:line="242" w:lineRule="auto"/>
+        <w:spacing w:after="40" w:before="80" w:line="198" w:lineRule="auto"/>
       </w:pPr>
       <w:r>
         <w:rPr>
@@ -1244,7 +1397,7 @@
     </w:p>
     <w:p>
       <w:pPr>
-        <w:spacing w:after="0" w:before="30" w:line="242" w:lineRule="auto"/>
+        <w:spacing w:after="0" w:before="30" w:line="198" w:lineRule="auto"/>
       </w:pPr>
       <w:r>
         <w:rPr>
@@ -1267,7 +1420,7 @@
     </w:p>
     <w:p>
       <w:pPr>
-        <w:spacing w:after="0" w:before="0" w:line="242" w:lineRule="auto"/>
+        <w:spacing w:after="0" w:before="0" w:line="198" w:lineRule="auto"/>
       </w:pPr>
       <w:r>
         <w:rPr>
@@ -1290,7 +1443,7 @@
     </w:p>
     <w:p>
       <w:pPr>
-        <w:spacing w:after="0" w:before="0" w:line="242" w:lineRule="auto"/>
+        <w:spacing w:after="0" w:before="0" w:line="198" w:lineRule="auto"/>
       </w:pPr>
       <w:r>
         <w:rPr>

</xml_diff>

<commit_message>
Resume: interests before activities, add TV Dramas
Co-Authored-By: Claude Opus 5.5 <noreply@anthropic.com>
Claude-Session: https://claude.ai/code/session_01G3JV145HgjUfXQyW7hEcYE
</commit_message>
<xml_diff>
--- a/assets/Jennifer-Amogu-Resume.docx
+++ b/assets/Jennifer-Amogu-Resume.docx
@@ -1344,7 +1344,7 @@
           <w:sz w:val="21"/>
           <w:szCs w:val="21"/>
         </w:rPr>
-        <w:t xml:space="preserve">A</w:t>
+        <w:t xml:space="preserve">I</w:t>
       </w:r>
       <w:r>
         <w:rPr>
@@ -1352,7 +1352,7 @@
           <w:sz w:val="18"/>
           <w:szCs w:val="18"/>
         </w:rPr>
-        <w:t xml:space="preserve">CTIVITIES</w:t>
+        <w:t xml:space="preserve">NTERESTS</w:t>
       </w:r>
       <w:r>
         <w:rPr>
@@ -1384,7 +1384,7 @@
           <w:sz w:val="21"/>
           <w:szCs w:val="21"/>
         </w:rPr>
-        <w:t xml:space="preserve">I</w:t>
+        <w:t xml:space="preserve">A</w:t>
       </w:r>
       <w:r>
         <w:rPr>
@@ -1392,7 +1392,7 @@
           <w:sz w:val="18"/>
           <w:szCs w:val="18"/>
         </w:rPr>
-        <w:t xml:space="preserve">NTERESTS</w:t>
+        <w:t xml:space="preserve">CTIVITIES</w:t>
       </w:r>
     </w:p>
     <w:p>
@@ -1430,15 +1430,15 @@
           <w:sz w:val="20"/>
           <w:szCs w:val="20"/>
         </w:rPr>
-        <w:t xml:space="preserve">Activities: </w:t>
-      </w:r>
-      <w:r>
-        <w:rPr>
-          <w:rFonts w:ascii="EB Garamond" w:cs="EB Garamond" w:eastAsia="EB Garamond" w:hAnsi="EB Garamond"/>
-          <w:sz w:val="20"/>
-          <w:szCs w:val="20"/>
-        </w:rPr>
-        <w:t xml:space="preserve">Vanderbilt Finance Club, Vanderbilt Culinary Club, WILSkills, Hear My Cry Foundation (Volunteer), Front of House (Runner)</w:t>
+        <w:t xml:space="preserve">Interests: </w:t>
+      </w:r>
+      <w:r>
+        <w:rPr>
+          <w:rFonts w:ascii="EB Garamond" w:cs="EB Garamond" w:eastAsia="EB Garamond" w:hAnsi="EB Garamond"/>
+          <w:sz w:val="20"/>
+          <w:szCs w:val="20"/>
+        </w:rPr>
+        <w:t xml:space="preserve">Consumer Psychology, Vintage Cards, Asian Food, Skiing, Making Waffles, TV Dramas</w:t>
       </w:r>
     </w:p>
     <w:p>
@@ -1453,15 +1453,15 @@
           <w:sz w:val="20"/>
           <w:szCs w:val="20"/>
         </w:rPr>
-        <w:t xml:space="preserve">Interests: </w:t>
-      </w:r>
-      <w:r>
-        <w:rPr>
-          <w:rFonts w:ascii="EB Garamond" w:cs="EB Garamond" w:eastAsia="EB Garamond" w:hAnsi="EB Garamond"/>
-          <w:sz w:val="20"/>
-          <w:szCs w:val="20"/>
-        </w:rPr>
-        <w:t xml:space="preserve">Consumer Psychology, Vintage Cards, Asian Food, Skiing, Making Waffles</w:t>
+        <w:t xml:space="preserve">Activities: </w:t>
+      </w:r>
+      <w:r>
+        <w:rPr>
+          <w:rFonts w:ascii="EB Garamond" w:cs="EB Garamond" w:eastAsia="EB Garamond" w:hAnsi="EB Garamond"/>
+          <w:sz w:val="20"/>
+          <w:szCs w:val="20"/>
+        </w:rPr>
+        <w:t xml:space="preserve">Vanderbilt Finance Club, Vanderbilt Culinary Club, WILSkills, Hear My Cry Foundation (Volunteer), Front of House (Runner)</w:t>
       </w:r>
     </w:p>
     <w:sectPr>

</xml_diff>

<commit_message>
Resume: apply reviewer feedback (verbs, GPA, skills, heading size)
Co-Authored-By: Claude Opus 5.5 <noreply@anthropic.com>
Claude-Session: https://claude.ai/code/session_01G3JV145HgjUfXQyW7hEcYE
</commit_message>
<xml_diff>
--- a/assets/Jennifer-Amogu-Resume.docx
+++ b/assets/Jennifer-Amogu-Resume.docx
@@ -42,16 +42,20 @@
       <w:r>
         <w:rPr>
           <w:rFonts w:ascii="EB Garamond" w:cs="EB Garamond" w:eastAsia="EB Garamond" w:hAnsi="EB Garamond"/>
+          <w:b/>
+          <w:bCs/>
+          <w:sz w:val="24"/>
+          <w:szCs w:val="24"/>
+        </w:rPr>
+        <w:t xml:space="preserve">E</w:t>
+      </w:r>
+      <w:r>
+        <w:rPr>
+          <w:rFonts w:ascii="EB Garamond" w:cs="EB Garamond" w:eastAsia="EB Garamond" w:hAnsi="EB Garamond"/>
+          <w:b/>
+          <w:bCs/>
           <w:sz w:val="21"/>
           <w:szCs w:val="21"/>
-        </w:rPr>
-        <w:t xml:space="preserve">E</w:t>
-      </w:r>
-      <w:r>
-        <w:rPr>
-          <w:rFonts w:ascii="EB Garamond" w:cs="EB Garamond" w:eastAsia="EB Garamond" w:hAnsi="EB Garamond"/>
-          <w:sz w:val="18"/>
-          <w:szCs w:val="18"/>
         </w:rPr>
         <w:t xml:space="preserve">DUCATION</w:t>
       </w:r>
@@ -113,7 +117,7 @@
           <w:sz w:val="20"/>
           <w:szCs w:val="20"/>
         </w:rPr>
-        <w:t xml:space="preserve">	Cumulative GPA: 3.9/4.0</w:t>
+        <w:t xml:space="preserve">	Cumulative GPA: 3.9</w:t>
       </w:r>
     </w:p>
     <w:p>
@@ -149,40 +153,50 @@
       <w:r>
         <w:rPr>
           <w:rFonts w:ascii="EB Garamond" w:cs="EB Garamond" w:eastAsia="EB Garamond" w:hAnsi="EB Garamond"/>
+          <w:b/>
+          <w:bCs/>
+          <w:sz w:val="24"/>
+          <w:szCs w:val="24"/>
+        </w:rPr>
+        <w:t xml:space="preserve">P</w:t>
+      </w:r>
+      <w:r>
+        <w:rPr>
+          <w:rFonts w:ascii="EB Garamond" w:cs="EB Garamond" w:eastAsia="EB Garamond" w:hAnsi="EB Garamond"/>
+          <w:b/>
+          <w:bCs/>
           <w:sz w:val="21"/>
           <w:szCs w:val="21"/>
         </w:rPr>
-        <w:t xml:space="preserve">P</w:t>
-      </w:r>
-      <w:r>
-        <w:rPr>
-          <w:rFonts w:ascii="EB Garamond" w:cs="EB Garamond" w:eastAsia="EB Garamond" w:hAnsi="EB Garamond"/>
-          <w:sz w:val="18"/>
-          <w:szCs w:val="18"/>
-        </w:rPr>
         <w:t xml:space="preserve">ROFESSIONAL</w:t>
       </w:r>
       <w:r>
         <w:rPr>
           <w:rFonts w:ascii="EB Garamond" w:cs="EB Garamond" w:eastAsia="EB Garamond" w:hAnsi="EB Garamond"/>
+          <w:b/>
+          <w:bCs/>
+          <w:sz w:val="24"/>
+          <w:szCs w:val="24"/>
+        </w:rPr>
+        <w:t xml:space="preserve"> </w:t>
+      </w:r>
+      <w:r>
+        <w:rPr>
+          <w:rFonts w:ascii="EB Garamond" w:cs="EB Garamond" w:eastAsia="EB Garamond" w:hAnsi="EB Garamond"/>
+          <w:b/>
+          <w:bCs/>
+          <w:sz w:val="24"/>
+          <w:szCs w:val="24"/>
+        </w:rPr>
+        <w:t xml:space="preserve">E</w:t>
+      </w:r>
+      <w:r>
+        <w:rPr>
+          <w:rFonts w:ascii="EB Garamond" w:cs="EB Garamond" w:eastAsia="EB Garamond" w:hAnsi="EB Garamond"/>
+          <w:b/>
+          <w:bCs/>
           <w:sz w:val="21"/>
           <w:szCs w:val="21"/>
-        </w:rPr>
-        <w:t xml:space="preserve"> </w:t>
-      </w:r>
-      <w:r>
-        <w:rPr>
-          <w:rFonts w:ascii="EB Garamond" w:cs="EB Garamond" w:eastAsia="EB Garamond" w:hAnsi="EB Garamond"/>
-          <w:sz w:val="21"/>
-          <w:szCs w:val="21"/>
-        </w:rPr>
-        <w:t xml:space="preserve">E</w:t>
-      </w:r>
-      <w:r>
-        <w:rPr>
-          <w:rFonts w:ascii="EB Garamond" w:cs="EB Garamond" w:eastAsia="EB Garamond" w:hAnsi="EB Garamond"/>
-          <w:sz w:val="18"/>
-          <w:szCs w:val="18"/>
         </w:rPr>
         <w:t xml:space="preserve">XPERIENCE</w:t>
       </w:r>
@@ -372,7 +386,7 @@
           <w:sz w:val="20"/>
           <w:szCs w:val="20"/>
         </w:rPr>
-        <w:t xml:space="preserve">Managed tracking of due diligence requests across all workstreams, flagging outstanding items each week between client and buyside teams</w:t>
+        <w:t xml:space="preserve">Maintained the due diligence request tracker across all workstreams, flagging open items weekly to keep client and buyside teams on schedule</w:t>
       </w:r>
     </w:p>
     <w:p>
@@ -439,7 +453,7 @@
           <w:sz w:val="20"/>
           <w:szCs w:val="20"/>
         </w:rPr>
-        <w:t xml:space="preserve">Supported multiple sell-side M&amp;A mandates through company research, industry analysis, and preparation of transaction marketing materials</w:t>
+        <w:t xml:space="preserve">Executed company and industry research across sell-side M&amp;A mandates, producing buyer profiles and marketing materials for live processes</w:t>
       </w:r>
     </w:p>
     <w:p>
@@ -560,7 +574,7 @@
           <w:sz w:val="20"/>
           <w:szCs w:val="20"/>
         </w:rPr>
-        <w:t xml:space="preserve">Assisted with deal execution and portfolio monitoring for six US- and India-based B2B SaaS investments in AI/ML, logistics, and RegTech</w:t>
+        <w:t xml:space="preserve">Tracked KPIs for six US- and India-based B2B SaaS portfolio companies across AI/ML, logistics, and RegTech, informing portfolio reviews</w:t>
       </w:r>
     </w:p>
     <w:p>
@@ -730,88 +744,110 @@
       <w:r>
         <w:rPr>
           <w:rFonts w:ascii="EB Garamond" w:cs="EB Garamond" w:eastAsia="EB Garamond" w:hAnsi="EB Garamond"/>
+          <w:b/>
+          <w:bCs/>
+          <w:sz w:val="24"/>
+          <w:szCs w:val="24"/>
+        </w:rPr>
+        <w:t xml:space="preserve">L</w:t>
+      </w:r>
+      <w:r>
+        <w:rPr>
+          <w:rFonts w:ascii="EB Garamond" w:cs="EB Garamond" w:eastAsia="EB Garamond" w:hAnsi="EB Garamond"/>
+          <w:b/>
+          <w:bCs/>
           <w:sz w:val="21"/>
           <w:szCs w:val="21"/>
         </w:rPr>
-        <w:t xml:space="preserve">L</w:t>
-      </w:r>
-      <w:r>
-        <w:rPr>
-          <w:rFonts w:ascii="EB Garamond" w:cs="EB Garamond" w:eastAsia="EB Garamond" w:hAnsi="EB Garamond"/>
-          <w:sz w:val="18"/>
-          <w:szCs w:val="18"/>
-        </w:rPr>
         <w:t xml:space="preserve">EADERSHIP</w:t>
       </w:r>
       <w:r>
         <w:rPr>
           <w:rFonts w:ascii="EB Garamond" w:cs="EB Garamond" w:eastAsia="EB Garamond" w:hAnsi="EB Garamond"/>
+          <w:b/>
+          <w:bCs/>
+          <w:sz w:val="24"/>
+          <w:szCs w:val="24"/>
+        </w:rPr>
+        <w:t xml:space="preserve"> </w:t>
+      </w:r>
+      <w:r>
+        <w:rPr>
+          <w:rFonts w:ascii="EB Garamond" w:cs="EB Garamond" w:eastAsia="EB Garamond" w:hAnsi="EB Garamond"/>
+          <w:b/>
+          <w:bCs/>
           <w:sz w:val="21"/>
           <w:szCs w:val="21"/>
         </w:rPr>
-        <w:t xml:space="preserve"> </w:t>
-      </w:r>
-      <w:r>
-        <w:rPr>
-          <w:rFonts w:ascii="EB Garamond" w:cs="EB Garamond" w:eastAsia="EB Garamond" w:hAnsi="EB Garamond"/>
-          <w:sz w:val="18"/>
-          <w:szCs w:val="18"/>
-        </w:rPr>
         <w:t xml:space="preserve">A</w:t>
       </w:r>
       <w:r>
         <w:rPr>
           <w:rFonts w:ascii="EB Garamond" w:cs="EB Garamond" w:eastAsia="EB Garamond" w:hAnsi="EB Garamond"/>
-          <w:sz w:val="18"/>
-          <w:szCs w:val="18"/>
-        </w:rPr>
-        <w:t xml:space="preserve">ND</w:t>
-      </w:r>
-      <w:r>
-        <w:rPr>
-          <w:rFonts w:ascii="EB Garamond" w:cs="EB Garamond" w:eastAsia="EB Garamond" w:hAnsi="EB Garamond"/>
+          <w:b/>
+          <w:bCs/>
           <w:sz w:val="21"/>
           <w:szCs w:val="21"/>
         </w:rPr>
+        <w:t xml:space="preserve">ND</w:t>
+      </w:r>
+      <w:r>
+        <w:rPr>
+          <w:rFonts w:ascii="EB Garamond" w:cs="EB Garamond" w:eastAsia="EB Garamond" w:hAnsi="EB Garamond"/>
+          <w:b/>
+          <w:bCs/>
+          <w:sz w:val="24"/>
+          <w:szCs w:val="24"/>
+        </w:rPr>
         <w:t xml:space="preserve"> </w:t>
       </w:r>
       <w:r>
         <w:rPr>
           <w:rFonts w:ascii="EB Garamond" w:cs="EB Garamond" w:eastAsia="EB Garamond" w:hAnsi="EB Garamond"/>
+          <w:b/>
+          <w:bCs/>
+          <w:sz w:val="24"/>
+          <w:szCs w:val="24"/>
+        </w:rPr>
+        <w:t xml:space="preserve">P</w:t>
+      </w:r>
+      <w:r>
+        <w:rPr>
+          <w:rFonts w:ascii="EB Garamond" w:cs="EB Garamond" w:eastAsia="EB Garamond" w:hAnsi="EB Garamond"/>
+          <w:b/>
+          <w:bCs/>
           <w:sz w:val="21"/>
           <w:szCs w:val="21"/>
         </w:rPr>
-        <w:t xml:space="preserve">P</w:t>
-      </w:r>
-      <w:r>
-        <w:rPr>
-          <w:rFonts w:ascii="EB Garamond" w:cs="EB Garamond" w:eastAsia="EB Garamond" w:hAnsi="EB Garamond"/>
-          <w:sz w:val="18"/>
-          <w:szCs w:val="18"/>
-        </w:rPr>
         <w:t xml:space="preserve">ROFESSIONAL</w:t>
       </w:r>
       <w:r>
         <w:rPr>
           <w:rFonts w:ascii="EB Garamond" w:cs="EB Garamond" w:eastAsia="EB Garamond" w:hAnsi="EB Garamond"/>
+          <w:b/>
+          <w:bCs/>
+          <w:sz w:val="24"/>
+          <w:szCs w:val="24"/>
+        </w:rPr>
+        <w:t xml:space="preserve"> </w:t>
+      </w:r>
+      <w:r>
+        <w:rPr>
+          <w:rFonts w:ascii="EB Garamond" w:cs="EB Garamond" w:eastAsia="EB Garamond" w:hAnsi="EB Garamond"/>
+          <w:b/>
+          <w:bCs/>
+          <w:sz w:val="24"/>
+          <w:szCs w:val="24"/>
+        </w:rPr>
+        <w:t xml:space="preserve">D</w:t>
+      </w:r>
+      <w:r>
+        <w:rPr>
+          <w:rFonts w:ascii="EB Garamond" w:cs="EB Garamond" w:eastAsia="EB Garamond" w:hAnsi="EB Garamond"/>
+          <w:b/>
+          <w:bCs/>
           <w:sz w:val="21"/>
           <w:szCs w:val="21"/>
-        </w:rPr>
-        <w:t xml:space="preserve"> </w:t>
-      </w:r>
-      <w:r>
-        <w:rPr>
-          <w:rFonts w:ascii="EB Garamond" w:cs="EB Garamond" w:eastAsia="EB Garamond" w:hAnsi="EB Garamond"/>
-          <w:sz w:val="21"/>
-          <w:szCs w:val="21"/>
-        </w:rPr>
-        <w:t xml:space="preserve">D</w:t>
-      </w:r>
-      <w:r>
-        <w:rPr>
-          <w:rFonts w:ascii="EB Garamond" w:cs="EB Garamond" w:eastAsia="EB Garamond" w:hAnsi="EB Garamond"/>
-          <w:sz w:val="18"/>
-          <w:szCs w:val="18"/>
         </w:rPr>
         <w:t xml:space="preserve">EVELOPMENT</w:t>
       </w:r>
@@ -1317,81 +1353,101 @@
       <w:r>
         <w:rPr>
           <w:rFonts w:ascii="EB Garamond" w:cs="EB Garamond" w:eastAsia="EB Garamond" w:hAnsi="EB Garamond"/>
+          <w:b/>
+          <w:bCs/>
+          <w:sz w:val="24"/>
+          <w:szCs w:val="24"/>
+        </w:rPr>
+        <w:t xml:space="preserve">S</w:t>
+      </w:r>
+      <w:r>
+        <w:rPr>
+          <w:rFonts w:ascii="EB Garamond" w:cs="EB Garamond" w:eastAsia="EB Garamond" w:hAnsi="EB Garamond"/>
+          <w:b/>
+          <w:bCs/>
           <w:sz w:val="21"/>
           <w:szCs w:val="21"/>
         </w:rPr>
-        <w:t xml:space="preserve">S</w:t>
-      </w:r>
-      <w:r>
-        <w:rPr>
-          <w:rFonts w:ascii="EB Garamond" w:cs="EB Garamond" w:eastAsia="EB Garamond" w:hAnsi="EB Garamond"/>
-          <w:sz w:val="18"/>
-          <w:szCs w:val="18"/>
-        </w:rPr>
         <w:t xml:space="preserve">KILLS,</w:t>
       </w:r>
       <w:r>
         <w:rPr>
           <w:rFonts w:ascii="EB Garamond" w:cs="EB Garamond" w:eastAsia="EB Garamond" w:hAnsi="EB Garamond"/>
+          <w:b/>
+          <w:bCs/>
+          <w:sz w:val="24"/>
+          <w:szCs w:val="24"/>
+        </w:rPr>
+        <w:t xml:space="preserve"> </w:t>
+      </w:r>
+      <w:r>
+        <w:rPr>
+          <w:rFonts w:ascii="EB Garamond" w:cs="EB Garamond" w:eastAsia="EB Garamond" w:hAnsi="EB Garamond"/>
+          <w:b/>
+          <w:bCs/>
+          <w:sz w:val="24"/>
+          <w:szCs w:val="24"/>
+        </w:rPr>
+        <w:t xml:space="preserve">I</w:t>
+      </w:r>
+      <w:r>
+        <w:rPr>
+          <w:rFonts w:ascii="EB Garamond" w:cs="EB Garamond" w:eastAsia="EB Garamond" w:hAnsi="EB Garamond"/>
+          <w:b/>
+          <w:bCs/>
           <w:sz w:val="21"/>
           <w:szCs w:val="21"/>
         </w:rPr>
+        <w:t xml:space="preserve">NTERESTS</w:t>
+      </w:r>
+      <w:r>
+        <w:rPr>
+          <w:rFonts w:ascii="EB Garamond" w:cs="EB Garamond" w:eastAsia="EB Garamond" w:hAnsi="EB Garamond"/>
+          <w:b/>
+          <w:bCs/>
+          <w:sz w:val="24"/>
+          <w:szCs w:val="24"/>
+        </w:rPr>
         <w:t xml:space="preserve"> </w:t>
       </w:r>
       <w:r>
         <w:rPr>
           <w:rFonts w:ascii="EB Garamond" w:cs="EB Garamond" w:eastAsia="EB Garamond" w:hAnsi="EB Garamond"/>
+          <w:b/>
+          <w:bCs/>
           <w:sz w:val="21"/>
           <w:szCs w:val="21"/>
         </w:rPr>
-        <w:t xml:space="preserve">I</w:t>
-      </w:r>
-      <w:r>
-        <w:rPr>
-          <w:rFonts w:ascii="EB Garamond" w:cs="EB Garamond" w:eastAsia="EB Garamond" w:hAnsi="EB Garamond"/>
-          <w:sz w:val="18"/>
-          <w:szCs w:val="18"/>
-        </w:rPr>
-        <w:t xml:space="preserve">NTERESTS</w:t>
-      </w:r>
-      <w:r>
-        <w:rPr>
-          <w:rFonts w:ascii="EB Garamond" w:cs="EB Garamond" w:eastAsia="EB Garamond" w:hAnsi="EB Garamond"/>
+        <w:t xml:space="preserve">&amp;</w:t>
+      </w:r>
+      <w:r>
+        <w:rPr>
+          <w:rFonts w:ascii="EB Garamond" w:cs="EB Garamond" w:eastAsia="EB Garamond" w:hAnsi="EB Garamond"/>
+          <w:b/>
+          <w:bCs/>
+          <w:sz w:val="24"/>
+          <w:szCs w:val="24"/>
+        </w:rPr>
+        <w:t xml:space="preserve"> </w:t>
+      </w:r>
+      <w:r>
+        <w:rPr>
+          <w:rFonts w:ascii="EB Garamond" w:cs="EB Garamond" w:eastAsia="EB Garamond" w:hAnsi="EB Garamond"/>
+          <w:b/>
+          <w:bCs/>
+          <w:sz w:val="24"/>
+          <w:szCs w:val="24"/>
+        </w:rPr>
+        <w:t xml:space="preserve">A</w:t>
+      </w:r>
+      <w:r>
+        <w:rPr>
+          <w:rFonts w:ascii="EB Garamond" w:cs="EB Garamond" w:eastAsia="EB Garamond" w:hAnsi="EB Garamond"/>
+          <w:b/>
+          <w:bCs/>
           <w:sz w:val="21"/>
           <w:szCs w:val="21"/>
         </w:rPr>
-        <w:t xml:space="preserve"> </w:t>
-      </w:r>
-      <w:r>
-        <w:rPr>
-          <w:rFonts w:ascii="EB Garamond" w:cs="EB Garamond" w:eastAsia="EB Garamond" w:hAnsi="EB Garamond"/>
-          <w:sz w:val="18"/>
-          <w:szCs w:val="18"/>
-        </w:rPr>
-        <w:t xml:space="preserve">&amp;</w:t>
-      </w:r>
-      <w:r>
-        <w:rPr>
-          <w:rFonts w:ascii="EB Garamond" w:cs="EB Garamond" w:eastAsia="EB Garamond" w:hAnsi="EB Garamond"/>
-          <w:sz w:val="21"/>
-          <w:szCs w:val="21"/>
-        </w:rPr>
-        <w:t xml:space="preserve"> </w:t>
-      </w:r>
-      <w:r>
-        <w:rPr>
-          <w:rFonts w:ascii="EB Garamond" w:cs="EB Garamond" w:eastAsia="EB Garamond" w:hAnsi="EB Garamond"/>
-          <w:sz w:val="21"/>
-          <w:szCs w:val="21"/>
-        </w:rPr>
-        <w:t xml:space="preserve">A</w:t>
-      </w:r>
-      <w:r>
-        <w:rPr>
-          <w:rFonts w:ascii="EB Garamond" w:cs="EB Garamond" w:eastAsia="EB Garamond" w:hAnsi="EB Garamond"/>
-          <w:sz w:val="18"/>
-          <w:szCs w:val="18"/>
-        </w:rPr>
         <w:t xml:space="preserve">CTIVITIES</w:t>
       </w:r>
     </w:p>
@@ -1415,7 +1471,7 @@
           <w:sz w:val="20"/>
           <w:szCs w:val="20"/>
         </w:rPr>
-        <w:t xml:space="preserve">Excel, PowerPoint, PitchBook, Python, Codex</w:t>
+        <w:t xml:space="preserve">Financial Modeling (DCF, LBO, Comps, Sum-of-the-Parts), PitchBook, Python, Codex</w:t>
       </w:r>
     </w:p>
     <w:p>

</xml_diff>

<commit_message>
Resume: First Analysis now current role (Oct 2026 - Present)
Co-Authored-By: Claude Opus 5.5 <noreply@anthropic.com>
Claude-Session: https://claude.ai/code/session_01G3JV145HgjUfXQyW7hEcYE
</commit_message>
<xml_diff>
--- a/assets/Jennifer-Amogu-Resume.docx
+++ b/assets/Jennifer-Amogu-Resume.docx
@@ -232,7 +232,7 @@
           <w:sz w:val="20"/>
           <w:szCs w:val="20"/>
         </w:rPr>
-        <w:t xml:space="preserve">	Oct 2026</w:t>
+        <w:t xml:space="preserve">	Oct 2026 - Present</w:t>
       </w:r>
     </w:p>
     <w:p>
@@ -247,7 +247,7 @@
           <w:sz w:val="20"/>
           <w:szCs w:val="20"/>
         </w:rPr>
-        <w:t xml:space="preserve">Incoming Investment Banking Fall Analyst</w:t>
+        <w:t xml:space="preserve">Investment Banking Fall Analyst</w:t>
       </w:r>
     </w:p>
     <w:p>

</xml_diff>

<commit_message>
Resume: order leadership entries reverse-chronologically
Co-Authored-By: Claude Opus 5.5 <noreply@anthropic.com>
Claude-Session: https://claude.ai/code/session_01G3JV145HgjUfXQyW7hEcYE
</commit_message>
<xml_diff>
--- a/assets/Jennifer-Amogu-Resume.docx
+++ b/assets/Jennifer-Amogu-Resume.docx
@@ -962,15 +962,15 @@
           <w:sz w:val="20"/>
           <w:szCs w:val="20"/>
         </w:rPr>
-        <w:t xml:space="preserve">Management Leadership for Tomorrow (MLT)</w:t>
-      </w:r>
-      <w:r>
-        <w:rPr>
-          <w:rFonts w:ascii="EB Garamond" w:cs="EB Garamond" w:eastAsia="EB Garamond" w:hAnsi="EB Garamond"/>
-          <w:sz w:val="20"/>
-          <w:szCs w:val="20"/>
-        </w:rPr>
-        <w:t xml:space="preserve">	Sep 2026 - Present</w:t>
+        <w:t xml:space="preserve">Recalc Finance Accelerator</w:t>
+      </w:r>
+      <w:r>
+        <w:rPr>
+          <w:rFonts w:ascii="EB Garamond" w:cs="EB Garamond" w:eastAsia="EB Garamond" w:hAnsi="EB Garamond"/>
+          <w:sz w:val="20"/>
+          <w:szCs w:val="20"/>
+        </w:rPr>
+        <w:t xml:space="preserve">	Oct 2026 - Present</w:t>
       </w:r>
     </w:p>
     <w:p>
@@ -985,61 +985,61 @@
           <w:sz w:val="20"/>
           <w:szCs w:val="20"/>
         </w:rPr>
-        <w:t xml:space="preserve">Career Prep Fellow</w:t>
-      </w:r>
-    </w:p>
-    <w:p>
-      <w:pPr>
-        <w:pStyle w:val="ListParagraph"/>
-        <w:numPr>
-          <w:ilvl w:val="0"/>
-          <w:numId w:val="2"/>
-        </w:numPr>
-        <w:spacing w:after="0" w:before="0" w:line="198" w:lineRule="auto"/>
-      </w:pPr>
-      <w:r>
-        <w:rPr>
-          <w:rFonts w:ascii="EB Garamond" w:cs="EB Garamond" w:eastAsia="EB Garamond" w:hAnsi="EB Garamond"/>
-          <w:sz w:val="20"/>
-          <w:szCs w:val="20"/>
-        </w:rPr>
-        <w:t xml:space="preserve">Selected for competitive 18+-month fellowship accelerating emerging leaders' careers via executive coaching, skill-building, and mentorship</w:t>
-      </w:r>
-    </w:p>
-    <w:p>
-      <w:pPr>
-        <w:pStyle w:val="ListParagraph"/>
-        <w:numPr>
-          <w:ilvl w:val="0"/>
-          <w:numId w:val="2"/>
-        </w:numPr>
-        <w:spacing w:after="0" w:before="0" w:line="198" w:lineRule="auto"/>
-      </w:pPr>
-      <w:r>
-        <w:rPr>
-          <w:rFonts w:ascii="EB Garamond" w:cs="EB Garamond" w:eastAsia="EB Garamond" w:hAnsi="EB Garamond"/>
-          <w:sz w:val="20"/>
-          <w:szCs w:val="20"/>
-        </w:rPr>
-        <w:t xml:space="preserve">Completed rigorous business case analyses, quantitative problem-solving assignments, and strategic simulations evaluated by career coaches</w:t>
-      </w:r>
-    </w:p>
-    <w:p>
-      <w:pPr>
-        <w:pStyle w:val="ListParagraph"/>
-        <w:numPr>
-          <w:ilvl w:val="0"/>
-          <w:numId w:val="2"/>
-        </w:numPr>
-        <w:spacing w:after="0" w:before="0" w:line="198" w:lineRule="auto"/>
-      </w:pPr>
-      <w:r>
-        <w:rPr>
-          <w:rFonts w:ascii="EB Garamond" w:cs="EB Garamond" w:eastAsia="EB Garamond" w:hAnsi="EB Garamond"/>
-          <w:sz w:val="20"/>
-          <w:szCs w:val="20"/>
-        </w:rPr>
-        <w:t xml:space="preserve">Engaged with corporate partner firms to gain direct industry exposure and prepare for accelerated investment banking and buyside recruiting</w:t>
+        <w:t xml:space="preserve">Fall 2026 Cohort Member</w:t>
+      </w:r>
+    </w:p>
+    <w:p>
+      <w:pPr>
+        <w:pStyle w:val="ListParagraph"/>
+        <w:numPr>
+          <w:ilvl w:val="0"/>
+          <w:numId w:val="2"/>
+        </w:numPr>
+        <w:spacing w:after="0" w:before="0" w:line="198" w:lineRule="auto"/>
+      </w:pPr>
+      <w:r>
+        <w:rPr>
+          <w:rFonts w:ascii="EB Garamond" w:cs="EB Garamond" w:eastAsia="EB Garamond" w:hAnsi="EB Garamond"/>
+          <w:sz w:val="20"/>
+          <w:szCs w:val="20"/>
+        </w:rPr>
+        <w:t xml:space="preserve">Selected via competitive application for an intensive finance accelerator backed by leading PE sponsors, focused on investor-grade modeling</w:t>
+      </w:r>
+    </w:p>
+    <w:p>
+      <w:pPr>
+        <w:pStyle w:val="ListParagraph"/>
+        <w:numPr>
+          <w:ilvl w:val="0"/>
+          <w:numId w:val="2"/>
+        </w:numPr>
+        <w:spacing w:after="0" w:before="0" w:line="198" w:lineRule="auto"/>
+      </w:pPr>
+      <w:r>
+        <w:rPr>
+          <w:rFonts w:ascii="EB Garamond" w:cs="EB Garamond" w:eastAsia="EB Garamond" w:hAnsi="EB Garamond"/>
+          <w:sz w:val="20"/>
+          <w:szCs w:val="20"/>
+        </w:rPr>
+        <w:t xml:space="preserve">Constructed multi-period three-statement operating models from blank spreadsheets with working capital, debt waterfalls, and sensitivities</w:t>
+      </w:r>
+    </w:p>
+    <w:p>
+      <w:pPr>
+        <w:pStyle w:val="ListParagraph"/>
+        <w:numPr>
+          <w:ilvl w:val="0"/>
+          <w:numId w:val="2"/>
+        </w:numPr>
+        <w:spacing w:after="0" w:before="0" w:line="198" w:lineRule="auto"/>
+      </w:pPr>
+      <w:r>
+        <w:rPr>
+          <w:rFonts w:ascii="EB Garamond" w:cs="EB Garamond" w:eastAsia="EB Garamond" w:hAnsi="EB Garamond"/>
+          <w:sz w:val="20"/>
+          <w:szCs w:val="20"/>
+        </w:rPr>
+        <w:t xml:space="preserve">Evaluated buyout case studies, analyzed operational drivers (unit economics, margins), and presented valuation takeaways to PE investors</w:t>
       </w:r>
     </w:p>
     <w:p>
@@ -1057,15 +1057,15 @@
           <w:sz w:val="20"/>
           <w:szCs w:val="20"/>
         </w:rPr>
-        <w:t xml:space="preserve">Recalc Finance Accelerator</w:t>
-      </w:r>
-      <w:r>
-        <w:rPr>
-          <w:rFonts w:ascii="EB Garamond" w:cs="EB Garamond" w:eastAsia="EB Garamond" w:hAnsi="EB Garamond"/>
-          <w:sz w:val="20"/>
-          <w:szCs w:val="20"/>
-        </w:rPr>
-        <w:t xml:space="preserve">	Oct 2026 - Present</w:t>
+        <w:t xml:space="preserve">Management Leadership for Tomorrow (MLT)</w:t>
+      </w:r>
+      <w:r>
+        <w:rPr>
+          <w:rFonts w:ascii="EB Garamond" w:cs="EB Garamond" w:eastAsia="EB Garamond" w:hAnsi="EB Garamond"/>
+          <w:sz w:val="20"/>
+          <w:szCs w:val="20"/>
+        </w:rPr>
+        <w:t xml:space="preserve">	Sep 2026 - Present</w:t>
       </w:r>
     </w:p>
     <w:p>
@@ -1080,61 +1080,61 @@
           <w:sz w:val="20"/>
           <w:szCs w:val="20"/>
         </w:rPr>
-        <w:t xml:space="preserve">Fall 2026 Cohort Member</w:t>
-      </w:r>
-    </w:p>
-    <w:p>
-      <w:pPr>
-        <w:pStyle w:val="ListParagraph"/>
-        <w:numPr>
-          <w:ilvl w:val="0"/>
-          <w:numId w:val="2"/>
-        </w:numPr>
-        <w:spacing w:after="0" w:before="0" w:line="198" w:lineRule="auto"/>
-      </w:pPr>
-      <w:r>
-        <w:rPr>
-          <w:rFonts w:ascii="EB Garamond" w:cs="EB Garamond" w:eastAsia="EB Garamond" w:hAnsi="EB Garamond"/>
-          <w:sz w:val="20"/>
-          <w:szCs w:val="20"/>
-        </w:rPr>
-        <w:t xml:space="preserve">Selected via competitive application for an intensive finance accelerator backed by leading PE sponsors, focused on investor-grade modeling</w:t>
-      </w:r>
-    </w:p>
-    <w:p>
-      <w:pPr>
-        <w:pStyle w:val="ListParagraph"/>
-        <w:numPr>
-          <w:ilvl w:val="0"/>
-          <w:numId w:val="2"/>
-        </w:numPr>
-        <w:spacing w:after="0" w:before="0" w:line="198" w:lineRule="auto"/>
-      </w:pPr>
-      <w:r>
-        <w:rPr>
-          <w:rFonts w:ascii="EB Garamond" w:cs="EB Garamond" w:eastAsia="EB Garamond" w:hAnsi="EB Garamond"/>
-          <w:sz w:val="20"/>
-          <w:szCs w:val="20"/>
-        </w:rPr>
-        <w:t xml:space="preserve">Constructed multi-period three-statement operating models from blank spreadsheets with working capital, debt waterfalls, and sensitivities</w:t>
-      </w:r>
-    </w:p>
-    <w:p>
-      <w:pPr>
-        <w:pStyle w:val="ListParagraph"/>
-        <w:numPr>
-          <w:ilvl w:val="0"/>
-          <w:numId w:val="2"/>
-        </w:numPr>
-        <w:spacing w:after="0" w:before="0" w:line="198" w:lineRule="auto"/>
-      </w:pPr>
-      <w:r>
-        <w:rPr>
-          <w:rFonts w:ascii="EB Garamond" w:cs="EB Garamond" w:eastAsia="EB Garamond" w:hAnsi="EB Garamond"/>
-          <w:sz w:val="20"/>
-          <w:szCs w:val="20"/>
-        </w:rPr>
-        <w:t xml:space="preserve">Evaluated buyout case studies, analyzed operational drivers (unit economics, margins), and presented valuation takeaways to PE investors</w:t>
+        <w:t xml:space="preserve">Career Prep Fellow</w:t>
+      </w:r>
+    </w:p>
+    <w:p>
+      <w:pPr>
+        <w:pStyle w:val="ListParagraph"/>
+        <w:numPr>
+          <w:ilvl w:val="0"/>
+          <w:numId w:val="2"/>
+        </w:numPr>
+        <w:spacing w:after="0" w:before="0" w:line="198" w:lineRule="auto"/>
+      </w:pPr>
+      <w:r>
+        <w:rPr>
+          <w:rFonts w:ascii="EB Garamond" w:cs="EB Garamond" w:eastAsia="EB Garamond" w:hAnsi="EB Garamond"/>
+          <w:sz w:val="20"/>
+          <w:szCs w:val="20"/>
+        </w:rPr>
+        <w:t xml:space="preserve">Selected for competitive 18+-month fellowship accelerating emerging leaders' careers via executive coaching, skill-building, and mentorship</w:t>
+      </w:r>
+    </w:p>
+    <w:p>
+      <w:pPr>
+        <w:pStyle w:val="ListParagraph"/>
+        <w:numPr>
+          <w:ilvl w:val="0"/>
+          <w:numId w:val="2"/>
+        </w:numPr>
+        <w:spacing w:after="0" w:before="0" w:line="198" w:lineRule="auto"/>
+      </w:pPr>
+      <w:r>
+        <w:rPr>
+          <w:rFonts w:ascii="EB Garamond" w:cs="EB Garamond" w:eastAsia="EB Garamond" w:hAnsi="EB Garamond"/>
+          <w:sz w:val="20"/>
+          <w:szCs w:val="20"/>
+        </w:rPr>
+        <w:t xml:space="preserve">Completed rigorous business case analyses, quantitative problem-solving assignments, and strategic simulations evaluated by career coaches</w:t>
+      </w:r>
+    </w:p>
+    <w:p>
+      <w:pPr>
+        <w:pStyle w:val="ListParagraph"/>
+        <w:numPr>
+          <w:ilvl w:val="0"/>
+          <w:numId w:val="2"/>
+        </w:numPr>
+        <w:spacing w:after="0" w:before="0" w:line="198" w:lineRule="auto"/>
+      </w:pPr>
+      <w:r>
+        <w:rPr>
+          <w:rFonts w:ascii="EB Garamond" w:cs="EB Garamond" w:eastAsia="EB Garamond" w:hAnsi="EB Garamond"/>
+          <w:sz w:val="20"/>
+          <w:szCs w:val="20"/>
+        </w:rPr>
+        <w:t xml:space="preserve">Engaged with corporate partner firms to gain direct industry exposure and prepare for accelerated investment banking and buyside recruiting</w:t>
       </w:r>
     </w:p>
     <w:p>
@@ -1152,23 +1152,23 @@
           <w:sz w:val="20"/>
           <w:szCs w:val="20"/>
         </w:rPr>
-        <w:t xml:space="preserve">Vandy 2 Wall Street</w:t>
-      </w:r>
-      <w:r>
-        <w:rPr>
-          <w:rFonts w:ascii="EB Garamond" w:cs="EB Garamond" w:eastAsia="EB Garamond" w:hAnsi="EB Garamond"/>
-          <w:sz w:val="20"/>
-          <w:szCs w:val="20"/>
-        </w:rPr>
-        <w:t xml:space="preserve"> | Nashville, TN</w:t>
-      </w:r>
-      <w:r>
-        <w:rPr>
-          <w:rFonts w:ascii="EB Garamond" w:cs="EB Garamond" w:eastAsia="EB Garamond" w:hAnsi="EB Garamond"/>
-          <w:sz w:val="20"/>
-          <w:szCs w:val="20"/>
-        </w:rPr>
-        <w:t xml:space="preserve">	Jun 2026</w:t>
+        <w:t xml:space="preserve">SEYA</w:t>
+      </w:r>
+      <w:r>
+        <w:rPr>
+          <w:rFonts w:ascii="EB Garamond" w:cs="EB Garamond" w:eastAsia="EB Garamond" w:hAnsi="EB Garamond"/>
+          <w:sz w:val="20"/>
+          <w:szCs w:val="20"/>
+        </w:rPr>
+        <w:t xml:space="preserve"> | Dallas, TX</w:t>
+      </w:r>
+      <w:r>
+        <w:rPr>
+          <w:rFonts w:ascii="EB Garamond" w:cs="EB Garamond" w:eastAsia="EB Garamond" w:hAnsi="EB Garamond"/>
+          <w:sz w:val="20"/>
+          <w:szCs w:val="20"/>
+        </w:rPr>
+        <w:t xml:space="preserve">	Jun 2025 - Jul 2026</w:t>
       </w:r>
     </w:p>
     <w:p>
@@ -1183,61 +1183,61 @@
           <w:sz w:val="20"/>
           <w:szCs w:val="20"/>
         </w:rPr>
-        <w:t xml:space="preserve">Team Co-Lead, M&amp;A Pitch Competition</w:t>
-      </w:r>
-    </w:p>
-    <w:p>
-      <w:pPr>
-        <w:pStyle w:val="ListParagraph"/>
-        <w:numPr>
-          <w:ilvl w:val="0"/>
-          <w:numId w:val="2"/>
-        </w:numPr>
-        <w:spacing w:after="0" w:before="0" w:line="198" w:lineRule="auto"/>
-      </w:pPr>
-      <w:r>
-        <w:rPr>
-          <w:rFonts w:ascii="EB Garamond" w:cs="EB Garamond" w:eastAsia="EB Garamond" w:hAnsi="EB Garamond"/>
-          <w:sz w:val="20"/>
-          <w:szCs w:val="20"/>
-        </w:rPr>
-        <w:t xml:space="preserve">Selected for inaugural M&amp;A Pitch Competition; recommended selling a 51% controlling stake in Athleta while retaining 49% of the upside</w:t>
-      </w:r>
-    </w:p>
-    <w:p>
-      <w:pPr>
-        <w:pStyle w:val="ListParagraph"/>
-        <w:numPr>
-          <w:ilvl w:val="0"/>
-          <w:numId w:val="2"/>
-        </w:numPr>
-        <w:spacing w:after="0" w:before="0" w:line="198" w:lineRule="auto"/>
-      </w:pPr>
-      <w:r>
-        <w:rPr>
-          <w:rFonts w:ascii="EB Garamond" w:cs="EB Garamond" w:eastAsia="EB Garamond" w:hAnsi="EB Garamond"/>
-          <w:sz w:val="20"/>
-          <w:szCs w:val="20"/>
-        </w:rPr>
-        <w:t xml:space="preserve">Modeled five-year operating case, DCF, sum-of-the-parts, and buyer returns analysis supporting a $561M enterprise value and a 19-20% IRR</w:t>
-      </w:r>
-    </w:p>
-    <w:p>
-      <w:pPr>
-        <w:pStyle w:val="ListParagraph"/>
-        <w:numPr>
-          <w:ilvl w:val="0"/>
-          <w:numId w:val="2"/>
-        </w:numPr>
-        <w:spacing w:after="0" w:before="0" w:line="198" w:lineRule="auto"/>
-      </w:pPr>
-      <w:r>
-        <w:rPr>
-          <w:rFonts w:ascii="EB Garamond" w:cs="EB Garamond" w:eastAsia="EB Garamond" w:hAnsi="EB Garamond"/>
-          <w:sz w:val="20"/>
-          <w:szCs w:val="20"/>
-        </w:rPr>
-        <w:t xml:space="preserve">Analyzed SEC filings, equity research, trading comparables, and precedent transactions to co-author a four-page investment banking memo</w:t>
+        <w:t xml:space="preserve">Co-Founder, DTC Apparel Brand</w:t>
+      </w:r>
+    </w:p>
+    <w:p>
+      <w:pPr>
+        <w:pStyle w:val="ListParagraph"/>
+        <w:numPr>
+          <w:ilvl w:val="0"/>
+          <w:numId w:val="2"/>
+        </w:numPr>
+        <w:spacing w:after="0" w:before="0" w:line="198" w:lineRule="auto"/>
+      </w:pPr>
+      <w:r>
+        <w:rPr>
+          <w:rFonts w:ascii="EB Garamond" w:cs="EB Garamond" w:eastAsia="EB Garamond" w:hAnsi="EB Garamond"/>
+          <w:sz w:val="20"/>
+          <w:szCs w:val="20"/>
+        </w:rPr>
+        <w:t xml:space="preserve">Co-founded a DTC apparel brand that reached $500K+ in first-year revenue; owned pricing, vendor negotiations, and product drop planning</w:t>
+      </w:r>
+    </w:p>
+    <w:p>
+      <w:pPr>
+        <w:pStyle w:val="ListParagraph"/>
+        <w:numPr>
+          <w:ilvl w:val="0"/>
+          <w:numId w:val="2"/>
+        </w:numPr>
+        <w:spacing w:after="0" w:before="0" w:line="198" w:lineRule="auto"/>
+      </w:pPr>
+      <w:r>
+        <w:rPr>
+          <w:rFonts w:ascii="EB Garamond" w:cs="EB Garamond" w:eastAsia="EB Garamond" w:hAnsi="EB Garamond"/>
+          <w:sz w:val="20"/>
+          <w:szCs w:val="20"/>
+        </w:rPr>
+        <w:t xml:space="preserve">Scaled brand to a 6.1M audience reach via campus creator and UGC program spanning 10+ US and Canadian college campuses in year one</w:t>
+      </w:r>
+    </w:p>
+    <w:p>
+      <w:pPr>
+        <w:pStyle w:val="ListParagraph"/>
+        <w:numPr>
+          <w:ilvl w:val="0"/>
+          <w:numId w:val="2"/>
+        </w:numPr>
+        <w:spacing w:after="0" w:before="0" w:line="198" w:lineRule="auto"/>
+      </w:pPr>
+      <w:r>
+        <w:rPr>
+          <w:rFonts w:ascii="EB Garamond" w:cs="EB Garamond" w:eastAsia="EB Garamond" w:hAnsi="EB Garamond"/>
+          <w:sz w:val="20"/>
+          <w:szCs w:val="20"/>
+        </w:rPr>
+        <w:t xml:space="preserve">Built in-house software to replace manual creator tracking, saving 20-25 hours weekly on creator communication, organization, and launches</w:t>
       </w:r>
     </w:p>
     <w:p>
@@ -1255,23 +1255,23 @@
           <w:sz w:val="20"/>
           <w:szCs w:val="20"/>
         </w:rPr>
-        <w:t xml:space="preserve">SEYA</w:t>
-      </w:r>
-      <w:r>
-        <w:rPr>
-          <w:rFonts w:ascii="EB Garamond" w:cs="EB Garamond" w:eastAsia="EB Garamond" w:hAnsi="EB Garamond"/>
-          <w:sz w:val="20"/>
-          <w:szCs w:val="20"/>
-        </w:rPr>
-        <w:t xml:space="preserve"> | Dallas, TX</w:t>
-      </w:r>
-      <w:r>
-        <w:rPr>
-          <w:rFonts w:ascii="EB Garamond" w:cs="EB Garamond" w:eastAsia="EB Garamond" w:hAnsi="EB Garamond"/>
-          <w:sz w:val="20"/>
-          <w:szCs w:val="20"/>
-        </w:rPr>
-        <w:t xml:space="preserve">	Jun 2025 - Jul 2026</w:t>
+        <w:t xml:space="preserve">Vandy 2 Wall Street</w:t>
+      </w:r>
+      <w:r>
+        <w:rPr>
+          <w:rFonts w:ascii="EB Garamond" w:cs="EB Garamond" w:eastAsia="EB Garamond" w:hAnsi="EB Garamond"/>
+          <w:sz w:val="20"/>
+          <w:szCs w:val="20"/>
+        </w:rPr>
+        <w:t xml:space="preserve"> | Nashville, TN</w:t>
+      </w:r>
+      <w:r>
+        <w:rPr>
+          <w:rFonts w:ascii="EB Garamond" w:cs="EB Garamond" w:eastAsia="EB Garamond" w:hAnsi="EB Garamond"/>
+          <w:sz w:val="20"/>
+          <w:szCs w:val="20"/>
+        </w:rPr>
+        <w:t xml:space="preserve">	Jun 2026</w:t>
       </w:r>
     </w:p>
     <w:p>
@@ -1286,61 +1286,61 @@
           <w:sz w:val="20"/>
           <w:szCs w:val="20"/>
         </w:rPr>
-        <w:t xml:space="preserve">Co-Founder, DTC Apparel Brand</w:t>
-      </w:r>
-    </w:p>
-    <w:p>
-      <w:pPr>
-        <w:pStyle w:val="ListParagraph"/>
-        <w:numPr>
-          <w:ilvl w:val="0"/>
-          <w:numId w:val="2"/>
-        </w:numPr>
-        <w:spacing w:after="0" w:before="0" w:line="198" w:lineRule="auto"/>
-      </w:pPr>
-      <w:r>
-        <w:rPr>
-          <w:rFonts w:ascii="EB Garamond" w:cs="EB Garamond" w:eastAsia="EB Garamond" w:hAnsi="EB Garamond"/>
-          <w:sz w:val="20"/>
-          <w:szCs w:val="20"/>
-        </w:rPr>
-        <w:t xml:space="preserve">Co-founded a DTC apparel brand that reached $500K+ in first-year revenue; owned pricing, vendor negotiations, and product drop planning</w:t>
-      </w:r>
-    </w:p>
-    <w:p>
-      <w:pPr>
-        <w:pStyle w:val="ListParagraph"/>
-        <w:numPr>
-          <w:ilvl w:val="0"/>
-          <w:numId w:val="2"/>
-        </w:numPr>
-        <w:spacing w:after="0" w:before="0" w:line="198" w:lineRule="auto"/>
-      </w:pPr>
-      <w:r>
-        <w:rPr>
-          <w:rFonts w:ascii="EB Garamond" w:cs="EB Garamond" w:eastAsia="EB Garamond" w:hAnsi="EB Garamond"/>
-          <w:sz w:val="20"/>
-          <w:szCs w:val="20"/>
-        </w:rPr>
-        <w:t xml:space="preserve">Scaled brand to a 6.1M audience reach via campus creator and UGC program spanning 10+ US and Canadian college campuses in year one</w:t>
-      </w:r>
-    </w:p>
-    <w:p>
-      <w:pPr>
-        <w:pStyle w:val="ListParagraph"/>
-        <w:numPr>
-          <w:ilvl w:val="0"/>
-          <w:numId w:val="2"/>
-        </w:numPr>
-        <w:spacing w:after="0" w:before="0" w:line="198" w:lineRule="auto"/>
-      </w:pPr>
-      <w:r>
-        <w:rPr>
-          <w:rFonts w:ascii="EB Garamond" w:cs="EB Garamond" w:eastAsia="EB Garamond" w:hAnsi="EB Garamond"/>
-          <w:sz w:val="20"/>
-          <w:szCs w:val="20"/>
-        </w:rPr>
-        <w:t xml:space="preserve">Built in-house software to replace manual creator tracking, saving 20-25 hours weekly on creator communication, organization, and launches</w:t>
+        <w:t xml:space="preserve">Team Co-Lead, M&amp;A Pitch Competition</w:t>
+      </w:r>
+    </w:p>
+    <w:p>
+      <w:pPr>
+        <w:pStyle w:val="ListParagraph"/>
+        <w:numPr>
+          <w:ilvl w:val="0"/>
+          <w:numId w:val="2"/>
+        </w:numPr>
+        <w:spacing w:after="0" w:before="0" w:line="198" w:lineRule="auto"/>
+      </w:pPr>
+      <w:r>
+        <w:rPr>
+          <w:rFonts w:ascii="EB Garamond" w:cs="EB Garamond" w:eastAsia="EB Garamond" w:hAnsi="EB Garamond"/>
+          <w:sz w:val="20"/>
+          <w:szCs w:val="20"/>
+        </w:rPr>
+        <w:t xml:space="preserve">Selected for inaugural M&amp;A Pitch Competition; recommended selling a 51% controlling stake in Athleta while retaining 49% of the upside</w:t>
+      </w:r>
+    </w:p>
+    <w:p>
+      <w:pPr>
+        <w:pStyle w:val="ListParagraph"/>
+        <w:numPr>
+          <w:ilvl w:val="0"/>
+          <w:numId w:val="2"/>
+        </w:numPr>
+        <w:spacing w:after="0" w:before="0" w:line="198" w:lineRule="auto"/>
+      </w:pPr>
+      <w:r>
+        <w:rPr>
+          <w:rFonts w:ascii="EB Garamond" w:cs="EB Garamond" w:eastAsia="EB Garamond" w:hAnsi="EB Garamond"/>
+          <w:sz w:val="20"/>
+          <w:szCs w:val="20"/>
+        </w:rPr>
+        <w:t xml:space="preserve">Modeled five-year operating case, DCF, sum-of-the-parts, and buyer returns analysis supporting a $561M enterprise value and a 19-20% IRR</w:t>
+      </w:r>
+    </w:p>
+    <w:p>
+      <w:pPr>
+        <w:pStyle w:val="ListParagraph"/>
+        <w:numPr>
+          <w:ilvl w:val="0"/>
+          <w:numId w:val="2"/>
+        </w:numPr>
+        <w:spacing w:after="0" w:before="0" w:line="198" w:lineRule="auto"/>
+      </w:pPr>
+      <w:r>
+        <w:rPr>
+          <w:rFonts w:ascii="EB Garamond" w:cs="EB Garamond" w:eastAsia="EB Garamond" w:hAnsi="EB Garamond"/>
+          <w:sz w:val="20"/>
+          <w:szCs w:val="20"/>
+        </w:rPr>
+        <w:t xml:space="preserve">Analyzed SEC filings, equity research, trading comparables, and precedent transactions to co-author a four-page investment banking memo</w:t>
       </w:r>
     </w:p>
     <w:p>

</xml_diff>

<commit_message>
Resume: add BLK Capital Management Investment Banking Specialized Pathways
Co-Authored-By: Claude Opus 5.5 <noreply@anthropic.com>
Claude-Session: https://claude.ai/code/session_01G3JV145HgjUfXQyW7hEcYE
</commit_message>
<xml_diff>
--- a/assets/Jennifer-Amogu-Resume.docx
+++ b/assets/Jennifer-Amogu-Resume.docx
@@ -20,7 +20,7 @@
     </w:p>
     <w:p>
       <w:pPr>
-        <w:spacing w:after="0" w:before="0" w:line="198" w:lineRule="auto"/>
+        <w:spacing w:after="0" w:before="0" w:line="188" w:lineRule="auto"/>
         <w:jc w:val="center"/>
       </w:pPr>
       <w:r>
@@ -37,7 +37,7 @@
         <w:pBdr>
           <w:bottom w:val="single" w:color="000000" w:sz="6" w:space="1"/>
         </w:pBdr>
-        <w:spacing w:after="40" w:before="60" w:line="198" w:lineRule="auto"/>
+        <w:spacing w:after="40" w:before="60" w:line="188" w:lineRule="auto"/>
       </w:pPr>
       <w:r>
         <w:rPr>
@@ -65,7 +65,7 @@
         <w:tabs>
           <w:tab w:val="right" w:pos="11228"/>
         </w:tabs>
-        <w:spacing w:after="0" w:before="40" w:line="198" w:lineRule="auto"/>
+        <w:spacing w:after="0" w:before="40" w:line="188" w:lineRule="auto"/>
       </w:pPr>
       <w:r>
         <w:rPr>
@@ -99,7 +99,7 @@
         <w:tabs>
           <w:tab w:val="right" w:pos="11228"/>
         </w:tabs>
-        <w:spacing w:after="0" w:before="0" w:line="198" w:lineRule="auto"/>
+        <w:spacing w:after="0" w:before="0" w:line="188" w:lineRule="auto"/>
       </w:pPr>
       <w:r>
         <w:rPr>
@@ -122,7 +122,7 @@
     </w:p>
     <w:p>
       <w:pPr>
-        <w:spacing w:after="0" w:before="0" w:line="198" w:lineRule="auto"/>
+        <w:spacing w:after="0" w:before="0" w:line="188" w:lineRule="auto"/>
       </w:pPr>
       <w:r>
         <w:rPr>
@@ -148,7 +148,7 @@
         <w:pBdr>
           <w:bottom w:val="single" w:color="000000" w:sz="6" w:space="1"/>
         </w:pBdr>
-        <w:spacing w:after="40" w:before="80" w:line="198" w:lineRule="auto"/>
+        <w:spacing w:after="40" w:before="80" w:line="188" w:lineRule="auto"/>
       </w:pPr>
       <w:r>
         <w:rPr>
@@ -206,7 +206,7 @@
         <w:tabs>
           <w:tab w:val="right" w:pos="11228"/>
         </w:tabs>
-        <w:spacing w:after="0" w:before="40" w:line="198" w:lineRule="auto"/>
+        <w:spacing w:after="0" w:before="40" w:line="188" w:lineRule="auto"/>
       </w:pPr>
       <w:r>
         <w:rPr>
@@ -237,7 +237,7 @@
     </w:p>
     <w:p>
       <w:pPr>
-        <w:spacing w:after="0" w:before="0" w:line="198" w:lineRule="auto"/>
+        <w:spacing w:after="0" w:before="0" w:line="188" w:lineRule="auto"/>
       </w:pPr>
       <w:r>
         <w:rPr>
@@ -257,7 +257,7 @@
           <w:ilvl w:val="0"/>
           <w:numId w:val="2"/>
         </w:numPr>
-        <w:spacing w:after="0" w:before="0" w:line="198" w:lineRule="auto"/>
+        <w:spacing w:after="0" w:before="0" w:line="188" w:lineRule="auto"/>
       </w:pPr>
       <w:r>
         <w:rPr>
@@ -273,7 +273,7 @@
         <w:tabs>
           <w:tab w:val="right" w:pos="11228"/>
         </w:tabs>
-        <w:spacing w:after="0" w:before="24" w:line="198" w:lineRule="auto"/>
+        <w:spacing w:after="0" w:before="24" w:line="188" w:lineRule="auto"/>
       </w:pPr>
       <w:r>
         <w:rPr>
@@ -304,7 +304,7 @@
     </w:p>
     <w:p>
       <w:pPr>
-        <w:spacing w:after="0" w:before="0" w:line="198" w:lineRule="auto"/>
+        <w:spacing w:after="0" w:before="0" w:line="188" w:lineRule="auto"/>
       </w:pPr>
       <w:r>
         <w:rPr>
@@ -324,7 +324,7 @@
           <w:ilvl w:val="0"/>
           <w:numId w:val="2"/>
         </w:numPr>
-        <w:spacing w:after="0" w:before="0" w:line="198" w:lineRule="auto"/>
+        <w:spacing w:after="0" w:before="0" w:line="188" w:lineRule="auto"/>
       </w:pPr>
       <w:r>
         <w:rPr>
@@ -342,7 +342,7 @@
           <w:ilvl w:val="0"/>
           <w:numId w:val="2"/>
         </w:numPr>
-        <w:spacing w:after="0" w:before="0" w:line="198" w:lineRule="auto"/>
+        <w:spacing w:after="0" w:before="0" w:line="188" w:lineRule="auto"/>
       </w:pPr>
       <w:r>
         <w:rPr>
@@ -360,7 +360,7 @@
           <w:ilvl w:val="0"/>
           <w:numId w:val="2"/>
         </w:numPr>
-        <w:spacing w:after="0" w:before="0" w:line="198" w:lineRule="auto"/>
+        <w:spacing w:after="0" w:before="0" w:line="188" w:lineRule="auto"/>
       </w:pPr>
       <w:r>
         <w:rPr>
@@ -378,7 +378,7 @@
           <w:ilvl w:val="0"/>
           <w:numId w:val="2"/>
         </w:numPr>
-        <w:spacing w:after="0" w:before="0" w:line="198" w:lineRule="auto"/>
+        <w:spacing w:after="0" w:before="0" w:line="188" w:lineRule="auto"/>
       </w:pPr>
       <w:r>
         <w:rPr>
@@ -394,7 +394,7 @@
         <w:tabs>
           <w:tab w:val="right" w:pos="11228"/>
         </w:tabs>
-        <w:spacing w:after="0" w:before="24" w:line="198" w:lineRule="auto"/>
+        <w:spacing w:after="0" w:before="24" w:line="188" w:lineRule="auto"/>
       </w:pPr>
       <w:r>
         <w:rPr>
@@ -425,7 +425,7 @@
     </w:p>
     <w:p>
       <w:pPr>
-        <w:spacing w:after="0" w:before="0" w:line="198" w:lineRule="auto"/>
+        <w:spacing w:after="0" w:before="0" w:line="188" w:lineRule="auto"/>
       </w:pPr>
       <w:r>
         <w:rPr>
@@ -445,7 +445,7 @@
           <w:ilvl w:val="0"/>
           <w:numId w:val="2"/>
         </w:numPr>
-        <w:spacing w:after="0" w:before="0" w:line="198" w:lineRule="auto"/>
+        <w:spacing w:after="0" w:before="0" w:line="188" w:lineRule="auto"/>
       </w:pPr>
       <w:r>
         <w:rPr>
@@ -463,7 +463,7 @@
           <w:ilvl w:val="0"/>
           <w:numId w:val="2"/>
         </w:numPr>
-        <w:spacing w:after="0" w:before="0" w:line="198" w:lineRule="auto"/>
+        <w:spacing w:after="0" w:before="0" w:line="188" w:lineRule="auto"/>
       </w:pPr>
       <w:r>
         <w:rPr>
@@ -481,7 +481,7 @@
           <w:ilvl w:val="0"/>
           <w:numId w:val="2"/>
         </w:numPr>
-        <w:spacing w:after="0" w:before="0" w:line="198" w:lineRule="auto"/>
+        <w:spacing w:after="0" w:before="0" w:line="188" w:lineRule="auto"/>
       </w:pPr>
       <w:r>
         <w:rPr>
@@ -499,7 +499,7 @@
           <w:ilvl w:val="0"/>
           <w:numId w:val="2"/>
         </w:numPr>
-        <w:spacing w:after="0" w:before="0" w:line="198" w:lineRule="auto"/>
+        <w:spacing w:after="0" w:before="0" w:line="188" w:lineRule="auto"/>
       </w:pPr>
       <w:r>
         <w:rPr>
@@ -515,7 +515,7 @@
         <w:tabs>
           <w:tab w:val="right" w:pos="11228"/>
         </w:tabs>
-        <w:spacing w:after="0" w:before="24" w:line="198" w:lineRule="auto"/>
+        <w:spacing w:after="0" w:before="24" w:line="188" w:lineRule="auto"/>
       </w:pPr>
       <w:r>
         <w:rPr>
@@ -546,7 +546,7 @@
     </w:p>
     <w:p>
       <w:pPr>
-        <w:spacing w:after="0" w:before="0" w:line="198" w:lineRule="auto"/>
+        <w:spacing w:after="0" w:before="0" w:line="188" w:lineRule="auto"/>
       </w:pPr>
       <w:r>
         <w:rPr>
@@ -566,7 +566,7 @@
           <w:ilvl w:val="0"/>
           <w:numId w:val="2"/>
         </w:numPr>
-        <w:spacing w:after="0" w:before="0" w:line="198" w:lineRule="auto"/>
+        <w:spacing w:after="0" w:before="0" w:line="188" w:lineRule="auto"/>
       </w:pPr>
       <w:r>
         <w:rPr>
@@ -584,7 +584,7 @@
           <w:ilvl w:val="0"/>
           <w:numId w:val="2"/>
         </w:numPr>
-        <w:spacing w:after="0" w:before="0" w:line="198" w:lineRule="auto"/>
+        <w:spacing w:after="0" w:before="0" w:line="188" w:lineRule="auto"/>
       </w:pPr>
       <w:r>
         <w:rPr>
@@ -602,7 +602,7 @@
           <w:ilvl w:val="0"/>
           <w:numId w:val="2"/>
         </w:numPr>
-        <w:spacing w:after="0" w:before="0" w:line="198" w:lineRule="auto"/>
+        <w:spacing w:after="0" w:before="0" w:line="188" w:lineRule="auto"/>
       </w:pPr>
       <w:r>
         <w:rPr>
@@ -620,7 +620,7 @@
           <w:ilvl w:val="0"/>
           <w:numId w:val="2"/>
         </w:numPr>
-        <w:spacing w:after="0" w:before="0" w:line="198" w:lineRule="auto"/>
+        <w:spacing w:after="0" w:before="0" w:line="188" w:lineRule="auto"/>
       </w:pPr>
       <w:r>
         <w:rPr>
@@ -636,7 +636,7 @@
         <w:tabs>
           <w:tab w:val="right" w:pos="11228"/>
         </w:tabs>
-        <w:spacing w:after="0" w:before="24" w:line="198" w:lineRule="auto"/>
+        <w:spacing w:after="0" w:before="24" w:line="188" w:lineRule="auto"/>
       </w:pPr>
       <w:r>
         <w:rPr>
@@ -667,7 +667,7 @@
     </w:p>
     <w:p>
       <w:pPr>
-        <w:spacing w:after="0" w:before="0" w:line="198" w:lineRule="auto"/>
+        <w:spacing w:after="0" w:before="0" w:line="188" w:lineRule="auto"/>
       </w:pPr>
       <w:r>
         <w:rPr>
@@ -687,7 +687,7 @@
           <w:ilvl w:val="0"/>
           <w:numId w:val="2"/>
         </w:numPr>
-        <w:spacing w:after="0" w:before="0" w:line="198" w:lineRule="auto"/>
+        <w:spacing w:after="0" w:before="0" w:line="188" w:lineRule="auto"/>
       </w:pPr>
       <w:r>
         <w:rPr>
@@ -705,7 +705,7 @@
           <w:ilvl w:val="0"/>
           <w:numId w:val="2"/>
         </w:numPr>
-        <w:spacing w:after="0" w:before="0" w:line="198" w:lineRule="auto"/>
+        <w:spacing w:after="0" w:before="0" w:line="188" w:lineRule="auto"/>
       </w:pPr>
       <w:r>
         <w:rPr>
@@ -723,7 +723,7 @@
           <w:ilvl w:val="0"/>
           <w:numId w:val="2"/>
         </w:numPr>
-        <w:spacing w:after="0" w:before="0" w:line="198" w:lineRule="auto"/>
+        <w:spacing w:after="0" w:before="0" w:line="188" w:lineRule="auto"/>
       </w:pPr>
       <w:r>
         <w:rPr>
@@ -739,7 +739,7 @@
         <w:pBdr>
           <w:bottom w:val="single" w:color="000000" w:sz="6" w:space="1"/>
         </w:pBdr>
-        <w:spacing w:after="40" w:before="80" w:line="198" w:lineRule="auto"/>
+        <w:spacing w:after="40" w:before="80" w:line="188" w:lineRule="auto"/>
       </w:pPr>
       <w:r>
         <w:rPr>
@@ -857,7 +857,7 @@
         <w:tabs>
           <w:tab w:val="right" w:pos="11228"/>
         </w:tabs>
-        <w:spacing w:after="0" w:before="40" w:line="198" w:lineRule="auto"/>
+        <w:spacing w:after="0" w:before="40" w:line="188" w:lineRule="auto"/>
       </w:pPr>
       <w:r>
         <w:rPr>
@@ -880,7 +880,7 @@
     </w:p>
     <w:p>
       <w:pPr>
-        <w:spacing w:after="0" w:before="0" w:line="198" w:lineRule="auto"/>
+        <w:spacing w:after="0" w:before="0" w:line="188" w:lineRule="auto"/>
       </w:pPr>
       <w:r>
         <w:rPr>
@@ -900,7 +900,7 @@
           <w:ilvl w:val="0"/>
           <w:numId w:val="2"/>
         </w:numPr>
-        <w:spacing w:after="0" w:before="0" w:line="198" w:lineRule="auto"/>
+        <w:spacing w:after="0" w:before="0" w:line="188" w:lineRule="auto"/>
       </w:pPr>
       <w:r>
         <w:rPr>
@@ -918,7 +918,7 @@
           <w:ilvl w:val="0"/>
           <w:numId w:val="2"/>
         </w:numPr>
-        <w:spacing w:after="0" w:before="0" w:line="198" w:lineRule="auto"/>
+        <w:spacing w:after="0" w:before="0" w:line="188" w:lineRule="auto"/>
       </w:pPr>
       <w:r>
         <w:rPr>
@@ -936,7 +936,7 @@
           <w:ilvl w:val="0"/>
           <w:numId w:val="2"/>
         </w:numPr>
-        <w:spacing w:after="0" w:before="0" w:line="198" w:lineRule="auto"/>
+        <w:spacing w:after="0" w:before="0" w:line="188" w:lineRule="auto"/>
       </w:pPr>
       <w:r>
         <w:rPr>
@@ -952,7 +952,7 @@
         <w:tabs>
           <w:tab w:val="right" w:pos="11228"/>
         </w:tabs>
-        <w:spacing w:after="0" w:before="24" w:line="198" w:lineRule="auto"/>
+        <w:spacing w:after="0" w:before="24" w:line="188" w:lineRule="auto"/>
       </w:pPr>
       <w:r>
         <w:rPr>
@@ -975,7 +975,7 @@
     </w:p>
     <w:p>
       <w:pPr>
-        <w:spacing w:after="0" w:before="0" w:line="198" w:lineRule="auto"/>
+        <w:spacing w:after="0" w:before="0" w:line="188" w:lineRule="auto"/>
       </w:pPr>
       <w:r>
         <w:rPr>
@@ -995,7 +995,7 @@
           <w:ilvl w:val="0"/>
           <w:numId w:val="2"/>
         </w:numPr>
-        <w:spacing w:after="0" w:before="0" w:line="198" w:lineRule="auto"/>
+        <w:spacing w:after="0" w:before="0" w:line="188" w:lineRule="auto"/>
       </w:pPr>
       <w:r>
         <w:rPr>
@@ -1013,7 +1013,7 @@
           <w:ilvl w:val="0"/>
           <w:numId w:val="2"/>
         </w:numPr>
-        <w:spacing w:after="0" w:before="0" w:line="198" w:lineRule="auto"/>
+        <w:spacing w:after="0" w:before="0" w:line="188" w:lineRule="auto"/>
       </w:pPr>
       <w:r>
         <w:rPr>
@@ -1031,7 +1031,7 @@
           <w:ilvl w:val="0"/>
           <w:numId w:val="2"/>
         </w:numPr>
-        <w:spacing w:after="0" w:before="0" w:line="198" w:lineRule="auto"/>
+        <w:spacing w:after="0" w:before="0" w:line="188" w:lineRule="auto"/>
       </w:pPr>
       <w:r>
         <w:rPr>
@@ -1047,30 +1047,30 @@
         <w:tabs>
           <w:tab w:val="right" w:pos="11228"/>
         </w:tabs>
-        <w:spacing w:after="0" w:before="24" w:line="198" w:lineRule="auto"/>
-      </w:pPr>
-      <w:r>
-        <w:rPr>
-          <w:rFonts w:ascii="EB Garamond" w:cs="EB Garamond" w:eastAsia="EB Garamond" w:hAnsi="EB Garamond"/>
-          <w:b/>
-          <w:bCs/>
-          <w:sz w:val="20"/>
-          <w:szCs w:val="20"/>
-        </w:rPr>
-        <w:t xml:space="preserve">Management Leadership for Tomorrow (MLT)</w:t>
-      </w:r>
-      <w:r>
-        <w:rPr>
-          <w:rFonts w:ascii="EB Garamond" w:cs="EB Garamond" w:eastAsia="EB Garamond" w:hAnsi="EB Garamond"/>
-          <w:sz w:val="20"/>
-          <w:szCs w:val="20"/>
-        </w:rPr>
-        <w:t xml:space="preserve">	Sep 2026 - Present</w:t>
-      </w:r>
-    </w:p>
-    <w:p>
-      <w:pPr>
-        <w:spacing w:after="0" w:before="0" w:line="198" w:lineRule="auto"/>
+        <w:spacing w:after="0" w:before="24" w:line="188" w:lineRule="auto"/>
+      </w:pPr>
+      <w:r>
+        <w:rPr>
+          <w:rFonts w:ascii="EB Garamond" w:cs="EB Garamond" w:eastAsia="EB Garamond" w:hAnsi="EB Garamond"/>
+          <w:b/>
+          <w:bCs/>
+          <w:sz w:val="20"/>
+          <w:szCs w:val="20"/>
+        </w:rPr>
+        <w:t xml:space="preserve">BLK Capital Management</w:t>
+      </w:r>
+      <w:r>
+        <w:rPr>
+          <w:rFonts w:ascii="EB Garamond" w:cs="EB Garamond" w:eastAsia="EB Garamond" w:hAnsi="EB Garamond"/>
+          <w:sz w:val="20"/>
+          <w:szCs w:val="20"/>
+        </w:rPr>
+        <w:t xml:space="preserve">	Oct 2026 - Present</w:t>
+      </w:r>
+    </w:p>
+    <w:p>
+      <w:pPr>
+        <w:spacing w:after="0" w:before="0" w:line="188" w:lineRule="auto"/>
       </w:pPr>
       <w:r>
         <w:rPr>
@@ -1080,61 +1080,25 @@
           <w:sz w:val="20"/>
           <w:szCs w:val="20"/>
         </w:rPr>
-        <w:t xml:space="preserve">Career Prep Fellow</w:t>
-      </w:r>
-    </w:p>
-    <w:p>
-      <w:pPr>
-        <w:pStyle w:val="ListParagraph"/>
-        <w:numPr>
-          <w:ilvl w:val="0"/>
-          <w:numId w:val="2"/>
-        </w:numPr>
-        <w:spacing w:after="0" w:before="0" w:line="198" w:lineRule="auto"/>
-      </w:pPr>
-      <w:r>
-        <w:rPr>
-          <w:rFonts w:ascii="EB Garamond" w:cs="EB Garamond" w:eastAsia="EB Garamond" w:hAnsi="EB Garamond"/>
-          <w:sz w:val="20"/>
-          <w:szCs w:val="20"/>
-        </w:rPr>
-        <w:t xml:space="preserve">Selected for competitive 18+-month fellowship accelerating emerging leaders' careers via executive coaching, skill-building, and mentorship</w:t>
-      </w:r>
-    </w:p>
-    <w:p>
-      <w:pPr>
-        <w:pStyle w:val="ListParagraph"/>
-        <w:numPr>
-          <w:ilvl w:val="0"/>
-          <w:numId w:val="2"/>
-        </w:numPr>
-        <w:spacing w:after="0" w:before="0" w:line="198" w:lineRule="auto"/>
-      </w:pPr>
-      <w:r>
-        <w:rPr>
-          <w:rFonts w:ascii="EB Garamond" w:cs="EB Garamond" w:eastAsia="EB Garamond" w:hAnsi="EB Garamond"/>
-          <w:sz w:val="20"/>
-          <w:szCs w:val="20"/>
-        </w:rPr>
-        <w:t xml:space="preserve">Completed rigorous business case analyses, quantitative problem-solving assignments, and strategic simulations evaluated by career coaches</w:t>
-      </w:r>
-    </w:p>
-    <w:p>
-      <w:pPr>
-        <w:pStyle w:val="ListParagraph"/>
-        <w:numPr>
-          <w:ilvl w:val="0"/>
-          <w:numId w:val="2"/>
-        </w:numPr>
-        <w:spacing w:after="0" w:before="0" w:line="198" w:lineRule="auto"/>
-      </w:pPr>
-      <w:r>
-        <w:rPr>
-          <w:rFonts w:ascii="EB Garamond" w:cs="EB Garamond" w:eastAsia="EB Garamond" w:hAnsi="EB Garamond"/>
-          <w:sz w:val="20"/>
-          <w:szCs w:val="20"/>
-        </w:rPr>
-        <w:t xml:space="preserve">Engaged with corporate partner firms to gain direct industry exposure and prepare for accelerated investment banking and buyside recruiting</w:t>
+        <w:t xml:space="preserve">Investment Banking Specialized Pathways</w:t>
+      </w:r>
+    </w:p>
+    <w:p>
+      <w:pPr>
+        <w:pStyle w:val="ListParagraph"/>
+        <w:numPr>
+          <w:ilvl w:val="0"/>
+          <w:numId w:val="2"/>
+        </w:numPr>
+        <w:spacing w:after="0" w:before="0" w:line="188" w:lineRule="auto"/>
+      </w:pPr>
+      <w:r>
+        <w:rPr>
+          <w:rFonts w:ascii="EB Garamond" w:cs="EB Garamond" w:eastAsia="EB Garamond" w:hAnsi="EB Garamond"/>
+          <w:sz w:val="20"/>
+          <w:szCs w:val="20"/>
+        </w:rPr>
+        <w:t xml:space="preserve">Selected for a competitive investment banking pathway program developing skills in financial modeling, valuation, and transaction analysis</w:t>
       </w:r>
     </w:p>
     <w:p>
@@ -1142,38 +1106,30 @@
         <w:tabs>
           <w:tab w:val="right" w:pos="11228"/>
         </w:tabs>
-        <w:spacing w:after="0" w:before="24" w:line="198" w:lineRule="auto"/>
-      </w:pPr>
-      <w:r>
-        <w:rPr>
-          <w:rFonts w:ascii="EB Garamond" w:cs="EB Garamond" w:eastAsia="EB Garamond" w:hAnsi="EB Garamond"/>
-          <w:b/>
-          <w:bCs/>
-          <w:sz w:val="20"/>
-          <w:szCs w:val="20"/>
-        </w:rPr>
-        <w:t xml:space="preserve">SEYA</w:t>
-      </w:r>
-      <w:r>
-        <w:rPr>
-          <w:rFonts w:ascii="EB Garamond" w:cs="EB Garamond" w:eastAsia="EB Garamond" w:hAnsi="EB Garamond"/>
-          <w:sz w:val="20"/>
-          <w:szCs w:val="20"/>
-        </w:rPr>
-        <w:t xml:space="preserve"> | Dallas, TX</w:t>
-      </w:r>
-      <w:r>
-        <w:rPr>
-          <w:rFonts w:ascii="EB Garamond" w:cs="EB Garamond" w:eastAsia="EB Garamond" w:hAnsi="EB Garamond"/>
-          <w:sz w:val="20"/>
-          <w:szCs w:val="20"/>
-        </w:rPr>
-        <w:t xml:space="preserve">	Jun 2025 - Jul 2026</w:t>
-      </w:r>
-    </w:p>
-    <w:p>
-      <w:pPr>
-        <w:spacing w:after="0" w:before="0" w:line="198" w:lineRule="auto"/>
+        <w:spacing w:after="0" w:before="24" w:line="188" w:lineRule="auto"/>
+      </w:pPr>
+      <w:r>
+        <w:rPr>
+          <w:rFonts w:ascii="EB Garamond" w:cs="EB Garamond" w:eastAsia="EB Garamond" w:hAnsi="EB Garamond"/>
+          <w:b/>
+          <w:bCs/>
+          <w:sz w:val="20"/>
+          <w:szCs w:val="20"/>
+        </w:rPr>
+        <w:t xml:space="preserve">Management Leadership for Tomorrow (MLT)</w:t>
+      </w:r>
+      <w:r>
+        <w:rPr>
+          <w:rFonts w:ascii="EB Garamond" w:cs="EB Garamond" w:eastAsia="EB Garamond" w:hAnsi="EB Garamond"/>
+          <w:sz w:val="20"/>
+          <w:szCs w:val="20"/>
+        </w:rPr>
+        <w:t xml:space="preserve">	Sep 2026 - Present</w:t>
+      </w:r>
+    </w:p>
+    <w:p>
+      <w:pPr>
+        <w:spacing w:after="0" w:before="0" w:line="188" w:lineRule="auto"/>
       </w:pPr>
       <w:r>
         <w:rPr>
@@ -1183,61 +1139,61 @@
           <w:sz w:val="20"/>
           <w:szCs w:val="20"/>
         </w:rPr>
-        <w:t xml:space="preserve">Co-Founder, DTC Apparel Brand</w:t>
-      </w:r>
-    </w:p>
-    <w:p>
-      <w:pPr>
-        <w:pStyle w:val="ListParagraph"/>
-        <w:numPr>
-          <w:ilvl w:val="0"/>
-          <w:numId w:val="2"/>
-        </w:numPr>
-        <w:spacing w:after="0" w:before="0" w:line="198" w:lineRule="auto"/>
-      </w:pPr>
-      <w:r>
-        <w:rPr>
-          <w:rFonts w:ascii="EB Garamond" w:cs="EB Garamond" w:eastAsia="EB Garamond" w:hAnsi="EB Garamond"/>
-          <w:sz w:val="20"/>
-          <w:szCs w:val="20"/>
-        </w:rPr>
-        <w:t xml:space="preserve">Co-founded a DTC apparel brand that reached $500K+ in first-year revenue; owned pricing, vendor negotiations, and product drop planning</w:t>
-      </w:r>
-    </w:p>
-    <w:p>
-      <w:pPr>
-        <w:pStyle w:val="ListParagraph"/>
-        <w:numPr>
-          <w:ilvl w:val="0"/>
-          <w:numId w:val="2"/>
-        </w:numPr>
-        <w:spacing w:after="0" w:before="0" w:line="198" w:lineRule="auto"/>
-      </w:pPr>
-      <w:r>
-        <w:rPr>
-          <w:rFonts w:ascii="EB Garamond" w:cs="EB Garamond" w:eastAsia="EB Garamond" w:hAnsi="EB Garamond"/>
-          <w:sz w:val="20"/>
-          <w:szCs w:val="20"/>
-        </w:rPr>
-        <w:t xml:space="preserve">Scaled brand to a 6.1M audience reach via campus creator and UGC program spanning 10+ US and Canadian college campuses in year one</w:t>
-      </w:r>
-    </w:p>
-    <w:p>
-      <w:pPr>
-        <w:pStyle w:val="ListParagraph"/>
-        <w:numPr>
-          <w:ilvl w:val="0"/>
-          <w:numId w:val="2"/>
-        </w:numPr>
-        <w:spacing w:after="0" w:before="0" w:line="198" w:lineRule="auto"/>
-      </w:pPr>
-      <w:r>
-        <w:rPr>
-          <w:rFonts w:ascii="EB Garamond" w:cs="EB Garamond" w:eastAsia="EB Garamond" w:hAnsi="EB Garamond"/>
-          <w:sz w:val="20"/>
-          <w:szCs w:val="20"/>
-        </w:rPr>
-        <w:t xml:space="preserve">Built in-house software to replace manual creator tracking, saving 20-25 hours weekly on creator communication, organization, and launches</w:t>
+        <w:t xml:space="preserve">Career Prep Fellow</w:t>
+      </w:r>
+    </w:p>
+    <w:p>
+      <w:pPr>
+        <w:pStyle w:val="ListParagraph"/>
+        <w:numPr>
+          <w:ilvl w:val="0"/>
+          <w:numId w:val="2"/>
+        </w:numPr>
+        <w:spacing w:after="0" w:before="0" w:line="188" w:lineRule="auto"/>
+      </w:pPr>
+      <w:r>
+        <w:rPr>
+          <w:rFonts w:ascii="EB Garamond" w:cs="EB Garamond" w:eastAsia="EB Garamond" w:hAnsi="EB Garamond"/>
+          <w:sz w:val="20"/>
+          <w:szCs w:val="20"/>
+        </w:rPr>
+        <w:t xml:space="preserve">Selected for competitive 18+-month fellowship accelerating emerging leaders' careers via executive coaching, skill-building, and mentorship</w:t>
+      </w:r>
+    </w:p>
+    <w:p>
+      <w:pPr>
+        <w:pStyle w:val="ListParagraph"/>
+        <w:numPr>
+          <w:ilvl w:val="0"/>
+          <w:numId w:val="2"/>
+        </w:numPr>
+        <w:spacing w:after="0" w:before="0" w:line="188" w:lineRule="auto"/>
+      </w:pPr>
+      <w:r>
+        <w:rPr>
+          <w:rFonts w:ascii="EB Garamond" w:cs="EB Garamond" w:eastAsia="EB Garamond" w:hAnsi="EB Garamond"/>
+          <w:sz w:val="20"/>
+          <w:szCs w:val="20"/>
+        </w:rPr>
+        <w:t xml:space="preserve">Completed rigorous business case analyses, quantitative problem-solving assignments, and strategic simulations evaluated by career coaches</w:t>
+      </w:r>
+    </w:p>
+    <w:p>
+      <w:pPr>
+        <w:pStyle w:val="ListParagraph"/>
+        <w:numPr>
+          <w:ilvl w:val="0"/>
+          <w:numId w:val="2"/>
+        </w:numPr>
+        <w:spacing w:after="0" w:before="0" w:line="188" w:lineRule="auto"/>
+      </w:pPr>
+      <w:r>
+        <w:rPr>
+          <w:rFonts w:ascii="EB Garamond" w:cs="EB Garamond" w:eastAsia="EB Garamond" w:hAnsi="EB Garamond"/>
+          <w:sz w:val="20"/>
+          <w:szCs w:val="20"/>
+        </w:rPr>
+        <w:t xml:space="preserve">Engaged with corporate partner firms to gain direct industry exposure and prepare for accelerated investment banking and buyside recruiting</w:t>
       </w:r>
     </w:p>
     <w:p>
@@ -1245,38 +1201,38 @@
         <w:tabs>
           <w:tab w:val="right" w:pos="11228"/>
         </w:tabs>
-        <w:spacing w:after="0" w:before="24" w:line="198" w:lineRule="auto"/>
-      </w:pPr>
-      <w:r>
-        <w:rPr>
-          <w:rFonts w:ascii="EB Garamond" w:cs="EB Garamond" w:eastAsia="EB Garamond" w:hAnsi="EB Garamond"/>
-          <w:b/>
-          <w:bCs/>
-          <w:sz w:val="20"/>
-          <w:szCs w:val="20"/>
-        </w:rPr>
-        <w:t xml:space="preserve">Vandy 2 Wall Street</w:t>
-      </w:r>
-      <w:r>
-        <w:rPr>
-          <w:rFonts w:ascii="EB Garamond" w:cs="EB Garamond" w:eastAsia="EB Garamond" w:hAnsi="EB Garamond"/>
-          <w:sz w:val="20"/>
-          <w:szCs w:val="20"/>
-        </w:rPr>
-        <w:t xml:space="preserve"> | Nashville, TN</w:t>
-      </w:r>
-      <w:r>
-        <w:rPr>
-          <w:rFonts w:ascii="EB Garamond" w:cs="EB Garamond" w:eastAsia="EB Garamond" w:hAnsi="EB Garamond"/>
-          <w:sz w:val="20"/>
-          <w:szCs w:val="20"/>
-        </w:rPr>
-        <w:t xml:space="preserve">	Jun 2026</w:t>
-      </w:r>
-    </w:p>
-    <w:p>
-      <w:pPr>
-        <w:spacing w:after="0" w:before="0" w:line="198" w:lineRule="auto"/>
+        <w:spacing w:after="0" w:before="24" w:line="188" w:lineRule="auto"/>
+      </w:pPr>
+      <w:r>
+        <w:rPr>
+          <w:rFonts w:ascii="EB Garamond" w:cs="EB Garamond" w:eastAsia="EB Garamond" w:hAnsi="EB Garamond"/>
+          <w:b/>
+          <w:bCs/>
+          <w:sz w:val="20"/>
+          <w:szCs w:val="20"/>
+        </w:rPr>
+        <w:t xml:space="preserve">SEYA</w:t>
+      </w:r>
+      <w:r>
+        <w:rPr>
+          <w:rFonts w:ascii="EB Garamond" w:cs="EB Garamond" w:eastAsia="EB Garamond" w:hAnsi="EB Garamond"/>
+          <w:sz w:val="20"/>
+          <w:szCs w:val="20"/>
+        </w:rPr>
+        <w:t xml:space="preserve"> | Dallas, TX</w:t>
+      </w:r>
+      <w:r>
+        <w:rPr>
+          <w:rFonts w:ascii="EB Garamond" w:cs="EB Garamond" w:eastAsia="EB Garamond" w:hAnsi="EB Garamond"/>
+          <w:sz w:val="20"/>
+          <w:szCs w:val="20"/>
+        </w:rPr>
+        <w:t xml:space="preserve">	Jun 2025 - Jul 2026</w:t>
+      </w:r>
+    </w:p>
+    <w:p>
+      <w:pPr>
+        <w:spacing w:after="0" w:before="0" w:line="188" w:lineRule="auto"/>
       </w:pPr>
       <w:r>
         <w:rPr>
@@ -1286,6 +1242,109 @@
           <w:sz w:val="20"/>
           <w:szCs w:val="20"/>
         </w:rPr>
+        <w:t xml:space="preserve">Co-Founder, DTC Apparel Brand</w:t>
+      </w:r>
+    </w:p>
+    <w:p>
+      <w:pPr>
+        <w:pStyle w:val="ListParagraph"/>
+        <w:numPr>
+          <w:ilvl w:val="0"/>
+          <w:numId w:val="2"/>
+        </w:numPr>
+        <w:spacing w:after="0" w:before="0" w:line="188" w:lineRule="auto"/>
+      </w:pPr>
+      <w:r>
+        <w:rPr>
+          <w:rFonts w:ascii="EB Garamond" w:cs="EB Garamond" w:eastAsia="EB Garamond" w:hAnsi="EB Garamond"/>
+          <w:sz w:val="20"/>
+          <w:szCs w:val="20"/>
+        </w:rPr>
+        <w:t xml:space="preserve">Co-founded a DTC apparel brand that reached $500K+ in first-year revenue; owned pricing, vendor negotiations, and product drop planning</w:t>
+      </w:r>
+    </w:p>
+    <w:p>
+      <w:pPr>
+        <w:pStyle w:val="ListParagraph"/>
+        <w:numPr>
+          <w:ilvl w:val="0"/>
+          <w:numId w:val="2"/>
+        </w:numPr>
+        <w:spacing w:after="0" w:before="0" w:line="188" w:lineRule="auto"/>
+      </w:pPr>
+      <w:r>
+        <w:rPr>
+          <w:rFonts w:ascii="EB Garamond" w:cs="EB Garamond" w:eastAsia="EB Garamond" w:hAnsi="EB Garamond"/>
+          <w:sz w:val="20"/>
+          <w:szCs w:val="20"/>
+        </w:rPr>
+        <w:t xml:space="preserve">Scaled brand to a 6.1M audience reach via campus creator and UGC program spanning 10+ US and Canadian college campuses in year one</w:t>
+      </w:r>
+    </w:p>
+    <w:p>
+      <w:pPr>
+        <w:pStyle w:val="ListParagraph"/>
+        <w:numPr>
+          <w:ilvl w:val="0"/>
+          <w:numId w:val="2"/>
+        </w:numPr>
+        <w:spacing w:after="0" w:before="0" w:line="188" w:lineRule="auto"/>
+      </w:pPr>
+      <w:r>
+        <w:rPr>
+          <w:rFonts w:ascii="EB Garamond" w:cs="EB Garamond" w:eastAsia="EB Garamond" w:hAnsi="EB Garamond"/>
+          <w:sz w:val="20"/>
+          <w:szCs w:val="20"/>
+        </w:rPr>
+        <w:t xml:space="preserve">Built in-house software to replace manual creator tracking, saving 20-25 hours weekly on creator communication, organization, and launches</w:t>
+      </w:r>
+    </w:p>
+    <w:p>
+      <w:pPr>
+        <w:tabs>
+          <w:tab w:val="right" w:pos="11228"/>
+        </w:tabs>
+        <w:spacing w:after="0" w:before="24" w:line="188" w:lineRule="auto"/>
+      </w:pPr>
+      <w:r>
+        <w:rPr>
+          <w:rFonts w:ascii="EB Garamond" w:cs="EB Garamond" w:eastAsia="EB Garamond" w:hAnsi="EB Garamond"/>
+          <w:b/>
+          <w:bCs/>
+          <w:sz w:val="20"/>
+          <w:szCs w:val="20"/>
+        </w:rPr>
+        <w:t xml:space="preserve">Vandy 2 Wall Street</w:t>
+      </w:r>
+      <w:r>
+        <w:rPr>
+          <w:rFonts w:ascii="EB Garamond" w:cs="EB Garamond" w:eastAsia="EB Garamond" w:hAnsi="EB Garamond"/>
+          <w:sz w:val="20"/>
+          <w:szCs w:val="20"/>
+        </w:rPr>
+        <w:t xml:space="preserve"> | Nashville, TN</w:t>
+      </w:r>
+      <w:r>
+        <w:rPr>
+          <w:rFonts w:ascii="EB Garamond" w:cs="EB Garamond" w:eastAsia="EB Garamond" w:hAnsi="EB Garamond"/>
+          <w:sz w:val="20"/>
+          <w:szCs w:val="20"/>
+        </w:rPr>
+        <w:t xml:space="preserve">	Jun 2026</w:t>
+      </w:r>
+    </w:p>
+    <w:p>
+      <w:pPr>
+        <w:spacing w:after="0" w:before="0" w:line="188" w:lineRule="auto"/>
+      </w:pPr>
+      <w:r>
+        <w:rPr>
+          <w:rFonts w:ascii="EB Garamond" w:cs="EB Garamond" w:eastAsia="EB Garamond" w:hAnsi="EB Garamond"/>
+          <w:i/>
+          <w:iCs/>
+          <w:sz w:val="20"/>
+          <w:szCs w:val="20"/>
+        </w:rPr>
         <w:t xml:space="preserve">Team Co-Lead, M&amp;A Pitch Competition</w:t>
       </w:r>
     </w:p>
@@ -1296,7 +1355,7 @@
           <w:ilvl w:val="0"/>
           <w:numId w:val="2"/>
         </w:numPr>
-        <w:spacing w:after="0" w:before="0" w:line="198" w:lineRule="auto"/>
+        <w:spacing w:after="0" w:before="0" w:line="188" w:lineRule="auto"/>
       </w:pPr>
       <w:r>
         <w:rPr>
@@ -1314,7 +1373,7 @@
           <w:ilvl w:val="0"/>
           <w:numId w:val="2"/>
         </w:numPr>
-        <w:spacing w:after="0" w:before="0" w:line="198" w:lineRule="auto"/>
+        <w:spacing w:after="0" w:before="0" w:line="188" w:lineRule="auto"/>
       </w:pPr>
       <w:r>
         <w:rPr>
@@ -1332,7 +1391,7 @@
           <w:ilvl w:val="0"/>
           <w:numId w:val="2"/>
         </w:numPr>
-        <w:spacing w:after="0" w:before="0" w:line="198" w:lineRule="auto"/>
+        <w:spacing w:after="0" w:before="0" w:line="188" w:lineRule="auto"/>
       </w:pPr>
       <w:r>
         <w:rPr>
@@ -1348,7 +1407,7 @@
         <w:pBdr>
           <w:bottom w:val="single" w:color="000000" w:sz="6" w:space="1"/>
         </w:pBdr>
-        <w:spacing w:after="40" w:before="80" w:line="198" w:lineRule="auto"/>
+        <w:spacing w:after="40" w:before="80" w:line="188" w:lineRule="auto"/>
       </w:pPr>
       <w:r>
         <w:rPr>
@@ -1453,7 +1512,7 @@
     </w:p>
     <w:p>
       <w:pPr>
-        <w:spacing w:after="0" w:before="30" w:line="198" w:lineRule="auto"/>
+        <w:spacing w:after="0" w:before="30" w:line="188" w:lineRule="auto"/>
       </w:pPr>
       <w:r>
         <w:rPr>
@@ -1476,7 +1535,7 @@
     </w:p>
     <w:p>
       <w:pPr>
-        <w:spacing w:after="0" w:before="0" w:line="198" w:lineRule="auto"/>
+        <w:spacing w:after="0" w:before="0" w:line="188" w:lineRule="auto"/>
       </w:pPr>
       <w:r>
         <w:rPr>
@@ -1499,7 +1558,7 @@
     </w:p>
     <w:p>
       <w:pPr>
-        <w:spacing w:after="0" w:before="0" w:line="198" w:lineRule="auto"/>
+        <w:spacing w:after="0" w:before="0" w:line="188" w:lineRule="auto"/>
       </w:pPr>
       <w:r>
         <w:rPr>

</xml_diff>

<commit_message>
Resume: move BLK to top of leadership section
Co-Authored-By: Claude Opus 5.5 <noreply@anthropic.com>
Claude-Session: https://claude.ai/code/session_01G3JV145HgjUfXQyW7hEcYE
</commit_message>
<xml_diff>
--- a/assets/Jennifer-Amogu-Resume.docx
+++ b/assets/Jennifer-Amogu-Resume.docx
@@ -867,7 +867,7 @@
           <w:sz w:val="20"/>
           <w:szCs w:val="20"/>
         </w:rPr>
-        <w:t xml:space="preserve">SEO Career</w:t>
+        <w:t xml:space="preserve">BLK Capital Management</w:t>
       </w:r>
       <w:r>
         <w:rPr>
@@ -890,61 +890,25 @@
           <w:sz w:val="20"/>
           <w:szCs w:val="20"/>
         </w:rPr>
-        <w:t xml:space="preserve">Fellow, Alternative Investments &amp; Investment Banking</w:t>
-      </w:r>
-    </w:p>
-    <w:p>
-      <w:pPr>
-        <w:pStyle w:val="ListParagraph"/>
-        <w:numPr>
-          <w:ilvl w:val="0"/>
-          <w:numId w:val="2"/>
-        </w:numPr>
-        <w:spacing w:after="0" w:before="0" w:line="188" w:lineRule="auto"/>
-      </w:pPr>
-      <w:r>
-        <w:rPr>
-          <w:rFonts w:ascii="EB Garamond" w:cs="EB Garamond" w:eastAsia="EB Garamond" w:hAnsi="EB Garamond"/>
-          <w:sz w:val="20"/>
-          <w:szCs w:val="20"/>
-        </w:rPr>
-        <w:t xml:space="preserve">Selected for competitive pre-professional fellowship offering intensive technical training for careers in investment banking and private equity</w:t>
-      </w:r>
-    </w:p>
-    <w:p>
-      <w:pPr>
-        <w:pStyle w:val="ListParagraph"/>
-        <w:numPr>
-          <w:ilvl w:val="0"/>
-          <w:numId w:val="2"/>
-        </w:numPr>
-        <w:spacing w:after="0" w:before="0" w:line="188" w:lineRule="auto"/>
-      </w:pPr>
-      <w:r>
-        <w:rPr>
-          <w:rFonts w:ascii="EB Garamond" w:cs="EB Garamond" w:eastAsia="EB Garamond" w:hAnsi="EB Garamond"/>
-          <w:sz w:val="20"/>
-          <w:szCs w:val="20"/>
-        </w:rPr>
-        <w:t xml:space="preserve">Completed 100+ hours of technical training in three-statement modeling, valuation methods (DCF, CCA, PTA), and core corporate finance</w:t>
-      </w:r>
-    </w:p>
-    <w:p>
-      <w:pPr>
-        <w:pStyle w:val="ListParagraph"/>
-        <w:numPr>
-          <w:ilvl w:val="0"/>
-          <w:numId w:val="2"/>
-        </w:numPr>
-        <w:spacing w:after="0" w:before="0" w:line="188" w:lineRule="auto"/>
-      </w:pPr>
-      <w:r>
-        <w:rPr>
-          <w:rFonts w:ascii="EB Garamond" w:cs="EB Garamond" w:eastAsia="EB Garamond" w:hAnsi="EB Garamond"/>
-          <w:sz w:val="20"/>
-          <w:szCs w:val="20"/>
-        </w:rPr>
-        <w:t xml:space="preserve">Analyzed real-world transaction case studies, completed technical assessments, and received mentorship from senior Wall Street professionals</w:t>
+        <w:t xml:space="preserve">Investment Banking Specialized Pathways</w:t>
+      </w:r>
+    </w:p>
+    <w:p>
+      <w:pPr>
+        <w:pStyle w:val="ListParagraph"/>
+        <w:numPr>
+          <w:ilvl w:val="0"/>
+          <w:numId w:val="2"/>
+        </w:numPr>
+        <w:spacing w:after="0" w:before="0" w:line="188" w:lineRule="auto"/>
+      </w:pPr>
+      <w:r>
+        <w:rPr>
+          <w:rFonts w:ascii="EB Garamond" w:cs="EB Garamond" w:eastAsia="EB Garamond" w:hAnsi="EB Garamond"/>
+          <w:sz w:val="20"/>
+          <w:szCs w:val="20"/>
+        </w:rPr>
+        <w:t xml:space="preserve">Selected for a competitive investment banking pathway program developing skills in financial modeling, valuation, and transaction analysis</w:t>
       </w:r>
     </w:p>
     <w:p>
@@ -962,7 +926,7 @@
           <w:sz w:val="20"/>
           <w:szCs w:val="20"/>
         </w:rPr>
-        <w:t xml:space="preserve">Recalc Finance Accelerator</w:t>
+        <w:t xml:space="preserve">SEO Career</w:t>
       </w:r>
       <w:r>
         <w:rPr>
@@ -985,61 +949,61 @@
           <w:sz w:val="20"/>
           <w:szCs w:val="20"/>
         </w:rPr>
-        <w:t xml:space="preserve">Fall 2026 Cohort Member</w:t>
-      </w:r>
-    </w:p>
-    <w:p>
-      <w:pPr>
-        <w:pStyle w:val="ListParagraph"/>
-        <w:numPr>
-          <w:ilvl w:val="0"/>
-          <w:numId w:val="2"/>
-        </w:numPr>
-        <w:spacing w:after="0" w:before="0" w:line="188" w:lineRule="auto"/>
-      </w:pPr>
-      <w:r>
-        <w:rPr>
-          <w:rFonts w:ascii="EB Garamond" w:cs="EB Garamond" w:eastAsia="EB Garamond" w:hAnsi="EB Garamond"/>
-          <w:sz w:val="20"/>
-          <w:szCs w:val="20"/>
-        </w:rPr>
-        <w:t xml:space="preserve">Selected via competitive application for an intensive finance accelerator backed by leading PE sponsors, focused on investor-grade modeling</w:t>
-      </w:r>
-    </w:p>
-    <w:p>
-      <w:pPr>
-        <w:pStyle w:val="ListParagraph"/>
-        <w:numPr>
-          <w:ilvl w:val="0"/>
-          <w:numId w:val="2"/>
-        </w:numPr>
-        <w:spacing w:after="0" w:before="0" w:line="188" w:lineRule="auto"/>
-      </w:pPr>
-      <w:r>
-        <w:rPr>
-          <w:rFonts w:ascii="EB Garamond" w:cs="EB Garamond" w:eastAsia="EB Garamond" w:hAnsi="EB Garamond"/>
-          <w:sz w:val="20"/>
-          <w:szCs w:val="20"/>
-        </w:rPr>
-        <w:t xml:space="preserve">Constructed multi-period three-statement operating models from blank spreadsheets with working capital, debt waterfalls, and sensitivities</w:t>
-      </w:r>
-    </w:p>
-    <w:p>
-      <w:pPr>
-        <w:pStyle w:val="ListParagraph"/>
-        <w:numPr>
-          <w:ilvl w:val="0"/>
-          <w:numId w:val="2"/>
-        </w:numPr>
-        <w:spacing w:after="0" w:before="0" w:line="188" w:lineRule="auto"/>
-      </w:pPr>
-      <w:r>
-        <w:rPr>
-          <w:rFonts w:ascii="EB Garamond" w:cs="EB Garamond" w:eastAsia="EB Garamond" w:hAnsi="EB Garamond"/>
-          <w:sz w:val="20"/>
-          <w:szCs w:val="20"/>
-        </w:rPr>
-        <w:t xml:space="preserve">Evaluated buyout case studies, analyzed operational drivers (unit economics, margins), and presented valuation takeaways to PE investors</w:t>
+        <w:t xml:space="preserve">Fellow, Alternative Investments &amp; Investment Banking</w:t>
+      </w:r>
+    </w:p>
+    <w:p>
+      <w:pPr>
+        <w:pStyle w:val="ListParagraph"/>
+        <w:numPr>
+          <w:ilvl w:val="0"/>
+          <w:numId w:val="2"/>
+        </w:numPr>
+        <w:spacing w:after="0" w:before="0" w:line="188" w:lineRule="auto"/>
+      </w:pPr>
+      <w:r>
+        <w:rPr>
+          <w:rFonts w:ascii="EB Garamond" w:cs="EB Garamond" w:eastAsia="EB Garamond" w:hAnsi="EB Garamond"/>
+          <w:sz w:val="20"/>
+          <w:szCs w:val="20"/>
+        </w:rPr>
+        <w:t xml:space="preserve">Selected for competitive pre-professional fellowship offering intensive technical training for careers in investment banking and private equity</w:t>
+      </w:r>
+    </w:p>
+    <w:p>
+      <w:pPr>
+        <w:pStyle w:val="ListParagraph"/>
+        <w:numPr>
+          <w:ilvl w:val="0"/>
+          <w:numId w:val="2"/>
+        </w:numPr>
+        <w:spacing w:after="0" w:before="0" w:line="188" w:lineRule="auto"/>
+      </w:pPr>
+      <w:r>
+        <w:rPr>
+          <w:rFonts w:ascii="EB Garamond" w:cs="EB Garamond" w:eastAsia="EB Garamond" w:hAnsi="EB Garamond"/>
+          <w:sz w:val="20"/>
+          <w:szCs w:val="20"/>
+        </w:rPr>
+        <w:t xml:space="preserve">Completed 100+ hours of technical training in three-statement modeling, valuation methods (DCF, CCA, PTA), and core corporate finance</w:t>
+      </w:r>
+    </w:p>
+    <w:p>
+      <w:pPr>
+        <w:pStyle w:val="ListParagraph"/>
+        <w:numPr>
+          <w:ilvl w:val="0"/>
+          <w:numId w:val="2"/>
+        </w:numPr>
+        <w:spacing w:after="0" w:before="0" w:line="188" w:lineRule="auto"/>
+      </w:pPr>
+      <w:r>
+        <w:rPr>
+          <w:rFonts w:ascii="EB Garamond" w:cs="EB Garamond" w:eastAsia="EB Garamond" w:hAnsi="EB Garamond"/>
+          <w:sz w:val="20"/>
+          <w:szCs w:val="20"/>
+        </w:rPr>
+        <w:t xml:space="preserve">Analyzed real-world transaction case studies, completed technical assessments, and received mentorship from senior Wall Street professionals</w:t>
       </w:r>
     </w:p>
     <w:p>
@@ -1057,7 +1021,7 @@
           <w:sz w:val="20"/>
           <w:szCs w:val="20"/>
         </w:rPr>
-        <w:t xml:space="preserve">BLK Capital Management</w:t>
+        <w:t xml:space="preserve">Recalc Finance Accelerator</w:t>
       </w:r>
       <w:r>
         <w:rPr>
@@ -1080,25 +1044,61 @@
           <w:sz w:val="20"/>
           <w:szCs w:val="20"/>
         </w:rPr>
-        <w:t xml:space="preserve">Investment Banking Specialized Pathways</w:t>
-      </w:r>
-    </w:p>
-    <w:p>
-      <w:pPr>
-        <w:pStyle w:val="ListParagraph"/>
-        <w:numPr>
-          <w:ilvl w:val="0"/>
-          <w:numId w:val="2"/>
-        </w:numPr>
-        <w:spacing w:after="0" w:before="0" w:line="188" w:lineRule="auto"/>
-      </w:pPr>
-      <w:r>
-        <w:rPr>
-          <w:rFonts w:ascii="EB Garamond" w:cs="EB Garamond" w:eastAsia="EB Garamond" w:hAnsi="EB Garamond"/>
-          <w:sz w:val="20"/>
-          <w:szCs w:val="20"/>
-        </w:rPr>
-        <w:t xml:space="preserve">Selected for a competitive investment banking pathway program developing skills in financial modeling, valuation, and transaction analysis</w:t>
+        <w:t xml:space="preserve">Fall 2026 Cohort Member</w:t>
+      </w:r>
+    </w:p>
+    <w:p>
+      <w:pPr>
+        <w:pStyle w:val="ListParagraph"/>
+        <w:numPr>
+          <w:ilvl w:val="0"/>
+          <w:numId w:val="2"/>
+        </w:numPr>
+        <w:spacing w:after="0" w:before="0" w:line="188" w:lineRule="auto"/>
+      </w:pPr>
+      <w:r>
+        <w:rPr>
+          <w:rFonts w:ascii="EB Garamond" w:cs="EB Garamond" w:eastAsia="EB Garamond" w:hAnsi="EB Garamond"/>
+          <w:sz w:val="20"/>
+          <w:szCs w:val="20"/>
+        </w:rPr>
+        <w:t xml:space="preserve">Selected via competitive application for an intensive finance accelerator backed by leading PE sponsors, focused on investor-grade modeling</w:t>
+      </w:r>
+    </w:p>
+    <w:p>
+      <w:pPr>
+        <w:pStyle w:val="ListParagraph"/>
+        <w:numPr>
+          <w:ilvl w:val="0"/>
+          <w:numId w:val="2"/>
+        </w:numPr>
+        <w:spacing w:after="0" w:before="0" w:line="188" w:lineRule="auto"/>
+      </w:pPr>
+      <w:r>
+        <w:rPr>
+          <w:rFonts w:ascii="EB Garamond" w:cs="EB Garamond" w:eastAsia="EB Garamond" w:hAnsi="EB Garamond"/>
+          <w:sz w:val="20"/>
+          <w:szCs w:val="20"/>
+        </w:rPr>
+        <w:t xml:space="preserve">Constructed multi-period three-statement operating models from blank spreadsheets with working capital, debt waterfalls, and sensitivities</w:t>
+      </w:r>
+    </w:p>
+    <w:p>
+      <w:pPr>
+        <w:pStyle w:val="ListParagraph"/>
+        <w:numPr>
+          <w:ilvl w:val="0"/>
+          <w:numId w:val="2"/>
+        </w:numPr>
+        <w:spacing w:after="0" w:before="0" w:line="188" w:lineRule="auto"/>
+      </w:pPr>
+      <w:r>
+        <w:rPr>
+          <w:rFonts w:ascii="EB Garamond" w:cs="EB Garamond" w:eastAsia="EB Garamond" w:hAnsi="EB Garamond"/>
+          <w:sz w:val="20"/>
+          <w:szCs w:val="20"/>
+        </w:rPr>
+        <w:t xml:space="preserve">Evaluated buyout case studies, analyzed operational drivers (unit economics, margins), and presented valuation takeaways to PE investors</w:t>
       </w:r>
     </w:p>
     <w:p>

</xml_diff>

<commit_message>
Resume: list SEYA last in leadership section
Co-Authored-By: Claude Opus 5.5 <noreply@anthropic.com>
Claude-Session: https://claude.ai/code/session_01G3JV145HgjUfXQyW7hEcYE
</commit_message>
<xml_diff>
--- a/assets/Jennifer-Amogu-Resume.docx
+++ b/assets/Jennifer-Amogu-Resume.docx
@@ -1211,23 +1211,23 @@
           <w:sz w:val="20"/>
           <w:szCs w:val="20"/>
         </w:rPr>
-        <w:t xml:space="preserve">SEYA</w:t>
-      </w:r>
-      <w:r>
-        <w:rPr>
-          <w:rFonts w:ascii="EB Garamond" w:cs="EB Garamond" w:eastAsia="EB Garamond" w:hAnsi="EB Garamond"/>
-          <w:sz w:val="20"/>
-          <w:szCs w:val="20"/>
-        </w:rPr>
-        <w:t xml:space="preserve"> | Dallas, TX</w:t>
-      </w:r>
-      <w:r>
-        <w:rPr>
-          <w:rFonts w:ascii="EB Garamond" w:cs="EB Garamond" w:eastAsia="EB Garamond" w:hAnsi="EB Garamond"/>
-          <w:sz w:val="20"/>
-          <w:szCs w:val="20"/>
-        </w:rPr>
-        <w:t xml:space="preserve">	Jun 2025 - Jul 2026</w:t>
+        <w:t xml:space="preserve">Vandy 2 Wall Street</w:t>
+      </w:r>
+      <w:r>
+        <w:rPr>
+          <w:rFonts w:ascii="EB Garamond" w:cs="EB Garamond" w:eastAsia="EB Garamond" w:hAnsi="EB Garamond"/>
+          <w:sz w:val="20"/>
+          <w:szCs w:val="20"/>
+        </w:rPr>
+        <w:t xml:space="preserve"> | Nashville, TN</w:t>
+      </w:r>
+      <w:r>
+        <w:rPr>
+          <w:rFonts w:ascii="EB Garamond" w:cs="EB Garamond" w:eastAsia="EB Garamond" w:hAnsi="EB Garamond"/>
+          <w:sz w:val="20"/>
+          <w:szCs w:val="20"/>
+        </w:rPr>
+        <w:t xml:space="preserve">	Jun 2026</w:t>
       </w:r>
     </w:p>
     <w:p>
@@ -1242,61 +1242,61 @@
           <w:sz w:val="20"/>
           <w:szCs w:val="20"/>
         </w:rPr>
-        <w:t xml:space="preserve">Co-Founder, DTC Apparel Brand</w:t>
-      </w:r>
-    </w:p>
-    <w:p>
-      <w:pPr>
-        <w:pStyle w:val="ListParagraph"/>
-        <w:numPr>
-          <w:ilvl w:val="0"/>
-          <w:numId w:val="2"/>
-        </w:numPr>
-        <w:spacing w:after="0" w:before="0" w:line="188" w:lineRule="auto"/>
-      </w:pPr>
-      <w:r>
-        <w:rPr>
-          <w:rFonts w:ascii="EB Garamond" w:cs="EB Garamond" w:eastAsia="EB Garamond" w:hAnsi="EB Garamond"/>
-          <w:sz w:val="20"/>
-          <w:szCs w:val="20"/>
-        </w:rPr>
-        <w:t xml:space="preserve">Co-founded a DTC apparel brand that reached $500K+ in first-year revenue; owned pricing, vendor negotiations, and product drop planning</w:t>
-      </w:r>
-    </w:p>
-    <w:p>
-      <w:pPr>
-        <w:pStyle w:val="ListParagraph"/>
-        <w:numPr>
-          <w:ilvl w:val="0"/>
-          <w:numId w:val="2"/>
-        </w:numPr>
-        <w:spacing w:after="0" w:before="0" w:line="188" w:lineRule="auto"/>
-      </w:pPr>
-      <w:r>
-        <w:rPr>
-          <w:rFonts w:ascii="EB Garamond" w:cs="EB Garamond" w:eastAsia="EB Garamond" w:hAnsi="EB Garamond"/>
-          <w:sz w:val="20"/>
-          <w:szCs w:val="20"/>
-        </w:rPr>
-        <w:t xml:space="preserve">Scaled brand to a 6.1M audience reach via campus creator and UGC program spanning 10+ US and Canadian college campuses in year one</w:t>
-      </w:r>
-    </w:p>
-    <w:p>
-      <w:pPr>
-        <w:pStyle w:val="ListParagraph"/>
-        <w:numPr>
-          <w:ilvl w:val="0"/>
-          <w:numId w:val="2"/>
-        </w:numPr>
-        <w:spacing w:after="0" w:before="0" w:line="188" w:lineRule="auto"/>
-      </w:pPr>
-      <w:r>
-        <w:rPr>
-          <w:rFonts w:ascii="EB Garamond" w:cs="EB Garamond" w:eastAsia="EB Garamond" w:hAnsi="EB Garamond"/>
-          <w:sz w:val="20"/>
-          <w:szCs w:val="20"/>
-        </w:rPr>
-        <w:t xml:space="preserve">Built in-house software to replace manual creator tracking, saving 20-25 hours weekly on creator communication, organization, and launches</w:t>
+        <w:t xml:space="preserve">Team Co-Lead, M&amp;A Pitch Competition</w:t>
+      </w:r>
+    </w:p>
+    <w:p>
+      <w:pPr>
+        <w:pStyle w:val="ListParagraph"/>
+        <w:numPr>
+          <w:ilvl w:val="0"/>
+          <w:numId w:val="2"/>
+        </w:numPr>
+        <w:spacing w:after="0" w:before="0" w:line="188" w:lineRule="auto"/>
+      </w:pPr>
+      <w:r>
+        <w:rPr>
+          <w:rFonts w:ascii="EB Garamond" w:cs="EB Garamond" w:eastAsia="EB Garamond" w:hAnsi="EB Garamond"/>
+          <w:sz w:val="20"/>
+          <w:szCs w:val="20"/>
+        </w:rPr>
+        <w:t xml:space="preserve">Selected for inaugural M&amp;A Pitch Competition; recommended selling a 51% controlling stake in Athleta while retaining 49% of the upside</w:t>
+      </w:r>
+    </w:p>
+    <w:p>
+      <w:pPr>
+        <w:pStyle w:val="ListParagraph"/>
+        <w:numPr>
+          <w:ilvl w:val="0"/>
+          <w:numId w:val="2"/>
+        </w:numPr>
+        <w:spacing w:after="0" w:before="0" w:line="188" w:lineRule="auto"/>
+      </w:pPr>
+      <w:r>
+        <w:rPr>
+          <w:rFonts w:ascii="EB Garamond" w:cs="EB Garamond" w:eastAsia="EB Garamond" w:hAnsi="EB Garamond"/>
+          <w:sz w:val="20"/>
+          <w:szCs w:val="20"/>
+        </w:rPr>
+        <w:t xml:space="preserve">Modeled five-year operating case, DCF, sum-of-the-parts, and buyer returns analysis supporting a $561M enterprise value and a 19-20% IRR</w:t>
+      </w:r>
+    </w:p>
+    <w:p>
+      <w:pPr>
+        <w:pStyle w:val="ListParagraph"/>
+        <w:numPr>
+          <w:ilvl w:val="0"/>
+          <w:numId w:val="2"/>
+        </w:numPr>
+        <w:spacing w:after="0" w:before="0" w:line="188" w:lineRule="auto"/>
+      </w:pPr>
+      <w:r>
+        <w:rPr>
+          <w:rFonts w:ascii="EB Garamond" w:cs="EB Garamond" w:eastAsia="EB Garamond" w:hAnsi="EB Garamond"/>
+          <w:sz w:val="20"/>
+          <w:szCs w:val="20"/>
+        </w:rPr>
+        <w:t xml:space="preserve">Analyzed SEC filings, equity research, trading comparables, and precedent transactions to co-author a four-page investment banking memo</w:t>
       </w:r>
     </w:p>
     <w:p>
@@ -1314,23 +1314,23 @@
           <w:sz w:val="20"/>
           <w:szCs w:val="20"/>
         </w:rPr>
-        <w:t xml:space="preserve">Vandy 2 Wall Street</w:t>
-      </w:r>
-      <w:r>
-        <w:rPr>
-          <w:rFonts w:ascii="EB Garamond" w:cs="EB Garamond" w:eastAsia="EB Garamond" w:hAnsi="EB Garamond"/>
-          <w:sz w:val="20"/>
-          <w:szCs w:val="20"/>
-        </w:rPr>
-        <w:t xml:space="preserve"> | Nashville, TN</w:t>
-      </w:r>
-      <w:r>
-        <w:rPr>
-          <w:rFonts w:ascii="EB Garamond" w:cs="EB Garamond" w:eastAsia="EB Garamond" w:hAnsi="EB Garamond"/>
-          <w:sz w:val="20"/>
-          <w:szCs w:val="20"/>
-        </w:rPr>
-        <w:t xml:space="preserve">	Jun 2026</w:t>
+        <w:t xml:space="preserve">SEYA</w:t>
+      </w:r>
+      <w:r>
+        <w:rPr>
+          <w:rFonts w:ascii="EB Garamond" w:cs="EB Garamond" w:eastAsia="EB Garamond" w:hAnsi="EB Garamond"/>
+          <w:sz w:val="20"/>
+          <w:szCs w:val="20"/>
+        </w:rPr>
+        <w:t xml:space="preserve"> | Dallas, TX</w:t>
+      </w:r>
+      <w:r>
+        <w:rPr>
+          <w:rFonts w:ascii="EB Garamond" w:cs="EB Garamond" w:eastAsia="EB Garamond" w:hAnsi="EB Garamond"/>
+          <w:sz w:val="20"/>
+          <w:szCs w:val="20"/>
+        </w:rPr>
+        <w:t xml:space="preserve">	Jun 2025 - Jul 2026</w:t>
       </w:r>
     </w:p>
     <w:p>
@@ -1345,61 +1345,61 @@
           <w:sz w:val="20"/>
           <w:szCs w:val="20"/>
         </w:rPr>
-        <w:t xml:space="preserve">Team Co-Lead, M&amp;A Pitch Competition</w:t>
-      </w:r>
-    </w:p>
-    <w:p>
-      <w:pPr>
-        <w:pStyle w:val="ListParagraph"/>
-        <w:numPr>
-          <w:ilvl w:val="0"/>
-          <w:numId w:val="2"/>
-        </w:numPr>
-        <w:spacing w:after="0" w:before="0" w:line="188" w:lineRule="auto"/>
-      </w:pPr>
-      <w:r>
-        <w:rPr>
-          <w:rFonts w:ascii="EB Garamond" w:cs="EB Garamond" w:eastAsia="EB Garamond" w:hAnsi="EB Garamond"/>
-          <w:sz w:val="20"/>
-          <w:szCs w:val="20"/>
-        </w:rPr>
-        <w:t xml:space="preserve">Selected for inaugural M&amp;A Pitch Competition; recommended selling a 51% controlling stake in Athleta while retaining 49% of the upside</w:t>
-      </w:r>
-    </w:p>
-    <w:p>
-      <w:pPr>
-        <w:pStyle w:val="ListParagraph"/>
-        <w:numPr>
-          <w:ilvl w:val="0"/>
-          <w:numId w:val="2"/>
-        </w:numPr>
-        <w:spacing w:after="0" w:before="0" w:line="188" w:lineRule="auto"/>
-      </w:pPr>
-      <w:r>
-        <w:rPr>
-          <w:rFonts w:ascii="EB Garamond" w:cs="EB Garamond" w:eastAsia="EB Garamond" w:hAnsi="EB Garamond"/>
-          <w:sz w:val="20"/>
-          <w:szCs w:val="20"/>
-        </w:rPr>
-        <w:t xml:space="preserve">Modeled five-year operating case, DCF, sum-of-the-parts, and buyer returns analysis supporting a $561M enterprise value and a 19-20% IRR</w:t>
-      </w:r>
-    </w:p>
-    <w:p>
-      <w:pPr>
-        <w:pStyle w:val="ListParagraph"/>
-        <w:numPr>
-          <w:ilvl w:val="0"/>
-          <w:numId w:val="2"/>
-        </w:numPr>
-        <w:spacing w:after="0" w:before="0" w:line="188" w:lineRule="auto"/>
-      </w:pPr>
-      <w:r>
-        <w:rPr>
-          <w:rFonts w:ascii="EB Garamond" w:cs="EB Garamond" w:eastAsia="EB Garamond" w:hAnsi="EB Garamond"/>
-          <w:sz w:val="20"/>
-          <w:szCs w:val="20"/>
-        </w:rPr>
-        <w:t xml:space="preserve">Analyzed SEC filings, equity research, trading comparables, and precedent transactions to co-author a four-page investment banking memo</w:t>
+        <w:t xml:space="preserve">Co-Founder, DTC Apparel Brand</w:t>
+      </w:r>
+    </w:p>
+    <w:p>
+      <w:pPr>
+        <w:pStyle w:val="ListParagraph"/>
+        <w:numPr>
+          <w:ilvl w:val="0"/>
+          <w:numId w:val="2"/>
+        </w:numPr>
+        <w:spacing w:after="0" w:before="0" w:line="188" w:lineRule="auto"/>
+      </w:pPr>
+      <w:r>
+        <w:rPr>
+          <w:rFonts w:ascii="EB Garamond" w:cs="EB Garamond" w:eastAsia="EB Garamond" w:hAnsi="EB Garamond"/>
+          <w:sz w:val="20"/>
+          <w:szCs w:val="20"/>
+        </w:rPr>
+        <w:t xml:space="preserve">Co-founded a DTC apparel brand that reached $500K+ in first-year revenue; owned pricing, vendor negotiations, and product drop planning</w:t>
+      </w:r>
+    </w:p>
+    <w:p>
+      <w:pPr>
+        <w:pStyle w:val="ListParagraph"/>
+        <w:numPr>
+          <w:ilvl w:val="0"/>
+          <w:numId w:val="2"/>
+        </w:numPr>
+        <w:spacing w:after="0" w:before="0" w:line="188" w:lineRule="auto"/>
+      </w:pPr>
+      <w:r>
+        <w:rPr>
+          <w:rFonts w:ascii="EB Garamond" w:cs="EB Garamond" w:eastAsia="EB Garamond" w:hAnsi="EB Garamond"/>
+          <w:sz w:val="20"/>
+          <w:szCs w:val="20"/>
+        </w:rPr>
+        <w:t xml:space="preserve">Scaled brand to a 6.1M audience reach via campus creator and UGC program spanning 10+ US and Canadian college campuses in year one</w:t>
+      </w:r>
+    </w:p>
+    <w:p>
+      <w:pPr>
+        <w:pStyle w:val="ListParagraph"/>
+        <w:numPr>
+          <w:ilvl w:val="0"/>
+          <w:numId w:val="2"/>
+        </w:numPr>
+        <w:spacing w:after="0" w:before="0" w:line="188" w:lineRule="auto"/>
+      </w:pPr>
+      <w:r>
+        <w:rPr>
+          <w:rFonts w:ascii="EB Garamond" w:cs="EB Garamond" w:eastAsia="EB Garamond" w:hAnsi="EB Garamond"/>
+          <w:sz w:val="20"/>
+          <w:szCs w:val="20"/>
+        </w:rPr>
+        <w:t xml:space="preserve">Built in-house software to replace manual creator tracking, saving 20-25 hours weekly on creator communication, organization, and launches</w:t>
       </w:r>
     </w:p>
     <w:p>

</xml_diff>

<commit_message>
Resume: First Analysis bullets, unique opening verbs throughout
Co-Authored-By: Claude Opus 5.5 <noreply@anthropic.com>
Claude-Session: https://claude.ai/code/session_01G3JV145HgjUfXQyW7hEcYE
</commit_message>
<xml_diff>
--- a/assets/Jennifer-Amogu-Resume.docx
+++ b/assets/Jennifer-Amogu-Resume.docx
@@ -20,7 +20,7 @@
     </w:p>
     <w:p>
       <w:pPr>
-        <w:spacing w:after="0" w:before="0" w:line="188" w:lineRule="auto"/>
+        <w:spacing w:after="0" w:before="0" w:line="184" w:lineRule="auto"/>
         <w:jc w:val="center"/>
       </w:pPr>
       <w:r>
@@ -37,7 +37,7 @@
         <w:pBdr>
           <w:bottom w:val="single" w:color="000000" w:sz="6" w:space="1"/>
         </w:pBdr>
-        <w:spacing w:after="40" w:before="60" w:line="188" w:lineRule="auto"/>
+        <w:spacing w:after="40" w:before="60" w:line="184" w:lineRule="auto"/>
       </w:pPr>
       <w:r>
         <w:rPr>
@@ -65,7 +65,7 @@
         <w:tabs>
           <w:tab w:val="right" w:pos="11228"/>
         </w:tabs>
-        <w:spacing w:after="0" w:before="40" w:line="188" w:lineRule="auto"/>
+        <w:spacing w:after="0" w:before="40" w:line="184" w:lineRule="auto"/>
       </w:pPr>
       <w:r>
         <w:rPr>
@@ -99,7 +99,7 @@
         <w:tabs>
           <w:tab w:val="right" w:pos="11228"/>
         </w:tabs>
-        <w:spacing w:after="0" w:before="0" w:line="188" w:lineRule="auto"/>
+        <w:spacing w:after="0" w:before="0" w:line="184" w:lineRule="auto"/>
       </w:pPr>
       <w:r>
         <w:rPr>
@@ -122,7 +122,7 @@
     </w:p>
     <w:p>
       <w:pPr>
-        <w:spacing w:after="0" w:before="0" w:line="188" w:lineRule="auto"/>
+        <w:spacing w:after="0" w:before="0" w:line="184" w:lineRule="auto"/>
       </w:pPr>
       <w:r>
         <w:rPr>
@@ -148,7 +148,7 @@
         <w:pBdr>
           <w:bottom w:val="single" w:color="000000" w:sz="6" w:space="1"/>
         </w:pBdr>
-        <w:spacing w:after="40" w:before="80" w:line="188" w:lineRule="auto"/>
+        <w:spacing w:after="40" w:before="80" w:line="184" w:lineRule="auto"/>
       </w:pPr>
       <w:r>
         <w:rPr>
@@ -206,7 +206,7 @@
         <w:tabs>
           <w:tab w:val="right" w:pos="11228"/>
         </w:tabs>
-        <w:spacing w:after="0" w:before="40" w:line="188" w:lineRule="auto"/>
+        <w:spacing w:after="0" w:before="40" w:line="184" w:lineRule="auto"/>
       </w:pPr>
       <w:r>
         <w:rPr>
@@ -237,7 +237,7 @@
     </w:p>
     <w:p>
       <w:pPr>
-        <w:spacing w:after="0" w:before="0" w:line="188" w:lineRule="auto"/>
+        <w:spacing w:after="0" w:before="0" w:line="184" w:lineRule="auto"/>
       </w:pPr>
       <w:r>
         <w:rPr>
@@ -257,15 +257,69 @@
           <w:ilvl w:val="0"/>
           <w:numId w:val="2"/>
         </w:numPr>
-        <w:spacing w:after="0" w:before="0" w:line="188" w:lineRule="auto"/>
-      </w:pPr>
-      <w:r>
-        <w:rPr>
-          <w:rFonts w:ascii="EB Garamond" w:cs="EB Garamond" w:eastAsia="EB Garamond" w:hAnsi="EB Garamond"/>
-          <w:sz w:val="20"/>
-          <w:szCs w:val="20"/>
-        </w:rPr>
-        <w:t xml:space="preserve">Selected for the fall analyst class to support sell-side M&amp;A, growth equity raises, and valuation for tech-enabled services and healthcare clients</w:t>
+        <w:spacing w:after="0" w:before="0" w:line="184" w:lineRule="auto"/>
+      </w:pPr>
+      <w:r>
+        <w:rPr>
+          <w:rFonts w:ascii="EB Garamond" w:cs="EB Garamond" w:eastAsia="EB Garamond" w:hAnsi="EB Garamond"/>
+          <w:sz w:val="20"/>
+          <w:szCs w:val="20"/>
+        </w:rPr>
+        <w:t xml:space="preserve">Constructed an 80+ company taxonomy across 9 cryptographic sub-sectors, building bottom-up TAM models tied to NIST 2030 mandates</w:t>
+      </w:r>
+    </w:p>
+    <w:p>
+      <w:pPr>
+        <w:pStyle w:val="ListParagraph"/>
+        <w:numPr>
+          <w:ilvl w:val="0"/>
+          <w:numId w:val="2"/>
+        </w:numPr>
+        <w:spacing w:after="0" w:before="0" w:line="184" w:lineRule="auto"/>
+      </w:pPr>
+      <w:r>
+        <w:rPr>
+          <w:rFonts w:ascii="EB Garamond" w:cs="EB Garamond" w:eastAsia="EB Garamond" w:hAnsi="EB Garamond"/>
+          <w:sz w:val="20"/>
+          <w:szCs w:val="20"/>
+        </w:rPr>
+        <w:t xml:space="preserve">Benchmarked public EV/NTM Revenue multiples against private funding rounds across 15+ peer comps to frame pure-play exit valuations</w:t>
+      </w:r>
+    </w:p>
+    <w:p>
+      <w:pPr>
+        <w:pStyle w:val="ListParagraph"/>
+        <w:numPr>
+          <w:ilvl w:val="0"/>
+          <w:numId w:val="2"/>
+        </w:numPr>
+        <w:spacing w:after="0" w:before="0" w:line="184" w:lineRule="auto"/>
+      </w:pPr>
+      <w:r>
+        <w:rPr>
+          <w:rFonts w:ascii="EB Garamond" w:cs="EB Garamond" w:eastAsia="EB Garamond" w:hAnsi="EB Garamond"/>
+          <w:sz w:val="20"/>
+          <w:szCs w:val="20"/>
+        </w:rPr>
+        <w:t xml:space="preserve">Evaluated bolt-on fit and consolidation rationales across 80+ pure-plays to identify acquisition targets for large-cap cybersecurity platforms</w:t>
+      </w:r>
+    </w:p>
+    <w:p>
+      <w:pPr>
+        <w:pStyle w:val="ListParagraph"/>
+        <w:numPr>
+          <w:ilvl w:val="0"/>
+          <w:numId w:val="2"/>
+        </w:numPr>
+        <w:spacing w:after="0" w:before="0" w:line="184" w:lineRule="auto"/>
+      </w:pPr>
+      <w:r>
+        <w:rPr>
+          <w:rFonts w:ascii="EB Garamond" w:cs="EB Garamond" w:eastAsia="EB Garamond" w:hAnsi="EB Garamond"/>
+          <w:sz w:val="20"/>
+          <w:szCs w:val="20"/>
+        </w:rPr>
+        <w:t xml:space="preserve">Engineered a deal origination database tracking leadership, capitalization, and channel partners across 3 regions to inform sector reporting</w:t>
       </w:r>
     </w:p>
     <w:p>
@@ -273,7 +327,7 @@
         <w:tabs>
           <w:tab w:val="right" w:pos="11228"/>
         </w:tabs>
-        <w:spacing w:after="0" w:before="24" w:line="188" w:lineRule="auto"/>
+        <w:spacing w:after="0" w:before="24" w:line="184" w:lineRule="auto"/>
       </w:pPr>
       <w:r>
         <w:rPr>
@@ -304,7 +358,7 @@
     </w:p>
     <w:p>
       <w:pPr>
-        <w:spacing w:after="0" w:before="0" w:line="188" w:lineRule="auto"/>
+        <w:spacing w:after="0" w:before="0" w:line="184" w:lineRule="auto"/>
       </w:pPr>
       <w:r>
         <w:rPr>
@@ -324,7 +378,7 @@
           <w:ilvl w:val="0"/>
           <w:numId w:val="2"/>
         </w:numPr>
-        <w:spacing w:after="0" w:before="0" w:line="188" w:lineRule="auto"/>
+        <w:spacing w:after="0" w:before="0" w:line="184" w:lineRule="auto"/>
       </w:pPr>
       <w:r>
         <w:rPr>
@@ -342,7 +396,7 @@
           <w:ilvl w:val="0"/>
           <w:numId w:val="2"/>
         </w:numPr>
-        <w:spacing w:after="0" w:before="0" w:line="188" w:lineRule="auto"/>
+        <w:spacing w:after="0" w:before="0" w:line="184" w:lineRule="auto"/>
       </w:pPr>
       <w:r>
         <w:rPr>
@@ -360,25 +414,25 @@
           <w:ilvl w:val="0"/>
           <w:numId w:val="2"/>
         </w:numPr>
-        <w:spacing w:after="0" w:before="0" w:line="188" w:lineRule="auto"/>
-      </w:pPr>
-      <w:r>
-        <w:rPr>
-          <w:rFonts w:ascii="EB Garamond" w:cs="EB Garamond" w:eastAsia="EB Garamond" w:hAnsi="EB Garamond"/>
-          <w:sz w:val="20"/>
-          <w:szCs w:val="20"/>
-        </w:rPr>
-        <w:t xml:space="preserve">Drafted marketing teasers and screened inbound targets on financial health, addressable market size, and fit with clients' investment criteria</w:t>
-      </w:r>
-    </w:p>
-    <w:p>
-      <w:pPr>
-        <w:pStyle w:val="ListParagraph"/>
-        <w:numPr>
-          <w:ilvl w:val="0"/>
-          <w:numId w:val="2"/>
-        </w:numPr>
-        <w:spacing w:after="0" w:before="0" w:line="188" w:lineRule="auto"/>
+        <w:spacing w:after="0" w:before="0" w:line="184" w:lineRule="auto"/>
+      </w:pPr>
+      <w:r>
+        <w:rPr>
+          <w:rFonts w:ascii="EB Garamond" w:cs="EB Garamond" w:eastAsia="EB Garamond" w:hAnsi="EB Garamond"/>
+          <w:sz w:val="20"/>
+          <w:szCs w:val="20"/>
+        </w:rPr>
+        <w:t xml:space="preserve">Prepared marketing teasers and screened inbound targets on financial health, addressable market size, and fit with clients' investment criteria</w:t>
+      </w:r>
+    </w:p>
+    <w:p>
+      <w:pPr>
+        <w:pStyle w:val="ListParagraph"/>
+        <w:numPr>
+          <w:ilvl w:val="0"/>
+          <w:numId w:val="2"/>
+        </w:numPr>
+        <w:spacing w:after="0" w:before="0" w:line="184" w:lineRule="auto"/>
       </w:pPr>
       <w:r>
         <w:rPr>
@@ -394,7 +448,7 @@
         <w:tabs>
           <w:tab w:val="right" w:pos="11228"/>
         </w:tabs>
-        <w:spacing w:after="0" w:before="24" w:line="188" w:lineRule="auto"/>
+        <w:spacing w:after="0" w:before="24" w:line="184" w:lineRule="auto"/>
       </w:pPr>
       <w:r>
         <w:rPr>
@@ -425,7 +479,7 @@
     </w:p>
     <w:p>
       <w:pPr>
-        <w:spacing w:after="0" w:before="0" w:line="188" w:lineRule="auto"/>
+        <w:spacing w:after="0" w:before="0" w:line="184" w:lineRule="auto"/>
       </w:pPr>
       <w:r>
         <w:rPr>
@@ -445,7 +499,7 @@
           <w:ilvl w:val="0"/>
           <w:numId w:val="2"/>
         </w:numPr>
-        <w:spacing w:after="0" w:before="0" w:line="188" w:lineRule="auto"/>
+        <w:spacing w:after="0" w:before="0" w:line="184" w:lineRule="auto"/>
       </w:pPr>
       <w:r>
         <w:rPr>
@@ -463,7 +517,7 @@
           <w:ilvl w:val="0"/>
           <w:numId w:val="2"/>
         </w:numPr>
-        <w:spacing w:after="0" w:before="0" w:line="188" w:lineRule="auto"/>
+        <w:spacing w:after="0" w:before="0" w:line="184" w:lineRule="auto"/>
       </w:pPr>
       <w:r>
         <w:rPr>
@@ -481,7 +535,7 @@
           <w:ilvl w:val="0"/>
           <w:numId w:val="2"/>
         </w:numPr>
-        <w:spacing w:after="0" w:before="0" w:line="188" w:lineRule="auto"/>
+        <w:spacing w:after="0" w:before="0" w:line="184" w:lineRule="auto"/>
       </w:pPr>
       <w:r>
         <w:rPr>
@@ -499,7 +553,7 @@
           <w:ilvl w:val="0"/>
           <w:numId w:val="2"/>
         </w:numPr>
-        <w:spacing w:after="0" w:before="0" w:line="188" w:lineRule="auto"/>
+        <w:spacing w:after="0" w:before="0" w:line="184" w:lineRule="auto"/>
       </w:pPr>
       <w:r>
         <w:rPr>
@@ -515,7 +569,7 @@
         <w:tabs>
           <w:tab w:val="right" w:pos="11228"/>
         </w:tabs>
-        <w:spacing w:after="0" w:before="24" w:line="188" w:lineRule="auto"/>
+        <w:spacing w:after="0" w:before="24" w:line="184" w:lineRule="auto"/>
       </w:pPr>
       <w:r>
         <w:rPr>
@@ -546,7 +600,7 @@
     </w:p>
     <w:p>
       <w:pPr>
-        <w:spacing w:after="0" w:before="0" w:line="188" w:lineRule="auto"/>
+        <w:spacing w:after="0" w:before="0" w:line="184" w:lineRule="auto"/>
       </w:pPr>
       <w:r>
         <w:rPr>
@@ -566,7 +620,7 @@
           <w:ilvl w:val="0"/>
           <w:numId w:val="2"/>
         </w:numPr>
-        <w:spacing w:after="0" w:before="0" w:line="188" w:lineRule="auto"/>
+        <w:spacing w:after="0" w:before="0" w:line="184" w:lineRule="auto"/>
       </w:pPr>
       <w:r>
         <w:rPr>
@@ -584,7 +638,7 @@
           <w:ilvl w:val="0"/>
           <w:numId w:val="2"/>
         </w:numPr>
-        <w:spacing w:after="0" w:before="0" w:line="188" w:lineRule="auto"/>
+        <w:spacing w:after="0" w:before="0" w:line="184" w:lineRule="auto"/>
       </w:pPr>
       <w:r>
         <w:rPr>
@@ -602,33 +656,33 @@
           <w:ilvl w:val="0"/>
           <w:numId w:val="2"/>
         </w:numPr>
-        <w:spacing w:after="0" w:before="0" w:line="188" w:lineRule="auto"/>
-      </w:pPr>
-      <w:r>
-        <w:rPr>
-          <w:rFonts w:ascii="EB Garamond" w:cs="EB Garamond" w:eastAsia="EB Garamond" w:hAnsi="EB Garamond"/>
-          <w:sz w:val="20"/>
-          <w:szCs w:val="20"/>
-        </w:rPr>
-        <w:t xml:space="preserve">Drafted 2 investment committee memos covering market sizing, competitive landscape, financial projections, and exit scenarios for partners</w:t>
-      </w:r>
-    </w:p>
-    <w:p>
-      <w:pPr>
-        <w:pStyle w:val="ListParagraph"/>
-        <w:numPr>
-          <w:ilvl w:val="0"/>
-          <w:numId w:val="2"/>
-        </w:numPr>
-        <w:spacing w:after="0" w:before="0" w:line="188" w:lineRule="auto"/>
-      </w:pPr>
-      <w:r>
-        <w:rPr>
-          <w:rFonts w:ascii="EB Garamond" w:cs="EB Garamond" w:eastAsia="EB Garamond" w:hAnsi="EB Garamond"/>
-          <w:sz w:val="20"/>
-          <w:szCs w:val="20"/>
-        </w:rPr>
-        <w:t xml:space="preserve">Built standardized portfolio review decks and automated monthly KPI tracking in Python, replacing recurring manual data pulls for the team</w:t>
+        <w:spacing w:after="0" w:before="0" w:line="184" w:lineRule="auto"/>
+      </w:pPr>
+      <w:r>
+        <w:rPr>
+          <w:rFonts w:ascii="EB Garamond" w:cs="EB Garamond" w:eastAsia="EB Garamond" w:hAnsi="EB Garamond"/>
+          <w:sz w:val="20"/>
+          <w:szCs w:val="20"/>
+        </w:rPr>
+        <w:t xml:space="preserve">Co-authored 2 investment committee memos on market sizing, competitive landscape, financial projections, and exit scenarios for partners</w:t>
+      </w:r>
+    </w:p>
+    <w:p>
+      <w:pPr>
+        <w:pStyle w:val="ListParagraph"/>
+        <w:numPr>
+          <w:ilvl w:val="0"/>
+          <w:numId w:val="2"/>
+        </w:numPr>
+        <w:spacing w:after="0" w:before="0" w:line="184" w:lineRule="auto"/>
+      </w:pPr>
+      <w:r>
+        <w:rPr>
+          <w:rFonts w:ascii="EB Garamond" w:cs="EB Garamond" w:eastAsia="EB Garamond" w:hAnsi="EB Garamond"/>
+          <w:sz w:val="20"/>
+          <w:szCs w:val="20"/>
+        </w:rPr>
+        <w:t xml:space="preserve">Automated monthly KPI tracking in Python and standardized portfolio review decks, replacing all recurring manual data pulls for the team</w:t>
       </w:r>
     </w:p>
     <w:p>
@@ -636,7 +690,7 @@
         <w:tabs>
           <w:tab w:val="right" w:pos="11228"/>
         </w:tabs>
-        <w:spacing w:after="0" w:before="24" w:line="188" w:lineRule="auto"/>
+        <w:spacing w:after="0" w:before="24" w:line="184" w:lineRule="auto"/>
       </w:pPr>
       <w:r>
         <w:rPr>
@@ -667,7 +721,7 @@
     </w:p>
     <w:p>
       <w:pPr>
-        <w:spacing w:after="0" w:before="0" w:line="188" w:lineRule="auto"/>
+        <w:spacing w:after="0" w:before="0" w:line="184" w:lineRule="auto"/>
       </w:pPr>
       <w:r>
         <w:rPr>
@@ -687,7 +741,7 @@
           <w:ilvl w:val="0"/>
           <w:numId w:val="2"/>
         </w:numPr>
-        <w:spacing w:after="0" w:before="0" w:line="188" w:lineRule="auto"/>
+        <w:spacing w:after="0" w:before="0" w:line="184" w:lineRule="auto"/>
       </w:pPr>
       <w:r>
         <w:rPr>
@@ -705,7 +759,7 @@
           <w:ilvl w:val="0"/>
           <w:numId w:val="2"/>
         </w:numPr>
-        <w:spacing w:after="0" w:before="0" w:line="188" w:lineRule="auto"/>
+        <w:spacing w:after="0" w:before="0" w:line="184" w:lineRule="auto"/>
       </w:pPr>
       <w:r>
         <w:rPr>
@@ -723,7 +777,7 @@
           <w:ilvl w:val="0"/>
           <w:numId w:val="2"/>
         </w:numPr>
-        <w:spacing w:after="0" w:before="0" w:line="188" w:lineRule="auto"/>
+        <w:spacing w:after="0" w:before="0" w:line="184" w:lineRule="auto"/>
       </w:pPr>
       <w:r>
         <w:rPr>
@@ -739,7 +793,7 @@
         <w:pBdr>
           <w:bottom w:val="single" w:color="000000" w:sz="6" w:space="1"/>
         </w:pBdr>
-        <w:spacing w:after="40" w:before="80" w:line="188" w:lineRule="auto"/>
+        <w:spacing w:after="40" w:before="80" w:line="184" w:lineRule="auto"/>
       </w:pPr>
       <w:r>
         <w:rPr>
@@ -857,7 +911,7 @@
         <w:tabs>
           <w:tab w:val="right" w:pos="11228"/>
         </w:tabs>
-        <w:spacing w:after="0" w:before="40" w:line="188" w:lineRule="auto"/>
+        <w:spacing w:after="0" w:before="40" w:line="184" w:lineRule="auto"/>
       </w:pPr>
       <w:r>
         <w:rPr>
@@ -880,7 +934,7 @@
     </w:p>
     <w:p>
       <w:pPr>
-        <w:spacing w:after="0" w:before="0" w:line="188" w:lineRule="auto"/>
+        <w:spacing w:after="0" w:before="0" w:line="184" w:lineRule="auto"/>
       </w:pPr>
       <w:r>
         <w:rPr>
@@ -900,7 +954,7 @@
           <w:ilvl w:val="0"/>
           <w:numId w:val="2"/>
         </w:numPr>
-        <w:spacing w:after="0" w:before="0" w:line="188" w:lineRule="auto"/>
+        <w:spacing w:after="0" w:before="0" w:line="184" w:lineRule="auto"/>
       </w:pPr>
       <w:r>
         <w:rPr>
@@ -916,7 +970,7 @@
         <w:tabs>
           <w:tab w:val="right" w:pos="11228"/>
         </w:tabs>
-        <w:spacing w:after="0" w:before="24" w:line="188" w:lineRule="auto"/>
+        <w:spacing w:after="0" w:before="24" w:line="184" w:lineRule="auto"/>
       </w:pPr>
       <w:r>
         <w:rPr>
@@ -939,7 +993,7 @@
     </w:p>
     <w:p>
       <w:pPr>
-        <w:spacing w:after="0" w:before="0" w:line="188" w:lineRule="auto"/>
+        <w:spacing w:after="0" w:before="0" w:line="184" w:lineRule="auto"/>
       </w:pPr>
       <w:r>
         <w:rPr>
@@ -959,25 +1013,25 @@
           <w:ilvl w:val="0"/>
           <w:numId w:val="2"/>
         </w:numPr>
-        <w:spacing w:after="0" w:before="0" w:line="188" w:lineRule="auto"/>
-      </w:pPr>
-      <w:r>
-        <w:rPr>
-          <w:rFonts w:ascii="EB Garamond" w:cs="EB Garamond" w:eastAsia="EB Garamond" w:hAnsi="EB Garamond"/>
-          <w:sz w:val="20"/>
-          <w:szCs w:val="20"/>
-        </w:rPr>
-        <w:t xml:space="preserve">Selected for competitive pre-professional fellowship offering intensive technical training for careers in investment banking and private equity</w:t>
-      </w:r>
-    </w:p>
-    <w:p>
-      <w:pPr>
-        <w:pStyle w:val="ListParagraph"/>
-        <w:numPr>
-          <w:ilvl w:val="0"/>
-          <w:numId w:val="2"/>
-        </w:numPr>
-        <w:spacing w:after="0" w:before="0" w:line="188" w:lineRule="auto"/>
+        <w:spacing w:after="0" w:before="0" w:line="184" w:lineRule="auto"/>
+      </w:pPr>
+      <w:r>
+        <w:rPr>
+          <w:rFonts w:ascii="EB Garamond" w:cs="EB Garamond" w:eastAsia="EB Garamond" w:hAnsi="EB Garamond"/>
+          <w:sz w:val="20"/>
+          <w:szCs w:val="20"/>
+        </w:rPr>
+        <w:t xml:space="preserve">Accepted into competitive pre-professional fellowship offering intensive technical training for careers in investment banking and buyside</w:t>
+      </w:r>
+    </w:p>
+    <w:p>
+      <w:pPr>
+        <w:pStyle w:val="ListParagraph"/>
+        <w:numPr>
+          <w:ilvl w:val="0"/>
+          <w:numId w:val="2"/>
+        </w:numPr>
+        <w:spacing w:after="0" w:before="0" w:line="184" w:lineRule="auto"/>
       </w:pPr>
       <w:r>
         <w:rPr>
@@ -995,15 +1049,15 @@
           <w:ilvl w:val="0"/>
           <w:numId w:val="2"/>
         </w:numPr>
-        <w:spacing w:after="0" w:before="0" w:line="188" w:lineRule="auto"/>
-      </w:pPr>
-      <w:r>
-        <w:rPr>
-          <w:rFonts w:ascii="EB Garamond" w:cs="EB Garamond" w:eastAsia="EB Garamond" w:hAnsi="EB Garamond"/>
-          <w:sz w:val="20"/>
-          <w:szCs w:val="20"/>
-        </w:rPr>
-        <w:t xml:space="preserve">Analyzed real-world transaction case studies, completed technical assessments, and received mentorship from senior Wall Street professionals</w:t>
+        <w:spacing w:after="0" w:before="0" w:line="184" w:lineRule="auto"/>
+      </w:pPr>
+      <w:r>
+        <w:rPr>
+          <w:rFonts w:ascii="EB Garamond" w:cs="EB Garamond" w:eastAsia="EB Garamond" w:hAnsi="EB Garamond"/>
+          <w:sz w:val="20"/>
+          <w:szCs w:val="20"/>
+        </w:rPr>
+        <w:t xml:space="preserve">Studied real-world transaction case studies, completed technical assessments, and received mentorship from senior Wall Street professionals</w:t>
       </w:r>
     </w:p>
     <w:p>
@@ -1011,7 +1065,7 @@
         <w:tabs>
           <w:tab w:val="right" w:pos="11228"/>
         </w:tabs>
-        <w:spacing w:after="0" w:before="24" w:line="188" w:lineRule="auto"/>
+        <w:spacing w:after="0" w:before="24" w:line="184" w:lineRule="auto"/>
       </w:pPr>
       <w:r>
         <w:rPr>
@@ -1034,7 +1088,7 @@
     </w:p>
     <w:p>
       <w:pPr>
-        <w:spacing w:after="0" w:before="0" w:line="188" w:lineRule="auto"/>
+        <w:spacing w:after="0" w:before="0" w:line="184" w:lineRule="auto"/>
       </w:pPr>
       <w:r>
         <w:rPr>
@@ -1054,51 +1108,51 @@
           <w:ilvl w:val="0"/>
           <w:numId w:val="2"/>
         </w:numPr>
-        <w:spacing w:after="0" w:before="0" w:line="188" w:lineRule="auto"/>
-      </w:pPr>
-      <w:r>
-        <w:rPr>
-          <w:rFonts w:ascii="EB Garamond" w:cs="EB Garamond" w:eastAsia="EB Garamond" w:hAnsi="EB Garamond"/>
-          <w:sz w:val="20"/>
-          <w:szCs w:val="20"/>
-        </w:rPr>
-        <w:t xml:space="preserve">Selected via competitive application for an intensive finance accelerator backed by leading PE sponsors, focused on investor-grade modeling</w:t>
-      </w:r>
-    </w:p>
-    <w:p>
-      <w:pPr>
-        <w:pStyle w:val="ListParagraph"/>
-        <w:numPr>
-          <w:ilvl w:val="0"/>
-          <w:numId w:val="2"/>
-        </w:numPr>
-        <w:spacing w:after="0" w:before="0" w:line="188" w:lineRule="auto"/>
-      </w:pPr>
-      <w:r>
-        <w:rPr>
-          <w:rFonts w:ascii="EB Garamond" w:cs="EB Garamond" w:eastAsia="EB Garamond" w:hAnsi="EB Garamond"/>
-          <w:sz w:val="20"/>
-          <w:szCs w:val="20"/>
-        </w:rPr>
-        <w:t xml:space="preserve">Constructed multi-period three-statement operating models from blank spreadsheets with working capital, debt waterfalls, and sensitivities</w:t>
-      </w:r>
-    </w:p>
-    <w:p>
-      <w:pPr>
-        <w:pStyle w:val="ListParagraph"/>
-        <w:numPr>
-          <w:ilvl w:val="0"/>
-          <w:numId w:val="2"/>
-        </w:numPr>
-        <w:spacing w:after="0" w:before="0" w:line="188" w:lineRule="auto"/>
-      </w:pPr>
-      <w:r>
-        <w:rPr>
-          <w:rFonts w:ascii="EB Garamond" w:cs="EB Garamond" w:eastAsia="EB Garamond" w:hAnsi="EB Garamond"/>
-          <w:sz w:val="20"/>
-          <w:szCs w:val="20"/>
-        </w:rPr>
-        <w:t xml:space="preserve">Evaluated buyout case studies, analyzed operational drivers (unit economics, margins), and presented valuation takeaways to PE investors</w:t>
+        <w:spacing w:after="0" w:before="0" w:line="184" w:lineRule="auto"/>
+      </w:pPr>
+      <w:r>
+        <w:rPr>
+          <w:rFonts w:ascii="EB Garamond" w:cs="EB Garamond" w:eastAsia="EB Garamond" w:hAnsi="EB Garamond"/>
+          <w:sz w:val="20"/>
+          <w:szCs w:val="20"/>
+        </w:rPr>
+        <w:t xml:space="preserve">Admitted via competitive application to an intensive finance accelerator backed by leading PE sponsors, focused on investor-grade modeling</w:t>
+      </w:r>
+    </w:p>
+    <w:p>
+      <w:pPr>
+        <w:pStyle w:val="ListParagraph"/>
+        <w:numPr>
+          <w:ilvl w:val="0"/>
+          <w:numId w:val="2"/>
+        </w:numPr>
+        <w:spacing w:after="0" w:before="0" w:line="184" w:lineRule="auto"/>
+      </w:pPr>
+      <w:r>
+        <w:rPr>
+          <w:rFonts w:ascii="EB Garamond" w:cs="EB Garamond" w:eastAsia="EB Garamond" w:hAnsi="EB Garamond"/>
+          <w:sz w:val="20"/>
+          <w:szCs w:val="20"/>
+        </w:rPr>
+        <w:t xml:space="preserve">Created multi-period three-statement operating models from blank spreadsheets with working capital, debt waterfalls, and sensitivity tables</w:t>
+      </w:r>
+    </w:p>
+    <w:p>
+      <w:pPr>
+        <w:pStyle w:val="ListParagraph"/>
+        <w:numPr>
+          <w:ilvl w:val="0"/>
+          <w:numId w:val="2"/>
+        </w:numPr>
+        <w:spacing w:after="0" w:before="0" w:line="184" w:lineRule="auto"/>
+      </w:pPr>
+      <w:r>
+        <w:rPr>
+          <w:rFonts w:ascii="EB Garamond" w:cs="EB Garamond" w:eastAsia="EB Garamond" w:hAnsi="EB Garamond"/>
+          <w:sz w:val="20"/>
+          <w:szCs w:val="20"/>
+        </w:rPr>
+        <w:t xml:space="preserve">Examined buyout case studies, analyzed operational drivers (unit economics, margins), and presented valuation takeaways to PE investors</w:t>
       </w:r>
     </w:p>
     <w:p>
@@ -1106,7 +1160,7 @@
         <w:tabs>
           <w:tab w:val="right" w:pos="11228"/>
         </w:tabs>
-        <w:spacing w:after="0" w:before="24" w:line="188" w:lineRule="auto"/>
+        <w:spacing w:after="0" w:before="24" w:line="184" w:lineRule="auto"/>
       </w:pPr>
       <w:r>
         <w:rPr>
@@ -1129,7 +1183,7 @@
     </w:p>
     <w:p>
       <w:pPr>
-        <w:spacing w:after="0" w:before="0" w:line="188" w:lineRule="auto"/>
+        <w:spacing w:after="0" w:before="0" w:line="184" w:lineRule="auto"/>
       </w:pPr>
       <w:r>
         <w:rPr>
@@ -1149,43 +1203,43 @@
           <w:ilvl w:val="0"/>
           <w:numId w:val="2"/>
         </w:numPr>
-        <w:spacing w:after="0" w:before="0" w:line="188" w:lineRule="auto"/>
-      </w:pPr>
-      <w:r>
-        <w:rPr>
-          <w:rFonts w:ascii="EB Garamond" w:cs="EB Garamond" w:eastAsia="EB Garamond" w:hAnsi="EB Garamond"/>
-          <w:sz w:val="20"/>
-          <w:szCs w:val="20"/>
-        </w:rPr>
-        <w:t xml:space="preserve">Selected for competitive 18+-month fellowship accelerating emerging leaders' careers via executive coaching, skill-building, and mentorship</w:t>
-      </w:r>
-    </w:p>
-    <w:p>
-      <w:pPr>
-        <w:pStyle w:val="ListParagraph"/>
-        <w:numPr>
-          <w:ilvl w:val="0"/>
-          <w:numId w:val="2"/>
-        </w:numPr>
-        <w:spacing w:after="0" w:before="0" w:line="188" w:lineRule="auto"/>
-      </w:pPr>
-      <w:r>
-        <w:rPr>
-          <w:rFonts w:ascii="EB Garamond" w:cs="EB Garamond" w:eastAsia="EB Garamond" w:hAnsi="EB Garamond"/>
-          <w:sz w:val="20"/>
-          <w:szCs w:val="20"/>
-        </w:rPr>
-        <w:t xml:space="preserve">Completed rigorous business case analyses, quantitative problem-solving assignments, and strategic simulations evaluated by career coaches</w:t>
-      </w:r>
-    </w:p>
-    <w:p>
-      <w:pPr>
-        <w:pStyle w:val="ListParagraph"/>
-        <w:numPr>
-          <w:ilvl w:val="0"/>
-          <w:numId w:val="2"/>
-        </w:numPr>
-        <w:spacing w:after="0" w:before="0" w:line="188" w:lineRule="auto"/>
+        <w:spacing w:after="0" w:before="0" w:line="184" w:lineRule="auto"/>
+      </w:pPr>
+      <w:r>
+        <w:rPr>
+          <w:rFonts w:ascii="EB Garamond" w:cs="EB Garamond" w:eastAsia="EB Garamond" w:hAnsi="EB Garamond"/>
+          <w:sz w:val="20"/>
+          <w:szCs w:val="20"/>
+        </w:rPr>
+        <w:t xml:space="preserve">Named to competitive 18+-month fellowship accelerating emerging leaders' careers via executive coaching, skill-building, and mentorship</w:t>
+      </w:r>
+    </w:p>
+    <w:p>
+      <w:pPr>
+        <w:pStyle w:val="ListParagraph"/>
+        <w:numPr>
+          <w:ilvl w:val="0"/>
+          <w:numId w:val="2"/>
+        </w:numPr>
+        <w:spacing w:after="0" w:before="0" w:line="184" w:lineRule="auto"/>
+      </w:pPr>
+      <w:r>
+        <w:rPr>
+          <w:rFonts w:ascii="EB Garamond" w:cs="EB Garamond" w:eastAsia="EB Garamond" w:hAnsi="EB Garamond"/>
+          <w:sz w:val="20"/>
+          <w:szCs w:val="20"/>
+        </w:rPr>
+        <w:t xml:space="preserve">Tackled rigorous business case analyses, quantitative problem-solving assignments, and strategic simulations reviewed by executive coaches</w:t>
+      </w:r>
+    </w:p>
+    <w:p>
+      <w:pPr>
+        <w:pStyle w:val="ListParagraph"/>
+        <w:numPr>
+          <w:ilvl w:val="0"/>
+          <w:numId w:val="2"/>
+        </w:numPr>
+        <w:spacing w:after="0" w:before="0" w:line="184" w:lineRule="auto"/>
       </w:pPr>
       <w:r>
         <w:rPr>
@@ -1201,7 +1255,7 @@
         <w:tabs>
           <w:tab w:val="right" w:pos="11228"/>
         </w:tabs>
-        <w:spacing w:after="0" w:before="24" w:line="188" w:lineRule="auto"/>
+        <w:spacing w:after="0" w:before="24" w:line="184" w:lineRule="auto"/>
       </w:pPr>
       <w:r>
         <w:rPr>
@@ -1232,7 +1286,7 @@
     </w:p>
     <w:p>
       <w:pPr>
-        <w:spacing w:after="0" w:before="0" w:line="188" w:lineRule="auto"/>
+        <w:spacing w:after="0" w:before="0" w:line="184" w:lineRule="auto"/>
       </w:pPr>
       <w:r>
         <w:rPr>
@@ -1252,25 +1306,25 @@
           <w:ilvl w:val="0"/>
           <w:numId w:val="2"/>
         </w:numPr>
-        <w:spacing w:after="0" w:before="0" w:line="188" w:lineRule="auto"/>
-      </w:pPr>
-      <w:r>
-        <w:rPr>
-          <w:rFonts w:ascii="EB Garamond" w:cs="EB Garamond" w:eastAsia="EB Garamond" w:hAnsi="EB Garamond"/>
-          <w:sz w:val="20"/>
-          <w:szCs w:val="20"/>
-        </w:rPr>
-        <w:t xml:space="preserve">Selected for inaugural M&amp;A Pitch Competition; recommended selling a 51% controlling stake in Athleta while retaining 49% of the upside</w:t>
-      </w:r>
-    </w:p>
-    <w:p>
-      <w:pPr>
-        <w:pStyle w:val="ListParagraph"/>
-        <w:numPr>
-          <w:ilvl w:val="0"/>
-          <w:numId w:val="2"/>
-        </w:numPr>
-        <w:spacing w:after="0" w:before="0" w:line="188" w:lineRule="auto"/>
+        <w:spacing w:after="0" w:before="0" w:line="184" w:lineRule="auto"/>
+      </w:pPr>
+      <w:r>
+        <w:rPr>
+          <w:rFonts w:ascii="EB Garamond" w:cs="EB Garamond" w:eastAsia="EB Garamond" w:hAnsi="EB Garamond"/>
+          <w:sz w:val="20"/>
+          <w:szCs w:val="20"/>
+        </w:rPr>
+        <w:t xml:space="preserve">Recommended selling a 51% controlling stake in Athleta while retaining 49% of the upside for Gap in the inaugural M&amp;A Pitch Competition</w:t>
+      </w:r>
+    </w:p>
+    <w:p>
+      <w:pPr>
+        <w:pStyle w:val="ListParagraph"/>
+        <w:numPr>
+          <w:ilvl w:val="0"/>
+          <w:numId w:val="2"/>
+        </w:numPr>
+        <w:spacing w:after="0" w:before="0" w:line="184" w:lineRule="auto"/>
       </w:pPr>
       <w:r>
         <w:rPr>
@@ -1279,24 +1333,6 @@
           <w:szCs w:val="20"/>
         </w:rPr>
         <w:t xml:space="preserve">Modeled five-year operating case, DCF, sum-of-the-parts, and buyer returns analysis supporting a $561M enterprise value and a 19-20% IRR</w:t>
-      </w:r>
-    </w:p>
-    <w:p>
-      <w:pPr>
-        <w:pStyle w:val="ListParagraph"/>
-        <w:numPr>
-          <w:ilvl w:val="0"/>
-          <w:numId w:val="2"/>
-        </w:numPr>
-        <w:spacing w:after="0" w:before="0" w:line="188" w:lineRule="auto"/>
-      </w:pPr>
-      <w:r>
-        <w:rPr>
-          <w:rFonts w:ascii="EB Garamond" w:cs="EB Garamond" w:eastAsia="EB Garamond" w:hAnsi="EB Garamond"/>
-          <w:sz w:val="20"/>
-          <w:szCs w:val="20"/>
-        </w:rPr>
-        <w:t xml:space="preserve">Analyzed SEC filings, equity research, trading comparables, and precedent transactions to co-author a four-page investment banking memo</w:t>
       </w:r>
     </w:p>
     <w:p>
@@ -1304,7 +1340,7 @@
         <w:tabs>
           <w:tab w:val="right" w:pos="11228"/>
         </w:tabs>
-        <w:spacing w:after="0" w:before="24" w:line="188" w:lineRule="auto"/>
+        <w:spacing w:after="0" w:before="24" w:line="184" w:lineRule="auto"/>
       </w:pPr>
       <w:r>
         <w:rPr>
@@ -1335,7 +1371,7 @@
     </w:p>
     <w:p>
       <w:pPr>
-        <w:spacing w:after="0" w:before="0" w:line="188" w:lineRule="auto"/>
+        <w:spacing w:after="0" w:before="0" w:line="184" w:lineRule="auto"/>
       </w:pPr>
       <w:r>
         <w:rPr>
@@ -1355,7 +1391,7 @@
           <w:ilvl w:val="0"/>
           <w:numId w:val="2"/>
         </w:numPr>
-        <w:spacing w:after="0" w:before="0" w:line="188" w:lineRule="auto"/>
+        <w:spacing w:after="0" w:before="0" w:line="184" w:lineRule="auto"/>
       </w:pPr>
       <w:r>
         <w:rPr>
@@ -1373,7 +1409,7 @@
           <w:ilvl w:val="0"/>
           <w:numId w:val="2"/>
         </w:numPr>
-        <w:spacing w:after="0" w:before="0" w:line="188" w:lineRule="auto"/>
+        <w:spacing w:after="0" w:before="0" w:line="184" w:lineRule="auto"/>
       </w:pPr>
       <w:r>
         <w:rPr>
@@ -1391,7 +1427,7 @@
           <w:ilvl w:val="0"/>
           <w:numId w:val="2"/>
         </w:numPr>
-        <w:spacing w:after="0" w:before="0" w:line="188" w:lineRule="auto"/>
+        <w:spacing w:after="0" w:before="0" w:line="184" w:lineRule="auto"/>
       </w:pPr>
       <w:r>
         <w:rPr>
@@ -1407,7 +1443,7 @@
         <w:pBdr>
           <w:bottom w:val="single" w:color="000000" w:sz="6" w:space="1"/>
         </w:pBdr>
-        <w:spacing w:after="40" w:before="80" w:line="188" w:lineRule="auto"/>
+        <w:spacing w:after="40" w:before="80" w:line="184" w:lineRule="auto"/>
       </w:pPr>
       <w:r>
         <w:rPr>
@@ -1512,7 +1548,7 @@
     </w:p>
     <w:p>
       <w:pPr>
-        <w:spacing w:after="0" w:before="30" w:line="188" w:lineRule="auto"/>
+        <w:spacing w:after="0" w:before="30" w:line="184" w:lineRule="auto"/>
       </w:pPr>
       <w:r>
         <w:rPr>
@@ -1535,7 +1571,7 @@
     </w:p>
     <w:p>
       <w:pPr>
-        <w:spacing w:after="0" w:before="0" w:line="188" w:lineRule="auto"/>
+        <w:spacing w:after="0" w:before="0" w:line="184" w:lineRule="auto"/>
       </w:pPr>
       <w:r>
         <w:rPr>
@@ -1558,7 +1594,7 @@
     </w:p>
     <w:p>
       <w:pPr>
-        <w:spacing w:after="0" w:before="0" w:line="188" w:lineRule="auto"/>
+        <w:spacing w:after="0" w:before="0" w:line="184" w:lineRule="auto"/>
       </w:pPr>
       <w:r>
         <w:rPr>

</xml_diff>

<commit_message>
Resume: Vandy 2 Wall Street back to 3 bullets, Nigerian community work in activities
Co-Authored-By: Claude Opus 5.5 <noreply@anthropic.com>
Claude-Session: https://claude.ai/code/session_01G3JV145HgjUfXQyW7hEcYE
</commit_message>
<xml_diff>
--- a/assets/Jennifer-Amogu-Resume.docx
+++ b/assets/Jennifer-Amogu-Resume.docx
@@ -20,7 +20,7 @@
     </w:p>
     <w:p>
       <w:pPr>
-        <w:spacing w:after="0" w:before="0" w:line="184" w:lineRule="auto"/>
+        <w:spacing w:after="0" w:before="0" w:line="182" w:lineRule="auto"/>
         <w:jc w:val="center"/>
       </w:pPr>
       <w:r>
@@ -37,7 +37,7 @@
         <w:pBdr>
           <w:bottom w:val="single" w:color="000000" w:sz="6" w:space="1"/>
         </w:pBdr>
-        <w:spacing w:after="40" w:before="60" w:line="184" w:lineRule="auto"/>
+        <w:spacing w:after="40" w:before="60" w:line="182" w:lineRule="auto"/>
       </w:pPr>
       <w:r>
         <w:rPr>
@@ -65,7 +65,7 @@
         <w:tabs>
           <w:tab w:val="right" w:pos="11228"/>
         </w:tabs>
-        <w:spacing w:after="0" w:before="40" w:line="184" w:lineRule="auto"/>
+        <w:spacing w:after="0" w:before="40" w:line="182" w:lineRule="auto"/>
       </w:pPr>
       <w:r>
         <w:rPr>
@@ -99,7 +99,7 @@
         <w:tabs>
           <w:tab w:val="right" w:pos="11228"/>
         </w:tabs>
-        <w:spacing w:after="0" w:before="0" w:line="184" w:lineRule="auto"/>
+        <w:spacing w:after="0" w:before="0" w:line="182" w:lineRule="auto"/>
       </w:pPr>
       <w:r>
         <w:rPr>
@@ -122,7 +122,7 @@
     </w:p>
     <w:p>
       <w:pPr>
-        <w:spacing w:after="0" w:before="0" w:line="184" w:lineRule="auto"/>
+        <w:spacing w:after="0" w:before="0" w:line="182" w:lineRule="auto"/>
       </w:pPr>
       <w:r>
         <w:rPr>
@@ -148,7 +148,7 @@
         <w:pBdr>
           <w:bottom w:val="single" w:color="000000" w:sz="6" w:space="1"/>
         </w:pBdr>
-        <w:spacing w:after="40" w:before="80" w:line="184" w:lineRule="auto"/>
+        <w:spacing w:after="40" w:before="80" w:line="182" w:lineRule="auto"/>
       </w:pPr>
       <w:r>
         <w:rPr>
@@ -206,7 +206,7 @@
         <w:tabs>
           <w:tab w:val="right" w:pos="11228"/>
         </w:tabs>
-        <w:spacing w:after="0" w:before="40" w:line="184" w:lineRule="auto"/>
+        <w:spacing w:after="0" w:before="40" w:line="182" w:lineRule="auto"/>
       </w:pPr>
       <w:r>
         <w:rPr>
@@ -237,7 +237,7 @@
     </w:p>
     <w:p>
       <w:pPr>
-        <w:spacing w:after="0" w:before="0" w:line="184" w:lineRule="auto"/>
+        <w:spacing w:after="0" w:before="0" w:line="182" w:lineRule="auto"/>
       </w:pPr>
       <w:r>
         <w:rPr>
@@ -257,7 +257,7 @@
           <w:ilvl w:val="0"/>
           <w:numId w:val="2"/>
         </w:numPr>
-        <w:spacing w:after="0" w:before="0" w:line="184" w:lineRule="auto"/>
+        <w:spacing w:after="0" w:before="0" w:line="182" w:lineRule="auto"/>
       </w:pPr>
       <w:r>
         <w:rPr>
@@ -275,7 +275,7 @@
           <w:ilvl w:val="0"/>
           <w:numId w:val="2"/>
         </w:numPr>
-        <w:spacing w:after="0" w:before="0" w:line="184" w:lineRule="auto"/>
+        <w:spacing w:after="0" w:before="0" w:line="182" w:lineRule="auto"/>
       </w:pPr>
       <w:r>
         <w:rPr>
@@ -293,7 +293,7 @@
           <w:ilvl w:val="0"/>
           <w:numId w:val="2"/>
         </w:numPr>
-        <w:spacing w:after="0" w:before="0" w:line="184" w:lineRule="auto"/>
+        <w:spacing w:after="0" w:before="0" w:line="182" w:lineRule="auto"/>
       </w:pPr>
       <w:r>
         <w:rPr>
@@ -311,7 +311,7 @@
           <w:ilvl w:val="0"/>
           <w:numId w:val="2"/>
         </w:numPr>
-        <w:spacing w:after="0" w:before="0" w:line="184" w:lineRule="auto"/>
+        <w:spacing w:after="0" w:before="0" w:line="182" w:lineRule="auto"/>
       </w:pPr>
       <w:r>
         <w:rPr>
@@ -327,7 +327,7 @@
         <w:tabs>
           <w:tab w:val="right" w:pos="11228"/>
         </w:tabs>
-        <w:spacing w:after="0" w:before="24" w:line="184" w:lineRule="auto"/>
+        <w:spacing w:after="0" w:before="24" w:line="182" w:lineRule="auto"/>
       </w:pPr>
       <w:r>
         <w:rPr>
@@ -358,7 +358,7 @@
     </w:p>
     <w:p>
       <w:pPr>
-        <w:spacing w:after="0" w:before="0" w:line="184" w:lineRule="auto"/>
+        <w:spacing w:after="0" w:before="0" w:line="182" w:lineRule="auto"/>
       </w:pPr>
       <w:r>
         <w:rPr>
@@ -378,7 +378,7 @@
           <w:ilvl w:val="0"/>
           <w:numId w:val="2"/>
         </w:numPr>
-        <w:spacing w:after="0" w:before="0" w:line="184" w:lineRule="auto"/>
+        <w:spacing w:after="0" w:before="0" w:line="182" w:lineRule="auto"/>
       </w:pPr>
       <w:r>
         <w:rPr>
@@ -396,7 +396,7 @@
           <w:ilvl w:val="0"/>
           <w:numId w:val="2"/>
         </w:numPr>
-        <w:spacing w:after="0" w:before="0" w:line="184" w:lineRule="auto"/>
+        <w:spacing w:after="0" w:before="0" w:line="182" w:lineRule="auto"/>
       </w:pPr>
       <w:r>
         <w:rPr>
@@ -414,7 +414,7 @@
           <w:ilvl w:val="0"/>
           <w:numId w:val="2"/>
         </w:numPr>
-        <w:spacing w:after="0" w:before="0" w:line="184" w:lineRule="auto"/>
+        <w:spacing w:after="0" w:before="0" w:line="182" w:lineRule="auto"/>
       </w:pPr>
       <w:r>
         <w:rPr>
@@ -432,7 +432,7 @@
           <w:ilvl w:val="0"/>
           <w:numId w:val="2"/>
         </w:numPr>
-        <w:spacing w:after="0" w:before="0" w:line="184" w:lineRule="auto"/>
+        <w:spacing w:after="0" w:before="0" w:line="182" w:lineRule="auto"/>
       </w:pPr>
       <w:r>
         <w:rPr>
@@ -448,7 +448,7 @@
         <w:tabs>
           <w:tab w:val="right" w:pos="11228"/>
         </w:tabs>
-        <w:spacing w:after="0" w:before="24" w:line="184" w:lineRule="auto"/>
+        <w:spacing w:after="0" w:before="24" w:line="182" w:lineRule="auto"/>
       </w:pPr>
       <w:r>
         <w:rPr>
@@ -479,7 +479,7 @@
     </w:p>
     <w:p>
       <w:pPr>
-        <w:spacing w:after="0" w:before="0" w:line="184" w:lineRule="auto"/>
+        <w:spacing w:after="0" w:before="0" w:line="182" w:lineRule="auto"/>
       </w:pPr>
       <w:r>
         <w:rPr>
@@ -499,7 +499,7 @@
           <w:ilvl w:val="0"/>
           <w:numId w:val="2"/>
         </w:numPr>
-        <w:spacing w:after="0" w:before="0" w:line="184" w:lineRule="auto"/>
+        <w:spacing w:after="0" w:before="0" w:line="182" w:lineRule="auto"/>
       </w:pPr>
       <w:r>
         <w:rPr>
@@ -517,7 +517,7 @@
           <w:ilvl w:val="0"/>
           <w:numId w:val="2"/>
         </w:numPr>
-        <w:spacing w:after="0" w:before="0" w:line="184" w:lineRule="auto"/>
+        <w:spacing w:after="0" w:before="0" w:line="182" w:lineRule="auto"/>
       </w:pPr>
       <w:r>
         <w:rPr>
@@ -535,7 +535,7 @@
           <w:ilvl w:val="0"/>
           <w:numId w:val="2"/>
         </w:numPr>
-        <w:spacing w:after="0" w:before="0" w:line="184" w:lineRule="auto"/>
+        <w:spacing w:after="0" w:before="0" w:line="182" w:lineRule="auto"/>
       </w:pPr>
       <w:r>
         <w:rPr>
@@ -553,7 +553,7 @@
           <w:ilvl w:val="0"/>
           <w:numId w:val="2"/>
         </w:numPr>
-        <w:spacing w:after="0" w:before="0" w:line="184" w:lineRule="auto"/>
+        <w:spacing w:after="0" w:before="0" w:line="182" w:lineRule="auto"/>
       </w:pPr>
       <w:r>
         <w:rPr>
@@ -569,7 +569,7 @@
         <w:tabs>
           <w:tab w:val="right" w:pos="11228"/>
         </w:tabs>
-        <w:spacing w:after="0" w:before="24" w:line="184" w:lineRule="auto"/>
+        <w:spacing w:after="0" w:before="24" w:line="182" w:lineRule="auto"/>
       </w:pPr>
       <w:r>
         <w:rPr>
@@ -600,7 +600,7 @@
     </w:p>
     <w:p>
       <w:pPr>
-        <w:spacing w:after="0" w:before="0" w:line="184" w:lineRule="auto"/>
+        <w:spacing w:after="0" w:before="0" w:line="182" w:lineRule="auto"/>
       </w:pPr>
       <w:r>
         <w:rPr>
@@ -620,7 +620,7 @@
           <w:ilvl w:val="0"/>
           <w:numId w:val="2"/>
         </w:numPr>
-        <w:spacing w:after="0" w:before="0" w:line="184" w:lineRule="auto"/>
+        <w:spacing w:after="0" w:before="0" w:line="182" w:lineRule="auto"/>
       </w:pPr>
       <w:r>
         <w:rPr>
@@ -638,7 +638,7 @@
           <w:ilvl w:val="0"/>
           <w:numId w:val="2"/>
         </w:numPr>
-        <w:spacing w:after="0" w:before="0" w:line="184" w:lineRule="auto"/>
+        <w:spacing w:after="0" w:before="0" w:line="182" w:lineRule="auto"/>
       </w:pPr>
       <w:r>
         <w:rPr>
@@ -656,7 +656,7 @@
           <w:ilvl w:val="0"/>
           <w:numId w:val="2"/>
         </w:numPr>
-        <w:spacing w:after="0" w:before="0" w:line="184" w:lineRule="auto"/>
+        <w:spacing w:after="0" w:before="0" w:line="182" w:lineRule="auto"/>
       </w:pPr>
       <w:r>
         <w:rPr>
@@ -674,7 +674,7 @@
           <w:ilvl w:val="0"/>
           <w:numId w:val="2"/>
         </w:numPr>
-        <w:spacing w:after="0" w:before="0" w:line="184" w:lineRule="auto"/>
+        <w:spacing w:after="0" w:before="0" w:line="182" w:lineRule="auto"/>
       </w:pPr>
       <w:r>
         <w:rPr>
@@ -690,7 +690,7 @@
         <w:tabs>
           <w:tab w:val="right" w:pos="11228"/>
         </w:tabs>
-        <w:spacing w:after="0" w:before="24" w:line="184" w:lineRule="auto"/>
+        <w:spacing w:after="0" w:before="24" w:line="182" w:lineRule="auto"/>
       </w:pPr>
       <w:r>
         <w:rPr>
@@ -721,7 +721,7 @@
     </w:p>
     <w:p>
       <w:pPr>
-        <w:spacing w:after="0" w:before="0" w:line="184" w:lineRule="auto"/>
+        <w:spacing w:after="0" w:before="0" w:line="182" w:lineRule="auto"/>
       </w:pPr>
       <w:r>
         <w:rPr>
@@ -741,7 +741,7 @@
           <w:ilvl w:val="0"/>
           <w:numId w:val="2"/>
         </w:numPr>
-        <w:spacing w:after="0" w:before="0" w:line="184" w:lineRule="auto"/>
+        <w:spacing w:after="0" w:before="0" w:line="182" w:lineRule="auto"/>
       </w:pPr>
       <w:r>
         <w:rPr>
@@ -759,7 +759,7 @@
           <w:ilvl w:val="0"/>
           <w:numId w:val="2"/>
         </w:numPr>
-        <w:spacing w:after="0" w:before="0" w:line="184" w:lineRule="auto"/>
+        <w:spacing w:after="0" w:before="0" w:line="182" w:lineRule="auto"/>
       </w:pPr>
       <w:r>
         <w:rPr>
@@ -777,7 +777,7 @@
           <w:ilvl w:val="0"/>
           <w:numId w:val="2"/>
         </w:numPr>
-        <w:spacing w:after="0" w:before="0" w:line="184" w:lineRule="auto"/>
+        <w:spacing w:after="0" w:before="0" w:line="182" w:lineRule="auto"/>
       </w:pPr>
       <w:r>
         <w:rPr>
@@ -793,7 +793,7 @@
         <w:pBdr>
           <w:bottom w:val="single" w:color="000000" w:sz="6" w:space="1"/>
         </w:pBdr>
-        <w:spacing w:after="40" w:before="80" w:line="184" w:lineRule="auto"/>
+        <w:spacing w:after="40" w:before="80" w:line="182" w:lineRule="auto"/>
       </w:pPr>
       <w:r>
         <w:rPr>
@@ -911,7 +911,7 @@
         <w:tabs>
           <w:tab w:val="right" w:pos="11228"/>
         </w:tabs>
-        <w:spacing w:after="0" w:before="40" w:line="184" w:lineRule="auto"/>
+        <w:spacing w:after="0" w:before="40" w:line="182" w:lineRule="auto"/>
       </w:pPr>
       <w:r>
         <w:rPr>
@@ -934,7 +934,7 @@
     </w:p>
     <w:p>
       <w:pPr>
-        <w:spacing w:after="0" w:before="0" w:line="184" w:lineRule="auto"/>
+        <w:spacing w:after="0" w:before="0" w:line="182" w:lineRule="auto"/>
       </w:pPr>
       <w:r>
         <w:rPr>
@@ -954,7 +954,7 @@
           <w:ilvl w:val="0"/>
           <w:numId w:val="2"/>
         </w:numPr>
-        <w:spacing w:after="0" w:before="0" w:line="184" w:lineRule="auto"/>
+        <w:spacing w:after="0" w:before="0" w:line="182" w:lineRule="auto"/>
       </w:pPr>
       <w:r>
         <w:rPr>
@@ -970,7 +970,7 @@
         <w:tabs>
           <w:tab w:val="right" w:pos="11228"/>
         </w:tabs>
-        <w:spacing w:after="0" w:before="24" w:line="184" w:lineRule="auto"/>
+        <w:spacing w:after="0" w:before="24" w:line="182" w:lineRule="auto"/>
       </w:pPr>
       <w:r>
         <w:rPr>
@@ -993,7 +993,7 @@
     </w:p>
     <w:p>
       <w:pPr>
-        <w:spacing w:after="0" w:before="0" w:line="184" w:lineRule="auto"/>
+        <w:spacing w:after="0" w:before="0" w:line="182" w:lineRule="auto"/>
       </w:pPr>
       <w:r>
         <w:rPr>
@@ -1013,25 +1013,25 @@
           <w:ilvl w:val="0"/>
           <w:numId w:val="2"/>
         </w:numPr>
-        <w:spacing w:after="0" w:before="0" w:line="184" w:lineRule="auto"/>
-      </w:pPr>
-      <w:r>
-        <w:rPr>
-          <w:rFonts w:ascii="EB Garamond" w:cs="EB Garamond" w:eastAsia="EB Garamond" w:hAnsi="EB Garamond"/>
-          <w:sz w:val="20"/>
-          <w:szCs w:val="20"/>
-        </w:rPr>
-        <w:t xml:space="preserve">Accepted into competitive pre-professional fellowship offering intensive technical training for careers in investment banking and buyside</w:t>
-      </w:r>
-    </w:p>
-    <w:p>
-      <w:pPr>
-        <w:pStyle w:val="ListParagraph"/>
-        <w:numPr>
-          <w:ilvl w:val="0"/>
-          <w:numId w:val="2"/>
-        </w:numPr>
-        <w:spacing w:after="0" w:before="0" w:line="184" w:lineRule="auto"/>
+        <w:spacing w:after="0" w:before="0" w:line="182" w:lineRule="auto"/>
+      </w:pPr>
+      <w:r>
+        <w:rPr>
+          <w:rFonts w:ascii="EB Garamond" w:cs="EB Garamond" w:eastAsia="EB Garamond" w:hAnsi="EB Garamond"/>
+          <w:sz w:val="20"/>
+          <w:szCs w:val="20"/>
+        </w:rPr>
+        <w:t xml:space="preserve">Selected for competitive pre-professional fellowship offering intensive technical training for careers in investment banking and private equity</w:t>
+      </w:r>
+    </w:p>
+    <w:p>
+      <w:pPr>
+        <w:pStyle w:val="ListParagraph"/>
+        <w:numPr>
+          <w:ilvl w:val="0"/>
+          <w:numId w:val="2"/>
+        </w:numPr>
+        <w:spacing w:after="0" w:before="0" w:line="182" w:lineRule="auto"/>
       </w:pPr>
       <w:r>
         <w:rPr>
@@ -1049,15 +1049,15 @@
           <w:ilvl w:val="0"/>
           <w:numId w:val="2"/>
         </w:numPr>
-        <w:spacing w:after="0" w:before="0" w:line="184" w:lineRule="auto"/>
-      </w:pPr>
-      <w:r>
-        <w:rPr>
-          <w:rFonts w:ascii="EB Garamond" w:cs="EB Garamond" w:eastAsia="EB Garamond" w:hAnsi="EB Garamond"/>
-          <w:sz w:val="20"/>
-          <w:szCs w:val="20"/>
-        </w:rPr>
-        <w:t xml:space="preserve">Studied real-world transaction case studies, completed technical assessments, and received mentorship from senior Wall Street professionals</w:t>
+        <w:spacing w:after="0" w:before="0" w:line="182" w:lineRule="auto"/>
+      </w:pPr>
+      <w:r>
+        <w:rPr>
+          <w:rFonts w:ascii="EB Garamond" w:cs="EB Garamond" w:eastAsia="EB Garamond" w:hAnsi="EB Garamond"/>
+          <w:sz w:val="20"/>
+          <w:szCs w:val="20"/>
+        </w:rPr>
+        <w:t xml:space="preserve">Analyzed real-world transaction case studies, completed technical assessments, and received mentorship from senior Wall Street professionals</w:t>
       </w:r>
     </w:p>
     <w:p>
@@ -1065,7 +1065,7 @@
         <w:tabs>
           <w:tab w:val="right" w:pos="11228"/>
         </w:tabs>
-        <w:spacing w:after="0" w:before="24" w:line="184" w:lineRule="auto"/>
+        <w:spacing w:after="0" w:before="24" w:line="182" w:lineRule="auto"/>
       </w:pPr>
       <w:r>
         <w:rPr>
@@ -1088,7 +1088,7 @@
     </w:p>
     <w:p>
       <w:pPr>
-        <w:spacing w:after="0" w:before="0" w:line="184" w:lineRule="auto"/>
+        <w:spacing w:after="0" w:before="0" w:line="182" w:lineRule="auto"/>
       </w:pPr>
       <w:r>
         <w:rPr>
@@ -1108,51 +1108,51 @@
           <w:ilvl w:val="0"/>
           <w:numId w:val="2"/>
         </w:numPr>
-        <w:spacing w:after="0" w:before="0" w:line="184" w:lineRule="auto"/>
-      </w:pPr>
-      <w:r>
-        <w:rPr>
-          <w:rFonts w:ascii="EB Garamond" w:cs="EB Garamond" w:eastAsia="EB Garamond" w:hAnsi="EB Garamond"/>
-          <w:sz w:val="20"/>
-          <w:szCs w:val="20"/>
-        </w:rPr>
-        <w:t xml:space="preserve">Admitted via competitive application to an intensive finance accelerator backed by leading PE sponsors, focused on investor-grade modeling</w:t>
-      </w:r>
-    </w:p>
-    <w:p>
-      <w:pPr>
-        <w:pStyle w:val="ListParagraph"/>
-        <w:numPr>
-          <w:ilvl w:val="0"/>
-          <w:numId w:val="2"/>
-        </w:numPr>
-        <w:spacing w:after="0" w:before="0" w:line="184" w:lineRule="auto"/>
-      </w:pPr>
-      <w:r>
-        <w:rPr>
-          <w:rFonts w:ascii="EB Garamond" w:cs="EB Garamond" w:eastAsia="EB Garamond" w:hAnsi="EB Garamond"/>
-          <w:sz w:val="20"/>
-          <w:szCs w:val="20"/>
-        </w:rPr>
-        <w:t xml:space="preserve">Created multi-period three-statement operating models from blank spreadsheets with working capital, debt waterfalls, and sensitivity tables</w:t>
-      </w:r>
-    </w:p>
-    <w:p>
-      <w:pPr>
-        <w:pStyle w:val="ListParagraph"/>
-        <w:numPr>
-          <w:ilvl w:val="0"/>
-          <w:numId w:val="2"/>
-        </w:numPr>
-        <w:spacing w:after="0" w:before="0" w:line="184" w:lineRule="auto"/>
-      </w:pPr>
-      <w:r>
-        <w:rPr>
-          <w:rFonts w:ascii="EB Garamond" w:cs="EB Garamond" w:eastAsia="EB Garamond" w:hAnsi="EB Garamond"/>
-          <w:sz w:val="20"/>
-          <w:szCs w:val="20"/>
-        </w:rPr>
-        <w:t xml:space="preserve">Examined buyout case studies, analyzed operational drivers (unit economics, margins), and presented valuation takeaways to PE investors</w:t>
+        <w:spacing w:after="0" w:before="0" w:line="182" w:lineRule="auto"/>
+      </w:pPr>
+      <w:r>
+        <w:rPr>
+          <w:rFonts w:ascii="EB Garamond" w:cs="EB Garamond" w:eastAsia="EB Garamond" w:hAnsi="EB Garamond"/>
+          <w:sz w:val="20"/>
+          <w:szCs w:val="20"/>
+        </w:rPr>
+        <w:t xml:space="preserve">Selected via competitive application for an intensive finance accelerator backed by leading PE sponsors, focused on investor-grade modeling</w:t>
+      </w:r>
+    </w:p>
+    <w:p>
+      <w:pPr>
+        <w:pStyle w:val="ListParagraph"/>
+        <w:numPr>
+          <w:ilvl w:val="0"/>
+          <w:numId w:val="2"/>
+        </w:numPr>
+        <w:spacing w:after="0" w:before="0" w:line="182" w:lineRule="auto"/>
+      </w:pPr>
+      <w:r>
+        <w:rPr>
+          <w:rFonts w:ascii="EB Garamond" w:cs="EB Garamond" w:eastAsia="EB Garamond" w:hAnsi="EB Garamond"/>
+          <w:sz w:val="20"/>
+          <w:szCs w:val="20"/>
+        </w:rPr>
+        <w:t xml:space="preserve">Constructed multi-period three-statement operating models from blank spreadsheets with working capital, debt waterfalls, and sensitivities</w:t>
+      </w:r>
+    </w:p>
+    <w:p>
+      <w:pPr>
+        <w:pStyle w:val="ListParagraph"/>
+        <w:numPr>
+          <w:ilvl w:val="0"/>
+          <w:numId w:val="2"/>
+        </w:numPr>
+        <w:spacing w:after="0" w:before="0" w:line="182" w:lineRule="auto"/>
+      </w:pPr>
+      <w:r>
+        <w:rPr>
+          <w:rFonts w:ascii="EB Garamond" w:cs="EB Garamond" w:eastAsia="EB Garamond" w:hAnsi="EB Garamond"/>
+          <w:sz w:val="20"/>
+          <w:szCs w:val="20"/>
+        </w:rPr>
+        <w:t xml:space="preserve">Evaluated buyout case studies, analyzed operational drivers (unit economics, margins), and presented valuation takeaways to PE investors</w:t>
       </w:r>
     </w:p>
     <w:p>
@@ -1160,7 +1160,7 @@
         <w:tabs>
           <w:tab w:val="right" w:pos="11228"/>
         </w:tabs>
-        <w:spacing w:after="0" w:before="24" w:line="184" w:lineRule="auto"/>
+        <w:spacing w:after="0" w:before="24" w:line="182" w:lineRule="auto"/>
       </w:pPr>
       <w:r>
         <w:rPr>
@@ -1183,7 +1183,7 @@
     </w:p>
     <w:p>
       <w:pPr>
-        <w:spacing w:after="0" w:before="0" w:line="184" w:lineRule="auto"/>
+        <w:spacing w:after="0" w:before="0" w:line="182" w:lineRule="auto"/>
       </w:pPr>
       <w:r>
         <w:rPr>
@@ -1203,43 +1203,43 @@
           <w:ilvl w:val="0"/>
           <w:numId w:val="2"/>
         </w:numPr>
-        <w:spacing w:after="0" w:before="0" w:line="184" w:lineRule="auto"/>
-      </w:pPr>
-      <w:r>
-        <w:rPr>
-          <w:rFonts w:ascii="EB Garamond" w:cs="EB Garamond" w:eastAsia="EB Garamond" w:hAnsi="EB Garamond"/>
-          <w:sz w:val="20"/>
-          <w:szCs w:val="20"/>
-        </w:rPr>
-        <w:t xml:space="preserve">Named to competitive 18+-month fellowship accelerating emerging leaders' careers via executive coaching, skill-building, and mentorship</w:t>
-      </w:r>
-    </w:p>
-    <w:p>
-      <w:pPr>
-        <w:pStyle w:val="ListParagraph"/>
-        <w:numPr>
-          <w:ilvl w:val="0"/>
-          <w:numId w:val="2"/>
-        </w:numPr>
-        <w:spacing w:after="0" w:before="0" w:line="184" w:lineRule="auto"/>
-      </w:pPr>
-      <w:r>
-        <w:rPr>
-          <w:rFonts w:ascii="EB Garamond" w:cs="EB Garamond" w:eastAsia="EB Garamond" w:hAnsi="EB Garamond"/>
-          <w:sz w:val="20"/>
-          <w:szCs w:val="20"/>
-        </w:rPr>
-        <w:t xml:space="preserve">Tackled rigorous business case analyses, quantitative problem-solving assignments, and strategic simulations reviewed by executive coaches</w:t>
-      </w:r>
-    </w:p>
-    <w:p>
-      <w:pPr>
-        <w:pStyle w:val="ListParagraph"/>
-        <w:numPr>
-          <w:ilvl w:val="0"/>
-          <w:numId w:val="2"/>
-        </w:numPr>
-        <w:spacing w:after="0" w:before="0" w:line="184" w:lineRule="auto"/>
+        <w:spacing w:after="0" w:before="0" w:line="182" w:lineRule="auto"/>
+      </w:pPr>
+      <w:r>
+        <w:rPr>
+          <w:rFonts w:ascii="EB Garamond" w:cs="EB Garamond" w:eastAsia="EB Garamond" w:hAnsi="EB Garamond"/>
+          <w:sz w:val="20"/>
+          <w:szCs w:val="20"/>
+        </w:rPr>
+        <w:t xml:space="preserve">Selected for competitive 18+-month fellowship accelerating emerging leaders' careers via executive coaching, skill-building, and mentorship</w:t>
+      </w:r>
+    </w:p>
+    <w:p>
+      <w:pPr>
+        <w:pStyle w:val="ListParagraph"/>
+        <w:numPr>
+          <w:ilvl w:val="0"/>
+          <w:numId w:val="2"/>
+        </w:numPr>
+        <w:spacing w:after="0" w:before="0" w:line="182" w:lineRule="auto"/>
+      </w:pPr>
+      <w:r>
+        <w:rPr>
+          <w:rFonts w:ascii="EB Garamond" w:cs="EB Garamond" w:eastAsia="EB Garamond" w:hAnsi="EB Garamond"/>
+          <w:sz w:val="20"/>
+          <w:szCs w:val="20"/>
+        </w:rPr>
+        <w:t xml:space="preserve">Completed rigorous business case analyses, quantitative problem-solving assignments, and strategic simulations evaluated by career coaches</w:t>
+      </w:r>
+    </w:p>
+    <w:p>
+      <w:pPr>
+        <w:pStyle w:val="ListParagraph"/>
+        <w:numPr>
+          <w:ilvl w:val="0"/>
+          <w:numId w:val="2"/>
+        </w:numPr>
+        <w:spacing w:after="0" w:before="0" w:line="182" w:lineRule="auto"/>
       </w:pPr>
       <w:r>
         <w:rPr>
@@ -1255,7 +1255,7 @@
         <w:tabs>
           <w:tab w:val="right" w:pos="11228"/>
         </w:tabs>
-        <w:spacing w:after="0" w:before="24" w:line="184" w:lineRule="auto"/>
+        <w:spacing w:after="0" w:before="24" w:line="182" w:lineRule="auto"/>
       </w:pPr>
       <w:r>
         <w:rPr>
@@ -1286,7 +1286,7 @@
     </w:p>
     <w:p>
       <w:pPr>
-        <w:spacing w:after="0" w:before="0" w:line="184" w:lineRule="auto"/>
+        <w:spacing w:after="0" w:before="0" w:line="182" w:lineRule="auto"/>
       </w:pPr>
       <w:r>
         <w:rPr>
@@ -1306,25 +1306,25 @@
           <w:ilvl w:val="0"/>
           <w:numId w:val="2"/>
         </w:numPr>
-        <w:spacing w:after="0" w:before="0" w:line="184" w:lineRule="auto"/>
-      </w:pPr>
-      <w:r>
-        <w:rPr>
-          <w:rFonts w:ascii="EB Garamond" w:cs="EB Garamond" w:eastAsia="EB Garamond" w:hAnsi="EB Garamond"/>
-          <w:sz w:val="20"/>
-          <w:szCs w:val="20"/>
-        </w:rPr>
-        <w:t xml:space="preserve">Recommended selling a 51% controlling stake in Athleta while retaining 49% of the upside for Gap in the inaugural M&amp;A Pitch Competition</w:t>
-      </w:r>
-    </w:p>
-    <w:p>
-      <w:pPr>
-        <w:pStyle w:val="ListParagraph"/>
-        <w:numPr>
-          <w:ilvl w:val="0"/>
-          <w:numId w:val="2"/>
-        </w:numPr>
-        <w:spacing w:after="0" w:before="0" w:line="184" w:lineRule="auto"/>
+        <w:spacing w:after="0" w:before="0" w:line="182" w:lineRule="auto"/>
+      </w:pPr>
+      <w:r>
+        <w:rPr>
+          <w:rFonts w:ascii="EB Garamond" w:cs="EB Garamond" w:eastAsia="EB Garamond" w:hAnsi="EB Garamond"/>
+          <w:sz w:val="20"/>
+          <w:szCs w:val="20"/>
+        </w:rPr>
+        <w:t xml:space="preserve">Selected for inaugural M&amp;A Pitch Competition; recommended selling a 51% controlling stake in Athleta while retaining 49% of the upside</w:t>
+      </w:r>
+    </w:p>
+    <w:p>
+      <w:pPr>
+        <w:pStyle w:val="ListParagraph"/>
+        <w:numPr>
+          <w:ilvl w:val="0"/>
+          <w:numId w:val="2"/>
+        </w:numPr>
+        <w:spacing w:after="0" w:before="0" w:line="182" w:lineRule="auto"/>
       </w:pPr>
       <w:r>
         <w:rPr>
@@ -1333,6 +1333,24 @@
           <w:szCs w:val="20"/>
         </w:rPr>
         <w:t xml:space="preserve">Modeled five-year operating case, DCF, sum-of-the-parts, and buyer returns analysis supporting a $561M enterprise value and a 19-20% IRR</w:t>
+      </w:r>
+    </w:p>
+    <w:p>
+      <w:pPr>
+        <w:pStyle w:val="ListParagraph"/>
+        <w:numPr>
+          <w:ilvl w:val="0"/>
+          <w:numId w:val="2"/>
+        </w:numPr>
+        <w:spacing w:after="0" w:before="0" w:line="182" w:lineRule="auto"/>
+      </w:pPr>
+      <w:r>
+        <w:rPr>
+          <w:rFonts w:ascii="EB Garamond" w:cs="EB Garamond" w:eastAsia="EB Garamond" w:hAnsi="EB Garamond"/>
+          <w:sz w:val="20"/>
+          <w:szCs w:val="20"/>
+        </w:rPr>
+        <w:t xml:space="preserve">Analyzed SEC filings, equity research, trading comparables, and precedent transactions to co-author a four-page investment banking memo</w:t>
       </w:r>
     </w:p>
     <w:p>
@@ -1340,7 +1358,7 @@
         <w:tabs>
           <w:tab w:val="right" w:pos="11228"/>
         </w:tabs>
-        <w:spacing w:after="0" w:before="24" w:line="184" w:lineRule="auto"/>
+        <w:spacing w:after="0" w:before="24" w:line="182" w:lineRule="auto"/>
       </w:pPr>
       <w:r>
         <w:rPr>
@@ -1371,7 +1389,7 @@
     </w:p>
     <w:p>
       <w:pPr>
-        <w:spacing w:after="0" w:before="0" w:line="184" w:lineRule="auto"/>
+        <w:spacing w:after="0" w:before="0" w:line="182" w:lineRule="auto"/>
       </w:pPr>
       <w:r>
         <w:rPr>
@@ -1391,7 +1409,7 @@
           <w:ilvl w:val="0"/>
           <w:numId w:val="2"/>
         </w:numPr>
-        <w:spacing w:after="0" w:before="0" w:line="184" w:lineRule="auto"/>
+        <w:spacing w:after="0" w:before="0" w:line="182" w:lineRule="auto"/>
       </w:pPr>
       <w:r>
         <w:rPr>
@@ -1409,7 +1427,7 @@
           <w:ilvl w:val="0"/>
           <w:numId w:val="2"/>
         </w:numPr>
-        <w:spacing w:after="0" w:before="0" w:line="184" w:lineRule="auto"/>
+        <w:spacing w:after="0" w:before="0" w:line="182" w:lineRule="auto"/>
       </w:pPr>
       <w:r>
         <w:rPr>
@@ -1427,7 +1445,7 @@
           <w:ilvl w:val="0"/>
           <w:numId w:val="2"/>
         </w:numPr>
-        <w:spacing w:after="0" w:before="0" w:line="184" w:lineRule="auto"/>
+        <w:spacing w:after="0" w:before="0" w:line="182" w:lineRule="auto"/>
       </w:pPr>
       <w:r>
         <w:rPr>
@@ -1443,7 +1461,7 @@
         <w:pBdr>
           <w:bottom w:val="single" w:color="000000" w:sz="6" w:space="1"/>
         </w:pBdr>
-        <w:spacing w:after="40" w:before="80" w:line="184" w:lineRule="auto"/>
+        <w:spacing w:after="40" w:before="80" w:line="182" w:lineRule="auto"/>
       </w:pPr>
       <w:r>
         <w:rPr>
@@ -1548,7 +1566,7 @@
     </w:p>
     <w:p>
       <w:pPr>
-        <w:spacing w:after="0" w:before="30" w:line="184" w:lineRule="auto"/>
+        <w:spacing w:after="0" w:before="30" w:line="182" w:lineRule="auto"/>
       </w:pPr>
       <w:r>
         <w:rPr>
@@ -1571,7 +1589,7 @@
     </w:p>
     <w:p>
       <w:pPr>
-        <w:spacing w:after="0" w:before="0" w:line="184" w:lineRule="auto"/>
+        <w:spacing w:after="0" w:before="0" w:line="182" w:lineRule="auto"/>
       </w:pPr>
       <w:r>
         <w:rPr>
@@ -1594,7 +1612,7 @@
     </w:p>
     <w:p>
       <w:pPr>
-        <w:spacing w:after="0" w:before="0" w:line="184" w:lineRule="auto"/>
+        <w:spacing w:after="0" w:before="0" w:line="182" w:lineRule="auto"/>
       </w:pPr>
       <w:r>
         <w:rPr>
@@ -1612,7 +1630,7 @@
           <w:sz w:val="20"/>
           <w:szCs w:val="20"/>
         </w:rPr>
-        <w:t xml:space="preserve">Vanderbilt Finance Club, Vanderbilt Culinary Club, WILSkills, Hear My Cry Foundation (Volunteer), Front of House (Runner)</w:t>
+        <w:t xml:space="preserve">Vanderbilt Finance Club, Nigerian Community Financial Literacy Lead, WILSkills, Hear My Cry Foundation, Front of House</w:t>
       </w:r>
     </w:p>
     <w:sectPr>

</xml_diff>

<commit_message>
Resume: First Analysis bullets reflect actual PQC coverage work
Co-Authored-By: Claude Opus 5.5 <noreply@anthropic.com>
Claude-Session: https://claude.ai/code/session_01G3JV145HgjUfXQyW7hEcYE
</commit_message>
<xml_diff>
--- a/assets/Jennifer-Amogu-Resume.docx
+++ b/assets/Jennifer-Amogu-Resume.docx
@@ -265,61 +265,61 @@
           <w:sz w:val="20"/>
           <w:szCs w:val="20"/>
         </w:rPr>
-        <w:t xml:space="preserve">Constructed an 80+ company taxonomy across 9 cryptographic sub-sectors, building bottom-up TAM models tied to NIST 2030 mandates</w:t>
-      </w:r>
-    </w:p>
-    <w:p>
-      <w:pPr>
-        <w:pStyle w:val="ListParagraph"/>
-        <w:numPr>
-          <w:ilvl w:val="0"/>
-          <w:numId w:val="2"/>
-        </w:numPr>
-        <w:spacing w:after="0" w:before="0" w:line="182" w:lineRule="auto"/>
-      </w:pPr>
-      <w:r>
-        <w:rPr>
-          <w:rFonts w:ascii="EB Garamond" w:cs="EB Garamond" w:eastAsia="EB Garamond" w:hAnsi="EB Garamond"/>
-          <w:sz w:val="20"/>
-          <w:szCs w:val="20"/>
-        </w:rPr>
-        <w:t xml:space="preserve">Benchmarked public EV/NTM Revenue multiples against private funding rounds across 15+ peer comps to frame pure-play exit valuations</w:t>
-      </w:r>
-    </w:p>
-    <w:p>
-      <w:pPr>
-        <w:pStyle w:val="ListParagraph"/>
-        <w:numPr>
-          <w:ilvl w:val="0"/>
-          <w:numId w:val="2"/>
-        </w:numPr>
-        <w:spacing w:after="0" w:before="0" w:line="182" w:lineRule="auto"/>
-      </w:pPr>
-      <w:r>
-        <w:rPr>
-          <w:rFonts w:ascii="EB Garamond" w:cs="EB Garamond" w:eastAsia="EB Garamond" w:hAnsi="EB Garamond"/>
-          <w:sz w:val="20"/>
-          <w:szCs w:val="20"/>
-        </w:rPr>
-        <w:t xml:space="preserve">Evaluated bolt-on fit and consolidation rationales across 80+ pure-plays to identify acquisition targets for large-cap cybersecurity platforms</w:t>
-      </w:r>
-    </w:p>
-    <w:p>
-      <w:pPr>
-        <w:pStyle w:val="ListParagraph"/>
-        <w:numPr>
-          <w:ilvl w:val="0"/>
-          <w:numId w:val="2"/>
-        </w:numPr>
-        <w:spacing w:after="0" w:before="0" w:line="182" w:lineRule="auto"/>
-      </w:pPr>
-      <w:r>
-        <w:rPr>
-          <w:rFonts w:ascii="EB Garamond" w:cs="EB Garamond" w:eastAsia="EB Garamond" w:hAnsi="EB Garamond"/>
-          <w:sz w:val="20"/>
-          <w:szCs w:val="20"/>
-        </w:rPr>
-        <w:t xml:space="preserve">Engineered a deal origination database tracking leadership, capitalization, and channel partners across 3 regions to inform sector reporting</w:t>
+        <w:t xml:space="preserve">Validated a 69-company post-quantum cryptography market map across 9 sub-sectors, refining segment fit and competitive differentiation</w:t>
+      </w:r>
+    </w:p>
+    <w:p>
+      <w:pPr>
+        <w:pStyle w:val="ListParagraph"/>
+        <w:numPr>
+          <w:ilvl w:val="0"/>
+          <w:numId w:val="2"/>
+        </w:numPr>
+        <w:spacing w:after="0" w:before="0" w:line="182" w:lineRule="auto"/>
+      </w:pPr>
+      <w:r>
+        <w:rPr>
+          <w:rFonts w:ascii="EB Garamond" w:cs="EB Garamond" w:eastAsia="EB Garamond" w:hAnsi="EB Garamond"/>
+          <w:sz w:val="20"/>
+          <w:szCs w:val="20"/>
+        </w:rPr>
+        <w:t xml:space="preserve">Logged precedent M&amp;A activity and ownership status across the coverage universe to map strategic cybersecurity buyers and consolidators</w:t>
+      </w:r>
+    </w:p>
+    <w:p>
+      <w:pPr>
+        <w:pStyle w:val="ListParagraph"/>
+        <w:numPr>
+          <w:ilvl w:val="0"/>
+          <w:numId w:val="2"/>
+        </w:numPr>
+        <w:spacing w:after="0" w:before="0" w:line="182" w:lineRule="auto"/>
+      </w:pPr>
+      <w:r>
+        <w:rPr>
+          <w:rFonts w:ascii="EB Garamond" w:cs="EB Garamond" w:eastAsia="EB Garamond" w:hAnsi="EB Garamond"/>
+          <w:sz w:val="20"/>
+          <w:szCs w:val="20"/>
+        </w:rPr>
+        <w:t xml:space="preserve">Compiled CEO contacts and partner ecosystems for each target company to support origination outreach for advisory and venture mandates</w:t>
+      </w:r>
+    </w:p>
+    <w:p>
+      <w:pPr>
+        <w:pStyle w:val="ListParagraph"/>
+        <w:numPr>
+          <w:ilvl w:val="0"/>
+          <w:numId w:val="2"/>
+        </w:numPr>
+        <w:spacing w:after="0" w:before="0" w:line="182" w:lineRule="auto"/>
+      </w:pPr>
+      <w:r>
+        <w:rPr>
+          <w:rFonts w:ascii="EB Garamond" w:cs="EB Garamond" w:eastAsia="EB Garamond" w:hAnsi="EB Garamond"/>
+          <w:sz w:val="20"/>
+          <w:szCs w:val="20"/>
+        </w:rPr>
+        <w:t xml:space="preserve">Sourced new post-quantum companies in healthcare, industrial IoT, supply chain, and identity, expanding firm coverage beyond the U.S.</w:t>
       </w:r>
     </w:p>
     <w:p>

</xml_diff>